<commit_message>
Complete Day 2: OpenCV image loading and image representation
</commit_message>
<xml_diff>
--- a/Working.docx
+++ b/Working.docx
@@ -5,6 +5,29 @@
     <w:p>
       <w:pPr>
         <w:rPr>
+          <w:rFonts w:ascii="Algerian" w:hAnsi="Algerian"/>
+          <w:b/>
+          <w:bCs/>
+          <w:sz w:val="52"/>
+          <w:szCs w:val="52"/>
+          <w:u w:val="single"/>
+        </w:rPr>
+      </w:pPr>
+      <w:r>
+        <w:rPr>
+          <w:rFonts w:ascii="Algerian" w:hAnsi="Algerian"/>
+          <w:b/>
+          <w:bCs/>
+          <w:sz w:val="52"/>
+          <w:szCs w:val="52"/>
+          <w:u w:val="single"/>
+        </w:rPr>
+        <w:t>Day 1</w:t>
+      </w:r>
+    </w:p>
+    <w:p>
+      <w:pPr>
+        <w:rPr>
           <w:b/>
           <w:bCs/>
         </w:rPr>
@@ -249,12 +272,12 @@
     </w:p>
     <w:p>
       <w:r>
+        <w:lastRenderedPageBreak/>
         <w:t>So this command means:</w:t>
       </w:r>
     </w:p>
     <w:p>
       <w:r>
-        <w:lastRenderedPageBreak/>
         <w:t xml:space="preserve">"Use Python's virtual environment module to create a virtual environment in a folder named </w:t>
       </w:r>
       <w:proofErr w:type="spellStart"/>
@@ -516,7 +539,6 @@
           <w:b/>
           <w:bCs/>
         </w:rPr>
-        <w:lastRenderedPageBreak/>
         <w:t>🚀</w:t>
       </w:r>
       <w:r>
@@ -683,7 +705,7 @@
     <w:p>
       <w:r>
         <w:pict w14:anchorId="2ACF0D84">
-          <v:rect id="_x0000_i1044" style="width:0;height:1.5pt" o:hralign="center" o:hrstd="t" o:hr="t" fillcolor="#a0a0a0" stroked="f"/>
+          <v:rect id="_x0000_i1032" style="width:0;height:1.5pt" o:hralign="center" o:hrstd="t" o:hr="t" fillcolor="#a0a0a0" stroked="f"/>
         </w:pict>
       </w:r>
     </w:p>
@@ -792,6 +814,7 @@
     </w:p>
     <w:p>
       <w:r>
+        <w:lastRenderedPageBreak/>
         <w:t xml:space="preserve">That's </w:t>
       </w:r>
       <w:r>
@@ -807,7 +830,6 @@
     </w:p>
     <w:p>
       <w:r>
-        <w:lastRenderedPageBreak/>
         <w:t>Another:</w:t>
       </w:r>
     </w:p>
@@ -842,7 +864,7 @@
     <w:p>
       <w:r>
         <w:pict w14:anchorId="64464B0E">
-          <v:rect id="_x0000_i1045" style="width:0;height:1.5pt" o:hralign="center" o:hrstd="t" o:hr="t" fillcolor="#a0a0a0" stroked="f"/>
+          <v:rect id="_x0000_i1033" style="width:0;height:1.5pt" o:hralign="center" o:hrstd="t" o:hr="t" fillcolor="#a0a0a0" stroked="f"/>
         </w:pict>
       </w:r>
     </w:p>
@@ -1021,7 +1043,7 @@
           <w:szCs w:val="44"/>
         </w:rPr>
         <w:pict w14:anchorId="0FA38654">
-          <v:rect id="_x0000_i1126" style="width:0;height:1.5pt" o:hralign="center" o:hrstd="t" o:hr="t" fillcolor="#a0a0a0" stroked="f"/>
+          <v:rect id="_x0000_i1034" style="width:0;height:1.5pt" o:hralign="center" o:hrstd="t" o:hr="t" fillcolor="#a0a0a0" stroked="f"/>
         </w:pict>
       </w:r>
     </w:p>
@@ -1113,7 +1135,7 @@
           <w:szCs w:val="44"/>
         </w:rPr>
         <w:pict w14:anchorId="0F64F958">
-          <v:rect id="_x0000_i1127" style="width:0;height:1.5pt" o:hralign="center" o:hrstd="t" o:hr="t" fillcolor="#a0a0a0" stroked="f"/>
+          <v:rect id="_x0000_i1035" style="width:0;height:1.5pt" o:hralign="center" o:hrstd="t" o:hr="t" fillcolor="#a0a0a0" stroked="f"/>
         </w:pict>
       </w:r>
     </w:p>
@@ -1332,7 +1354,7 @@
           <w:szCs w:val="44"/>
         </w:rPr>
         <w:pict w14:anchorId="2FBE5A9E">
-          <v:rect id="_x0000_i1128" style="width:0;height:1.5pt" o:hralign="center" o:hrstd="t" o:hr="t" fillcolor="#a0a0a0" stroked="f"/>
+          <v:rect id="_x0000_i1036" style="width:0;height:1.5pt" o:hralign="center" o:hrstd="t" o:hr="t" fillcolor="#a0a0a0" stroked="f"/>
         </w:pict>
       </w:r>
     </w:p>
@@ -1612,7 +1634,7 @@
           <w:szCs w:val="44"/>
         </w:rPr>
         <w:pict w14:anchorId="34A73B56">
-          <v:rect id="_x0000_i1129" style="width:0;height:1.5pt" o:hralign="center" o:hrstd="t" o:hr="t" fillcolor="#a0a0a0" stroked="f"/>
+          <v:rect id="_x0000_i1037" style="width:0;height:1.5pt" o:hralign="center" o:hrstd="t" o:hr="t" fillcolor="#a0a0a0" stroked="f"/>
         </w:pict>
       </w:r>
     </w:p>
@@ -1769,7 +1791,7 @@
           <w:szCs w:val="44"/>
         </w:rPr>
         <w:pict w14:anchorId="0E9C2737">
-          <v:rect id="_x0000_i1130" style="width:0;height:1.5pt" o:hralign="center" o:hrstd="t" o:hr="t" fillcolor="#a0a0a0" stroked="f"/>
+          <v:rect id="_x0000_i1038" style="width:0;height:1.5pt" o:hralign="center" o:hrstd="t" o:hr="t" fillcolor="#a0a0a0" stroked="f"/>
         </w:pict>
       </w:r>
     </w:p>
@@ -1956,7 +1978,7 @@
         </w:rPr>
         <w:lastRenderedPageBreak/>
         <w:pict w14:anchorId="17991BB6">
-          <v:rect id="_x0000_i1131" style="width:0;height:1.5pt" o:hralign="center" o:hrstd="t" o:hr="t" fillcolor="#a0a0a0" stroked="f"/>
+          <v:rect id="_x0000_i1039" style="width:0;height:1.5pt" o:hralign="center" o:hrstd="t" o:hr="t" fillcolor="#a0a0a0" stroked="f"/>
         </w:pict>
       </w:r>
     </w:p>
@@ -2219,7 +2241,7 @@
           <w:szCs w:val="44"/>
         </w:rPr>
         <w:pict w14:anchorId="67C8C778">
-          <v:rect id="_x0000_i1132" style="width:0;height:1.5pt" o:hralign="center" o:hrstd="t" o:hr="t" fillcolor="#a0a0a0" stroked="f"/>
+          <v:rect id="_x0000_i1040" style="width:0;height:1.5pt" o:hralign="center" o:hrstd="t" o:hr="t" fillcolor="#a0a0a0" stroked="f"/>
         </w:pict>
       </w:r>
     </w:p>
@@ -2548,7 +2570,7 @@
           <w:szCs w:val="44"/>
         </w:rPr>
         <w:pict w14:anchorId="1C9922D5">
-          <v:rect id="_x0000_i1133" style="width:0;height:1.5pt" o:hralign="center" o:hrstd="t" o:hr="t" fillcolor="#a0a0a0" stroked="f"/>
+          <v:rect id="_x0000_i1041" style="width:0;height:1.5pt" o:hralign="center" o:hrstd="t" o:hr="t" fillcolor="#a0a0a0" stroked="f"/>
         </w:pict>
       </w:r>
     </w:p>
@@ -2614,7 +2636,7 @@
           <w:szCs w:val="44"/>
         </w:rPr>
         <w:pict w14:anchorId="39DA0FDC">
-          <v:rect id="_x0000_i1134" style="width:0;height:1.5pt" o:hralign="center" o:hrstd="t" o:hr="t" fillcolor="#a0a0a0" stroked="f"/>
+          <v:rect id="_x0000_i1042" style="width:0;height:1.5pt" o:hralign="center" o:hrstd="t" o:hr="t" fillcolor="#a0a0a0" stroked="f"/>
         </w:pict>
       </w:r>
     </w:p>
@@ -3098,7 +3120,7 @@
           <w:szCs w:val="44"/>
         </w:rPr>
         <w:pict w14:anchorId="7D9F3386">
-          <v:rect id="_x0000_i1135" style="width:0;height:1.5pt" o:hralign="center" o:hrstd="t" o:hr="t" fillcolor="#a0a0a0" stroked="f"/>
+          <v:rect id="_x0000_i1043" style="width:0;height:1.5pt" o:hralign="center" o:hrstd="t" o:hr="t" fillcolor="#a0a0a0" stroked="f"/>
         </w:pict>
       </w:r>
     </w:p>
@@ -3336,7 +3358,7 @@
           <w:szCs w:val="44"/>
         </w:rPr>
         <w:pict w14:anchorId="5F889C41">
-          <v:rect id="_x0000_i1136" style="width:0;height:1.5pt" o:hralign="center" o:hrstd="t" o:hr="t" fillcolor="#a0a0a0" stroked="f"/>
+          <v:rect id="_x0000_i1044" style="width:0;height:1.5pt" o:hralign="center" o:hrstd="t" o:hr="t" fillcolor="#a0a0a0" stroked="f"/>
         </w:pict>
       </w:r>
     </w:p>
@@ -3453,7 +3475,7 @@
           <w:szCs w:val="44"/>
         </w:rPr>
         <w:pict w14:anchorId="16DF5E21">
-          <v:rect id="_x0000_i1137" style="width:0;height:1.5pt" o:hralign="center" o:hrstd="t" o:hr="t" fillcolor="#a0a0a0" stroked="f"/>
+          <v:rect id="_x0000_i1045" style="width:0;height:1.5pt" o:hralign="center" o:hrstd="t" o:hr="t" fillcolor="#a0a0a0" stroked="f"/>
         </w:pict>
       </w:r>
     </w:p>
@@ -3505,7 +3527,7 @@
           <w:szCs w:val="44"/>
         </w:rPr>
         <w:pict w14:anchorId="122ADCC7">
-          <v:rect id="_x0000_i1138" style="width:0;height:1.5pt" o:hralign="center" o:hrstd="t" o:hr="t" fillcolor="#a0a0a0" stroked="f"/>
+          <v:rect id="_x0000_i1046" style="width:0;height:1.5pt" o:hralign="center" o:hrstd="t" o:hr="t" fillcolor="#a0a0a0" stroked="f"/>
         </w:pict>
       </w:r>
     </w:p>
@@ -4325,6 +4347,976 @@
         <w:t>OpenCV is used to read images and videos, process them, resize them, draw shapes and text, detect objects, and perform many computer vision tasks.</w:t>
       </w:r>
     </w:p>
+    <w:p>
+      <w:pPr>
+        <w:rPr>
+          <w:sz w:val="44"/>
+          <w:szCs w:val="44"/>
+        </w:rPr>
+      </w:pPr>
+    </w:p>
+    <w:p>
+      <w:pPr>
+        <w:rPr>
+          <w:sz w:val="44"/>
+          <w:szCs w:val="44"/>
+        </w:rPr>
+      </w:pPr>
+      <w:r>
+        <w:rPr>
+          <w:sz w:val="44"/>
+          <w:szCs w:val="44"/>
+        </w:rPr>
+        <w:br w:type="page"/>
+      </w:r>
+    </w:p>
+    <w:p>
+      <w:pPr>
+        <w:rPr>
+          <w:b/>
+          <w:bCs/>
+          <w:sz w:val="44"/>
+          <w:szCs w:val="44"/>
+        </w:rPr>
+      </w:pPr>
+      <w:r>
+        <w:rPr>
+          <w:b/>
+          <w:bCs/>
+          <w:sz w:val="44"/>
+          <w:szCs w:val="44"/>
+        </w:rPr>
+        <w:lastRenderedPageBreak/>
+        <w:t>Our Git Workflow (You'll use this throughout the project)</w:t>
+      </w:r>
+    </w:p>
+    <w:p>
+      <w:pPr>
+        <w:rPr>
+          <w:sz w:val="44"/>
+          <w:szCs w:val="44"/>
+        </w:rPr>
+      </w:pPr>
+      <w:r>
+        <w:rPr>
+          <w:sz w:val="44"/>
+          <w:szCs w:val="44"/>
+        </w:rPr>
+        <w:t>Whenever you finish a milestone:</w:t>
+      </w:r>
+    </w:p>
+    <w:p>
+      <w:pPr>
+        <w:rPr>
+          <w:sz w:val="44"/>
+          <w:szCs w:val="44"/>
+        </w:rPr>
+      </w:pPr>
+      <w:r>
+        <w:rPr>
+          <w:sz w:val="44"/>
+          <w:szCs w:val="44"/>
+        </w:rPr>
+        <w:t>git status</w:t>
+      </w:r>
+      <w:r>
+        <w:rPr>
+          <w:sz w:val="44"/>
+          <w:szCs w:val="44"/>
+        </w:rPr>
+        <w:br/>
+        <w:t>git add .</w:t>
+      </w:r>
+      <w:r>
+        <w:rPr>
+          <w:sz w:val="44"/>
+          <w:szCs w:val="44"/>
+        </w:rPr>
+        <w:br/>
+        <w:t>git commit -m "Meaningful commit message"</w:t>
+      </w:r>
+      <w:r>
+        <w:rPr>
+          <w:sz w:val="44"/>
+          <w:szCs w:val="44"/>
+        </w:rPr>
+        <w:br/>
+        <w:t>git push</w:t>
+      </w:r>
+    </w:p>
+    <w:p>
+      <w:pPr>
+        <w:rPr>
+          <w:sz w:val="44"/>
+          <w:szCs w:val="44"/>
+        </w:rPr>
+      </w:pPr>
+      <w:r>
+        <w:rPr>
+          <w:sz w:val="44"/>
+          <w:szCs w:val="44"/>
+        </w:rPr>
+        <w:t>That's all.</w:t>
+      </w:r>
+    </w:p>
+    <w:p>
+      <w:pPr>
+        <w:rPr>
+          <w:sz w:val="44"/>
+          <w:szCs w:val="44"/>
+        </w:rPr>
+      </w:pPr>
+      <w:r>
+        <w:rPr>
+          <w:sz w:val="44"/>
+          <w:szCs w:val="44"/>
+        </w:rPr>
+        <w:br w:type="page"/>
+      </w:r>
+    </w:p>
+    <w:p>
+      <w:pPr>
+        <w:rPr>
+          <w:rFonts w:ascii="Algerian" w:hAnsi="Algerian"/>
+          <w:sz w:val="52"/>
+          <w:szCs w:val="52"/>
+          <w:u w:val="single"/>
+        </w:rPr>
+      </w:pPr>
+      <w:r>
+        <w:rPr>
+          <w:rFonts w:ascii="Algerian" w:hAnsi="Algerian"/>
+          <w:sz w:val="52"/>
+          <w:szCs w:val="52"/>
+          <w:u w:val="single"/>
+        </w:rPr>
+        <w:lastRenderedPageBreak/>
+        <w:t>Day 2</w:t>
+      </w:r>
+    </w:p>
+    <w:p>
+      <w:pPr>
+        <w:rPr>
+          <w:rFonts w:ascii="Arial" w:hAnsi="Arial" w:cs="Arial"/>
+          <w:b/>
+          <w:bCs/>
+          <w:sz w:val="44"/>
+          <w:szCs w:val="44"/>
+        </w:rPr>
+      </w:pPr>
+      <w:r>
+        <w:rPr>
+          <w:rFonts w:ascii="Segoe UI Emoji" w:hAnsi="Segoe UI Emoji" w:cs="Segoe UI Emoji"/>
+          <w:b/>
+          <w:bCs/>
+          <w:sz w:val="44"/>
+          <w:szCs w:val="44"/>
+        </w:rPr>
+        <w:t>🎯</w:t>
+      </w:r>
+      <w:r>
+        <w:rPr>
+          <w:rFonts w:ascii="Arial" w:hAnsi="Arial" w:cs="Arial"/>
+          <w:b/>
+          <w:bCs/>
+          <w:sz w:val="44"/>
+          <w:szCs w:val="44"/>
+        </w:rPr>
+        <w:t xml:space="preserve"> Today's Goal</w:t>
+      </w:r>
+    </w:p>
+    <w:p>
+      <w:pPr>
+        <w:rPr>
+          <w:rFonts w:ascii="Arial" w:hAnsi="Arial" w:cs="Arial"/>
+          <w:sz w:val="44"/>
+          <w:szCs w:val="44"/>
+        </w:rPr>
+      </w:pPr>
+      <w:r>
+        <w:rPr>
+          <w:rFonts w:ascii="Arial" w:hAnsi="Arial" w:cs="Arial"/>
+          <w:sz w:val="44"/>
+          <w:szCs w:val="44"/>
+        </w:rPr>
+        <w:t>By the end of today's lesson, you'll be able to answer these questions confidently:</w:t>
+      </w:r>
+    </w:p>
+    <w:p>
+      <w:pPr>
+        <w:numPr>
+          <w:ilvl w:val="0"/>
+          <w:numId w:val="7"/>
+        </w:numPr>
+        <w:rPr>
+          <w:rFonts w:ascii="Arial" w:hAnsi="Arial" w:cs="Arial"/>
+          <w:sz w:val="44"/>
+          <w:szCs w:val="44"/>
+        </w:rPr>
+      </w:pPr>
+      <w:r>
+        <w:rPr>
+          <w:rFonts w:ascii="Arial" w:hAnsi="Arial" w:cs="Arial"/>
+          <w:sz w:val="44"/>
+          <w:szCs w:val="44"/>
+        </w:rPr>
+        <w:t xml:space="preserve">How does OpenCV read an image? </w:t>
+      </w:r>
+    </w:p>
+    <w:p>
+      <w:pPr>
+        <w:numPr>
+          <w:ilvl w:val="0"/>
+          <w:numId w:val="7"/>
+        </w:numPr>
+        <w:rPr>
+          <w:rFonts w:ascii="Arial" w:hAnsi="Arial" w:cs="Arial"/>
+          <w:sz w:val="44"/>
+          <w:szCs w:val="44"/>
+        </w:rPr>
+      </w:pPr>
+      <w:r>
+        <w:rPr>
+          <w:rFonts w:ascii="Arial" w:hAnsi="Arial" w:cs="Arial"/>
+          <w:sz w:val="44"/>
+          <w:szCs w:val="44"/>
+        </w:rPr>
+        <w:t xml:space="preserve">What is stored inside the variable image? </w:t>
+      </w:r>
+    </w:p>
+    <w:p>
+      <w:pPr>
+        <w:numPr>
+          <w:ilvl w:val="0"/>
+          <w:numId w:val="7"/>
+        </w:numPr>
+        <w:rPr>
+          <w:rFonts w:ascii="Arial" w:hAnsi="Arial" w:cs="Arial"/>
+          <w:sz w:val="44"/>
+          <w:szCs w:val="44"/>
+        </w:rPr>
+      </w:pPr>
+      <w:r>
+        <w:rPr>
+          <w:rFonts w:ascii="Arial" w:hAnsi="Arial" w:cs="Arial"/>
+          <w:sz w:val="44"/>
+          <w:szCs w:val="44"/>
+        </w:rPr>
+        <w:t xml:space="preserve">What is a NumPy array? </w:t>
+      </w:r>
+    </w:p>
+    <w:p>
+      <w:pPr>
+        <w:numPr>
+          <w:ilvl w:val="0"/>
+          <w:numId w:val="7"/>
+        </w:numPr>
+        <w:rPr>
+          <w:rFonts w:ascii="Arial" w:hAnsi="Arial" w:cs="Arial"/>
+          <w:sz w:val="44"/>
+          <w:szCs w:val="44"/>
+        </w:rPr>
+      </w:pPr>
+      <w:r>
+        <w:rPr>
+          <w:rFonts w:ascii="Arial" w:hAnsi="Arial" w:cs="Arial"/>
+          <w:sz w:val="44"/>
+          <w:szCs w:val="44"/>
+        </w:rPr>
+        <w:t xml:space="preserve">What does </w:t>
+      </w:r>
+      <w:proofErr w:type="spellStart"/>
+      <w:r>
+        <w:rPr>
+          <w:rFonts w:ascii="Arial" w:hAnsi="Arial" w:cs="Arial"/>
+          <w:sz w:val="44"/>
+          <w:szCs w:val="44"/>
+        </w:rPr>
+        <w:t>image.shape</w:t>
+      </w:r>
+      <w:proofErr w:type="spellEnd"/>
+      <w:r>
+        <w:rPr>
+          <w:rFonts w:ascii="Arial" w:hAnsi="Arial" w:cs="Arial"/>
+          <w:sz w:val="44"/>
+          <w:szCs w:val="44"/>
+        </w:rPr>
+        <w:t xml:space="preserve"> mean? </w:t>
+      </w:r>
+    </w:p>
+    <w:p>
+      <w:pPr>
+        <w:numPr>
+          <w:ilvl w:val="0"/>
+          <w:numId w:val="7"/>
+        </w:numPr>
+        <w:rPr>
+          <w:rFonts w:ascii="Arial" w:hAnsi="Arial" w:cs="Arial"/>
+          <w:sz w:val="44"/>
+          <w:szCs w:val="44"/>
+        </w:rPr>
+      </w:pPr>
+      <w:r>
+        <w:rPr>
+          <w:rFonts w:ascii="Arial" w:hAnsi="Arial" w:cs="Arial"/>
+          <w:sz w:val="44"/>
+          <w:szCs w:val="44"/>
+        </w:rPr>
+        <w:t xml:space="preserve">Why are there 3 values in shape? </w:t>
+      </w:r>
+    </w:p>
+    <w:p>
+      <w:pPr>
+        <w:numPr>
+          <w:ilvl w:val="0"/>
+          <w:numId w:val="7"/>
+        </w:numPr>
+        <w:rPr>
+          <w:rFonts w:ascii="Arial" w:hAnsi="Arial" w:cs="Arial"/>
+          <w:sz w:val="44"/>
+          <w:szCs w:val="44"/>
+        </w:rPr>
+      </w:pPr>
+      <w:r>
+        <w:rPr>
+          <w:rFonts w:ascii="Arial" w:hAnsi="Arial" w:cs="Arial"/>
+          <w:sz w:val="44"/>
+          <w:szCs w:val="44"/>
+        </w:rPr>
+        <w:t xml:space="preserve">What is </w:t>
+      </w:r>
+      <w:proofErr w:type="spellStart"/>
+      <w:r>
+        <w:rPr>
+          <w:rFonts w:ascii="Arial" w:hAnsi="Arial" w:cs="Arial"/>
+          <w:sz w:val="44"/>
+          <w:szCs w:val="44"/>
+        </w:rPr>
+        <w:t>dtype</w:t>
+      </w:r>
+      <w:proofErr w:type="spellEnd"/>
+      <w:r>
+        <w:rPr>
+          <w:rFonts w:ascii="Arial" w:hAnsi="Arial" w:cs="Arial"/>
+          <w:sz w:val="44"/>
+          <w:szCs w:val="44"/>
+        </w:rPr>
+        <w:t xml:space="preserve">? </w:t>
+      </w:r>
+    </w:p>
+    <w:p>
+      <w:pPr>
+        <w:numPr>
+          <w:ilvl w:val="0"/>
+          <w:numId w:val="7"/>
+        </w:numPr>
+        <w:rPr>
+          <w:rFonts w:ascii="Arial" w:hAnsi="Arial" w:cs="Arial"/>
+          <w:sz w:val="44"/>
+          <w:szCs w:val="44"/>
+        </w:rPr>
+      </w:pPr>
+      <w:r>
+        <w:rPr>
+          <w:rFonts w:ascii="Arial" w:hAnsi="Arial" w:cs="Arial"/>
+          <w:sz w:val="44"/>
+          <w:szCs w:val="44"/>
+        </w:rPr>
+        <w:t xml:space="preserve">Why does OpenCV use </w:t>
+      </w:r>
+      <w:r>
+        <w:rPr>
+          <w:rFonts w:ascii="Arial" w:hAnsi="Arial" w:cs="Arial"/>
+          <w:b/>
+          <w:bCs/>
+          <w:sz w:val="44"/>
+          <w:szCs w:val="44"/>
+        </w:rPr>
+        <w:t>BGR</w:t>
+      </w:r>
+      <w:r>
+        <w:rPr>
+          <w:rFonts w:ascii="Arial" w:hAnsi="Arial" w:cs="Arial"/>
+          <w:sz w:val="44"/>
+          <w:szCs w:val="44"/>
+        </w:rPr>
+        <w:t xml:space="preserve"> instead of </w:t>
+      </w:r>
+      <w:r>
+        <w:rPr>
+          <w:rFonts w:ascii="Arial" w:hAnsi="Arial" w:cs="Arial"/>
+          <w:b/>
+          <w:bCs/>
+          <w:sz w:val="44"/>
+          <w:szCs w:val="44"/>
+        </w:rPr>
+        <w:t>RGB</w:t>
+      </w:r>
+      <w:r>
+        <w:rPr>
+          <w:rFonts w:ascii="Arial" w:hAnsi="Arial" w:cs="Arial"/>
+          <w:sz w:val="44"/>
+          <w:szCs w:val="44"/>
+        </w:rPr>
+        <w:t xml:space="preserve">? </w:t>
+      </w:r>
+    </w:p>
+    <w:p>
+      <w:pPr>
+        <w:numPr>
+          <w:ilvl w:val="0"/>
+          <w:numId w:val="7"/>
+        </w:numPr>
+        <w:rPr>
+          <w:rFonts w:ascii="Arial" w:hAnsi="Arial" w:cs="Arial"/>
+          <w:sz w:val="44"/>
+          <w:szCs w:val="44"/>
+        </w:rPr>
+      </w:pPr>
+      <w:r>
+        <w:rPr>
+          <w:rFonts w:ascii="Arial" w:hAnsi="Arial" w:cs="Arial"/>
+          <w:sz w:val="44"/>
+          <w:szCs w:val="44"/>
+        </w:rPr>
+        <w:t xml:space="preserve">How are images stored inside the computer? </w:t>
+      </w:r>
+    </w:p>
+    <w:p>
+      <w:pPr>
+        <w:rPr>
+          <w:rFonts w:ascii="Arial" w:hAnsi="Arial" w:cs="Arial"/>
+          <w:sz w:val="44"/>
+          <w:szCs w:val="44"/>
+        </w:rPr>
+      </w:pPr>
+      <w:r>
+        <w:rPr>
+          <w:rFonts w:ascii="Arial" w:hAnsi="Arial" w:cs="Arial"/>
+          <w:sz w:val="44"/>
+          <w:szCs w:val="44"/>
+        </w:rPr>
+        <w:t>These concepts are the foundation of everything we'll do later with YOLO and defect detection.</w:t>
+      </w:r>
+    </w:p>
+    <w:p>
+      <w:pPr>
+        <w:rPr>
+          <w:rFonts w:ascii="Arial" w:hAnsi="Arial" w:cs="Arial"/>
+          <w:sz w:val="44"/>
+          <w:szCs w:val="44"/>
+        </w:rPr>
+      </w:pPr>
+      <w:r>
+        <w:rPr>
+          <w:rFonts w:ascii="Arial" w:hAnsi="Arial" w:cs="Arial"/>
+          <w:sz w:val="44"/>
+          <w:szCs w:val="44"/>
+        </w:rPr>
+        <w:br w:type="page"/>
+      </w:r>
+    </w:p>
+    <w:p>
+      <w:pPr>
+        <w:rPr>
+          <w:rFonts w:ascii="Arial" w:hAnsi="Arial" w:cs="Arial"/>
+          <w:b/>
+          <w:bCs/>
+          <w:sz w:val="44"/>
+          <w:szCs w:val="44"/>
+        </w:rPr>
+      </w:pPr>
+      <w:r>
+        <w:rPr>
+          <w:rFonts w:ascii="Arial" w:hAnsi="Arial" w:cs="Arial"/>
+          <w:b/>
+          <w:bCs/>
+          <w:sz w:val="44"/>
+          <w:szCs w:val="44"/>
+        </w:rPr>
+        <w:lastRenderedPageBreak/>
+        <w:t xml:space="preserve">Interview Question </w:t>
+      </w:r>
+      <w:r>
+        <w:rPr>
+          <w:rFonts w:ascii="Segoe UI Emoji" w:hAnsi="Segoe UI Emoji" w:cs="Segoe UI Emoji"/>
+          <w:b/>
+          <w:bCs/>
+          <w:sz w:val="44"/>
+          <w:szCs w:val="44"/>
+        </w:rPr>
+        <w:t>⭐</w:t>
+      </w:r>
+    </w:p>
+    <w:p>
+      <w:pPr>
+        <w:rPr>
+          <w:rFonts w:ascii="Arial" w:hAnsi="Arial" w:cs="Arial"/>
+          <w:sz w:val="44"/>
+          <w:szCs w:val="44"/>
+        </w:rPr>
+      </w:pPr>
+      <w:r>
+        <w:rPr>
+          <w:rFonts w:ascii="Arial" w:hAnsi="Arial" w:cs="Arial"/>
+          <w:b/>
+          <w:bCs/>
+          <w:sz w:val="44"/>
+          <w:szCs w:val="44"/>
+        </w:rPr>
+        <w:t>Q:</w:t>
+      </w:r>
+      <w:r>
+        <w:rPr>
+          <w:rFonts w:ascii="Arial" w:hAnsi="Arial" w:cs="Arial"/>
+          <w:sz w:val="44"/>
+          <w:szCs w:val="44"/>
+        </w:rPr>
+        <w:t xml:space="preserve"> Why does cv2.imread() return a NumPy array instead of an image object?</w:t>
+      </w:r>
+    </w:p>
+    <w:p>
+      <w:pPr>
+        <w:rPr>
+          <w:rFonts w:ascii="Arial" w:hAnsi="Arial" w:cs="Arial"/>
+          <w:sz w:val="44"/>
+          <w:szCs w:val="44"/>
+        </w:rPr>
+      </w:pPr>
+      <w:r>
+        <w:rPr>
+          <w:rFonts w:ascii="Arial" w:hAnsi="Arial" w:cs="Arial"/>
+          <w:b/>
+          <w:bCs/>
+          <w:sz w:val="44"/>
+          <w:szCs w:val="44"/>
+        </w:rPr>
+        <w:t>Answer:</w:t>
+      </w:r>
+    </w:p>
+    <w:p>
+      <w:pPr>
+        <w:rPr>
+          <w:rFonts w:ascii="Arial" w:hAnsi="Arial" w:cs="Arial"/>
+          <w:sz w:val="44"/>
+          <w:szCs w:val="44"/>
+        </w:rPr>
+      </w:pPr>
+      <w:r>
+        <w:rPr>
+          <w:rFonts w:ascii="Arial" w:hAnsi="Arial" w:cs="Arial"/>
+          <w:sz w:val="44"/>
+          <w:szCs w:val="44"/>
+        </w:rPr>
+        <w:t xml:space="preserve">Because AI algorithms and image processing operations work on </w:t>
+      </w:r>
+      <w:r>
+        <w:rPr>
+          <w:rFonts w:ascii="Arial" w:hAnsi="Arial" w:cs="Arial"/>
+          <w:b/>
+          <w:bCs/>
+          <w:sz w:val="44"/>
+          <w:szCs w:val="44"/>
+        </w:rPr>
+        <w:t>numerical data</w:t>
+      </w:r>
+      <w:r>
+        <w:rPr>
+          <w:rFonts w:ascii="Arial" w:hAnsi="Arial" w:cs="Arial"/>
+          <w:sz w:val="44"/>
+          <w:szCs w:val="44"/>
+        </w:rPr>
+        <w:t>, not pictures. A NumPy array allows efficient mathematical operations on pixel values.</w:t>
+      </w:r>
+    </w:p>
+    <w:p>
+      <w:pPr>
+        <w:rPr>
+          <w:rFonts w:ascii="Arial" w:hAnsi="Arial" w:cs="Arial"/>
+          <w:b/>
+          <w:bCs/>
+          <w:sz w:val="44"/>
+          <w:szCs w:val="44"/>
+        </w:rPr>
+      </w:pPr>
+      <w:r>
+        <w:rPr>
+          <w:rFonts w:ascii="Arial" w:hAnsi="Arial" w:cs="Arial"/>
+          <w:b/>
+          <w:bCs/>
+          <w:sz w:val="44"/>
+          <w:szCs w:val="44"/>
+        </w:rPr>
+        <w:t xml:space="preserve">Interview Questions </w:t>
+      </w:r>
+      <w:r>
+        <w:rPr>
+          <w:rFonts w:ascii="Segoe UI Emoji" w:hAnsi="Segoe UI Emoji" w:cs="Segoe UI Emoji"/>
+          <w:b/>
+          <w:bCs/>
+          <w:sz w:val="44"/>
+          <w:szCs w:val="44"/>
+        </w:rPr>
+        <w:t>⭐</w:t>
+      </w:r>
+    </w:p>
+    <w:p>
+      <w:pPr>
+        <w:rPr>
+          <w:rFonts w:ascii="Arial" w:hAnsi="Arial" w:cs="Arial"/>
+          <w:b/>
+          <w:bCs/>
+          <w:sz w:val="44"/>
+          <w:szCs w:val="44"/>
+        </w:rPr>
+      </w:pPr>
+      <w:r>
+        <w:rPr>
+          <w:rFonts w:ascii="Arial" w:hAnsi="Arial" w:cs="Arial"/>
+          <w:b/>
+          <w:bCs/>
+          <w:sz w:val="44"/>
+          <w:szCs w:val="44"/>
+        </w:rPr>
+        <w:t>Q1. Why do we use cv2.waitKey(0)?</w:t>
+      </w:r>
+    </w:p>
+    <w:p>
+      <w:pPr>
+        <w:rPr>
+          <w:rFonts w:ascii="Arial" w:hAnsi="Arial" w:cs="Arial"/>
+          <w:sz w:val="44"/>
+          <w:szCs w:val="44"/>
+        </w:rPr>
+      </w:pPr>
+      <w:r>
+        <w:rPr>
+          <w:rFonts w:ascii="Arial" w:hAnsi="Arial" w:cs="Arial"/>
+          <w:b/>
+          <w:bCs/>
+          <w:sz w:val="44"/>
+          <w:szCs w:val="44"/>
+        </w:rPr>
+        <w:t>Answer:</w:t>
+      </w:r>
+    </w:p>
+    <w:p>
+      <w:pPr>
+        <w:rPr>
+          <w:rFonts w:ascii="Arial" w:hAnsi="Arial" w:cs="Arial"/>
+          <w:sz w:val="44"/>
+          <w:szCs w:val="44"/>
+        </w:rPr>
+      </w:pPr>
+      <w:r>
+        <w:rPr>
+          <w:rFonts w:ascii="Arial" w:hAnsi="Arial" w:cs="Arial"/>
+          <w:sz w:val="44"/>
+          <w:szCs w:val="44"/>
+        </w:rPr>
+        <w:t>To pause the program until the user presses a key. Otherwise, the image window closes immediately when the program finishes.</w:t>
+      </w:r>
+    </w:p>
+    <w:p>
+      <w:pPr>
+        <w:rPr>
+          <w:rFonts w:ascii="Arial" w:hAnsi="Arial" w:cs="Arial"/>
+          <w:sz w:val="44"/>
+          <w:szCs w:val="44"/>
+        </w:rPr>
+      </w:pPr>
+      <w:r>
+        <w:rPr>
+          <w:rFonts w:ascii="Arial" w:hAnsi="Arial" w:cs="Arial"/>
+          <w:sz w:val="44"/>
+          <w:szCs w:val="44"/>
+        </w:rPr>
+        <w:pict w14:anchorId="14CA90DA">
+          <v:rect id="_x0000_i1059" style="width:0;height:1.5pt" o:hralign="center" o:hrstd="t" o:hr="t" fillcolor="#a0a0a0" stroked="f"/>
+        </w:pict>
+      </w:r>
+    </w:p>
+    <w:p>
+      <w:pPr>
+        <w:rPr>
+          <w:rFonts w:ascii="Arial" w:hAnsi="Arial" w:cs="Arial"/>
+          <w:b/>
+          <w:bCs/>
+          <w:sz w:val="44"/>
+          <w:szCs w:val="44"/>
+        </w:rPr>
+      </w:pPr>
+      <w:r>
+        <w:rPr>
+          <w:rFonts w:ascii="Arial" w:hAnsi="Arial" w:cs="Arial"/>
+          <w:b/>
+          <w:bCs/>
+          <w:sz w:val="44"/>
+          <w:szCs w:val="44"/>
+        </w:rPr>
+        <w:t xml:space="preserve">Q2. What is the difference between </w:t>
+      </w:r>
+      <w:proofErr w:type="spellStart"/>
+      <w:r>
+        <w:rPr>
+          <w:rFonts w:ascii="Arial" w:hAnsi="Arial" w:cs="Arial"/>
+          <w:b/>
+          <w:bCs/>
+          <w:sz w:val="44"/>
+          <w:szCs w:val="44"/>
+        </w:rPr>
+        <w:t>imshow</w:t>
+      </w:r>
+      <w:proofErr w:type="spellEnd"/>
+      <w:r>
+        <w:rPr>
+          <w:rFonts w:ascii="Arial" w:hAnsi="Arial" w:cs="Arial"/>
+          <w:b/>
+          <w:bCs/>
+          <w:sz w:val="44"/>
+          <w:szCs w:val="44"/>
+        </w:rPr>
+        <w:t xml:space="preserve">() and </w:t>
+      </w:r>
+      <w:proofErr w:type="spellStart"/>
+      <w:r>
+        <w:rPr>
+          <w:rFonts w:ascii="Arial" w:hAnsi="Arial" w:cs="Arial"/>
+          <w:b/>
+          <w:bCs/>
+          <w:sz w:val="44"/>
+          <w:szCs w:val="44"/>
+        </w:rPr>
+        <w:t>imread</w:t>
+      </w:r>
+      <w:proofErr w:type="spellEnd"/>
+      <w:r>
+        <w:rPr>
+          <w:rFonts w:ascii="Arial" w:hAnsi="Arial" w:cs="Arial"/>
+          <w:b/>
+          <w:bCs/>
+          <w:sz w:val="44"/>
+          <w:szCs w:val="44"/>
+        </w:rPr>
+        <w:t>()?</w:t>
+      </w:r>
+    </w:p>
+    <w:p>
+      <w:pPr>
+        <w:rPr>
+          <w:rFonts w:ascii="Arial" w:hAnsi="Arial" w:cs="Arial"/>
+          <w:sz w:val="44"/>
+          <w:szCs w:val="44"/>
+        </w:rPr>
+      </w:pPr>
+      <w:r>
+        <w:rPr>
+          <w:rFonts w:ascii="Arial" w:hAnsi="Arial" w:cs="Arial"/>
+          <w:b/>
+          <w:bCs/>
+          <w:sz w:val="44"/>
+          <w:szCs w:val="44"/>
+        </w:rPr>
+        <w:t>Answer:</w:t>
+      </w:r>
+    </w:p>
+    <w:p>
+      <w:pPr>
+        <w:numPr>
+          <w:ilvl w:val="0"/>
+          <w:numId w:val="8"/>
+        </w:numPr>
+        <w:rPr>
+          <w:rFonts w:ascii="Arial" w:hAnsi="Arial" w:cs="Arial"/>
+          <w:sz w:val="44"/>
+          <w:szCs w:val="44"/>
+        </w:rPr>
+      </w:pPr>
+      <w:proofErr w:type="spellStart"/>
+      <w:r>
+        <w:rPr>
+          <w:rFonts w:ascii="Arial" w:hAnsi="Arial" w:cs="Arial"/>
+          <w:sz w:val="44"/>
+          <w:szCs w:val="44"/>
+        </w:rPr>
+        <w:t>imread</w:t>
+      </w:r>
+      <w:proofErr w:type="spellEnd"/>
+      <w:r>
+        <w:rPr>
+          <w:rFonts w:ascii="Arial" w:hAnsi="Arial" w:cs="Arial"/>
+          <w:sz w:val="44"/>
+          <w:szCs w:val="44"/>
+        </w:rPr>
+        <w:t xml:space="preserve">() reads an image from disk and returns a NumPy array. </w:t>
+      </w:r>
+    </w:p>
+    <w:p>
+      <w:pPr>
+        <w:numPr>
+          <w:ilvl w:val="0"/>
+          <w:numId w:val="8"/>
+        </w:numPr>
+        <w:rPr>
+          <w:rFonts w:ascii="Arial" w:hAnsi="Arial" w:cs="Arial"/>
+          <w:sz w:val="44"/>
+          <w:szCs w:val="44"/>
+        </w:rPr>
+      </w:pPr>
+      <w:proofErr w:type="spellStart"/>
+      <w:r>
+        <w:rPr>
+          <w:rFonts w:ascii="Arial" w:hAnsi="Arial" w:cs="Arial"/>
+          <w:sz w:val="44"/>
+          <w:szCs w:val="44"/>
+        </w:rPr>
+        <w:lastRenderedPageBreak/>
+        <w:t>imshow</w:t>
+      </w:r>
+      <w:proofErr w:type="spellEnd"/>
+      <w:r>
+        <w:rPr>
+          <w:rFonts w:ascii="Arial" w:hAnsi="Arial" w:cs="Arial"/>
+          <w:sz w:val="44"/>
+          <w:szCs w:val="44"/>
+        </w:rPr>
+        <w:t xml:space="preserve">() displays a NumPy array in a window. </w:t>
+      </w:r>
+    </w:p>
+    <w:p>
+      <w:pPr>
+        <w:rPr>
+          <w:rFonts w:ascii="Arial" w:hAnsi="Arial" w:cs="Arial"/>
+          <w:sz w:val="44"/>
+          <w:szCs w:val="44"/>
+        </w:rPr>
+      </w:pPr>
+      <w:r>
+        <w:rPr>
+          <w:rFonts w:ascii="Arial" w:hAnsi="Arial" w:cs="Arial"/>
+          <w:sz w:val="44"/>
+          <w:szCs w:val="44"/>
+        </w:rPr>
+        <w:pict w14:anchorId="3A23BA5C">
+          <v:rect id="_x0000_i1060" style="width:0;height:1.5pt" o:hralign="center" o:hrstd="t" o:hr="t" fillcolor="#a0a0a0" stroked="f"/>
+        </w:pict>
+      </w:r>
+    </w:p>
+    <w:p>
+      <w:pPr>
+        <w:rPr>
+          <w:rFonts w:ascii="Arial" w:hAnsi="Arial" w:cs="Arial"/>
+          <w:b/>
+          <w:bCs/>
+          <w:sz w:val="44"/>
+          <w:szCs w:val="44"/>
+        </w:rPr>
+      </w:pPr>
+      <w:r>
+        <w:rPr>
+          <w:rFonts w:ascii="Arial" w:hAnsi="Arial" w:cs="Arial"/>
+          <w:b/>
+          <w:bCs/>
+          <w:sz w:val="44"/>
+          <w:szCs w:val="44"/>
+        </w:rPr>
+        <w:t xml:space="preserve">Q3. Does </w:t>
+      </w:r>
+      <w:proofErr w:type="spellStart"/>
+      <w:r>
+        <w:rPr>
+          <w:rFonts w:ascii="Arial" w:hAnsi="Arial" w:cs="Arial"/>
+          <w:b/>
+          <w:bCs/>
+          <w:sz w:val="44"/>
+          <w:szCs w:val="44"/>
+        </w:rPr>
+        <w:t>imshow</w:t>
+      </w:r>
+      <w:proofErr w:type="spellEnd"/>
+      <w:r>
+        <w:rPr>
+          <w:rFonts w:ascii="Arial" w:hAnsi="Arial" w:cs="Arial"/>
+          <w:b/>
+          <w:bCs/>
+          <w:sz w:val="44"/>
+          <w:szCs w:val="44"/>
+        </w:rPr>
+        <w:t>() read the image from disk?</w:t>
+      </w:r>
+    </w:p>
+    <w:p>
+      <w:pPr>
+        <w:rPr>
+          <w:rFonts w:ascii="Arial" w:hAnsi="Arial" w:cs="Arial"/>
+          <w:sz w:val="44"/>
+          <w:szCs w:val="44"/>
+        </w:rPr>
+      </w:pPr>
+      <w:r>
+        <w:rPr>
+          <w:rFonts w:ascii="Arial" w:hAnsi="Arial" w:cs="Arial"/>
+          <w:b/>
+          <w:bCs/>
+          <w:sz w:val="44"/>
+          <w:szCs w:val="44"/>
+        </w:rPr>
+        <w:t>Answer:</w:t>
+      </w:r>
+    </w:p>
+    <w:p>
+      <w:pPr>
+        <w:rPr>
+          <w:rFonts w:ascii="Arial" w:hAnsi="Arial" w:cs="Arial"/>
+          <w:sz w:val="44"/>
+          <w:szCs w:val="44"/>
+        </w:rPr>
+      </w:pPr>
+      <w:r>
+        <w:rPr>
+          <w:rFonts w:ascii="Arial" w:hAnsi="Arial" w:cs="Arial"/>
+          <w:sz w:val="44"/>
+          <w:szCs w:val="44"/>
+        </w:rPr>
+        <w:t>No.</w:t>
+      </w:r>
+    </w:p>
+    <w:p>
+      <w:pPr>
+        <w:rPr>
+          <w:rFonts w:ascii="Arial" w:hAnsi="Arial" w:cs="Arial"/>
+          <w:sz w:val="44"/>
+          <w:szCs w:val="44"/>
+        </w:rPr>
+      </w:pPr>
+      <w:r>
+        <w:rPr>
+          <w:rFonts w:ascii="Arial" w:hAnsi="Arial" w:cs="Arial"/>
+          <w:sz w:val="44"/>
+          <w:szCs w:val="44"/>
+        </w:rPr>
+        <w:t>It only displays the NumPy array already stored in memory.</w:t>
+      </w:r>
+    </w:p>
+    <w:p>
+      <w:pPr>
+        <w:rPr>
+          <w:rFonts w:ascii="Arial" w:hAnsi="Arial" w:cs="Arial"/>
+          <w:sz w:val="44"/>
+          <w:szCs w:val="44"/>
+        </w:rPr>
+      </w:pPr>
+    </w:p>
+    <w:p>
+      <w:pPr>
+        <w:rPr>
+          <w:rFonts w:ascii="Algerian" w:hAnsi="Algerian"/>
+          <w:sz w:val="52"/>
+          <w:szCs w:val="52"/>
+          <w:u w:val="single"/>
+        </w:rPr>
+      </w:pPr>
+    </w:p>
     <w:sectPr>
       <w:pgSz w:w="11906" w:h="16838"/>
       <w:pgMar w:top="1440" w:right="1440" w:bottom="1440" w:left="1440" w:header="708" w:footer="708" w:gutter="0"/>
@@ -4338,9 +5330,9 @@
 <file path=word/numbering.xml><?xml version="1.0" encoding="utf-8"?>
 <w:numbering xmlns:wpc="http://schemas.microsoft.com/office/word/2010/wordprocessingCanvas" xmlns:cx="http://schemas.microsoft.com/office/drawing/2014/chartex" xmlns:cx1="http://schemas.microsoft.com/office/drawing/2015/9/8/chartex" xmlns:cx2="http://schemas.microsoft.com/office/drawing/2015/10/21/chartex" xmlns:cx3="http://schemas.microsoft.com/office/drawing/2016/5/9/chartex" xmlns:cx4="http://schemas.microsoft.com/office/drawing/2016/5/10/chartex" xmlns:cx5="http://schemas.microsoft.com/office/drawing/2016/5/11/chartex" xmlns:cx6="http://schemas.microsoft.com/office/drawing/2016/5/12/chartex" xmlns:cx7="http://schemas.microsoft.com/office/drawing/2016/5/13/chartex" xmlns:cx8="http://schemas.microsoft.com/office/drawing/2016/5/14/chartex" xmlns:mc="http://schemas.openxmlformats.org/markup-compatibility/2006" xmlns:aink="http://schemas.microsoft.com/office/drawing/2016/ink" xmlns:am3d="http://schemas.microsoft.com/office/drawing/2017/model3d" xmlns:o="urn:schemas-microsoft-com:office:office" xmlns:oel="http://schemas.microsoft.com/office/2019/extlst" xmlns:r="http://schemas.openxmlformats.org/officeDocument/2006/relationships" xmlns:m="http://schemas.openxmlformats.org/officeDocument/2006/math" xmlns:v="urn:schemas-microsoft-com:vml" xmlns:wp14="http://schemas.microsoft.com/office/word/2010/wordprocessingDrawing" xmlns:wp="http://schemas.openxmlformats.org/drawingml/2006/wordprocessingDrawing" xmlns:w10="urn:schemas-microsoft-com:office:word" xmlns:w="http://schemas.openxmlformats.org/wordprocessingml/2006/main" xmlns:w14="http://schemas.microsoft.com/office/word/2010/wordml" xmlns:w15="http://schemas.microsoft.com/office/word/2012/wordml" xmlns:w16cex="http://schemas.microsoft.com/office/word/2018/wordml/cex" xmlns:w16cid="http://schemas.microsoft.com/office/word/2016/wordml/cid" xmlns:w16="http://schemas.microsoft.com/office/word/2018/wordml" xmlns:w16du="http://schemas.microsoft.com/office/word/2023/wordml/word16du" xmlns:w16sdtdh="http://schemas.microsoft.com/office/word/2020/wordml/sdtdatahash" xmlns:w16sdtfl="http://schemas.microsoft.com/office/word/2024/wordml/sdtformatlock" xmlns:w16se="http://schemas.microsoft.com/office/word/2015/wordml/symex" xmlns:wpg="http://schemas.microsoft.com/office/word/2010/wordprocessingGroup" xmlns:wpi="http://schemas.microsoft.com/office/word/2010/wordprocessingInk" xmlns:wne="http://schemas.microsoft.com/office/word/2006/wordml" xmlns:wps="http://schemas.microsoft.com/office/word/2010/wordprocessingShape" mc:Ignorable="w14 w15 w16se w16cid w16 w16cex w16sdtdh w16sdtfl w16du wp14">
   <w:abstractNum w:abstractNumId="0" w15:restartNumberingAfterBreak="0">
-    <w:nsid w:val="2B6175FA"/>
+    <w:nsid w:val="07962403"/>
     <w:multiLevelType w:val="multilevel"/>
-    <w:tmpl w:val="78D63E14"/>
+    <w:tmpl w:val="8F287D86"/>
     <w:lvl w:ilvl="0">
       <w:start w:val="1"/>
       <w:numFmt w:val="bullet"/>
@@ -4487,9 +5479,9 @@
     </w:lvl>
   </w:abstractNum>
   <w:abstractNum w:abstractNumId="1" w15:restartNumberingAfterBreak="0">
-    <w:nsid w:val="353D30CB"/>
+    <w:nsid w:val="2B6175FA"/>
     <w:multiLevelType w:val="multilevel"/>
-    <w:tmpl w:val="3EC0C1C8"/>
+    <w:tmpl w:val="78D63E14"/>
     <w:lvl w:ilvl="0">
       <w:start w:val="1"/>
       <w:numFmt w:val="bullet"/>
@@ -4636,9 +5628,9 @@
     </w:lvl>
   </w:abstractNum>
   <w:abstractNum w:abstractNumId="2" w15:restartNumberingAfterBreak="0">
-    <w:nsid w:val="3884659F"/>
+    <w:nsid w:val="353D30CB"/>
     <w:multiLevelType w:val="multilevel"/>
-    <w:tmpl w:val="8E2C9308"/>
+    <w:tmpl w:val="3EC0C1C8"/>
     <w:lvl w:ilvl="0">
       <w:start w:val="1"/>
       <w:numFmt w:val="bullet"/>
@@ -4785,9 +5777,9 @@
     </w:lvl>
   </w:abstractNum>
   <w:abstractNum w:abstractNumId="3" w15:restartNumberingAfterBreak="0">
-    <w:nsid w:val="539A0854"/>
+    <w:nsid w:val="3884659F"/>
     <w:multiLevelType w:val="multilevel"/>
-    <w:tmpl w:val="5588D980"/>
+    <w:tmpl w:val="8E2C9308"/>
     <w:lvl w:ilvl="0">
       <w:start w:val="1"/>
       <w:numFmt w:val="bullet"/>
@@ -4934,9 +5926,9 @@
     </w:lvl>
   </w:abstractNum>
   <w:abstractNum w:abstractNumId="4" w15:restartNumberingAfterBreak="0">
-    <w:nsid w:val="5ABF11C5"/>
+    <w:nsid w:val="539A0854"/>
     <w:multiLevelType w:val="multilevel"/>
-    <w:tmpl w:val="BE98880C"/>
+    <w:tmpl w:val="5588D980"/>
     <w:lvl w:ilvl="0">
       <w:start w:val="1"/>
       <w:numFmt w:val="bullet"/>
@@ -5083,9 +6075,9 @@
     </w:lvl>
   </w:abstractNum>
   <w:abstractNum w:abstractNumId="5" w15:restartNumberingAfterBreak="0">
-    <w:nsid w:val="7C907E68"/>
+    <w:nsid w:val="5ABF11C5"/>
     <w:multiLevelType w:val="multilevel"/>
-    <w:tmpl w:val="729AECCA"/>
+    <w:tmpl w:val="BE98880C"/>
     <w:lvl w:ilvl="0">
       <w:start w:val="1"/>
       <w:numFmt w:val="bullet"/>
@@ -5231,23 +6223,327 @@
       </w:rPr>
     </w:lvl>
   </w:abstractNum>
+  <w:abstractNum w:abstractNumId="6" w15:restartNumberingAfterBreak="0">
+    <w:nsid w:val="78C73386"/>
+    <w:multiLevelType w:val="multilevel"/>
+    <w:tmpl w:val="8D266888"/>
+    <w:lvl w:ilvl="0">
+      <w:start w:val="1"/>
+      <w:numFmt w:val="bullet"/>
+      <w:lvlText w:val=""/>
+      <w:lvlJc w:val="left"/>
+      <w:pPr>
+        <w:tabs>
+          <w:tab w:val="num" w:pos="720"/>
+        </w:tabs>
+        <w:ind w:left="720" w:hanging="360"/>
+      </w:pPr>
+      <w:rPr>
+        <w:rFonts w:ascii="Symbol" w:hAnsi="Symbol" w:hint="default"/>
+        <w:sz w:val="20"/>
+      </w:rPr>
+    </w:lvl>
+    <w:lvl w:ilvl="1" w:tentative="1">
+      <w:start w:val="1"/>
+      <w:numFmt w:val="bullet"/>
+      <w:lvlText w:val="o"/>
+      <w:lvlJc w:val="left"/>
+      <w:pPr>
+        <w:tabs>
+          <w:tab w:val="num" w:pos="1440"/>
+        </w:tabs>
+        <w:ind w:left="1440" w:hanging="360"/>
+      </w:pPr>
+      <w:rPr>
+        <w:rFonts w:ascii="Courier New" w:hAnsi="Courier New" w:hint="default"/>
+        <w:sz w:val="20"/>
+      </w:rPr>
+    </w:lvl>
+    <w:lvl w:ilvl="2" w:tentative="1">
+      <w:start w:val="1"/>
+      <w:numFmt w:val="bullet"/>
+      <w:lvlText w:val=""/>
+      <w:lvlJc w:val="left"/>
+      <w:pPr>
+        <w:tabs>
+          <w:tab w:val="num" w:pos="2160"/>
+        </w:tabs>
+        <w:ind w:left="2160" w:hanging="360"/>
+      </w:pPr>
+      <w:rPr>
+        <w:rFonts w:ascii="Wingdings" w:hAnsi="Wingdings" w:hint="default"/>
+        <w:sz w:val="20"/>
+      </w:rPr>
+    </w:lvl>
+    <w:lvl w:ilvl="3" w:tentative="1">
+      <w:start w:val="1"/>
+      <w:numFmt w:val="bullet"/>
+      <w:lvlText w:val=""/>
+      <w:lvlJc w:val="left"/>
+      <w:pPr>
+        <w:tabs>
+          <w:tab w:val="num" w:pos="2880"/>
+        </w:tabs>
+        <w:ind w:left="2880" w:hanging="360"/>
+      </w:pPr>
+      <w:rPr>
+        <w:rFonts w:ascii="Wingdings" w:hAnsi="Wingdings" w:hint="default"/>
+        <w:sz w:val="20"/>
+      </w:rPr>
+    </w:lvl>
+    <w:lvl w:ilvl="4" w:tentative="1">
+      <w:start w:val="1"/>
+      <w:numFmt w:val="bullet"/>
+      <w:lvlText w:val=""/>
+      <w:lvlJc w:val="left"/>
+      <w:pPr>
+        <w:tabs>
+          <w:tab w:val="num" w:pos="3600"/>
+        </w:tabs>
+        <w:ind w:left="3600" w:hanging="360"/>
+      </w:pPr>
+      <w:rPr>
+        <w:rFonts w:ascii="Wingdings" w:hAnsi="Wingdings" w:hint="default"/>
+        <w:sz w:val="20"/>
+      </w:rPr>
+    </w:lvl>
+    <w:lvl w:ilvl="5" w:tentative="1">
+      <w:start w:val="1"/>
+      <w:numFmt w:val="bullet"/>
+      <w:lvlText w:val=""/>
+      <w:lvlJc w:val="left"/>
+      <w:pPr>
+        <w:tabs>
+          <w:tab w:val="num" w:pos="4320"/>
+        </w:tabs>
+        <w:ind w:left="4320" w:hanging="360"/>
+      </w:pPr>
+      <w:rPr>
+        <w:rFonts w:ascii="Wingdings" w:hAnsi="Wingdings" w:hint="default"/>
+        <w:sz w:val="20"/>
+      </w:rPr>
+    </w:lvl>
+    <w:lvl w:ilvl="6" w:tentative="1">
+      <w:start w:val="1"/>
+      <w:numFmt w:val="bullet"/>
+      <w:lvlText w:val=""/>
+      <w:lvlJc w:val="left"/>
+      <w:pPr>
+        <w:tabs>
+          <w:tab w:val="num" w:pos="5040"/>
+        </w:tabs>
+        <w:ind w:left="5040" w:hanging="360"/>
+      </w:pPr>
+      <w:rPr>
+        <w:rFonts w:ascii="Wingdings" w:hAnsi="Wingdings" w:hint="default"/>
+        <w:sz w:val="20"/>
+      </w:rPr>
+    </w:lvl>
+    <w:lvl w:ilvl="7" w:tentative="1">
+      <w:start w:val="1"/>
+      <w:numFmt w:val="bullet"/>
+      <w:lvlText w:val=""/>
+      <w:lvlJc w:val="left"/>
+      <w:pPr>
+        <w:tabs>
+          <w:tab w:val="num" w:pos="5760"/>
+        </w:tabs>
+        <w:ind w:left="5760" w:hanging="360"/>
+      </w:pPr>
+      <w:rPr>
+        <w:rFonts w:ascii="Wingdings" w:hAnsi="Wingdings" w:hint="default"/>
+        <w:sz w:val="20"/>
+      </w:rPr>
+    </w:lvl>
+    <w:lvl w:ilvl="8" w:tentative="1">
+      <w:start w:val="1"/>
+      <w:numFmt w:val="bullet"/>
+      <w:lvlText w:val=""/>
+      <w:lvlJc w:val="left"/>
+      <w:pPr>
+        <w:tabs>
+          <w:tab w:val="num" w:pos="6480"/>
+        </w:tabs>
+        <w:ind w:left="6480" w:hanging="360"/>
+      </w:pPr>
+      <w:rPr>
+        <w:rFonts w:ascii="Wingdings" w:hAnsi="Wingdings" w:hint="default"/>
+        <w:sz w:val="20"/>
+      </w:rPr>
+    </w:lvl>
+  </w:abstractNum>
+  <w:abstractNum w:abstractNumId="7" w15:restartNumberingAfterBreak="0">
+    <w:nsid w:val="7C907E68"/>
+    <w:multiLevelType w:val="multilevel"/>
+    <w:tmpl w:val="729AECCA"/>
+    <w:lvl w:ilvl="0">
+      <w:start w:val="1"/>
+      <w:numFmt w:val="bullet"/>
+      <w:lvlText w:val=""/>
+      <w:lvlJc w:val="left"/>
+      <w:pPr>
+        <w:tabs>
+          <w:tab w:val="num" w:pos="720"/>
+        </w:tabs>
+        <w:ind w:left="720" w:hanging="360"/>
+      </w:pPr>
+      <w:rPr>
+        <w:rFonts w:ascii="Symbol" w:hAnsi="Symbol" w:hint="default"/>
+        <w:sz w:val="20"/>
+      </w:rPr>
+    </w:lvl>
+    <w:lvl w:ilvl="1" w:tentative="1">
+      <w:start w:val="1"/>
+      <w:numFmt w:val="bullet"/>
+      <w:lvlText w:val="o"/>
+      <w:lvlJc w:val="left"/>
+      <w:pPr>
+        <w:tabs>
+          <w:tab w:val="num" w:pos="1440"/>
+        </w:tabs>
+        <w:ind w:left="1440" w:hanging="360"/>
+      </w:pPr>
+      <w:rPr>
+        <w:rFonts w:ascii="Courier New" w:hAnsi="Courier New" w:hint="default"/>
+        <w:sz w:val="20"/>
+      </w:rPr>
+    </w:lvl>
+    <w:lvl w:ilvl="2" w:tentative="1">
+      <w:start w:val="1"/>
+      <w:numFmt w:val="bullet"/>
+      <w:lvlText w:val=""/>
+      <w:lvlJc w:val="left"/>
+      <w:pPr>
+        <w:tabs>
+          <w:tab w:val="num" w:pos="2160"/>
+        </w:tabs>
+        <w:ind w:left="2160" w:hanging="360"/>
+      </w:pPr>
+      <w:rPr>
+        <w:rFonts w:ascii="Wingdings" w:hAnsi="Wingdings" w:hint="default"/>
+        <w:sz w:val="20"/>
+      </w:rPr>
+    </w:lvl>
+    <w:lvl w:ilvl="3" w:tentative="1">
+      <w:start w:val="1"/>
+      <w:numFmt w:val="bullet"/>
+      <w:lvlText w:val=""/>
+      <w:lvlJc w:val="left"/>
+      <w:pPr>
+        <w:tabs>
+          <w:tab w:val="num" w:pos="2880"/>
+        </w:tabs>
+        <w:ind w:left="2880" w:hanging="360"/>
+      </w:pPr>
+      <w:rPr>
+        <w:rFonts w:ascii="Wingdings" w:hAnsi="Wingdings" w:hint="default"/>
+        <w:sz w:val="20"/>
+      </w:rPr>
+    </w:lvl>
+    <w:lvl w:ilvl="4" w:tentative="1">
+      <w:start w:val="1"/>
+      <w:numFmt w:val="bullet"/>
+      <w:lvlText w:val=""/>
+      <w:lvlJc w:val="left"/>
+      <w:pPr>
+        <w:tabs>
+          <w:tab w:val="num" w:pos="3600"/>
+        </w:tabs>
+        <w:ind w:left="3600" w:hanging="360"/>
+      </w:pPr>
+      <w:rPr>
+        <w:rFonts w:ascii="Wingdings" w:hAnsi="Wingdings" w:hint="default"/>
+        <w:sz w:val="20"/>
+      </w:rPr>
+    </w:lvl>
+    <w:lvl w:ilvl="5" w:tentative="1">
+      <w:start w:val="1"/>
+      <w:numFmt w:val="bullet"/>
+      <w:lvlText w:val=""/>
+      <w:lvlJc w:val="left"/>
+      <w:pPr>
+        <w:tabs>
+          <w:tab w:val="num" w:pos="4320"/>
+        </w:tabs>
+        <w:ind w:left="4320" w:hanging="360"/>
+      </w:pPr>
+      <w:rPr>
+        <w:rFonts w:ascii="Wingdings" w:hAnsi="Wingdings" w:hint="default"/>
+        <w:sz w:val="20"/>
+      </w:rPr>
+    </w:lvl>
+    <w:lvl w:ilvl="6" w:tentative="1">
+      <w:start w:val="1"/>
+      <w:numFmt w:val="bullet"/>
+      <w:lvlText w:val=""/>
+      <w:lvlJc w:val="left"/>
+      <w:pPr>
+        <w:tabs>
+          <w:tab w:val="num" w:pos="5040"/>
+        </w:tabs>
+        <w:ind w:left="5040" w:hanging="360"/>
+      </w:pPr>
+      <w:rPr>
+        <w:rFonts w:ascii="Wingdings" w:hAnsi="Wingdings" w:hint="default"/>
+        <w:sz w:val="20"/>
+      </w:rPr>
+    </w:lvl>
+    <w:lvl w:ilvl="7" w:tentative="1">
+      <w:start w:val="1"/>
+      <w:numFmt w:val="bullet"/>
+      <w:lvlText w:val=""/>
+      <w:lvlJc w:val="left"/>
+      <w:pPr>
+        <w:tabs>
+          <w:tab w:val="num" w:pos="5760"/>
+        </w:tabs>
+        <w:ind w:left="5760" w:hanging="360"/>
+      </w:pPr>
+      <w:rPr>
+        <w:rFonts w:ascii="Wingdings" w:hAnsi="Wingdings" w:hint="default"/>
+        <w:sz w:val="20"/>
+      </w:rPr>
+    </w:lvl>
+    <w:lvl w:ilvl="8" w:tentative="1">
+      <w:start w:val="1"/>
+      <w:numFmt w:val="bullet"/>
+      <w:lvlText w:val=""/>
+      <w:lvlJc w:val="left"/>
+      <w:pPr>
+        <w:tabs>
+          <w:tab w:val="num" w:pos="6480"/>
+        </w:tabs>
+        <w:ind w:left="6480" w:hanging="360"/>
+      </w:pPr>
+      <w:rPr>
+        <w:rFonts w:ascii="Wingdings" w:hAnsi="Wingdings" w:hint="default"/>
+        <w:sz w:val="20"/>
+      </w:rPr>
+    </w:lvl>
+  </w:abstractNum>
   <w:num w:numId="1" w16cid:durableId="176506218">
+    <w:abstractNumId w:val="3"/>
+  </w:num>
+  <w:num w:numId="2" w16cid:durableId="1302231459">
+    <w:abstractNumId w:val="7"/>
+  </w:num>
+  <w:num w:numId="3" w16cid:durableId="1849980898">
+    <w:abstractNumId w:val="1"/>
+  </w:num>
+  <w:num w:numId="4" w16cid:durableId="1309558280">
+    <w:abstractNumId w:val="5"/>
+  </w:num>
+  <w:num w:numId="5" w16cid:durableId="1543057062">
     <w:abstractNumId w:val="2"/>
   </w:num>
-  <w:num w:numId="2" w16cid:durableId="1302231459">
-    <w:abstractNumId w:val="5"/>
+  <w:num w:numId="6" w16cid:durableId="1045367518">
+    <w:abstractNumId w:val="4"/>
   </w:num>
-  <w:num w:numId="3" w16cid:durableId="1849980898">
+  <w:num w:numId="7" w16cid:durableId="1985309264">
     <w:abstractNumId w:val="0"/>
   </w:num>
-  <w:num w:numId="4" w16cid:durableId="1309558280">
-    <w:abstractNumId w:val="4"/>
-  </w:num>
-  <w:num w:numId="5" w16cid:durableId="1543057062">
-    <w:abstractNumId w:val="1"/>
-  </w:num>
-  <w:num w:numId="6" w16cid:durableId="1045367518">
-    <w:abstractNumId w:val="3"/>
+  <w:num w:numId="8" w16cid:durableId="1196625876">
+    <w:abstractNumId w:val="6"/>
   </w:num>
 </w:numbering>
 </file>

</xml_diff>

<commit_message>
Complete Day 3: Image slicing, cropping, resizing and aspect ratio
</commit_message>
<xml_diff>
--- a/Working.docx
+++ b/Working.docx
@@ -271,9 +271,14 @@
       </w:r>
     </w:p>
     <w:p>
+      <w:proofErr w:type="gramStart"/>
       <w:r>
         <w:lastRenderedPageBreak/>
-        <w:t>So this command means:</w:t>
+        <w:t>So</w:t>
+      </w:r>
+      <w:proofErr w:type="gramEnd"/>
+      <w:r>
+        <w:t xml:space="preserve"> this command means:</w:t>
       </w:r>
     </w:p>
     <w:p>
@@ -975,14 +980,25 @@
           <w:szCs w:val="44"/>
         </w:rPr>
       </w:pPr>
-      <w:r>
-        <w:rPr>
-          <w:b/>
-          <w:bCs/>
-          <w:sz w:val="44"/>
-          <w:szCs w:val="44"/>
-        </w:rPr>
-        <w:t>Open Source Computer Vision Library</w:t>
+      <w:proofErr w:type="gramStart"/>
+      <w:r>
+        <w:rPr>
+          <w:b/>
+          <w:bCs/>
+          <w:sz w:val="44"/>
+          <w:szCs w:val="44"/>
+        </w:rPr>
+        <w:t>Open Source</w:t>
+      </w:r>
+      <w:proofErr w:type="gramEnd"/>
+      <w:r>
+        <w:rPr>
+          <w:b/>
+          <w:bCs/>
+          <w:sz w:val="44"/>
+          <w:szCs w:val="44"/>
+        </w:rPr>
+        <w:t xml:space="preserve"> Computer Vision Library</w:t>
       </w:r>
     </w:p>
     <w:p>
@@ -2220,12 +2236,21 @@
           <w:szCs w:val="44"/>
         </w:rPr>
       </w:pPr>
-      <w:r>
-        <w:rPr>
-          <w:sz w:val="44"/>
-          <w:szCs w:val="44"/>
-        </w:rPr>
-        <w:t>print() is a function.</w:t>
+      <w:proofErr w:type="gramStart"/>
+      <w:r>
+        <w:rPr>
+          <w:sz w:val="44"/>
+          <w:szCs w:val="44"/>
+        </w:rPr>
+        <w:t>print(</w:t>
+      </w:r>
+      <w:proofErr w:type="gramEnd"/>
+      <w:r>
+        <w:rPr>
+          <w:sz w:val="44"/>
+          <w:szCs w:val="44"/>
+        </w:rPr>
+        <w:t>) is a function.</w:t>
       </w:r>
     </w:p>
     <w:p>
@@ -3403,14 +3428,25 @@
           <w:szCs w:val="44"/>
         </w:rPr>
       </w:pPr>
-      <w:r>
-        <w:rPr>
-          <w:b/>
-          <w:bCs/>
-          <w:sz w:val="44"/>
-          <w:szCs w:val="44"/>
-        </w:rPr>
-        <w:t>Open Source Computer Vision Library</w:t>
+      <w:proofErr w:type="gramStart"/>
+      <w:r>
+        <w:rPr>
+          <w:b/>
+          <w:bCs/>
+          <w:sz w:val="44"/>
+          <w:szCs w:val="44"/>
+        </w:rPr>
+        <w:t>Open Source</w:t>
+      </w:r>
+      <w:proofErr w:type="gramEnd"/>
+      <w:r>
+        <w:rPr>
+          <w:b/>
+          <w:bCs/>
+          <w:sz w:val="44"/>
+          <w:szCs w:val="44"/>
+        </w:rPr>
+        <w:t xml:space="preserve"> Computer Vision Library</w:t>
       </w:r>
     </w:p>
     <w:p>
@@ -4425,8 +4461,17 @@
           <w:szCs w:val="44"/>
         </w:rPr>
         <w:br/>
-        <w:t>git add .</w:t>
-      </w:r>
+        <w:t xml:space="preserve">git </w:t>
+      </w:r>
+      <w:proofErr w:type="gramStart"/>
+      <w:r>
+        <w:rPr>
+          <w:sz w:val="44"/>
+          <w:szCs w:val="44"/>
+        </w:rPr>
+        <w:t>add .</w:t>
+      </w:r>
+      <w:proofErr w:type="gramEnd"/>
       <w:r>
         <w:rPr>
           <w:sz w:val="44"/>
@@ -4626,6 +4671,7 @@
         <w:t xml:space="preserve">What does </w:t>
       </w:r>
       <w:proofErr w:type="spellStart"/>
+      <w:proofErr w:type="gramStart"/>
       <w:r>
         <w:rPr>
           <w:rFonts w:ascii="Arial" w:hAnsi="Arial" w:cs="Arial"/>
@@ -4635,6 +4681,7 @@
         <w:t>image.shape</w:t>
       </w:r>
       <w:proofErr w:type="spellEnd"/>
+      <w:proofErr w:type="gramEnd"/>
       <w:r>
         <w:rPr>
           <w:rFonts w:ascii="Arial" w:hAnsi="Arial" w:cs="Arial"/>
@@ -5032,7 +5079,7 @@
           <w:szCs w:val="44"/>
         </w:rPr>
         <w:pict w14:anchorId="14CA90DA">
-          <v:rect id="_x0000_i1059" style="width:0;height:1.5pt" o:hralign="center" o:hrstd="t" o:hr="t" fillcolor="#a0a0a0" stroked="f"/>
+          <v:rect id="_x0000_i1047" style="width:0;height:1.5pt" o:hralign="center" o:hrstd="t" o:hr="t" fillcolor="#a0a0a0" stroked="f"/>
         </w:pict>
       </w:r>
     </w:p>
@@ -5057,6 +5104,7 @@
         <w:t xml:space="preserve">Q2. What is the difference between </w:t>
       </w:r>
       <w:proofErr w:type="spellStart"/>
+      <w:proofErr w:type="gramStart"/>
       <w:r>
         <w:rPr>
           <w:rFonts w:ascii="Arial" w:hAnsi="Arial" w:cs="Arial"/>
@@ -5076,9 +5124,21 @@
           <w:sz w:val="44"/>
           <w:szCs w:val="44"/>
         </w:rPr>
-        <w:t xml:space="preserve">() and </w:t>
+        <w:t>(</w:t>
+      </w:r>
+      <w:proofErr w:type="gramEnd"/>
+      <w:r>
+        <w:rPr>
+          <w:rFonts w:ascii="Arial" w:hAnsi="Arial" w:cs="Arial"/>
+          <w:b/>
+          <w:bCs/>
+          <w:sz w:val="44"/>
+          <w:szCs w:val="44"/>
+        </w:rPr>
+        <w:t xml:space="preserve">) and </w:t>
       </w:r>
       <w:proofErr w:type="spellStart"/>
+      <w:proofErr w:type="gramStart"/>
       <w:r>
         <w:rPr>
           <w:rFonts w:ascii="Arial" w:hAnsi="Arial" w:cs="Arial"/>
@@ -5098,7 +5158,18 @@
           <w:sz w:val="44"/>
           <w:szCs w:val="44"/>
         </w:rPr>
-        <w:t>()?</w:t>
+        <w:t>(</w:t>
+      </w:r>
+      <w:proofErr w:type="gramEnd"/>
+      <w:r>
+        <w:rPr>
+          <w:rFonts w:ascii="Arial" w:hAnsi="Arial" w:cs="Arial"/>
+          <w:b/>
+          <w:bCs/>
+          <w:sz w:val="44"/>
+          <w:szCs w:val="44"/>
+        </w:rPr>
+        <w:t>)?</w:t>
       </w:r>
     </w:p>
     <w:p>
@@ -5133,6 +5204,7 @@
         </w:rPr>
       </w:pPr>
       <w:proofErr w:type="spellStart"/>
+      <w:proofErr w:type="gramStart"/>
       <w:r>
         <w:rPr>
           <w:rFonts w:ascii="Arial" w:hAnsi="Arial" w:cs="Arial"/>
@@ -5148,7 +5220,16 @@
           <w:sz w:val="44"/>
           <w:szCs w:val="44"/>
         </w:rPr>
-        <w:t xml:space="preserve">() reads an image from disk and returns a NumPy array. </w:t>
+        <w:t>(</w:t>
+      </w:r>
+      <w:proofErr w:type="gramEnd"/>
+      <w:r>
+        <w:rPr>
+          <w:rFonts w:ascii="Arial" w:hAnsi="Arial" w:cs="Arial"/>
+          <w:sz w:val="44"/>
+          <w:szCs w:val="44"/>
+        </w:rPr>
+        <w:t xml:space="preserve">) reads an image from disk and returns a NumPy array. </w:t>
       </w:r>
     </w:p>
     <w:p>
@@ -5164,6 +5245,7 @@
         </w:rPr>
       </w:pPr>
       <w:proofErr w:type="spellStart"/>
+      <w:proofErr w:type="gramStart"/>
       <w:r>
         <w:rPr>
           <w:rFonts w:ascii="Arial" w:hAnsi="Arial" w:cs="Arial"/>
@@ -5180,7 +5262,16 @@
           <w:sz w:val="44"/>
           <w:szCs w:val="44"/>
         </w:rPr>
-        <w:t xml:space="preserve">() displays a NumPy array in a window. </w:t>
+        <w:t>(</w:t>
+      </w:r>
+      <w:proofErr w:type="gramEnd"/>
+      <w:r>
+        <w:rPr>
+          <w:rFonts w:ascii="Arial" w:hAnsi="Arial" w:cs="Arial"/>
+          <w:sz w:val="44"/>
+          <w:szCs w:val="44"/>
+        </w:rPr>
+        <w:t xml:space="preserve">) displays a NumPy array in a window. </w:t>
       </w:r>
     </w:p>
     <w:p>
@@ -5198,7 +5289,7 @@
           <w:szCs w:val="44"/>
         </w:rPr>
         <w:pict w14:anchorId="3A23BA5C">
-          <v:rect id="_x0000_i1060" style="width:0;height:1.5pt" o:hralign="center" o:hrstd="t" o:hr="t" fillcolor="#a0a0a0" stroked="f"/>
+          <v:rect id="_x0000_i1048" style="width:0;height:1.5pt" o:hralign="center" o:hrstd="t" o:hr="t" fillcolor="#a0a0a0" stroked="f"/>
         </w:pict>
       </w:r>
     </w:p>
@@ -5223,6 +5314,7 @@
         <w:t xml:space="preserve">Q3. Does </w:t>
       </w:r>
       <w:proofErr w:type="spellStart"/>
+      <w:proofErr w:type="gramStart"/>
       <w:r>
         <w:rPr>
           <w:rFonts w:ascii="Arial" w:hAnsi="Arial" w:cs="Arial"/>
@@ -5242,7 +5334,18 @@
           <w:sz w:val="44"/>
           <w:szCs w:val="44"/>
         </w:rPr>
-        <w:t>() read the image from disk?</w:t>
+        <w:t>(</w:t>
+      </w:r>
+      <w:proofErr w:type="gramEnd"/>
+      <w:r>
+        <w:rPr>
+          <w:rFonts w:ascii="Arial" w:hAnsi="Arial" w:cs="Arial"/>
+          <w:b/>
+          <w:bCs/>
+          <w:sz w:val="44"/>
+          <w:szCs w:val="44"/>
+        </w:rPr>
+        <w:t>) read the image from disk?</w:t>
       </w:r>
     </w:p>
     <w:p>
@@ -5306,6 +5409,390 @@
           <w:szCs w:val="44"/>
         </w:rPr>
       </w:pPr>
+    </w:p>
+    <w:p>
+      <w:pPr>
+        <w:rPr>
+          <w:rFonts w:ascii="Arial" w:hAnsi="Arial" w:cs="Arial"/>
+          <w:sz w:val="32"/>
+          <w:szCs w:val="32"/>
+        </w:rPr>
+      </w:pPr>
+      <w:r>
+        <w:rPr>
+          <w:rFonts w:ascii="Arial" w:hAnsi="Arial" w:cs="Arial"/>
+          <w:sz w:val="32"/>
+          <w:szCs w:val="32"/>
+        </w:rPr>
+        <w:t>Look at this comparison:</w:t>
+      </w:r>
+    </w:p>
+    <w:tbl>
+      <w:tblPr>
+        <w:tblW w:w="0" w:type="auto"/>
+        <w:tblCellSpacing w:w="15" w:type="dxa"/>
+        <w:tblCellMar>
+          <w:top w:w="15" w:type="dxa"/>
+          <w:left w:w="15" w:type="dxa"/>
+          <w:bottom w:w="15" w:type="dxa"/>
+          <w:right w:w="15" w:type="dxa"/>
+        </w:tblCellMar>
+        <w:tblLook w:val="04A0" w:firstRow="1" w:lastRow="0" w:firstColumn="1" w:lastColumn="0" w:noHBand="0" w:noVBand="1"/>
+      </w:tblPr>
+      <w:tblGrid>
+        <w:gridCol w:w="1812"/>
+        <w:gridCol w:w="1501"/>
+        <w:gridCol w:w="2498"/>
+        <w:gridCol w:w="2183"/>
+      </w:tblGrid>
+      <w:tr>
+        <w:trPr>
+          <w:tblHeader/>
+          <w:tblCellSpacing w:w="15" w:type="dxa"/>
+        </w:trPr>
+        <w:tc>
+          <w:tcPr>
+            <w:tcW w:w="0" w:type="auto"/>
+            <w:vAlign w:val="center"/>
+            <w:hideMark/>
+          </w:tcPr>
+          <w:p>
+            <w:pPr>
+              <w:rPr>
+                <w:rFonts w:ascii="Arial" w:hAnsi="Arial" w:cs="Arial"/>
+                <w:b/>
+                <w:bCs/>
+                <w:sz w:val="32"/>
+                <w:szCs w:val="32"/>
+              </w:rPr>
+            </w:pPr>
+            <w:r>
+              <w:rPr>
+                <w:rFonts w:ascii="Arial" w:hAnsi="Arial" w:cs="Arial"/>
+                <w:b/>
+                <w:bCs/>
+                <w:sz w:val="32"/>
+                <w:szCs w:val="32"/>
+              </w:rPr>
+              <w:t>Image Type</w:t>
+            </w:r>
+          </w:p>
+        </w:tc>
+        <w:tc>
+          <w:tcPr>
+            <w:tcW w:w="0" w:type="auto"/>
+            <w:vAlign w:val="center"/>
+            <w:hideMark/>
+          </w:tcPr>
+          <w:p>
+            <w:pPr>
+              <w:rPr>
+                <w:rFonts w:ascii="Arial" w:hAnsi="Arial" w:cs="Arial"/>
+                <w:b/>
+                <w:bCs/>
+                <w:sz w:val="32"/>
+                <w:szCs w:val="32"/>
+              </w:rPr>
+            </w:pPr>
+            <w:r>
+              <w:rPr>
+                <w:rFonts w:ascii="Arial" w:hAnsi="Arial" w:cs="Arial"/>
+                <w:b/>
+                <w:bCs/>
+                <w:sz w:val="32"/>
+                <w:szCs w:val="32"/>
+              </w:rPr>
+              <w:t>Channels</w:t>
+            </w:r>
+          </w:p>
+        </w:tc>
+        <w:tc>
+          <w:tcPr>
+            <w:tcW w:w="0" w:type="auto"/>
+            <w:vAlign w:val="center"/>
+            <w:hideMark/>
+          </w:tcPr>
+          <w:p>
+            <w:pPr>
+              <w:rPr>
+                <w:rFonts w:ascii="Arial" w:hAnsi="Arial" w:cs="Arial"/>
+                <w:b/>
+                <w:bCs/>
+                <w:sz w:val="32"/>
+                <w:szCs w:val="32"/>
+              </w:rPr>
+            </w:pPr>
+            <w:r>
+              <w:rPr>
+                <w:rFonts w:ascii="Arial" w:hAnsi="Arial" w:cs="Arial"/>
+                <w:b/>
+                <w:bCs/>
+                <w:sz w:val="32"/>
+                <w:szCs w:val="32"/>
+              </w:rPr>
+              <w:t>Values per Pixel</w:t>
+            </w:r>
+          </w:p>
+        </w:tc>
+        <w:tc>
+          <w:tcPr>
+            <w:tcW w:w="0" w:type="auto"/>
+            <w:vAlign w:val="center"/>
+            <w:hideMark/>
+          </w:tcPr>
+          <w:p>
+            <w:pPr>
+              <w:rPr>
+                <w:rFonts w:ascii="Arial" w:hAnsi="Arial" w:cs="Arial"/>
+                <w:b/>
+                <w:bCs/>
+                <w:sz w:val="32"/>
+                <w:szCs w:val="32"/>
+              </w:rPr>
+            </w:pPr>
+            <w:r>
+              <w:rPr>
+                <w:rFonts w:ascii="Arial" w:hAnsi="Arial" w:cs="Arial"/>
+                <w:b/>
+                <w:bCs/>
+                <w:sz w:val="32"/>
+                <w:szCs w:val="32"/>
+              </w:rPr>
+              <w:t>Memory</w:t>
+            </w:r>
+          </w:p>
+        </w:tc>
+      </w:tr>
+      <w:tr>
+        <w:trPr>
+          <w:tblCellSpacing w:w="15" w:type="dxa"/>
+        </w:trPr>
+        <w:tc>
+          <w:tcPr>
+            <w:tcW w:w="0" w:type="auto"/>
+            <w:vAlign w:val="center"/>
+            <w:hideMark/>
+          </w:tcPr>
+          <w:p>
+            <w:pPr>
+              <w:rPr>
+                <w:rFonts w:ascii="Arial" w:hAnsi="Arial" w:cs="Arial"/>
+                <w:sz w:val="32"/>
+                <w:szCs w:val="32"/>
+              </w:rPr>
+            </w:pPr>
+            <w:r>
+              <w:rPr>
+                <w:rFonts w:ascii="Arial" w:hAnsi="Arial" w:cs="Arial"/>
+                <w:sz w:val="32"/>
+                <w:szCs w:val="32"/>
+              </w:rPr>
+              <w:t>Grayscale</w:t>
+            </w:r>
+          </w:p>
+        </w:tc>
+        <w:tc>
+          <w:tcPr>
+            <w:tcW w:w="0" w:type="auto"/>
+            <w:vAlign w:val="center"/>
+            <w:hideMark/>
+          </w:tcPr>
+          <w:p>
+            <w:pPr>
+              <w:rPr>
+                <w:rFonts w:ascii="Arial" w:hAnsi="Arial" w:cs="Arial"/>
+                <w:sz w:val="32"/>
+                <w:szCs w:val="32"/>
+              </w:rPr>
+            </w:pPr>
+            <w:r>
+              <w:rPr>
+                <w:rFonts w:ascii="Arial" w:hAnsi="Arial" w:cs="Arial"/>
+                <w:sz w:val="32"/>
+                <w:szCs w:val="32"/>
+              </w:rPr>
+              <w:t>1</w:t>
+            </w:r>
+          </w:p>
+        </w:tc>
+        <w:tc>
+          <w:tcPr>
+            <w:tcW w:w="0" w:type="auto"/>
+            <w:vAlign w:val="center"/>
+            <w:hideMark/>
+          </w:tcPr>
+          <w:p>
+            <w:pPr>
+              <w:rPr>
+                <w:rFonts w:ascii="Arial" w:hAnsi="Arial" w:cs="Arial"/>
+                <w:sz w:val="32"/>
+                <w:szCs w:val="32"/>
+              </w:rPr>
+            </w:pPr>
+            <w:r>
+              <w:rPr>
+                <w:rFonts w:ascii="Arial" w:hAnsi="Arial" w:cs="Arial"/>
+                <w:sz w:val="32"/>
+                <w:szCs w:val="32"/>
+              </w:rPr>
+              <w:t>1</w:t>
+            </w:r>
+          </w:p>
+        </w:tc>
+        <w:tc>
+          <w:tcPr>
+            <w:tcW w:w="0" w:type="auto"/>
+            <w:vAlign w:val="center"/>
+            <w:hideMark/>
+          </w:tcPr>
+          <w:p>
+            <w:pPr>
+              <w:rPr>
+                <w:rFonts w:ascii="Arial" w:hAnsi="Arial" w:cs="Arial"/>
+                <w:sz w:val="32"/>
+                <w:szCs w:val="32"/>
+              </w:rPr>
+            </w:pPr>
+            <w:r>
+              <w:rPr>
+                <w:rFonts w:ascii="Arial" w:hAnsi="Arial" w:cs="Arial"/>
+                <w:sz w:val="32"/>
+                <w:szCs w:val="32"/>
+              </w:rPr>
+              <w:t>Less</w:t>
+            </w:r>
+          </w:p>
+        </w:tc>
+      </w:tr>
+      <w:tr>
+        <w:trPr>
+          <w:tblCellSpacing w:w="15" w:type="dxa"/>
+        </w:trPr>
+        <w:tc>
+          <w:tcPr>
+            <w:tcW w:w="0" w:type="auto"/>
+            <w:vAlign w:val="center"/>
+            <w:hideMark/>
+          </w:tcPr>
+          <w:p>
+            <w:pPr>
+              <w:rPr>
+                <w:rFonts w:ascii="Arial" w:hAnsi="Arial" w:cs="Arial"/>
+                <w:sz w:val="32"/>
+                <w:szCs w:val="32"/>
+              </w:rPr>
+            </w:pPr>
+            <w:proofErr w:type="spellStart"/>
+            <w:r>
+              <w:rPr>
+                <w:rFonts w:ascii="Arial" w:hAnsi="Arial" w:cs="Arial"/>
+                <w:sz w:val="32"/>
+                <w:szCs w:val="32"/>
+              </w:rPr>
+              <w:t>Color</w:t>
+            </w:r>
+            <w:proofErr w:type="spellEnd"/>
+          </w:p>
+        </w:tc>
+        <w:tc>
+          <w:tcPr>
+            <w:tcW w:w="0" w:type="auto"/>
+            <w:vAlign w:val="center"/>
+            <w:hideMark/>
+          </w:tcPr>
+          <w:p>
+            <w:pPr>
+              <w:rPr>
+                <w:rFonts w:ascii="Arial" w:hAnsi="Arial" w:cs="Arial"/>
+                <w:sz w:val="32"/>
+                <w:szCs w:val="32"/>
+              </w:rPr>
+            </w:pPr>
+            <w:r>
+              <w:rPr>
+                <w:rFonts w:ascii="Arial" w:hAnsi="Arial" w:cs="Arial"/>
+                <w:sz w:val="32"/>
+                <w:szCs w:val="32"/>
+              </w:rPr>
+              <w:t>3</w:t>
+            </w:r>
+          </w:p>
+        </w:tc>
+        <w:tc>
+          <w:tcPr>
+            <w:tcW w:w="0" w:type="auto"/>
+            <w:vAlign w:val="center"/>
+            <w:hideMark/>
+          </w:tcPr>
+          <w:p>
+            <w:pPr>
+              <w:rPr>
+                <w:rFonts w:ascii="Arial" w:hAnsi="Arial" w:cs="Arial"/>
+                <w:sz w:val="32"/>
+                <w:szCs w:val="32"/>
+              </w:rPr>
+            </w:pPr>
+            <w:r>
+              <w:rPr>
+                <w:rFonts w:ascii="Arial" w:hAnsi="Arial" w:cs="Arial"/>
+                <w:sz w:val="32"/>
+                <w:szCs w:val="32"/>
+              </w:rPr>
+              <w:t>3</w:t>
+            </w:r>
+          </w:p>
+        </w:tc>
+        <w:tc>
+          <w:tcPr>
+            <w:tcW w:w="0" w:type="auto"/>
+            <w:vAlign w:val="center"/>
+            <w:hideMark/>
+          </w:tcPr>
+          <w:p>
+            <w:pPr>
+              <w:rPr>
+                <w:rFonts w:ascii="Arial" w:hAnsi="Arial" w:cs="Arial"/>
+                <w:sz w:val="32"/>
+                <w:szCs w:val="32"/>
+              </w:rPr>
+            </w:pPr>
+            <w:r>
+              <w:rPr>
+                <w:rFonts w:ascii="Arial" w:hAnsi="Arial" w:cs="Arial"/>
+                <w:sz w:val="32"/>
+                <w:szCs w:val="32"/>
+              </w:rPr>
+              <w:t>About 3× more</w:t>
+            </w:r>
+          </w:p>
+        </w:tc>
+      </w:tr>
+    </w:tbl>
+    <w:p>
+      <w:pPr>
+        <w:rPr>
+          <w:rFonts w:ascii="Arial" w:hAnsi="Arial" w:cs="Arial"/>
+          <w:sz w:val="32"/>
+          <w:szCs w:val="32"/>
+        </w:rPr>
+      </w:pPr>
+    </w:p>
+    <w:p>
+      <w:pPr>
+        <w:rPr>
+          <w:rFonts w:ascii="Arial" w:hAnsi="Arial" w:cs="Arial"/>
+          <w:sz w:val="32"/>
+          <w:szCs w:val="32"/>
+        </w:rPr>
+      </w:pPr>
+      <w:r>
+        <w:rPr>
+          <w:rFonts w:ascii="Arial" w:hAnsi="Arial" w:cs="Arial"/>
+          <w:sz w:val="32"/>
+          <w:szCs w:val="32"/>
+        </w:rPr>
+        <w:br w:type="page"/>
+      </w:r>
     </w:p>
     <w:p>
       <w:pPr>
@@ -5314,6 +5801,3210 @@
           <w:sz w:val="52"/>
           <w:szCs w:val="52"/>
           <w:u w:val="single"/>
+        </w:rPr>
+      </w:pPr>
+      <w:r>
+        <w:rPr>
+          <w:rFonts w:ascii="Algerian" w:hAnsi="Algerian"/>
+          <w:sz w:val="52"/>
+          <w:szCs w:val="52"/>
+          <w:u w:val="single"/>
+        </w:rPr>
+        <w:lastRenderedPageBreak/>
+        <w:t xml:space="preserve">Day </w:t>
+      </w:r>
+      <w:r>
+        <w:rPr>
+          <w:rFonts w:ascii="Algerian" w:hAnsi="Algerian"/>
+          <w:sz w:val="52"/>
+          <w:szCs w:val="52"/>
+          <w:u w:val="single"/>
+        </w:rPr>
+        <w:t>3</w:t>
+      </w:r>
+    </w:p>
+    <w:p>
+      <w:pPr>
+        <w:pStyle w:val="ListParagraph"/>
+        <w:numPr>
+          <w:ilvl w:val="0"/>
+          <w:numId w:val="11"/>
+        </w:numPr>
+        <w:rPr>
+          <w:rFonts w:ascii="Arial" w:hAnsi="Arial" w:cs="Arial"/>
+          <w:sz w:val="32"/>
+          <w:szCs w:val="32"/>
+        </w:rPr>
+      </w:pPr>
+      <w:r>
+        <w:rPr>
+          <w:rFonts w:ascii="Arial" w:hAnsi="Arial" w:cs="Arial"/>
+          <w:sz w:val="32"/>
+          <w:szCs w:val="32"/>
+        </w:rPr>
+        <w:t>Shape depends ONLY on:</w:t>
+      </w:r>
+    </w:p>
+    <w:p>
+      <w:pPr>
+        <w:rPr>
+          <w:rFonts w:ascii="Arial" w:hAnsi="Arial" w:cs="Arial"/>
+          <w:sz w:val="32"/>
+          <w:szCs w:val="32"/>
+        </w:rPr>
+      </w:pPr>
+    </w:p>
+    <w:p>
+      <w:pPr>
+        <w:rPr>
+          <w:rFonts w:ascii="Arial" w:hAnsi="Arial" w:cs="Arial"/>
+          <w:sz w:val="32"/>
+          <w:szCs w:val="32"/>
+        </w:rPr>
+      </w:pPr>
+      <w:r>
+        <w:rPr>
+          <w:rFonts w:ascii="Arial" w:hAnsi="Arial" w:cs="Arial"/>
+          <w:sz w:val="32"/>
+          <w:szCs w:val="32"/>
+        </w:rPr>
+        <w:t>Number of Rows</w:t>
+      </w:r>
+    </w:p>
+    <w:p>
+      <w:pPr>
+        <w:rPr>
+          <w:rFonts w:ascii="Arial" w:hAnsi="Arial" w:cs="Arial"/>
+          <w:sz w:val="32"/>
+          <w:szCs w:val="32"/>
+        </w:rPr>
+      </w:pPr>
+      <w:r>
+        <w:rPr>
+          <w:rFonts w:ascii="Arial" w:hAnsi="Arial" w:cs="Arial"/>
+          <w:sz w:val="32"/>
+          <w:szCs w:val="32"/>
+        </w:rPr>
+        <w:t>and</w:t>
+      </w:r>
+    </w:p>
+    <w:p>
+      <w:pPr>
+        <w:rPr>
+          <w:rFonts w:ascii="Arial" w:hAnsi="Arial" w:cs="Arial"/>
+          <w:sz w:val="32"/>
+          <w:szCs w:val="32"/>
+        </w:rPr>
+      </w:pPr>
+      <w:r>
+        <w:rPr>
+          <w:rFonts w:ascii="Arial" w:hAnsi="Arial" w:cs="Arial"/>
+          <w:sz w:val="32"/>
+          <w:szCs w:val="32"/>
+        </w:rPr>
+        <w:t>Number of Columns</w:t>
+      </w:r>
+    </w:p>
+    <w:p>
+      <w:pPr>
+        <w:rPr>
+          <w:rFonts w:ascii="Arial" w:hAnsi="Arial" w:cs="Arial"/>
+          <w:sz w:val="32"/>
+          <w:szCs w:val="32"/>
+        </w:rPr>
+      </w:pPr>
+    </w:p>
+    <w:p>
+      <w:pPr>
+        <w:rPr>
+          <w:rFonts w:ascii="Arial" w:hAnsi="Arial" w:cs="Arial"/>
+          <w:sz w:val="32"/>
+          <w:szCs w:val="32"/>
+        </w:rPr>
+      </w:pPr>
+      <w:r>
+        <w:rPr>
+          <w:rFonts w:ascii="Arial" w:hAnsi="Arial" w:cs="Arial"/>
+          <w:sz w:val="32"/>
+          <w:szCs w:val="32"/>
+        </w:rPr>
+        <w:t>NOT on where the selection starts.</w:t>
+      </w:r>
+    </w:p>
+    <w:p>
+      <w:pPr>
+        <w:rPr>
+          <w:rFonts w:ascii="Arial" w:hAnsi="Arial" w:cs="Arial"/>
+          <w:sz w:val="32"/>
+          <w:szCs w:val="32"/>
+        </w:rPr>
+      </w:pPr>
+    </w:p>
+    <w:p>
+      <w:pPr>
+        <w:pStyle w:val="ListParagraph"/>
+        <w:numPr>
+          <w:ilvl w:val="0"/>
+          <w:numId w:val="10"/>
+        </w:numPr>
+        <w:rPr>
+          <w:rFonts w:ascii="Arial" w:hAnsi="Arial" w:cs="Arial"/>
+          <w:sz w:val="32"/>
+          <w:szCs w:val="32"/>
+        </w:rPr>
+      </w:pPr>
+      <w:r>
+        <w:rPr>
+          <w:rFonts w:ascii="Arial" w:hAnsi="Arial" w:cs="Arial"/>
+          <w:sz w:val="32"/>
+          <w:szCs w:val="32"/>
+        </w:rPr>
+        <w:t>Slicing Syntax</w:t>
+      </w:r>
+    </w:p>
+    <w:p>
+      <w:pPr>
+        <w:rPr>
+          <w:rFonts w:ascii="Arial" w:hAnsi="Arial" w:cs="Arial"/>
+          <w:sz w:val="32"/>
+          <w:szCs w:val="32"/>
+        </w:rPr>
+      </w:pPr>
+    </w:p>
+    <w:p>
+      <w:pPr>
+        <w:rPr>
+          <w:rFonts w:ascii="Arial" w:hAnsi="Arial" w:cs="Arial"/>
+          <w:sz w:val="32"/>
+          <w:szCs w:val="32"/>
+        </w:rPr>
+      </w:pPr>
+      <w:r>
+        <w:rPr>
+          <w:rFonts w:ascii="Arial" w:hAnsi="Arial" w:cs="Arial"/>
+          <w:sz w:val="32"/>
+          <w:szCs w:val="32"/>
+        </w:rPr>
+        <w:t>array[</w:t>
+      </w:r>
+      <w:proofErr w:type="spellStart"/>
+      <w:proofErr w:type="gramStart"/>
+      <w:r>
+        <w:rPr>
+          <w:rFonts w:ascii="Arial" w:hAnsi="Arial" w:cs="Arial"/>
+          <w:sz w:val="32"/>
+          <w:szCs w:val="32"/>
+        </w:rPr>
+        <w:t>start:end</w:t>
+      </w:r>
+      <w:proofErr w:type="spellEnd"/>
+      <w:proofErr w:type="gramEnd"/>
+      <w:r>
+        <w:rPr>
+          <w:rFonts w:ascii="Arial" w:hAnsi="Arial" w:cs="Arial"/>
+          <w:sz w:val="32"/>
+          <w:szCs w:val="32"/>
+        </w:rPr>
+        <w:t>]</w:t>
+      </w:r>
+    </w:p>
+    <w:p>
+      <w:pPr>
+        <w:rPr>
+          <w:rFonts w:ascii="Arial" w:hAnsi="Arial" w:cs="Arial"/>
+          <w:sz w:val="32"/>
+          <w:szCs w:val="32"/>
+        </w:rPr>
+      </w:pPr>
+    </w:p>
+    <w:p>
+      <w:pPr>
+        <w:rPr>
+          <w:rFonts w:ascii="Arial" w:hAnsi="Arial" w:cs="Arial"/>
+          <w:sz w:val="32"/>
+          <w:szCs w:val="32"/>
+        </w:rPr>
+      </w:pPr>
+      <w:r>
+        <w:rPr>
+          <w:rFonts w:ascii="Arial" w:hAnsi="Arial" w:cs="Arial"/>
+          <w:sz w:val="32"/>
+          <w:szCs w:val="32"/>
+        </w:rPr>
+        <w:t>If start is omitted → Start from 0</w:t>
+      </w:r>
+    </w:p>
+    <w:p>
+      <w:pPr>
+        <w:rPr>
+          <w:rFonts w:ascii="Arial" w:hAnsi="Arial" w:cs="Arial"/>
+          <w:sz w:val="32"/>
+          <w:szCs w:val="32"/>
+        </w:rPr>
+      </w:pPr>
+    </w:p>
+    <w:p>
+      <w:pPr>
+        <w:rPr>
+          <w:rFonts w:ascii="Arial" w:hAnsi="Arial" w:cs="Arial"/>
+          <w:sz w:val="32"/>
+          <w:szCs w:val="32"/>
+        </w:rPr>
+      </w:pPr>
+      <w:r>
+        <w:rPr>
+          <w:rFonts w:ascii="Arial" w:hAnsi="Arial" w:cs="Arial"/>
+          <w:sz w:val="32"/>
+          <w:szCs w:val="32"/>
+        </w:rPr>
+        <w:t>If end is omitted → Go till the end</w:t>
+      </w:r>
+    </w:p>
+    <w:p>
+      <w:pPr>
+        <w:rPr>
+          <w:rFonts w:ascii="Arial" w:hAnsi="Arial" w:cs="Arial"/>
+          <w:sz w:val="32"/>
+          <w:szCs w:val="32"/>
+        </w:rPr>
+      </w:pPr>
+    </w:p>
+    <w:p>
+      <w:pPr>
+        <w:rPr>
+          <w:rFonts w:ascii="Arial" w:hAnsi="Arial" w:cs="Arial"/>
+          <w:sz w:val="32"/>
+          <w:szCs w:val="32"/>
+        </w:rPr>
+      </w:pPr>
+      <w:r>
+        <w:rPr>
+          <w:rFonts w:ascii="Arial" w:hAnsi="Arial" w:cs="Arial"/>
+          <w:sz w:val="32"/>
+          <w:szCs w:val="32"/>
+        </w:rPr>
+        <w:t>If both are omitted (:) → Take everything</w:t>
+      </w:r>
+    </w:p>
+    <w:p>
+      <w:pPr>
+        <w:rPr>
+          <w:rFonts w:ascii="Arial" w:hAnsi="Arial" w:cs="Arial"/>
+          <w:sz w:val="32"/>
+          <w:szCs w:val="32"/>
+        </w:rPr>
+      </w:pPr>
+    </w:p>
+    <w:p>
+      <w:pPr>
+        <w:pStyle w:val="ListParagraph"/>
+        <w:rPr>
+          <w:rFonts w:ascii="Arial" w:hAnsi="Arial" w:cs="Arial"/>
+          <w:sz w:val="32"/>
+          <w:szCs w:val="32"/>
+        </w:rPr>
+      </w:pPr>
+      <w:r>
+        <w:rPr>
+          <w:rFonts w:ascii="Arial" w:hAnsi="Arial" w:cs="Arial"/>
+          <w:sz w:val="32"/>
+          <w:szCs w:val="32"/>
+        </w:rPr>
+        <w:t>image</w:t>
+      </w:r>
+      <w:proofErr w:type="gramStart"/>
+      <w:r>
+        <w:rPr>
+          <w:rFonts w:ascii="Arial" w:hAnsi="Arial" w:cs="Arial"/>
+          <w:sz w:val="32"/>
+          <w:szCs w:val="32"/>
+        </w:rPr>
+        <w:t>[:,</w:t>
+      </w:r>
+      <w:proofErr w:type="gramEnd"/>
+      <w:r>
+        <w:rPr>
+          <w:rFonts w:ascii="Arial" w:hAnsi="Arial" w:cs="Arial"/>
+          <w:sz w:val="32"/>
+          <w:szCs w:val="32"/>
+        </w:rPr>
+        <w:t xml:space="preserve"> :]        # Entire image</w:t>
+      </w:r>
+    </w:p>
+    <w:p>
+      <w:pPr>
+        <w:pStyle w:val="ListParagraph"/>
+        <w:rPr>
+          <w:rFonts w:ascii="Arial" w:hAnsi="Arial" w:cs="Arial"/>
+          <w:sz w:val="32"/>
+          <w:szCs w:val="32"/>
+        </w:rPr>
+      </w:pPr>
+    </w:p>
+    <w:p>
+      <w:pPr>
+        <w:pStyle w:val="ListParagraph"/>
+        <w:rPr>
+          <w:rFonts w:ascii="Arial" w:hAnsi="Arial" w:cs="Arial"/>
+          <w:sz w:val="32"/>
+          <w:szCs w:val="32"/>
+        </w:rPr>
+      </w:pPr>
+      <w:proofErr w:type="gramStart"/>
+      <w:r>
+        <w:rPr>
+          <w:rFonts w:ascii="Arial" w:hAnsi="Arial" w:cs="Arial"/>
+          <w:sz w:val="32"/>
+          <w:szCs w:val="32"/>
+        </w:rPr>
+        <w:t>image[</w:t>
+      </w:r>
+      <w:proofErr w:type="gramEnd"/>
+      <w:r>
+        <w:rPr>
+          <w:rFonts w:ascii="Arial" w:hAnsi="Arial" w:cs="Arial"/>
+          <w:sz w:val="32"/>
+          <w:szCs w:val="32"/>
+        </w:rPr>
+        <w:t>:500</w:t>
+      </w:r>
+      <w:proofErr w:type="gramStart"/>
+      <w:r>
+        <w:rPr>
+          <w:rFonts w:ascii="Arial" w:hAnsi="Arial" w:cs="Arial"/>
+          <w:sz w:val="32"/>
+          <w:szCs w:val="32"/>
+        </w:rPr>
+        <w:t>, :</w:t>
+      </w:r>
+      <w:proofErr w:type="gramEnd"/>
+      <w:r>
+        <w:rPr>
+          <w:rFonts w:ascii="Arial" w:hAnsi="Arial" w:cs="Arial"/>
+          <w:sz w:val="32"/>
+          <w:szCs w:val="32"/>
+        </w:rPr>
+        <w:t>]     # First 500 rows</w:t>
+      </w:r>
+    </w:p>
+    <w:p>
+      <w:pPr>
+        <w:pStyle w:val="ListParagraph"/>
+        <w:rPr>
+          <w:rFonts w:ascii="Arial" w:hAnsi="Arial" w:cs="Arial"/>
+          <w:sz w:val="32"/>
+          <w:szCs w:val="32"/>
+        </w:rPr>
+      </w:pPr>
+    </w:p>
+    <w:p>
+      <w:pPr>
+        <w:pStyle w:val="ListParagraph"/>
+        <w:rPr>
+          <w:rFonts w:ascii="Arial" w:hAnsi="Arial" w:cs="Arial"/>
+          <w:sz w:val="32"/>
+          <w:szCs w:val="32"/>
+        </w:rPr>
+      </w:pPr>
+      <w:r>
+        <w:rPr>
+          <w:rFonts w:ascii="Arial" w:hAnsi="Arial" w:cs="Arial"/>
+          <w:sz w:val="32"/>
+          <w:szCs w:val="32"/>
+        </w:rPr>
+        <w:t>image</w:t>
+      </w:r>
+      <w:proofErr w:type="gramStart"/>
+      <w:r>
+        <w:rPr>
+          <w:rFonts w:ascii="Arial" w:hAnsi="Arial" w:cs="Arial"/>
+          <w:sz w:val="32"/>
+          <w:szCs w:val="32"/>
+        </w:rPr>
+        <w:t>[:,</w:t>
+      </w:r>
+      <w:proofErr w:type="gramEnd"/>
+      <w:r>
+        <w:rPr>
+          <w:rFonts w:ascii="Arial" w:hAnsi="Arial" w:cs="Arial"/>
+          <w:sz w:val="32"/>
+          <w:szCs w:val="32"/>
+        </w:rPr>
+        <w:t xml:space="preserve"> :300]     # First 300 columns</w:t>
+      </w:r>
+    </w:p>
+    <w:p>
+      <w:pPr>
+        <w:pStyle w:val="ListParagraph"/>
+        <w:rPr>
+          <w:rFonts w:ascii="Arial" w:hAnsi="Arial" w:cs="Arial"/>
+          <w:sz w:val="32"/>
+          <w:szCs w:val="32"/>
+        </w:rPr>
+      </w:pPr>
+    </w:p>
+    <w:p>
+      <w:pPr>
+        <w:pStyle w:val="ListParagraph"/>
+        <w:rPr>
+          <w:rFonts w:ascii="Arial" w:hAnsi="Arial" w:cs="Arial"/>
+          <w:sz w:val="32"/>
+          <w:szCs w:val="32"/>
+        </w:rPr>
+      </w:pPr>
+      <w:proofErr w:type="gramStart"/>
+      <w:r>
+        <w:rPr>
+          <w:rFonts w:ascii="Arial" w:hAnsi="Arial" w:cs="Arial"/>
+          <w:sz w:val="32"/>
+          <w:szCs w:val="32"/>
+        </w:rPr>
+        <w:t>image[300:,</w:t>
+      </w:r>
+      <w:proofErr w:type="gramEnd"/>
+      <w:r>
+        <w:rPr>
+          <w:rFonts w:ascii="Arial" w:hAnsi="Arial" w:cs="Arial"/>
+          <w:sz w:val="32"/>
+          <w:szCs w:val="32"/>
+        </w:rPr>
+        <w:t xml:space="preserve"> :]</w:t>
+      </w:r>
+    </w:p>
+    <w:p>
+      <w:pPr>
+        <w:pStyle w:val="ListParagraph"/>
+        <w:rPr>
+          <w:rFonts w:ascii="Arial" w:hAnsi="Arial" w:cs="Arial"/>
+          <w:sz w:val="32"/>
+          <w:szCs w:val="32"/>
+        </w:rPr>
+      </w:pPr>
+    </w:p>
+    <w:p>
+      <w:pPr>
+        <w:pStyle w:val="ListParagraph"/>
+        <w:rPr>
+          <w:rFonts w:ascii="Arial" w:hAnsi="Arial" w:cs="Arial"/>
+          <w:sz w:val="32"/>
+          <w:szCs w:val="32"/>
+        </w:rPr>
+      </w:pPr>
+    </w:p>
+    <w:p>
+      <w:pPr>
+        <w:pStyle w:val="ListParagraph"/>
+        <w:rPr>
+          <w:rFonts w:ascii="Arial" w:hAnsi="Arial" w:cs="Arial"/>
+          <w:b/>
+          <w:bCs/>
+          <w:sz w:val="32"/>
+          <w:szCs w:val="32"/>
+        </w:rPr>
+      </w:pPr>
+      <w:r>
+        <w:rPr>
+          <w:rFonts w:ascii="Segoe UI Emoji" w:hAnsi="Segoe UI Emoji" w:cs="Segoe UI Emoji"/>
+          <w:b/>
+          <w:bCs/>
+          <w:sz w:val="32"/>
+          <w:szCs w:val="32"/>
+        </w:rPr>
+        <w:t>📖</w:t>
+      </w:r>
+      <w:r>
+        <w:rPr>
+          <w:rFonts w:ascii="Arial" w:hAnsi="Arial" w:cs="Arial"/>
+          <w:b/>
+          <w:bCs/>
+          <w:sz w:val="32"/>
+          <w:szCs w:val="32"/>
+        </w:rPr>
+        <w:t xml:space="preserve"> Topic 3: Image Resizing</w:t>
+      </w:r>
+    </w:p>
+    <w:p>
+      <w:pPr>
+        <w:pStyle w:val="ListParagraph"/>
+        <w:rPr>
+          <w:rFonts w:ascii="Arial" w:hAnsi="Arial" w:cs="Arial"/>
+          <w:b/>
+          <w:bCs/>
+          <w:sz w:val="32"/>
+          <w:szCs w:val="32"/>
+        </w:rPr>
+      </w:pPr>
+      <w:r>
+        <w:rPr>
+          <w:rFonts w:ascii="Arial" w:hAnsi="Arial" w:cs="Arial"/>
+          <w:b/>
+          <w:bCs/>
+          <w:sz w:val="32"/>
+          <w:szCs w:val="32"/>
+        </w:rPr>
+        <w:t>First, why do we resize images?</w:t>
+      </w:r>
+    </w:p>
+    <w:p>
+      <w:pPr>
+        <w:pStyle w:val="ListParagraph"/>
+        <w:rPr>
+          <w:rFonts w:ascii="Arial" w:hAnsi="Arial" w:cs="Arial"/>
+          <w:sz w:val="32"/>
+          <w:szCs w:val="32"/>
+        </w:rPr>
+      </w:pPr>
+      <w:r>
+        <w:rPr>
+          <w:rFonts w:ascii="Arial" w:hAnsi="Arial" w:cs="Arial"/>
+          <w:sz w:val="32"/>
+          <w:szCs w:val="32"/>
+        </w:rPr>
+        <w:t>Let's imagine you have these three images:</w:t>
+      </w:r>
+    </w:p>
+    <w:p>
+      <w:pPr>
+        <w:pStyle w:val="ListParagraph"/>
+        <w:rPr>
+          <w:rFonts w:ascii="Arial" w:hAnsi="Arial" w:cs="Arial"/>
+          <w:sz w:val="32"/>
+          <w:szCs w:val="32"/>
+        </w:rPr>
+      </w:pPr>
+      <w:r>
+        <w:rPr>
+          <w:rFonts w:ascii="Arial" w:hAnsi="Arial" w:cs="Arial"/>
+          <w:sz w:val="32"/>
+          <w:szCs w:val="32"/>
+        </w:rPr>
+        <w:t>Image 1</w:t>
+      </w:r>
+    </w:p>
+    <w:p>
+      <w:pPr>
+        <w:pStyle w:val="ListParagraph"/>
+        <w:rPr>
+          <w:rFonts w:ascii="Arial" w:hAnsi="Arial" w:cs="Arial"/>
+          <w:sz w:val="32"/>
+          <w:szCs w:val="32"/>
+        </w:rPr>
+      </w:pPr>
+      <w:r>
+        <w:rPr>
+          <w:rFonts w:ascii="Arial" w:hAnsi="Arial" w:cs="Arial"/>
+          <w:sz w:val="32"/>
+          <w:szCs w:val="32"/>
+        </w:rPr>
+        <w:t>1920 × 1080</w:t>
+      </w:r>
+    </w:p>
+    <w:p>
+      <w:pPr>
+        <w:pStyle w:val="ListParagraph"/>
+        <w:rPr>
+          <w:rFonts w:ascii="Arial" w:hAnsi="Arial" w:cs="Arial"/>
+          <w:sz w:val="32"/>
+          <w:szCs w:val="32"/>
+        </w:rPr>
+      </w:pPr>
+    </w:p>
+    <w:p>
+      <w:pPr>
+        <w:pStyle w:val="ListParagraph"/>
+        <w:rPr>
+          <w:rFonts w:ascii="Arial" w:hAnsi="Arial" w:cs="Arial"/>
+          <w:sz w:val="32"/>
+          <w:szCs w:val="32"/>
+        </w:rPr>
+      </w:pPr>
+      <w:r>
+        <w:rPr>
+          <w:rFonts w:ascii="Arial" w:hAnsi="Arial" w:cs="Arial"/>
+          <w:sz w:val="32"/>
+          <w:szCs w:val="32"/>
+        </w:rPr>
+        <w:t>Image 2</w:t>
+      </w:r>
+    </w:p>
+    <w:p>
+      <w:pPr>
+        <w:pStyle w:val="ListParagraph"/>
+        <w:rPr>
+          <w:rFonts w:ascii="Arial" w:hAnsi="Arial" w:cs="Arial"/>
+          <w:sz w:val="32"/>
+          <w:szCs w:val="32"/>
+        </w:rPr>
+      </w:pPr>
+      <w:r>
+        <w:rPr>
+          <w:rFonts w:ascii="Arial" w:hAnsi="Arial" w:cs="Arial"/>
+          <w:sz w:val="32"/>
+          <w:szCs w:val="32"/>
+        </w:rPr>
+        <w:t>800 × 600</w:t>
+      </w:r>
+    </w:p>
+    <w:p>
+      <w:pPr>
+        <w:pStyle w:val="ListParagraph"/>
+        <w:rPr>
+          <w:rFonts w:ascii="Arial" w:hAnsi="Arial" w:cs="Arial"/>
+          <w:sz w:val="32"/>
+          <w:szCs w:val="32"/>
+        </w:rPr>
+      </w:pPr>
+    </w:p>
+    <w:p>
+      <w:pPr>
+        <w:pStyle w:val="ListParagraph"/>
+        <w:rPr>
+          <w:rFonts w:ascii="Arial" w:hAnsi="Arial" w:cs="Arial"/>
+          <w:sz w:val="32"/>
+          <w:szCs w:val="32"/>
+        </w:rPr>
+      </w:pPr>
+      <w:r>
+        <w:rPr>
+          <w:rFonts w:ascii="Arial" w:hAnsi="Arial" w:cs="Arial"/>
+          <w:sz w:val="32"/>
+          <w:szCs w:val="32"/>
+        </w:rPr>
+        <w:t>Image 3</w:t>
+      </w:r>
+    </w:p>
+    <w:p>
+      <w:pPr>
+        <w:pStyle w:val="ListParagraph"/>
+        <w:rPr>
+          <w:rFonts w:ascii="Arial" w:hAnsi="Arial" w:cs="Arial"/>
+          <w:sz w:val="32"/>
+          <w:szCs w:val="32"/>
+        </w:rPr>
+      </w:pPr>
+      <w:r>
+        <w:rPr>
+          <w:rFonts w:ascii="Arial" w:hAnsi="Arial" w:cs="Arial"/>
+          <w:sz w:val="32"/>
+          <w:szCs w:val="32"/>
+        </w:rPr>
+        <w:t>4032 × 3024</w:t>
+      </w:r>
+    </w:p>
+    <w:p>
+      <w:pPr>
+        <w:pStyle w:val="ListParagraph"/>
+        <w:rPr>
+          <w:rFonts w:ascii="Arial" w:hAnsi="Arial" w:cs="Arial"/>
+          <w:sz w:val="32"/>
+          <w:szCs w:val="32"/>
+        </w:rPr>
+      </w:pPr>
+      <w:r>
+        <w:rPr>
+          <w:rFonts w:ascii="Arial" w:hAnsi="Arial" w:cs="Arial"/>
+          <w:sz w:val="32"/>
+          <w:szCs w:val="32"/>
+        </w:rPr>
+        <w:t>Can we directly give these to an AI model?</w:t>
+      </w:r>
+    </w:p>
+    <w:p>
+      <w:pPr>
+        <w:pStyle w:val="ListParagraph"/>
+        <w:rPr>
+          <w:rFonts w:ascii="Arial" w:hAnsi="Arial" w:cs="Arial"/>
+          <w:sz w:val="32"/>
+          <w:szCs w:val="32"/>
+        </w:rPr>
+      </w:pPr>
+      <w:r>
+        <w:rPr>
+          <w:rFonts w:ascii="Segoe UI Emoji" w:hAnsi="Segoe UI Emoji" w:cs="Segoe UI Emoji"/>
+          <w:sz w:val="32"/>
+          <w:szCs w:val="32"/>
+        </w:rPr>
+        <w:t>❌</w:t>
+      </w:r>
+      <w:r>
+        <w:rPr>
+          <w:rFonts w:ascii="Arial" w:hAnsi="Arial" w:cs="Arial"/>
+          <w:sz w:val="32"/>
+          <w:szCs w:val="32"/>
+        </w:rPr>
+        <w:t xml:space="preserve"> No.</w:t>
+      </w:r>
+    </w:p>
+    <w:p>
+      <w:pPr>
+        <w:pStyle w:val="ListParagraph"/>
+        <w:rPr>
+          <w:rFonts w:ascii="Arial" w:hAnsi="Arial" w:cs="Arial"/>
+          <w:sz w:val="32"/>
+          <w:szCs w:val="32"/>
+        </w:rPr>
+      </w:pPr>
+      <w:r>
+        <w:rPr>
+          <w:rFonts w:ascii="Arial" w:hAnsi="Arial" w:cs="Arial"/>
+          <w:sz w:val="32"/>
+          <w:szCs w:val="32"/>
+        </w:rPr>
+        <w:t>Why?</w:t>
+      </w:r>
+    </w:p>
+    <w:p>
+      <w:pPr>
+        <w:pStyle w:val="ListParagraph"/>
+        <w:rPr>
+          <w:rFonts w:ascii="Arial" w:hAnsi="Arial" w:cs="Arial"/>
+          <w:sz w:val="32"/>
+          <w:szCs w:val="32"/>
+        </w:rPr>
+      </w:pPr>
+      <w:r>
+        <w:rPr>
+          <w:rFonts w:ascii="Arial" w:hAnsi="Arial" w:cs="Arial"/>
+          <w:sz w:val="32"/>
+          <w:szCs w:val="32"/>
+        </w:rPr>
+        <w:t xml:space="preserve">Because AI models expect </w:t>
+      </w:r>
+      <w:r>
+        <w:rPr>
+          <w:rFonts w:ascii="Arial" w:hAnsi="Arial" w:cs="Arial"/>
+          <w:b/>
+          <w:bCs/>
+          <w:sz w:val="32"/>
+          <w:szCs w:val="32"/>
+        </w:rPr>
+        <w:t>every image to have the same dimensions</w:t>
+      </w:r>
+      <w:r>
+        <w:rPr>
+          <w:rFonts w:ascii="Arial" w:hAnsi="Arial" w:cs="Arial"/>
+          <w:sz w:val="32"/>
+          <w:szCs w:val="32"/>
+        </w:rPr>
+        <w:t>.</w:t>
+      </w:r>
+    </w:p>
+    <w:p>
+      <w:pPr>
+        <w:pStyle w:val="ListParagraph"/>
+        <w:rPr>
+          <w:rFonts w:ascii="Arial" w:hAnsi="Arial" w:cs="Arial"/>
+          <w:sz w:val="32"/>
+          <w:szCs w:val="32"/>
+        </w:rPr>
+      </w:pPr>
+      <w:r>
+        <w:rPr>
+          <w:rFonts w:ascii="Arial" w:hAnsi="Arial" w:cs="Arial"/>
+          <w:sz w:val="32"/>
+          <w:szCs w:val="32"/>
+        </w:rPr>
+        <w:t>Imagine you're a teacher checking answer sheets.</w:t>
+      </w:r>
+    </w:p>
+    <w:p>
+      <w:pPr>
+        <w:pStyle w:val="ListParagraph"/>
+        <w:rPr>
+          <w:rFonts w:ascii="Arial" w:hAnsi="Arial" w:cs="Arial"/>
+          <w:sz w:val="32"/>
+          <w:szCs w:val="32"/>
+        </w:rPr>
+      </w:pPr>
+      <w:r>
+        <w:rPr>
+          <w:rFonts w:ascii="Arial" w:hAnsi="Arial" w:cs="Arial"/>
+          <w:sz w:val="32"/>
+          <w:szCs w:val="32"/>
+        </w:rPr>
+        <w:t>Student A submits:</w:t>
+      </w:r>
+    </w:p>
+    <w:p>
+      <w:pPr>
+        <w:pStyle w:val="ListParagraph"/>
+        <w:rPr>
+          <w:rFonts w:ascii="Arial" w:hAnsi="Arial" w:cs="Arial"/>
+          <w:sz w:val="32"/>
+          <w:szCs w:val="32"/>
+        </w:rPr>
+      </w:pPr>
+      <w:r>
+        <w:rPr>
+          <w:rFonts w:ascii="Arial" w:hAnsi="Arial" w:cs="Arial"/>
+          <w:sz w:val="32"/>
+          <w:szCs w:val="32"/>
+        </w:rPr>
+        <w:t>A4 Paper</w:t>
+      </w:r>
+    </w:p>
+    <w:p>
+      <w:pPr>
+        <w:pStyle w:val="ListParagraph"/>
+        <w:rPr>
+          <w:rFonts w:ascii="Arial" w:hAnsi="Arial" w:cs="Arial"/>
+          <w:sz w:val="32"/>
+          <w:szCs w:val="32"/>
+        </w:rPr>
+      </w:pPr>
+      <w:r>
+        <w:rPr>
+          <w:rFonts w:ascii="Arial" w:hAnsi="Arial" w:cs="Arial"/>
+          <w:sz w:val="32"/>
+          <w:szCs w:val="32"/>
+        </w:rPr>
+        <w:t>Student B submits:</w:t>
+      </w:r>
+    </w:p>
+    <w:p>
+      <w:pPr>
+        <w:pStyle w:val="ListParagraph"/>
+        <w:rPr>
+          <w:rFonts w:ascii="Arial" w:hAnsi="Arial" w:cs="Arial"/>
+          <w:sz w:val="32"/>
+          <w:szCs w:val="32"/>
+        </w:rPr>
+      </w:pPr>
+      <w:r>
+        <w:rPr>
+          <w:rFonts w:ascii="Arial" w:hAnsi="Arial" w:cs="Arial"/>
+          <w:sz w:val="32"/>
+          <w:szCs w:val="32"/>
+        </w:rPr>
+        <w:t>A3 Paper</w:t>
+      </w:r>
+    </w:p>
+    <w:p>
+      <w:pPr>
+        <w:pStyle w:val="ListParagraph"/>
+        <w:rPr>
+          <w:rFonts w:ascii="Arial" w:hAnsi="Arial" w:cs="Arial"/>
+          <w:sz w:val="32"/>
+          <w:szCs w:val="32"/>
+        </w:rPr>
+      </w:pPr>
+      <w:r>
+        <w:rPr>
+          <w:rFonts w:ascii="Arial" w:hAnsi="Arial" w:cs="Arial"/>
+          <w:sz w:val="32"/>
+          <w:szCs w:val="32"/>
+        </w:rPr>
+        <w:t>Student C submits:</w:t>
+      </w:r>
+    </w:p>
+    <w:p>
+      <w:pPr>
+        <w:pStyle w:val="ListParagraph"/>
+        <w:rPr>
+          <w:rFonts w:ascii="Arial" w:hAnsi="Arial" w:cs="Arial"/>
+          <w:sz w:val="32"/>
+          <w:szCs w:val="32"/>
+        </w:rPr>
+      </w:pPr>
+      <w:r>
+        <w:rPr>
+          <w:rFonts w:ascii="Arial" w:hAnsi="Arial" w:cs="Arial"/>
+          <w:sz w:val="32"/>
+          <w:szCs w:val="32"/>
+        </w:rPr>
+        <w:t>A5 Paper</w:t>
+      </w:r>
+    </w:p>
+    <w:p>
+      <w:pPr>
+        <w:pStyle w:val="ListParagraph"/>
+        <w:rPr>
+          <w:rFonts w:ascii="Arial" w:hAnsi="Arial" w:cs="Arial"/>
+          <w:sz w:val="32"/>
+          <w:szCs w:val="32"/>
+        </w:rPr>
+      </w:pPr>
+      <w:r>
+        <w:rPr>
+          <w:rFonts w:ascii="Arial" w:hAnsi="Arial" w:cs="Arial"/>
+          <w:sz w:val="32"/>
+          <w:szCs w:val="32"/>
+        </w:rPr>
+        <w:t>Wouldn't it be difficult to organize and evaluate them?</w:t>
+      </w:r>
+    </w:p>
+    <w:p>
+      <w:pPr>
+        <w:pStyle w:val="ListParagraph"/>
+        <w:rPr>
+          <w:rFonts w:ascii="Arial" w:hAnsi="Arial" w:cs="Arial"/>
+          <w:sz w:val="32"/>
+          <w:szCs w:val="32"/>
+        </w:rPr>
+      </w:pPr>
+      <w:r>
+        <w:rPr>
+          <w:rFonts w:ascii="Arial" w:hAnsi="Arial" w:cs="Arial"/>
+          <w:sz w:val="32"/>
+          <w:szCs w:val="32"/>
+        </w:rPr>
+        <w:t>Instead, you would ask:</w:t>
+      </w:r>
+    </w:p>
+    <w:p>
+      <w:pPr>
+        <w:pStyle w:val="ListParagraph"/>
+        <w:rPr>
+          <w:rFonts w:ascii="Arial" w:hAnsi="Arial" w:cs="Arial"/>
+          <w:sz w:val="32"/>
+          <w:szCs w:val="32"/>
+        </w:rPr>
+      </w:pPr>
+      <w:r>
+        <w:rPr>
+          <w:rFonts w:ascii="Arial" w:hAnsi="Arial" w:cs="Arial"/>
+          <w:sz w:val="32"/>
+          <w:szCs w:val="32"/>
+        </w:rPr>
+        <w:t>"Everyone must submit on A4 paper."</w:t>
+      </w:r>
+    </w:p>
+    <w:p>
+      <w:pPr>
+        <w:pStyle w:val="ListParagraph"/>
+        <w:rPr>
+          <w:rFonts w:ascii="Arial" w:hAnsi="Arial" w:cs="Arial"/>
+          <w:sz w:val="32"/>
+          <w:szCs w:val="32"/>
+        </w:rPr>
+      </w:pPr>
+      <w:r>
+        <w:rPr>
+          <w:rFonts w:ascii="Arial" w:hAnsi="Arial" w:cs="Arial"/>
+          <w:sz w:val="32"/>
+          <w:szCs w:val="32"/>
+        </w:rPr>
+        <w:t>AI models work the same way.</w:t>
+      </w:r>
+    </w:p>
+    <w:p>
+      <w:pPr>
+        <w:rPr>
+          <w:rFonts w:ascii="Arial" w:hAnsi="Arial" w:cs="Arial"/>
+          <w:sz w:val="32"/>
+          <w:szCs w:val="32"/>
+        </w:rPr>
+      </w:pPr>
+      <w:r>
+        <w:rPr>
+          <w:rFonts w:ascii="Arial" w:hAnsi="Arial" w:cs="Arial"/>
+          <w:sz w:val="32"/>
+          <w:szCs w:val="32"/>
+        </w:rPr>
+        <w:br w:type="page"/>
+      </w:r>
+    </w:p>
+    <w:p>
+      <w:pPr>
+        <w:pStyle w:val="ListParagraph"/>
+        <w:rPr>
+          <w:rFonts w:ascii="Arial" w:hAnsi="Arial" w:cs="Arial"/>
+          <w:b/>
+          <w:bCs/>
+          <w:sz w:val="32"/>
+          <w:szCs w:val="32"/>
+        </w:rPr>
+      </w:pPr>
+      <w:r>
+        <w:rPr>
+          <w:rFonts w:ascii="Segoe UI Emoji" w:hAnsi="Segoe UI Emoji" w:cs="Segoe UI Emoji"/>
+          <w:b/>
+          <w:bCs/>
+          <w:sz w:val="32"/>
+          <w:szCs w:val="32"/>
+        </w:rPr>
+        <w:lastRenderedPageBreak/>
+        <w:t>📅</w:t>
+      </w:r>
+      <w:r>
+        <w:rPr>
+          <w:rFonts w:ascii="Arial" w:hAnsi="Arial" w:cs="Arial"/>
+          <w:b/>
+          <w:bCs/>
+          <w:sz w:val="32"/>
+          <w:szCs w:val="32"/>
+        </w:rPr>
+        <w:t xml:space="preserve"> Day 3 - Topic 4: Aspect Ratio</w:t>
+      </w:r>
+    </w:p>
+    <w:p>
+      <w:pPr>
+        <w:pStyle w:val="ListParagraph"/>
+        <w:rPr>
+          <w:rFonts w:ascii="Arial" w:hAnsi="Arial" w:cs="Arial"/>
+          <w:b/>
+          <w:bCs/>
+          <w:sz w:val="32"/>
+          <w:szCs w:val="32"/>
+        </w:rPr>
+      </w:pPr>
+      <w:r>
+        <w:rPr>
+          <w:rFonts w:ascii="Segoe UI Emoji" w:hAnsi="Segoe UI Emoji" w:cs="Segoe UI Emoji"/>
+          <w:b/>
+          <w:bCs/>
+          <w:sz w:val="32"/>
+          <w:szCs w:val="32"/>
+        </w:rPr>
+        <w:t>🎯</w:t>
+      </w:r>
+      <w:r>
+        <w:rPr>
+          <w:rFonts w:ascii="Arial" w:hAnsi="Arial" w:cs="Arial"/>
+          <w:b/>
+          <w:bCs/>
+          <w:sz w:val="32"/>
+          <w:szCs w:val="32"/>
+        </w:rPr>
+        <w:t xml:space="preserve"> First, what is Aspect Ratio?</w:t>
+      </w:r>
+    </w:p>
+    <w:p>
+      <w:pPr>
+        <w:pStyle w:val="ListParagraph"/>
+        <w:rPr>
+          <w:rFonts w:ascii="Arial" w:hAnsi="Arial" w:cs="Arial"/>
+          <w:sz w:val="32"/>
+          <w:szCs w:val="32"/>
+        </w:rPr>
+      </w:pPr>
+      <w:r>
+        <w:rPr>
+          <w:rFonts w:ascii="Arial" w:hAnsi="Arial" w:cs="Arial"/>
+          <w:b/>
+          <w:bCs/>
+          <w:sz w:val="32"/>
+          <w:szCs w:val="32"/>
+        </w:rPr>
+        <w:t>Aspect Ratio</w:t>
+      </w:r>
+      <w:r>
+        <w:rPr>
+          <w:rFonts w:ascii="Arial" w:hAnsi="Arial" w:cs="Arial"/>
+          <w:sz w:val="32"/>
+          <w:szCs w:val="32"/>
+        </w:rPr>
+        <w:t xml:space="preserve"> is the </w:t>
+      </w:r>
+      <w:r>
+        <w:rPr>
+          <w:rFonts w:ascii="Arial" w:hAnsi="Arial" w:cs="Arial"/>
+          <w:b/>
+          <w:bCs/>
+          <w:sz w:val="32"/>
+          <w:szCs w:val="32"/>
+        </w:rPr>
+        <w:t>relationship between the width and the height of an image.</w:t>
+      </w:r>
+    </w:p>
+    <w:p>
+      <w:pPr>
+        <w:pStyle w:val="ListParagraph"/>
+        <w:rPr>
+          <w:rFonts w:ascii="Arial" w:hAnsi="Arial" w:cs="Arial"/>
+          <w:sz w:val="32"/>
+          <w:szCs w:val="32"/>
+        </w:rPr>
+      </w:pPr>
+      <w:r>
+        <w:rPr>
+          <w:rFonts w:ascii="Arial" w:hAnsi="Arial" w:cs="Arial"/>
+          <w:sz w:val="32"/>
+          <w:szCs w:val="32"/>
+        </w:rPr>
+        <w:t xml:space="preserve">It tells us the </w:t>
+      </w:r>
+      <w:r>
+        <w:rPr>
+          <w:rFonts w:ascii="Arial" w:hAnsi="Arial" w:cs="Arial"/>
+          <w:b/>
+          <w:bCs/>
+          <w:sz w:val="32"/>
+          <w:szCs w:val="32"/>
+        </w:rPr>
+        <w:t>shape</w:t>
+      </w:r>
+      <w:r>
+        <w:rPr>
+          <w:rFonts w:ascii="Arial" w:hAnsi="Arial" w:cs="Arial"/>
+          <w:sz w:val="32"/>
+          <w:szCs w:val="32"/>
+        </w:rPr>
+        <w:t xml:space="preserve"> of the image, </w:t>
+      </w:r>
+      <w:r>
+        <w:rPr>
+          <w:rFonts w:ascii="Arial" w:hAnsi="Arial" w:cs="Arial"/>
+          <w:b/>
+          <w:bCs/>
+          <w:sz w:val="32"/>
+          <w:szCs w:val="32"/>
+        </w:rPr>
+        <w:t>not its size</w:t>
+      </w:r>
+      <w:r>
+        <w:rPr>
+          <w:rFonts w:ascii="Arial" w:hAnsi="Arial" w:cs="Arial"/>
+          <w:sz w:val="32"/>
+          <w:szCs w:val="32"/>
+        </w:rPr>
+        <w:t>.</w:t>
+      </w:r>
+    </w:p>
+    <w:p>
+      <w:pPr>
+        <w:pStyle w:val="ListParagraph"/>
+        <w:rPr>
+          <w:rFonts w:ascii="Arial" w:hAnsi="Arial" w:cs="Arial"/>
+          <w:sz w:val="32"/>
+          <w:szCs w:val="32"/>
+        </w:rPr>
+      </w:pPr>
+      <w:r>
+        <w:rPr>
+          <w:rFonts w:ascii="Arial" w:hAnsi="Arial" w:cs="Arial"/>
+          <w:sz w:val="32"/>
+          <w:szCs w:val="32"/>
+        </w:rPr>
+        <w:t>The formula is:</w:t>
+      </w:r>
+    </w:p>
+    <w:p>
+      <w:pPr>
+        <w:pStyle w:val="ListParagraph"/>
+        <w:rPr>
+          <w:rFonts w:ascii="Arial" w:hAnsi="Arial" w:cs="Arial"/>
+          <w:sz w:val="32"/>
+          <w:szCs w:val="32"/>
+        </w:rPr>
+      </w:pPr>
+      <w:r>
+        <w:rPr>
+          <w:rFonts w:ascii="Arial" w:hAnsi="Arial" w:cs="Arial"/>
+          <w:sz w:val="32"/>
+          <w:szCs w:val="32"/>
+        </w:rPr>
+        <w:t xml:space="preserve">Aspect Ratio = </w:t>
+      </w:r>
+      <w:proofErr w:type="gramStart"/>
+      <w:r>
+        <w:rPr>
+          <w:rFonts w:ascii="Arial" w:hAnsi="Arial" w:cs="Arial"/>
+          <w:sz w:val="32"/>
+          <w:szCs w:val="32"/>
+        </w:rPr>
+        <w:t>Width :</w:t>
+      </w:r>
+      <w:proofErr w:type="gramEnd"/>
+      <w:r>
+        <w:rPr>
+          <w:rFonts w:ascii="Arial" w:hAnsi="Arial" w:cs="Arial"/>
+          <w:sz w:val="32"/>
+          <w:szCs w:val="32"/>
+        </w:rPr>
+        <w:t xml:space="preserve"> Height</w:t>
+      </w:r>
+    </w:p>
+    <w:p>
+      <w:pPr>
+        <w:pStyle w:val="ListParagraph"/>
+        <w:rPr>
+          <w:rFonts w:ascii="Arial" w:hAnsi="Arial" w:cs="Arial"/>
+          <w:sz w:val="32"/>
+          <w:szCs w:val="32"/>
+        </w:rPr>
+      </w:pPr>
+      <w:r>
+        <w:rPr>
+          <w:rFonts w:ascii="Arial" w:hAnsi="Arial" w:cs="Arial"/>
+          <w:sz w:val="32"/>
+          <w:szCs w:val="32"/>
+        </w:rPr>
+        <w:t>For example,</w:t>
+      </w:r>
+    </w:p>
+    <w:p>
+      <w:pPr>
+        <w:pStyle w:val="ListParagraph"/>
+        <w:rPr>
+          <w:rFonts w:ascii="Arial" w:hAnsi="Arial" w:cs="Arial"/>
+          <w:sz w:val="32"/>
+          <w:szCs w:val="32"/>
+        </w:rPr>
+      </w:pPr>
+      <w:r>
+        <w:rPr>
+          <w:rFonts w:ascii="Arial" w:hAnsi="Arial" w:cs="Arial"/>
+          <w:sz w:val="32"/>
+          <w:szCs w:val="32"/>
+        </w:rPr>
+        <w:t>Suppose an image has:</w:t>
+      </w:r>
+    </w:p>
+    <w:p>
+      <w:pPr>
+        <w:pStyle w:val="ListParagraph"/>
+        <w:rPr>
+          <w:rFonts w:ascii="Arial" w:hAnsi="Arial" w:cs="Arial"/>
+          <w:sz w:val="32"/>
+          <w:szCs w:val="32"/>
+        </w:rPr>
+      </w:pPr>
+      <w:r>
+        <w:rPr>
+          <w:rFonts w:ascii="Arial" w:hAnsi="Arial" w:cs="Arial"/>
+          <w:sz w:val="32"/>
+          <w:szCs w:val="32"/>
+        </w:rPr>
+        <w:t>Width = 1920</w:t>
+      </w:r>
+    </w:p>
+    <w:p>
+      <w:pPr>
+        <w:pStyle w:val="ListParagraph"/>
+        <w:rPr>
+          <w:rFonts w:ascii="Arial" w:hAnsi="Arial" w:cs="Arial"/>
+          <w:sz w:val="32"/>
+          <w:szCs w:val="32"/>
+        </w:rPr>
+      </w:pPr>
+      <w:r>
+        <w:rPr>
+          <w:rFonts w:ascii="Arial" w:hAnsi="Arial" w:cs="Arial"/>
+          <w:sz w:val="32"/>
+          <w:szCs w:val="32"/>
+        </w:rPr>
+        <w:t>Height = 1080</w:t>
+      </w:r>
+    </w:p>
+    <w:p>
+      <w:pPr>
+        <w:pStyle w:val="ListParagraph"/>
+        <w:rPr>
+          <w:rFonts w:ascii="Arial" w:hAnsi="Arial" w:cs="Arial"/>
+          <w:sz w:val="32"/>
+          <w:szCs w:val="32"/>
+        </w:rPr>
+      </w:pPr>
+      <w:r>
+        <w:rPr>
+          <w:rFonts w:ascii="Arial" w:hAnsi="Arial" w:cs="Arial"/>
+          <w:sz w:val="32"/>
+          <w:szCs w:val="32"/>
+        </w:rPr>
+        <w:t>Its aspect ratio is:</w:t>
+      </w:r>
+    </w:p>
+    <w:p>
+      <w:pPr>
+        <w:pStyle w:val="ListParagraph"/>
+        <w:rPr>
+          <w:rFonts w:ascii="Arial" w:hAnsi="Arial" w:cs="Arial"/>
+          <w:sz w:val="32"/>
+          <w:szCs w:val="32"/>
+        </w:rPr>
+      </w:pPr>
+      <w:proofErr w:type="gramStart"/>
+      <w:r>
+        <w:rPr>
+          <w:rFonts w:ascii="Arial" w:hAnsi="Arial" w:cs="Arial"/>
+          <w:sz w:val="32"/>
+          <w:szCs w:val="32"/>
+        </w:rPr>
+        <w:t>1920 :</w:t>
+      </w:r>
+      <w:proofErr w:type="gramEnd"/>
+      <w:r>
+        <w:rPr>
+          <w:rFonts w:ascii="Arial" w:hAnsi="Arial" w:cs="Arial"/>
+          <w:sz w:val="32"/>
+          <w:szCs w:val="32"/>
+        </w:rPr>
+        <w:t xml:space="preserve"> 1080</w:t>
+      </w:r>
+    </w:p>
+    <w:p>
+      <w:pPr>
+        <w:pStyle w:val="ListParagraph"/>
+        <w:rPr>
+          <w:rFonts w:ascii="Arial" w:hAnsi="Arial" w:cs="Arial"/>
+          <w:sz w:val="32"/>
+          <w:szCs w:val="32"/>
+        </w:rPr>
+      </w:pPr>
+      <w:r>
+        <w:rPr>
+          <w:rFonts w:ascii="Arial" w:hAnsi="Arial" w:cs="Arial"/>
+          <w:sz w:val="32"/>
+          <w:szCs w:val="32"/>
+        </w:rPr>
+        <w:t xml:space="preserve">Divide both numbers by </w:t>
+      </w:r>
+      <w:r>
+        <w:rPr>
+          <w:rFonts w:ascii="Arial" w:hAnsi="Arial" w:cs="Arial"/>
+          <w:b/>
+          <w:bCs/>
+          <w:sz w:val="32"/>
+          <w:szCs w:val="32"/>
+        </w:rPr>
+        <w:t>120</w:t>
+      </w:r>
+      <w:r>
+        <w:rPr>
+          <w:rFonts w:ascii="Arial" w:hAnsi="Arial" w:cs="Arial"/>
+          <w:sz w:val="32"/>
+          <w:szCs w:val="32"/>
+        </w:rPr>
+        <w:t>:</w:t>
+      </w:r>
+    </w:p>
+    <w:p>
+      <w:pPr>
+        <w:pStyle w:val="ListParagraph"/>
+        <w:rPr>
+          <w:rFonts w:ascii="Arial" w:hAnsi="Arial" w:cs="Arial"/>
+          <w:sz w:val="32"/>
+          <w:szCs w:val="32"/>
+        </w:rPr>
+      </w:pPr>
+      <w:proofErr w:type="gramStart"/>
+      <w:r>
+        <w:rPr>
+          <w:rFonts w:ascii="Arial" w:hAnsi="Arial" w:cs="Arial"/>
+          <w:sz w:val="32"/>
+          <w:szCs w:val="32"/>
+        </w:rPr>
+        <w:t>16 :</w:t>
+      </w:r>
+      <w:proofErr w:type="gramEnd"/>
+      <w:r>
+        <w:rPr>
+          <w:rFonts w:ascii="Arial" w:hAnsi="Arial" w:cs="Arial"/>
+          <w:sz w:val="32"/>
+          <w:szCs w:val="32"/>
+        </w:rPr>
+        <w:t xml:space="preserve"> 9</w:t>
+      </w:r>
+    </w:p>
+    <w:p>
+      <w:pPr>
+        <w:pStyle w:val="ListParagraph"/>
+        <w:rPr>
+          <w:rFonts w:ascii="Arial" w:hAnsi="Arial" w:cs="Arial"/>
+          <w:sz w:val="32"/>
+          <w:szCs w:val="32"/>
+        </w:rPr>
+      </w:pPr>
+      <w:proofErr w:type="gramStart"/>
+      <w:r>
+        <w:rPr>
+          <w:rFonts w:ascii="Arial" w:hAnsi="Arial" w:cs="Arial"/>
+          <w:sz w:val="32"/>
+          <w:szCs w:val="32"/>
+        </w:rPr>
+        <w:t>So</w:t>
+      </w:r>
+      <w:proofErr w:type="gramEnd"/>
+      <w:r>
+        <w:rPr>
+          <w:rFonts w:ascii="Arial" w:hAnsi="Arial" w:cs="Arial"/>
+          <w:sz w:val="32"/>
+          <w:szCs w:val="32"/>
+        </w:rPr>
+        <w:t xml:space="preserve"> we say:</w:t>
+      </w:r>
+    </w:p>
+    <w:p>
+      <w:pPr>
+        <w:pStyle w:val="ListParagraph"/>
+        <w:rPr>
+          <w:rFonts w:ascii="Arial" w:hAnsi="Arial" w:cs="Arial"/>
+          <w:sz w:val="32"/>
+          <w:szCs w:val="32"/>
+        </w:rPr>
+      </w:pPr>
+      <w:r>
+        <w:rPr>
+          <w:rFonts w:ascii="Arial" w:hAnsi="Arial" w:cs="Arial"/>
+          <w:b/>
+          <w:bCs/>
+          <w:sz w:val="32"/>
+          <w:szCs w:val="32"/>
+        </w:rPr>
+        <w:t>The image has an aspect ratio of 16:9.</w:t>
+      </w:r>
+    </w:p>
+    <w:p>
+      <w:pPr>
+        <w:pStyle w:val="ListParagraph"/>
+        <w:rPr>
+          <w:rFonts w:ascii="Arial" w:hAnsi="Arial" w:cs="Arial"/>
+          <w:sz w:val="32"/>
+          <w:szCs w:val="32"/>
+        </w:rPr>
+      </w:pPr>
+      <w:r>
+        <w:rPr>
+          <w:rFonts w:ascii="Arial" w:hAnsi="Arial" w:cs="Arial"/>
+          <w:sz w:val="32"/>
+          <w:szCs w:val="32"/>
+        </w:rPr>
+        <w:t>Notice something:</w:t>
+      </w:r>
+    </w:p>
+    <w:p>
+      <w:pPr>
+        <w:pStyle w:val="ListParagraph"/>
+        <w:rPr>
+          <w:rFonts w:ascii="Arial" w:hAnsi="Arial" w:cs="Arial"/>
+          <w:sz w:val="32"/>
+          <w:szCs w:val="32"/>
+        </w:rPr>
+      </w:pPr>
+      <w:r>
+        <w:rPr>
+          <w:rFonts w:ascii="Arial" w:hAnsi="Arial" w:cs="Arial"/>
+          <w:sz w:val="32"/>
+          <w:szCs w:val="32"/>
+        </w:rPr>
+        <w:t xml:space="preserve">We didn't say the image is </w:t>
+      </w:r>
+      <w:r>
+        <w:rPr>
+          <w:rFonts w:ascii="Arial" w:hAnsi="Arial" w:cs="Arial"/>
+          <w:b/>
+          <w:bCs/>
+          <w:sz w:val="32"/>
+          <w:szCs w:val="32"/>
+        </w:rPr>
+        <w:t>1920 × 1080</w:t>
+      </w:r>
+      <w:r>
+        <w:rPr>
+          <w:rFonts w:ascii="Arial" w:hAnsi="Arial" w:cs="Arial"/>
+          <w:sz w:val="32"/>
+          <w:szCs w:val="32"/>
+        </w:rPr>
+        <w:t>.</w:t>
+      </w:r>
+    </w:p>
+    <w:p>
+      <w:pPr>
+        <w:pStyle w:val="ListParagraph"/>
+        <w:rPr>
+          <w:rFonts w:ascii="Arial" w:hAnsi="Arial" w:cs="Arial"/>
+          <w:sz w:val="32"/>
+          <w:szCs w:val="32"/>
+        </w:rPr>
+      </w:pPr>
+      <w:r>
+        <w:rPr>
+          <w:rFonts w:ascii="Arial" w:hAnsi="Arial" w:cs="Arial"/>
+          <w:sz w:val="32"/>
+          <w:szCs w:val="32"/>
+        </w:rPr>
+        <w:t xml:space="preserve">We only said its </w:t>
+      </w:r>
+      <w:r>
+        <w:rPr>
+          <w:rFonts w:ascii="Arial" w:hAnsi="Arial" w:cs="Arial"/>
+          <w:b/>
+          <w:bCs/>
+          <w:sz w:val="32"/>
+          <w:szCs w:val="32"/>
+        </w:rPr>
+        <w:t>shape</w:t>
+      </w:r>
+      <w:r>
+        <w:rPr>
+          <w:rFonts w:ascii="Arial" w:hAnsi="Arial" w:cs="Arial"/>
+          <w:sz w:val="32"/>
+          <w:szCs w:val="32"/>
+        </w:rPr>
+        <w:t xml:space="preserve"> is </w:t>
+      </w:r>
+      <w:r>
+        <w:rPr>
+          <w:rFonts w:ascii="Arial" w:hAnsi="Arial" w:cs="Arial"/>
+          <w:b/>
+          <w:bCs/>
+          <w:sz w:val="32"/>
+          <w:szCs w:val="32"/>
+        </w:rPr>
+        <w:t>16:9</w:t>
+      </w:r>
+      <w:r>
+        <w:rPr>
+          <w:rFonts w:ascii="Arial" w:hAnsi="Arial" w:cs="Arial"/>
+          <w:sz w:val="32"/>
+          <w:szCs w:val="32"/>
+        </w:rPr>
+        <w:t>.</w:t>
+      </w:r>
+    </w:p>
+    <w:p>
+      <w:pPr>
+        <w:pStyle w:val="ListParagraph"/>
+        <w:rPr>
+          <w:rFonts w:ascii="Arial" w:hAnsi="Arial" w:cs="Arial"/>
+          <w:sz w:val="32"/>
+          <w:szCs w:val="32"/>
+        </w:rPr>
+      </w:pPr>
+      <w:r>
+        <w:rPr>
+          <w:rFonts w:ascii="Arial" w:hAnsi="Arial" w:cs="Arial"/>
+          <w:sz w:val="32"/>
+          <w:szCs w:val="32"/>
+        </w:rPr>
+        <w:t xml:space="preserve">     </w:t>
+      </w:r>
+    </w:p>
+    <w:p>
+      <w:pPr>
+        <w:pStyle w:val="ListParagraph"/>
+        <w:rPr>
+          <w:rFonts w:ascii="Arial" w:hAnsi="Arial" w:cs="Arial"/>
+          <w:sz w:val="32"/>
+          <w:szCs w:val="32"/>
+        </w:rPr>
+      </w:pPr>
+      <w:r>
+        <w:rPr>
+          <w:rFonts w:ascii="Arial" w:hAnsi="Arial" w:cs="Arial"/>
+          <w:sz w:val="32"/>
+          <w:szCs w:val="32"/>
+        </w:rPr>
+        <w:t>To find the aspect ratio:</w:t>
+      </w:r>
+    </w:p>
+    <w:p>
+      <w:pPr>
+        <w:pStyle w:val="ListParagraph"/>
+        <w:rPr>
+          <w:rFonts w:ascii="Arial" w:hAnsi="Arial" w:cs="Arial"/>
+          <w:sz w:val="32"/>
+          <w:szCs w:val="32"/>
+        </w:rPr>
+      </w:pPr>
+    </w:p>
+    <w:p>
+      <w:pPr>
+        <w:pStyle w:val="ListParagraph"/>
+        <w:rPr>
+          <w:rFonts w:ascii="Arial" w:hAnsi="Arial" w:cs="Arial"/>
+          <w:sz w:val="32"/>
+          <w:szCs w:val="32"/>
+        </w:rPr>
+      </w:pPr>
+      <w:r>
+        <w:rPr>
+          <w:rFonts w:ascii="Arial" w:hAnsi="Arial" w:cs="Arial"/>
+          <w:sz w:val="32"/>
+          <w:szCs w:val="32"/>
+        </w:rPr>
+        <w:t xml:space="preserve">1. Write </w:t>
+      </w:r>
+      <w:proofErr w:type="gramStart"/>
+      <w:r>
+        <w:rPr>
+          <w:rFonts w:ascii="Arial" w:hAnsi="Arial" w:cs="Arial"/>
+          <w:sz w:val="32"/>
+          <w:szCs w:val="32"/>
+        </w:rPr>
+        <w:t>Width :</w:t>
+      </w:r>
+      <w:proofErr w:type="gramEnd"/>
+      <w:r>
+        <w:rPr>
+          <w:rFonts w:ascii="Arial" w:hAnsi="Arial" w:cs="Arial"/>
+          <w:sz w:val="32"/>
+          <w:szCs w:val="32"/>
+        </w:rPr>
+        <w:t xml:space="preserve"> Height</w:t>
+      </w:r>
+    </w:p>
+    <w:p>
+      <w:pPr>
+        <w:pStyle w:val="ListParagraph"/>
+        <w:rPr>
+          <w:rFonts w:ascii="Arial" w:hAnsi="Arial" w:cs="Arial"/>
+          <w:sz w:val="32"/>
+          <w:szCs w:val="32"/>
+        </w:rPr>
+      </w:pPr>
+      <w:r>
+        <w:rPr>
+          <w:rFonts w:ascii="Arial" w:hAnsi="Arial" w:cs="Arial"/>
+          <w:sz w:val="32"/>
+          <w:szCs w:val="32"/>
+        </w:rPr>
+        <w:t>2. Find the Greatest Common Divisor (GCD)</w:t>
+      </w:r>
+      <w:r>
+        <w:rPr>
+          <w:rFonts w:ascii="Arial" w:hAnsi="Arial" w:cs="Arial"/>
+          <w:sz w:val="32"/>
+          <w:szCs w:val="32"/>
+        </w:rPr>
+        <w:t xml:space="preserve"> or just divide it until it </w:t>
+      </w:r>
+      <w:proofErr w:type="gramStart"/>
+      <w:r>
+        <w:rPr>
+          <w:rFonts w:ascii="Arial" w:hAnsi="Arial" w:cs="Arial"/>
+          <w:sz w:val="32"/>
+          <w:szCs w:val="32"/>
+        </w:rPr>
+        <w:t>become</w:t>
+      </w:r>
+      <w:proofErr w:type="gramEnd"/>
+      <w:r>
+        <w:rPr>
+          <w:rFonts w:ascii="Arial" w:hAnsi="Arial" w:cs="Arial"/>
+          <w:sz w:val="32"/>
+          <w:szCs w:val="32"/>
+        </w:rPr>
+        <w:t xml:space="preserve"> simple</w:t>
+      </w:r>
+    </w:p>
+    <w:p>
+      <w:pPr>
+        <w:pStyle w:val="ListParagraph"/>
+        <w:rPr>
+          <w:rFonts w:ascii="Arial" w:hAnsi="Arial" w:cs="Arial"/>
+          <w:sz w:val="32"/>
+          <w:szCs w:val="32"/>
+        </w:rPr>
+      </w:pPr>
+      <w:r>
+        <w:rPr>
+          <w:rFonts w:ascii="Arial" w:hAnsi="Arial" w:cs="Arial"/>
+          <w:sz w:val="32"/>
+          <w:szCs w:val="32"/>
+        </w:rPr>
+        <w:t>3. Divide both numbers by the GCD</w:t>
+      </w:r>
+    </w:p>
+    <w:p>
+      <w:pPr>
+        <w:pStyle w:val="ListParagraph"/>
+        <w:rPr>
+          <w:rFonts w:ascii="Arial" w:hAnsi="Arial" w:cs="Arial"/>
+          <w:sz w:val="32"/>
+          <w:szCs w:val="32"/>
+        </w:rPr>
+      </w:pPr>
+      <w:r>
+        <w:rPr>
+          <w:rFonts w:ascii="Arial" w:hAnsi="Arial" w:cs="Arial"/>
+          <w:sz w:val="32"/>
+          <w:szCs w:val="32"/>
+        </w:rPr>
+        <w:t>4. The result is the simplest aspect ratio.</w:t>
+      </w:r>
+    </w:p>
+    <w:p>
+      <w:pPr>
+        <w:rPr>
+          <w:rFonts w:ascii="Arial" w:hAnsi="Arial" w:cs="Arial"/>
+          <w:sz w:val="32"/>
+          <w:szCs w:val="32"/>
+        </w:rPr>
+      </w:pPr>
+      <w:r>
+        <w:rPr>
+          <w:rFonts w:ascii="Arial" w:hAnsi="Arial" w:cs="Arial"/>
+          <w:sz w:val="32"/>
+          <w:szCs w:val="32"/>
+        </w:rPr>
+        <w:br w:type="page"/>
+      </w:r>
+    </w:p>
+    <w:p>
+      <w:pPr>
+        <w:pStyle w:val="ListParagraph"/>
+        <w:rPr>
+          <w:rFonts w:ascii="Arial" w:hAnsi="Arial" w:cs="Arial"/>
+          <w:b/>
+          <w:bCs/>
+          <w:sz w:val="32"/>
+          <w:szCs w:val="32"/>
+        </w:rPr>
+      </w:pPr>
+      <w:r>
+        <w:rPr>
+          <w:rFonts w:ascii="Segoe UI Emoji" w:hAnsi="Segoe UI Emoji" w:cs="Segoe UI Emoji"/>
+          <w:b/>
+          <w:bCs/>
+          <w:sz w:val="32"/>
+          <w:szCs w:val="32"/>
+        </w:rPr>
+        <w:lastRenderedPageBreak/>
+        <w:t>🧠</w:t>
+      </w:r>
+      <w:r>
+        <w:rPr>
+          <w:rFonts w:ascii="Arial" w:hAnsi="Arial" w:cs="Arial"/>
+          <w:b/>
+          <w:bCs/>
+          <w:sz w:val="32"/>
+          <w:szCs w:val="32"/>
+        </w:rPr>
+        <w:t xml:space="preserve"> Since you answered, let me now answer my original question.</w:t>
+      </w:r>
+    </w:p>
+    <w:p>
+      <w:pPr>
+        <w:pStyle w:val="ListParagraph"/>
+        <w:rPr>
+          <w:rFonts w:ascii="Arial" w:hAnsi="Arial" w:cs="Arial"/>
+          <w:sz w:val="32"/>
+          <w:szCs w:val="32"/>
+        </w:rPr>
+      </w:pPr>
+      <w:r>
+        <w:rPr>
+          <w:rFonts w:ascii="Arial" w:hAnsi="Arial" w:cs="Arial"/>
+          <w:sz w:val="32"/>
+          <w:szCs w:val="32"/>
+        </w:rPr>
+        <w:t>I asked:</w:t>
+      </w:r>
+    </w:p>
+    <w:p>
+      <w:pPr>
+        <w:pStyle w:val="ListParagraph"/>
+        <w:rPr>
+          <w:rFonts w:ascii="Arial" w:hAnsi="Arial" w:cs="Arial"/>
+          <w:sz w:val="32"/>
+          <w:szCs w:val="32"/>
+        </w:rPr>
+      </w:pPr>
+      <w:r>
+        <w:rPr>
+          <w:rFonts w:ascii="Arial" w:hAnsi="Arial" w:cs="Arial"/>
+          <w:sz w:val="32"/>
+          <w:szCs w:val="32"/>
+        </w:rPr>
+        <w:t xml:space="preserve">A 200 × 200 image has </w:t>
+      </w:r>
+      <w:r>
+        <w:rPr>
+          <w:rFonts w:ascii="Arial" w:hAnsi="Arial" w:cs="Arial"/>
+          <w:b/>
+          <w:bCs/>
+          <w:sz w:val="32"/>
+          <w:szCs w:val="32"/>
+        </w:rPr>
+        <w:t>40,000 pixels</w:t>
+      </w:r>
+      <w:r>
+        <w:rPr>
+          <w:rFonts w:ascii="Arial" w:hAnsi="Arial" w:cs="Arial"/>
+          <w:sz w:val="32"/>
+          <w:szCs w:val="32"/>
+        </w:rPr>
+        <w:t>.</w:t>
+      </w:r>
+    </w:p>
+    <w:p>
+      <w:pPr>
+        <w:pStyle w:val="ListParagraph"/>
+        <w:rPr>
+          <w:rFonts w:ascii="Arial" w:hAnsi="Arial" w:cs="Arial"/>
+          <w:sz w:val="32"/>
+          <w:szCs w:val="32"/>
+        </w:rPr>
+      </w:pPr>
+      <w:r>
+        <w:rPr>
+          <w:rFonts w:ascii="Arial" w:hAnsi="Arial" w:cs="Arial"/>
+          <w:sz w:val="32"/>
+          <w:szCs w:val="32"/>
+        </w:rPr>
+        <w:t xml:space="preserve">After resizing to 800 × 800, it has </w:t>
+      </w:r>
+      <w:r>
+        <w:rPr>
+          <w:rFonts w:ascii="Arial" w:hAnsi="Arial" w:cs="Arial"/>
+          <w:b/>
+          <w:bCs/>
+          <w:sz w:val="32"/>
+          <w:szCs w:val="32"/>
+        </w:rPr>
+        <w:t>640,000 pixels</w:t>
+      </w:r>
+      <w:r>
+        <w:rPr>
+          <w:rFonts w:ascii="Arial" w:hAnsi="Arial" w:cs="Arial"/>
+          <w:sz w:val="32"/>
+          <w:szCs w:val="32"/>
+        </w:rPr>
+        <w:t>.</w:t>
+      </w:r>
+    </w:p>
+    <w:p>
+      <w:pPr>
+        <w:pStyle w:val="ListParagraph"/>
+        <w:rPr>
+          <w:rFonts w:ascii="Arial" w:hAnsi="Arial" w:cs="Arial"/>
+          <w:sz w:val="32"/>
+          <w:szCs w:val="32"/>
+        </w:rPr>
+      </w:pPr>
+      <w:r>
+        <w:rPr>
+          <w:rFonts w:ascii="Arial" w:hAnsi="Arial" w:cs="Arial"/>
+          <w:b/>
+          <w:bCs/>
+          <w:sz w:val="32"/>
+          <w:szCs w:val="32"/>
+        </w:rPr>
+        <w:t>Where did the extra pixels come from?</w:t>
+      </w:r>
+    </w:p>
+    <w:p>
+      <w:pPr>
+        <w:pStyle w:val="ListParagraph"/>
+        <w:rPr>
+          <w:rFonts w:ascii="Arial" w:hAnsi="Arial" w:cs="Arial"/>
+          <w:sz w:val="32"/>
+          <w:szCs w:val="32"/>
+        </w:rPr>
+      </w:pPr>
+      <w:r>
+        <w:rPr>
+          <w:rFonts w:ascii="Arial" w:hAnsi="Arial" w:cs="Arial"/>
+          <w:sz w:val="32"/>
+          <w:szCs w:val="32"/>
+        </w:rPr>
+        <w:t xml:space="preserve">Very good attempt. </w:t>
+      </w:r>
+      <w:r>
+        <w:rPr>
+          <w:rFonts w:ascii="Segoe UI Emoji" w:hAnsi="Segoe UI Emoji" w:cs="Segoe UI Emoji"/>
+          <w:sz w:val="32"/>
+          <w:szCs w:val="32"/>
+        </w:rPr>
+        <w:t>👍</w:t>
+      </w:r>
+      <w:r>
+        <w:rPr>
+          <w:rFonts w:ascii="Arial" w:hAnsi="Arial" w:cs="Arial"/>
+          <w:sz w:val="32"/>
+          <w:szCs w:val="32"/>
+        </w:rPr>
+        <w:t xml:space="preserve"> You're thinking about what </w:t>
+      </w:r>
+      <w:r>
+        <w:rPr>
+          <w:rFonts w:ascii="Arial" w:hAnsi="Arial" w:cs="Arial"/>
+          <w:b/>
+          <w:bCs/>
+          <w:sz w:val="32"/>
+          <w:szCs w:val="32"/>
+        </w:rPr>
+        <w:t>happens to the image</w:t>
+      </w:r>
+      <w:r>
+        <w:rPr>
+          <w:rFonts w:ascii="Arial" w:hAnsi="Arial" w:cs="Arial"/>
+          <w:sz w:val="32"/>
+          <w:szCs w:val="32"/>
+        </w:rPr>
+        <w:t>, but my question was slightly different.</w:t>
+      </w:r>
+    </w:p>
+    <w:p>
+      <w:pPr>
+        <w:pStyle w:val="ListParagraph"/>
+        <w:rPr>
+          <w:rFonts w:ascii="Arial" w:hAnsi="Arial" w:cs="Arial"/>
+          <w:sz w:val="32"/>
+          <w:szCs w:val="32"/>
+        </w:rPr>
+      </w:pPr>
+      <w:r>
+        <w:rPr>
+          <w:rFonts w:ascii="Arial" w:hAnsi="Arial" w:cs="Arial"/>
+          <w:sz w:val="32"/>
+          <w:szCs w:val="32"/>
+        </w:rPr>
+        <w:t>I asked:</w:t>
+      </w:r>
+    </w:p>
+    <w:p>
+      <w:pPr>
+        <w:pStyle w:val="ListParagraph"/>
+        <w:rPr>
+          <w:rFonts w:ascii="Arial" w:hAnsi="Arial" w:cs="Arial"/>
+          <w:sz w:val="32"/>
+          <w:szCs w:val="32"/>
+        </w:rPr>
+      </w:pPr>
+      <w:r>
+        <w:rPr>
+          <w:rFonts w:ascii="Arial" w:hAnsi="Arial" w:cs="Arial"/>
+          <w:b/>
+          <w:bCs/>
+          <w:sz w:val="32"/>
+          <w:szCs w:val="32"/>
+        </w:rPr>
+        <w:t>Where do the NEW pixels come from?</w:t>
+      </w:r>
+    </w:p>
+    <w:p>
+      <w:pPr>
+        <w:pStyle w:val="ListParagraph"/>
+        <w:rPr>
+          <w:rFonts w:ascii="Arial" w:hAnsi="Arial" w:cs="Arial"/>
+          <w:sz w:val="32"/>
+          <w:szCs w:val="32"/>
+        </w:rPr>
+      </w:pPr>
+      <w:r>
+        <w:rPr>
+          <w:rFonts w:ascii="Arial" w:hAnsi="Arial" w:cs="Arial"/>
+          <w:sz w:val="32"/>
+          <w:szCs w:val="32"/>
+        </w:rPr>
+        <w:t>Your answer:</w:t>
+      </w:r>
+    </w:p>
+    <w:p>
+      <w:pPr>
+        <w:pStyle w:val="ListParagraph"/>
+        <w:rPr>
+          <w:rFonts w:ascii="Arial" w:hAnsi="Arial" w:cs="Arial"/>
+          <w:sz w:val="32"/>
+          <w:szCs w:val="32"/>
+        </w:rPr>
+      </w:pPr>
+      <w:r>
+        <w:rPr>
+          <w:rFonts w:ascii="Arial" w:hAnsi="Arial" w:cs="Arial"/>
+          <w:sz w:val="32"/>
+          <w:szCs w:val="32"/>
+        </w:rPr>
+        <w:t>"It will get stretched like it will become wider and height will also increase."</w:t>
+      </w:r>
+    </w:p>
+    <w:p>
+      <w:pPr>
+        <w:pStyle w:val="ListParagraph"/>
+        <w:rPr>
+          <w:rFonts w:ascii="Arial" w:hAnsi="Arial" w:cs="Arial"/>
+          <w:b/>
+          <w:bCs/>
+          <w:sz w:val="32"/>
+          <w:szCs w:val="32"/>
+        </w:rPr>
+      </w:pPr>
+      <w:r>
+        <w:rPr>
+          <w:rFonts w:ascii="Segoe UI Emoji" w:hAnsi="Segoe UI Emoji" w:cs="Segoe UI Emoji"/>
+          <w:b/>
+          <w:bCs/>
+          <w:sz w:val="32"/>
+          <w:szCs w:val="32"/>
+        </w:rPr>
+        <w:t>⭐</w:t>
+      </w:r>
+      <w:r>
+        <w:rPr>
+          <w:rFonts w:ascii="Arial" w:hAnsi="Arial" w:cs="Arial"/>
+          <w:b/>
+          <w:bCs/>
+          <w:sz w:val="32"/>
+          <w:szCs w:val="32"/>
+        </w:rPr>
+        <w:t xml:space="preserve"> I'd give this 7/10.</w:t>
+      </w:r>
+    </w:p>
+    <w:p>
+      <w:pPr>
+        <w:pStyle w:val="ListParagraph"/>
+        <w:rPr>
+          <w:rFonts w:ascii="Arial" w:hAnsi="Arial" w:cs="Arial"/>
+          <w:sz w:val="32"/>
+          <w:szCs w:val="32"/>
+        </w:rPr>
+      </w:pPr>
+      <w:r>
+        <w:rPr>
+          <w:rFonts w:ascii="Arial" w:hAnsi="Arial" w:cs="Arial"/>
+          <w:sz w:val="32"/>
+          <w:szCs w:val="32"/>
+        </w:rPr>
+        <w:t xml:space="preserve">You correctly explained the </w:t>
+      </w:r>
+      <w:r>
+        <w:rPr>
+          <w:rFonts w:ascii="Arial" w:hAnsi="Arial" w:cs="Arial"/>
+          <w:b/>
+          <w:bCs/>
+          <w:sz w:val="32"/>
+          <w:szCs w:val="32"/>
+        </w:rPr>
+        <w:t>effect</w:t>
+      </w:r>
+      <w:r>
+        <w:rPr>
+          <w:rFonts w:ascii="Arial" w:hAnsi="Arial" w:cs="Arial"/>
+          <w:sz w:val="32"/>
+          <w:szCs w:val="32"/>
+        </w:rPr>
+        <w:t xml:space="preserve"> of resizing, but not </w:t>
+      </w:r>
+      <w:r>
+        <w:rPr>
+          <w:rFonts w:ascii="Arial" w:hAnsi="Arial" w:cs="Arial"/>
+          <w:b/>
+          <w:bCs/>
+          <w:sz w:val="32"/>
+          <w:szCs w:val="32"/>
+        </w:rPr>
+        <w:t>how the computer creates the extra pixels</w:t>
+      </w:r>
+      <w:r>
+        <w:rPr>
+          <w:rFonts w:ascii="Arial" w:hAnsi="Arial" w:cs="Arial"/>
+          <w:sz w:val="32"/>
+          <w:szCs w:val="32"/>
+        </w:rPr>
+        <w:t>.</w:t>
+      </w:r>
+    </w:p>
+    <w:p>
+      <w:pPr>
+        <w:pStyle w:val="ListParagraph"/>
+        <w:rPr>
+          <w:rFonts w:ascii="Arial" w:hAnsi="Arial" w:cs="Arial"/>
+          <w:sz w:val="32"/>
+          <w:szCs w:val="32"/>
+        </w:rPr>
+      </w:pPr>
+      <w:r>
+        <w:rPr>
+          <w:rFonts w:ascii="Arial" w:hAnsi="Arial" w:cs="Arial"/>
+          <w:sz w:val="32"/>
+          <w:szCs w:val="32"/>
+        </w:rPr>
+        <w:pict w14:anchorId="68E9C0E4">
+          <v:rect id="_x0000_i1055" style="width:0;height:1.5pt" o:hralign="center" o:hrstd="t" o:hr="t" fillcolor="#a0a0a0" stroked="f"/>
+        </w:pict>
+      </w:r>
+    </w:p>
+    <w:p>
+      <w:pPr>
+        <w:pStyle w:val="ListParagraph"/>
+        <w:rPr>
+          <w:rFonts w:ascii="Arial" w:hAnsi="Arial" w:cs="Arial"/>
+          <w:b/>
+          <w:bCs/>
+          <w:sz w:val="32"/>
+          <w:szCs w:val="32"/>
+        </w:rPr>
+      </w:pPr>
+      <w:r>
+        <w:rPr>
+          <w:rFonts w:ascii="Arial" w:hAnsi="Arial" w:cs="Arial"/>
+          <w:b/>
+          <w:bCs/>
+          <w:sz w:val="32"/>
+          <w:szCs w:val="32"/>
+        </w:rPr>
+        <w:t>Let's understand with a simple example.</w:t>
+      </w:r>
+    </w:p>
+    <w:p>
+      <w:pPr>
+        <w:pStyle w:val="ListParagraph"/>
+        <w:rPr>
+          <w:rFonts w:ascii="Arial" w:hAnsi="Arial" w:cs="Arial"/>
+          <w:sz w:val="32"/>
+          <w:szCs w:val="32"/>
+        </w:rPr>
+      </w:pPr>
+      <w:r>
+        <w:rPr>
+          <w:rFonts w:ascii="Arial" w:hAnsi="Arial" w:cs="Arial"/>
+          <w:sz w:val="32"/>
+          <w:szCs w:val="32"/>
+        </w:rPr>
+        <w:t>Imagine we have a very tiny image.</w:t>
+      </w:r>
+    </w:p>
+    <w:p>
+      <w:pPr>
+        <w:pStyle w:val="ListParagraph"/>
+        <w:rPr>
+          <w:rFonts w:ascii="Arial" w:hAnsi="Arial" w:cs="Arial"/>
+          <w:sz w:val="32"/>
+          <w:szCs w:val="32"/>
+        </w:rPr>
+      </w:pPr>
+      <w:r>
+        <w:rPr>
+          <w:rFonts w:ascii="Arial" w:hAnsi="Arial" w:cs="Arial"/>
+          <w:sz w:val="32"/>
+          <w:szCs w:val="32"/>
+        </w:rPr>
+        <w:t xml:space="preserve">It has only </w:t>
+      </w:r>
+      <w:r>
+        <w:rPr>
+          <w:rFonts w:ascii="Arial" w:hAnsi="Arial" w:cs="Arial"/>
+          <w:b/>
+          <w:bCs/>
+          <w:sz w:val="32"/>
+          <w:szCs w:val="32"/>
+        </w:rPr>
+        <w:t>2 × 2 pixels</w:t>
+      </w:r>
+      <w:r>
+        <w:rPr>
+          <w:rFonts w:ascii="Arial" w:hAnsi="Arial" w:cs="Arial"/>
+          <w:sz w:val="32"/>
+          <w:szCs w:val="32"/>
+        </w:rPr>
+        <w:t>.</w:t>
+      </w:r>
+    </w:p>
+    <w:p>
+      <w:pPr>
+        <w:pStyle w:val="ListParagraph"/>
+        <w:rPr>
+          <w:rFonts w:ascii="Arial" w:hAnsi="Arial" w:cs="Arial"/>
+          <w:sz w:val="32"/>
+          <w:szCs w:val="32"/>
+        </w:rPr>
+      </w:pPr>
+      <w:r>
+        <w:rPr>
+          <w:rFonts w:ascii="Arial" w:hAnsi="Arial" w:cs="Arial"/>
+          <w:sz w:val="32"/>
+          <w:szCs w:val="32"/>
+        </w:rPr>
+        <w:t>A   B</w:t>
+      </w:r>
+    </w:p>
+    <w:p>
+      <w:pPr>
+        <w:pStyle w:val="ListParagraph"/>
+        <w:rPr>
+          <w:rFonts w:ascii="Arial" w:hAnsi="Arial" w:cs="Arial"/>
+          <w:sz w:val="32"/>
+          <w:szCs w:val="32"/>
+        </w:rPr>
+      </w:pPr>
+    </w:p>
+    <w:p>
+      <w:pPr>
+        <w:pStyle w:val="ListParagraph"/>
+        <w:rPr>
+          <w:rFonts w:ascii="Arial" w:hAnsi="Arial" w:cs="Arial"/>
+          <w:sz w:val="32"/>
+          <w:szCs w:val="32"/>
+        </w:rPr>
+      </w:pPr>
+      <w:r>
+        <w:rPr>
+          <w:rFonts w:ascii="Arial" w:hAnsi="Arial" w:cs="Arial"/>
+          <w:sz w:val="32"/>
+          <w:szCs w:val="32"/>
+        </w:rPr>
+        <w:t>C   D</w:t>
+      </w:r>
+    </w:p>
+    <w:p>
+      <w:pPr>
+        <w:pStyle w:val="ListParagraph"/>
+        <w:rPr>
+          <w:rFonts w:ascii="Arial" w:hAnsi="Arial" w:cs="Arial"/>
+          <w:sz w:val="32"/>
+          <w:szCs w:val="32"/>
+        </w:rPr>
+      </w:pPr>
+      <w:r>
+        <w:rPr>
+          <w:rFonts w:ascii="Arial" w:hAnsi="Arial" w:cs="Arial"/>
+          <w:sz w:val="32"/>
+          <w:szCs w:val="32"/>
+        </w:rPr>
+        <w:t xml:space="preserve">Now we resize it to </w:t>
+      </w:r>
+      <w:r>
+        <w:rPr>
+          <w:rFonts w:ascii="Arial" w:hAnsi="Arial" w:cs="Arial"/>
+          <w:b/>
+          <w:bCs/>
+          <w:sz w:val="32"/>
+          <w:szCs w:val="32"/>
+        </w:rPr>
+        <w:t>4 × 4</w:t>
+      </w:r>
+      <w:r>
+        <w:rPr>
+          <w:rFonts w:ascii="Arial" w:hAnsi="Arial" w:cs="Arial"/>
+          <w:sz w:val="32"/>
+          <w:szCs w:val="32"/>
+        </w:rPr>
+        <w:t>.</w:t>
+      </w:r>
+    </w:p>
+    <w:p>
+      <w:pPr>
+        <w:pStyle w:val="ListParagraph"/>
+        <w:rPr>
+          <w:rFonts w:ascii="Arial" w:hAnsi="Arial" w:cs="Arial"/>
+          <w:sz w:val="32"/>
+          <w:szCs w:val="32"/>
+        </w:rPr>
+      </w:pPr>
+      <w:r>
+        <w:rPr>
+          <w:rFonts w:ascii="Arial" w:hAnsi="Arial" w:cs="Arial"/>
+          <w:sz w:val="32"/>
+          <w:szCs w:val="32"/>
+        </w:rPr>
+        <w:t xml:space="preserve">Suddenly, we need </w:t>
+      </w:r>
+      <w:r>
+        <w:rPr>
+          <w:rFonts w:ascii="Arial" w:hAnsi="Arial" w:cs="Arial"/>
+          <w:b/>
+          <w:bCs/>
+          <w:sz w:val="32"/>
+          <w:szCs w:val="32"/>
+        </w:rPr>
+        <w:t>16 pixels</w:t>
+      </w:r>
+      <w:r>
+        <w:rPr>
+          <w:rFonts w:ascii="Arial" w:hAnsi="Arial" w:cs="Arial"/>
+          <w:sz w:val="32"/>
+          <w:szCs w:val="32"/>
+        </w:rPr>
+        <w:t xml:space="preserve"> instead of </w:t>
+      </w:r>
+      <w:r>
+        <w:rPr>
+          <w:rFonts w:ascii="Arial" w:hAnsi="Arial" w:cs="Arial"/>
+          <w:b/>
+          <w:bCs/>
+          <w:sz w:val="32"/>
+          <w:szCs w:val="32"/>
+        </w:rPr>
+        <w:t>4</w:t>
+      </w:r>
+      <w:r>
+        <w:rPr>
+          <w:rFonts w:ascii="Arial" w:hAnsi="Arial" w:cs="Arial"/>
+          <w:sz w:val="32"/>
+          <w:szCs w:val="32"/>
+        </w:rPr>
+        <w:t>.</w:t>
+      </w:r>
+    </w:p>
+    <w:p>
+      <w:pPr>
+        <w:pStyle w:val="ListParagraph"/>
+        <w:rPr>
+          <w:rFonts w:ascii="Arial" w:hAnsi="Arial" w:cs="Arial"/>
+          <w:sz w:val="32"/>
+          <w:szCs w:val="32"/>
+        </w:rPr>
+      </w:pPr>
+      <w:r>
+        <w:rPr>
+          <w:rFonts w:ascii="Arial" w:hAnsi="Arial" w:cs="Arial"/>
+          <w:sz w:val="32"/>
+          <w:szCs w:val="32"/>
+        </w:rPr>
+        <w:t>Where did the extra 12 pixels come from?</w:t>
+      </w:r>
+    </w:p>
+    <w:p>
+      <w:pPr>
+        <w:pStyle w:val="ListParagraph"/>
+        <w:rPr>
+          <w:rFonts w:ascii="Arial" w:hAnsi="Arial" w:cs="Arial"/>
+          <w:sz w:val="32"/>
+          <w:szCs w:val="32"/>
+        </w:rPr>
+      </w:pPr>
+      <w:r>
+        <w:rPr>
+          <w:rFonts w:ascii="Arial" w:hAnsi="Arial" w:cs="Arial"/>
+          <w:sz w:val="32"/>
+          <w:szCs w:val="32"/>
+        </w:rPr>
+        <w:t xml:space="preserve">Can the computer magically know the real </w:t>
+      </w:r>
+      <w:proofErr w:type="spellStart"/>
+      <w:r>
+        <w:rPr>
+          <w:rFonts w:ascii="Arial" w:hAnsi="Arial" w:cs="Arial"/>
+          <w:sz w:val="32"/>
+          <w:szCs w:val="32"/>
+        </w:rPr>
+        <w:t>colors</w:t>
+      </w:r>
+      <w:proofErr w:type="spellEnd"/>
+      <w:r>
+        <w:rPr>
+          <w:rFonts w:ascii="Arial" w:hAnsi="Arial" w:cs="Arial"/>
+          <w:sz w:val="32"/>
+          <w:szCs w:val="32"/>
+        </w:rPr>
+        <w:t>?</w:t>
+      </w:r>
+    </w:p>
+    <w:p>
+      <w:pPr>
+        <w:pStyle w:val="ListParagraph"/>
+        <w:rPr>
+          <w:rFonts w:ascii="Arial" w:hAnsi="Arial" w:cs="Arial"/>
+          <w:sz w:val="32"/>
+          <w:szCs w:val="32"/>
+        </w:rPr>
+      </w:pPr>
+      <w:r>
+        <w:rPr>
+          <w:rFonts w:ascii="Segoe UI Emoji" w:hAnsi="Segoe UI Emoji" w:cs="Segoe UI Emoji"/>
+          <w:sz w:val="32"/>
+          <w:szCs w:val="32"/>
+        </w:rPr>
+        <w:t>❌</w:t>
+      </w:r>
+      <w:r>
+        <w:rPr>
+          <w:rFonts w:ascii="Arial" w:hAnsi="Arial" w:cs="Arial"/>
+          <w:sz w:val="32"/>
+          <w:szCs w:val="32"/>
+        </w:rPr>
+        <w:t xml:space="preserve"> No.</w:t>
+      </w:r>
+    </w:p>
+    <w:p>
+      <w:pPr>
+        <w:pStyle w:val="ListParagraph"/>
+        <w:rPr>
+          <w:rFonts w:ascii="Arial" w:hAnsi="Arial" w:cs="Arial"/>
+          <w:sz w:val="32"/>
+          <w:szCs w:val="32"/>
+        </w:rPr>
+      </w:pPr>
+      <w:r>
+        <w:rPr>
+          <w:rFonts w:ascii="Arial" w:hAnsi="Arial" w:cs="Arial"/>
+          <w:sz w:val="32"/>
+          <w:szCs w:val="32"/>
+        </w:rPr>
+        <w:t xml:space="preserve">Instead, it </w:t>
+      </w:r>
+      <w:r>
+        <w:rPr>
+          <w:rFonts w:ascii="Arial" w:hAnsi="Arial" w:cs="Arial"/>
+          <w:b/>
+          <w:bCs/>
+          <w:sz w:val="32"/>
+          <w:szCs w:val="32"/>
+        </w:rPr>
+        <w:t xml:space="preserve">looks at the </w:t>
+      </w:r>
+      <w:proofErr w:type="spellStart"/>
+      <w:r>
+        <w:rPr>
+          <w:rFonts w:ascii="Arial" w:hAnsi="Arial" w:cs="Arial"/>
+          <w:b/>
+          <w:bCs/>
+          <w:sz w:val="32"/>
+          <w:szCs w:val="32"/>
+        </w:rPr>
+        <w:t>neighboring</w:t>
+      </w:r>
+      <w:proofErr w:type="spellEnd"/>
+      <w:r>
+        <w:rPr>
+          <w:rFonts w:ascii="Arial" w:hAnsi="Arial" w:cs="Arial"/>
+          <w:b/>
+          <w:bCs/>
+          <w:sz w:val="32"/>
+          <w:szCs w:val="32"/>
+        </w:rPr>
+        <w:t xml:space="preserve"> pixels and estimates</w:t>
+      </w:r>
+      <w:r>
+        <w:rPr>
+          <w:rFonts w:ascii="Arial" w:hAnsi="Arial" w:cs="Arial"/>
+          <w:sz w:val="32"/>
+          <w:szCs w:val="32"/>
+        </w:rPr>
+        <w:t xml:space="preserve"> what the new pixels should be.</w:t>
+      </w:r>
+    </w:p>
+    <w:p>
+      <w:pPr>
+        <w:pStyle w:val="ListParagraph"/>
+        <w:rPr>
+          <w:rFonts w:ascii="Arial" w:hAnsi="Arial" w:cs="Arial"/>
+          <w:sz w:val="32"/>
+          <w:szCs w:val="32"/>
+        </w:rPr>
+      </w:pPr>
+      <w:r>
+        <w:rPr>
+          <w:rFonts w:ascii="Arial" w:hAnsi="Arial" w:cs="Arial"/>
+          <w:sz w:val="32"/>
+          <w:szCs w:val="32"/>
+        </w:rPr>
+        <w:t>For example:</w:t>
+      </w:r>
+    </w:p>
+    <w:p>
+      <w:pPr>
+        <w:pStyle w:val="ListParagraph"/>
+        <w:rPr>
+          <w:rFonts w:ascii="Arial" w:hAnsi="Arial" w:cs="Arial"/>
+          <w:sz w:val="32"/>
+          <w:szCs w:val="32"/>
+        </w:rPr>
+      </w:pPr>
+      <w:r>
+        <w:rPr>
+          <w:rFonts w:ascii="Arial" w:hAnsi="Arial" w:cs="Arial"/>
+          <w:sz w:val="32"/>
+          <w:szCs w:val="32"/>
+        </w:rPr>
+        <w:lastRenderedPageBreak/>
+        <w:t>Original</w:t>
+      </w:r>
+    </w:p>
+    <w:p>
+      <w:pPr>
+        <w:pStyle w:val="ListParagraph"/>
+        <w:rPr>
+          <w:rFonts w:ascii="Arial" w:hAnsi="Arial" w:cs="Arial"/>
+          <w:sz w:val="32"/>
+          <w:szCs w:val="32"/>
+        </w:rPr>
+      </w:pPr>
+    </w:p>
+    <w:p>
+      <w:pPr>
+        <w:pStyle w:val="ListParagraph"/>
+        <w:rPr>
+          <w:rFonts w:ascii="Arial" w:hAnsi="Arial" w:cs="Arial"/>
+          <w:sz w:val="32"/>
+          <w:szCs w:val="32"/>
+        </w:rPr>
+      </w:pPr>
+      <w:r>
+        <w:rPr>
+          <w:rFonts w:ascii="Arial" w:hAnsi="Arial" w:cs="Arial"/>
+          <w:sz w:val="32"/>
+          <w:szCs w:val="32"/>
+        </w:rPr>
+        <w:t>A       B</w:t>
+      </w:r>
+    </w:p>
+    <w:p>
+      <w:pPr>
+        <w:pStyle w:val="ListParagraph"/>
+        <w:rPr>
+          <w:rFonts w:ascii="Arial" w:hAnsi="Arial" w:cs="Arial"/>
+          <w:sz w:val="32"/>
+          <w:szCs w:val="32"/>
+        </w:rPr>
+      </w:pPr>
+    </w:p>
+    <w:p>
+      <w:pPr>
+        <w:pStyle w:val="ListParagraph"/>
+        <w:rPr>
+          <w:rFonts w:ascii="Arial" w:hAnsi="Arial" w:cs="Arial"/>
+          <w:sz w:val="32"/>
+          <w:szCs w:val="32"/>
+        </w:rPr>
+      </w:pPr>
+    </w:p>
+    <w:p>
+      <w:pPr>
+        <w:pStyle w:val="ListParagraph"/>
+        <w:rPr>
+          <w:rFonts w:ascii="Arial" w:hAnsi="Arial" w:cs="Arial"/>
+          <w:sz w:val="32"/>
+          <w:szCs w:val="32"/>
+        </w:rPr>
+      </w:pPr>
+      <w:r>
+        <w:rPr>
+          <w:rFonts w:ascii="Arial" w:hAnsi="Arial" w:cs="Arial"/>
+          <w:sz w:val="32"/>
+          <w:szCs w:val="32"/>
+        </w:rPr>
+        <w:t>C       D</w:t>
+      </w:r>
+    </w:p>
+    <w:p>
+      <w:pPr>
+        <w:pStyle w:val="ListParagraph"/>
+        <w:rPr>
+          <w:rFonts w:ascii="Arial" w:hAnsi="Arial" w:cs="Arial"/>
+          <w:sz w:val="32"/>
+          <w:szCs w:val="32"/>
+        </w:rPr>
+      </w:pPr>
+      <w:r>
+        <w:rPr>
+          <w:rFonts w:ascii="Arial" w:hAnsi="Arial" w:cs="Arial"/>
+          <w:sz w:val="32"/>
+          <w:szCs w:val="32"/>
+        </w:rPr>
+        <w:t>After resizing, OpenCV may create something like:</w:t>
+      </w:r>
+    </w:p>
+    <w:p>
+      <w:pPr>
+        <w:pStyle w:val="ListParagraph"/>
+        <w:rPr>
+          <w:rFonts w:ascii="Arial" w:hAnsi="Arial" w:cs="Arial"/>
+          <w:sz w:val="32"/>
+          <w:szCs w:val="32"/>
+        </w:rPr>
+      </w:pPr>
+      <w:proofErr w:type="gramStart"/>
+      <w:r>
+        <w:rPr>
+          <w:rFonts w:ascii="Arial" w:hAnsi="Arial" w:cs="Arial"/>
+          <w:sz w:val="32"/>
+          <w:szCs w:val="32"/>
+        </w:rPr>
+        <w:t>A</w:t>
+      </w:r>
+      <w:proofErr w:type="gramEnd"/>
+      <w:r>
+        <w:rPr>
+          <w:rFonts w:ascii="Arial" w:hAnsi="Arial" w:cs="Arial"/>
+          <w:sz w:val="32"/>
+          <w:szCs w:val="32"/>
+        </w:rPr>
+        <w:t xml:space="preserve">   AB   </w:t>
+      </w:r>
+      <w:proofErr w:type="spellStart"/>
+      <w:r>
+        <w:rPr>
+          <w:rFonts w:ascii="Arial" w:hAnsi="Arial" w:cs="Arial"/>
+          <w:sz w:val="32"/>
+          <w:szCs w:val="32"/>
+        </w:rPr>
+        <w:t>AB</w:t>
+      </w:r>
+      <w:proofErr w:type="spellEnd"/>
+      <w:r>
+        <w:rPr>
+          <w:rFonts w:ascii="Arial" w:hAnsi="Arial" w:cs="Arial"/>
+          <w:sz w:val="32"/>
+          <w:szCs w:val="32"/>
+        </w:rPr>
+        <w:t xml:space="preserve">   B</w:t>
+      </w:r>
+    </w:p>
+    <w:p>
+      <w:pPr>
+        <w:pStyle w:val="ListParagraph"/>
+        <w:rPr>
+          <w:rFonts w:ascii="Arial" w:hAnsi="Arial" w:cs="Arial"/>
+          <w:sz w:val="32"/>
+          <w:szCs w:val="32"/>
+        </w:rPr>
+      </w:pPr>
+    </w:p>
+    <w:p>
+      <w:pPr>
+        <w:pStyle w:val="ListParagraph"/>
+        <w:rPr>
+          <w:rFonts w:ascii="Arial" w:hAnsi="Arial" w:cs="Arial"/>
+          <w:sz w:val="32"/>
+          <w:szCs w:val="32"/>
+        </w:rPr>
+      </w:pPr>
+      <w:proofErr w:type="gramStart"/>
+      <w:r>
+        <w:rPr>
+          <w:rFonts w:ascii="Arial" w:hAnsi="Arial" w:cs="Arial"/>
+          <w:sz w:val="32"/>
+          <w:szCs w:val="32"/>
+        </w:rPr>
+        <w:t>AC  X</w:t>
+      </w:r>
+      <w:proofErr w:type="gramEnd"/>
+      <w:r>
+        <w:rPr>
+          <w:rFonts w:ascii="Arial" w:hAnsi="Arial" w:cs="Arial"/>
+          <w:sz w:val="32"/>
+          <w:szCs w:val="32"/>
+        </w:rPr>
+        <w:t xml:space="preserve">    Y    BD</w:t>
+      </w:r>
+    </w:p>
+    <w:p>
+      <w:pPr>
+        <w:pStyle w:val="ListParagraph"/>
+        <w:rPr>
+          <w:rFonts w:ascii="Arial" w:hAnsi="Arial" w:cs="Arial"/>
+          <w:sz w:val="32"/>
+          <w:szCs w:val="32"/>
+        </w:rPr>
+      </w:pPr>
+    </w:p>
+    <w:p>
+      <w:pPr>
+        <w:pStyle w:val="ListParagraph"/>
+        <w:rPr>
+          <w:rFonts w:ascii="Arial" w:hAnsi="Arial" w:cs="Arial"/>
+          <w:sz w:val="32"/>
+          <w:szCs w:val="32"/>
+        </w:rPr>
+      </w:pPr>
+      <w:proofErr w:type="gramStart"/>
+      <w:r>
+        <w:rPr>
+          <w:rFonts w:ascii="Arial" w:hAnsi="Arial" w:cs="Arial"/>
+          <w:sz w:val="32"/>
+          <w:szCs w:val="32"/>
+        </w:rPr>
+        <w:t>AC  Z</w:t>
+      </w:r>
+      <w:proofErr w:type="gramEnd"/>
+      <w:r>
+        <w:rPr>
+          <w:rFonts w:ascii="Arial" w:hAnsi="Arial" w:cs="Arial"/>
+          <w:sz w:val="32"/>
+          <w:szCs w:val="32"/>
+        </w:rPr>
+        <w:t xml:space="preserve">    W    BD</w:t>
+      </w:r>
+    </w:p>
+    <w:p>
+      <w:pPr>
+        <w:pStyle w:val="ListParagraph"/>
+        <w:rPr>
+          <w:rFonts w:ascii="Arial" w:hAnsi="Arial" w:cs="Arial"/>
+          <w:sz w:val="32"/>
+          <w:szCs w:val="32"/>
+        </w:rPr>
+      </w:pPr>
+    </w:p>
+    <w:p>
+      <w:pPr>
+        <w:pStyle w:val="ListParagraph"/>
+        <w:rPr>
+          <w:rFonts w:ascii="Arial" w:hAnsi="Arial" w:cs="Arial"/>
+          <w:sz w:val="32"/>
+          <w:szCs w:val="32"/>
+        </w:rPr>
+      </w:pPr>
+      <w:r>
+        <w:rPr>
+          <w:rFonts w:ascii="Arial" w:hAnsi="Arial" w:cs="Arial"/>
+          <w:sz w:val="32"/>
+          <w:szCs w:val="32"/>
+        </w:rPr>
+        <w:t xml:space="preserve">C   CD   </w:t>
+      </w:r>
+      <w:proofErr w:type="spellStart"/>
+      <w:r>
+        <w:rPr>
+          <w:rFonts w:ascii="Arial" w:hAnsi="Arial" w:cs="Arial"/>
+          <w:sz w:val="32"/>
+          <w:szCs w:val="32"/>
+        </w:rPr>
+        <w:t>CD</w:t>
+      </w:r>
+      <w:proofErr w:type="spellEnd"/>
+      <w:r>
+        <w:rPr>
+          <w:rFonts w:ascii="Arial" w:hAnsi="Arial" w:cs="Arial"/>
+          <w:sz w:val="32"/>
+          <w:szCs w:val="32"/>
+        </w:rPr>
+        <w:t xml:space="preserve">   D</w:t>
+      </w:r>
+    </w:p>
+    <w:p>
+      <w:pPr>
+        <w:pStyle w:val="ListParagraph"/>
+        <w:rPr>
+          <w:rFonts w:ascii="Arial" w:hAnsi="Arial" w:cs="Arial"/>
+          <w:sz w:val="32"/>
+          <w:szCs w:val="32"/>
+        </w:rPr>
+      </w:pPr>
+      <w:r>
+        <w:rPr>
+          <w:rFonts w:ascii="Arial" w:hAnsi="Arial" w:cs="Arial"/>
+          <w:sz w:val="32"/>
+          <w:szCs w:val="32"/>
+        </w:rPr>
+        <w:t xml:space="preserve">The pixels </w:t>
+      </w:r>
+      <w:r>
+        <w:rPr>
+          <w:rFonts w:ascii="Arial" w:hAnsi="Arial" w:cs="Arial"/>
+          <w:b/>
+          <w:bCs/>
+          <w:sz w:val="32"/>
+          <w:szCs w:val="32"/>
+        </w:rPr>
+        <w:t>AB, AC, X, Y, Z, W, CD</w:t>
+      </w:r>
+      <w:r>
+        <w:rPr>
+          <w:rFonts w:ascii="Arial" w:hAnsi="Arial" w:cs="Arial"/>
+          <w:sz w:val="32"/>
+          <w:szCs w:val="32"/>
+        </w:rPr>
+        <w:t xml:space="preserve"> never existed in the original image.</w:t>
+      </w:r>
+    </w:p>
+    <w:p>
+      <w:pPr>
+        <w:pStyle w:val="ListParagraph"/>
+        <w:rPr>
+          <w:rFonts w:ascii="Arial" w:hAnsi="Arial" w:cs="Arial"/>
+          <w:sz w:val="32"/>
+          <w:szCs w:val="32"/>
+        </w:rPr>
+      </w:pPr>
+      <w:r>
+        <w:rPr>
+          <w:rFonts w:ascii="Arial" w:hAnsi="Arial" w:cs="Arial"/>
+          <w:sz w:val="32"/>
+          <w:szCs w:val="32"/>
+        </w:rPr>
+        <w:t xml:space="preserve">The computer </w:t>
+      </w:r>
+      <w:r>
+        <w:rPr>
+          <w:rFonts w:ascii="Arial" w:hAnsi="Arial" w:cs="Arial"/>
+          <w:b/>
+          <w:bCs/>
+          <w:sz w:val="32"/>
+          <w:szCs w:val="32"/>
+        </w:rPr>
+        <w:t>calculated</w:t>
+      </w:r>
+      <w:r>
+        <w:rPr>
+          <w:rFonts w:ascii="Arial" w:hAnsi="Arial" w:cs="Arial"/>
+          <w:sz w:val="32"/>
+          <w:szCs w:val="32"/>
+        </w:rPr>
+        <w:t xml:space="preserve"> them by looking at nearby pixels.</w:t>
+      </w:r>
+    </w:p>
+    <w:p>
+      <w:pPr>
+        <w:pStyle w:val="ListParagraph"/>
+        <w:rPr>
+          <w:rFonts w:ascii="Arial" w:hAnsi="Arial" w:cs="Arial"/>
+          <w:sz w:val="32"/>
+          <w:szCs w:val="32"/>
+        </w:rPr>
+      </w:pPr>
+      <w:r>
+        <w:rPr>
+          <w:rFonts w:ascii="Arial" w:hAnsi="Arial" w:cs="Arial"/>
+          <w:sz w:val="32"/>
+          <w:szCs w:val="32"/>
+        </w:rPr>
+        <w:t xml:space="preserve">This process is called </w:t>
+      </w:r>
+      <w:r>
+        <w:rPr>
+          <w:rFonts w:ascii="Arial" w:hAnsi="Arial" w:cs="Arial"/>
+          <w:b/>
+          <w:bCs/>
+          <w:sz w:val="32"/>
+          <w:szCs w:val="32"/>
+        </w:rPr>
+        <w:t>Interpolation</w:t>
+      </w:r>
+      <w:r>
+        <w:rPr>
+          <w:rFonts w:ascii="Arial" w:hAnsi="Arial" w:cs="Arial"/>
+          <w:sz w:val="32"/>
+          <w:szCs w:val="32"/>
+        </w:rPr>
+        <w:t>.</w:t>
+      </w:r>
+    </w:p>
+    <w:p>
+      <w:pPr>
+        <w:pStyle w:val="ListParagraph"/>
+        <w:rPr>
+          <w:rFonts w:ascii="Arial" w:hAnsi="Arial" w:cs="Arial"/>
+          <w:sz w:val="32"/>
+          <w:szCs w:val="32"/>
+        </w:rPr>
+      </w:pPr>
+    </w:p>
+    <w:p>
+      <w:pPr>
+        <w:pStyle w:val="ListParagraph"/>
+        <w:rPr>
+          <w:rFonts w:ascii="Arial" w:hAnsi="Arial" w:cs="Arial"/>
+          <w:sz w:val="32"/>
+          <w:szCs w:val="32"/>
+        </w:rPr>
+      </w:pPr>
+    </w:p>
+    <w:p>
+      <w:pPr>
+        <w:pStyle w:val="ListParagraph"/>
+        <w:numPr>
+          <w:ilvl w:val="0"/>
+          <w:numId w:val="12"/>
+        </w:numPr>
+        <w:rPr>
+          <w:rFonts w:ascii="Algerian" w:hAnsi="Algerian" w:cs="Arial"/>
+          <w:sz w:val="52"/>
+          <w:szCs w:val="52"/>
+        </w:rPr>
+      </w:pPr>
+      <w:r>
+        <w:rPr>
+          <w:rFonts w:ascii="Algerian" w:hAnsi="Algerian" w:cs="Arial"/>
+          <w:sz w:val="52"/>
+          <w:szCs w:val="52"/>
+        </w:rPr>
+        <w:t xml:space="preserve">Interpolation works in exactly the same way, except instead of estimating positions, it estimates </w:t>
+      </w:r>
+      <w:r>
+        <w:rPr>
+          <w:rFonts w:ascii="Algerian" w:hAnsi="Algerian" w:cs="Arial"/>
+          <w:b/>
+          <w:bCs/>
+          <w:sz w:val="52"/>
+          <w:szCs w:val="52"/>
+        </w:rPr>
+        <w:t xml:space="preserve">pixel </w:t>
+      </w:r>
+      <w:proofErr w:type="spellStart"/>
+      <w:r>
+        <w:rPr>
+          <w:rFonts w:ascii="Algerian" w:hAnsi="Algerian" w:cs="Arial"/>
+          <w:b/>
+          <w:bCs/>
+          <w:sz w:val="52"/>
+          <w:szCs w:val="52"/>
+        </w:rPr>
+        <w:t>colors</w:t>
+      </w:r>
+      <w:proofErr w:type="spellEnd"/>
+      <w:r>
+        <w:rPr>
+          <w:rFonts w:ascii="Algerian" w:hAnsi="Algerian" w:cs="Arial"/>
+          <w:sz w:val="52"/>
+          <w:szCs w:val="52"/>
+        </w:rPr>
+        <w:t>.</w:t>
+      </w:r>
+      <w:r>
+        <w:rPr>
+          <w:rFonts w:ascii="Algerian" w:hAnsi="Algerian" w:cs="Arial"/>
+          <w:sz w:val="52"/>
+          <w:szCs w:val="52"/>
+        </w:rPr>
+        <w:br/>
+      </w:r>
+    </w:p>
+    <w:p>
+      <w:pPr>
+        <w:rPr>
+          <w:rFonts w:ascii="Arial" w:hAnsi="Arial" w:cs="Arial"/>
+          <w:sz w:val="36"/>
+          <w:szCs w:val="36"/>
+        </w:rPr>
+      </w:pPr>
+      <w:r>
+        <w:rPr>
+          <w:rFonts w:ascii="Arial" w:hAnsi="Arial" w:cs="Arial"/>
+          <w:sz w:val="36"/>
+          <w:szCs w:val="36"/>
+        </w:rPr>
+        <w:lastRenderedPageBreak/>
+        <w:t xml:space="preserve">Depending on </w:t>
+      </w:r>
+      <w:r>
+        <w:rPr>
+          <w:rFonts w:ascii="Arial" w:hAnsi="Arial" w:cs="Arial"/>
+          <w:b/>
+          <w:bCs/>
+          <w:sz w:val="36"/>
+          <w:szCs w:val="36"/>
+        </w:rPr>
+        <w:t>which interpolation algorithm</w:t>
+      </w:r>
+      <w:r>
+        <w:rPr>
+          <w:rFonts w:ascii="Arial" w:hAnsi="Arial" w:cs="Arial"/>
+          <w:sz w:val="36"/>
+          <w:szCs w:val="36"/>
+        </w:rPr>
+        <w:t xml:space="preserve"> is used, the resized image can be:</w:t>
+      </w:r>
+    </w:p>
+    <w:p>
+      <w:pPr>
+        <w:numPr>
+          <w:ilvl w:val="0"/>
+          <w:numId w:val="13"/>
+        </w:numPr>
+        <w:rPr>
+          <w:rFonts w:ascii="Arial" w:hAnsi="Arial" w:cs="Arial"/>
+          <w:sz w:val="36"/>
+          <w:szCs w:val="36"/>
+        </w:rPr>
+      </w:pPr>
+      <w:r>
+        <w:rPr>
+          <w:rFonts w:ascii="Arial" w:hAnsi="Arial" w:cs="Arial"/>
+          <w:sz w:val="36"/>
+          <w:szCs w:val="36"/>
+        </w:rPr>
+        <w:t xml:space="preserve">Very sharp </w:t>
+      </w:r>
+      <w:r>
+        <w:rPr>
+          <w:rFonts w:ascii="Segoe UI Emoji" w:hAnsi="Segoe UI Emoji" w:cs="Segoe UI Emoji"/>
+          <w:sz w:val="36"/>
+          <w:szCs w:val="36"/>
+        </w:rPr>
+        <w:t>✅</w:t>
+      </w:r>
+      <w:r>
+        <w:rPr>
+          <w:rFonts w:ascii="Arial" w:hAnsi="Arial" w:cs="Arial"/>
+          <w:sz w:val="36"/>
+          <w:szCs w:val="36"/>
+        </w:rPr>
+        <w:t xml:space="preserve"> </w:t>
+      </w:r>
+    </w:p>
+    <w:p>
+      <w:pPr>
+        <w:numPr>
+          <w:ilvl w:val="0"/>
+          <w:numId w:val="13"/>
+        </w:numPr>
+        <w:rPr>
+          <w:rFonts w:ascii="Arial" w:hAnsi="Arial" w:cs="Arial"/>
+          <w:sz w:val="36"/>
+          <w:szCs w:val="36"/>
+        </w:rPr>
+      </w:pPr>
+      <w:r>
+        <w:rPr>
+          <w:rFonts w:ascii="Arial" w:hAnsi="Arial" w:cs="Arial"/>
+          <w:sz w:val="36"/>
+          <w:szCs w:val="36"/>
+        </w:rPr>
+        <w:t xml:space="preserve">Slightly blurry </w:t>
+      </w:r>
+      <w:r>
+        <w:rPr>
+          <w:rFonts w:ascii="Segoe UI Emoji" w:hAnsi="Segoe UI Emoji" w:cs="Segoe UI Emoji"/>
+          <w:sz w:val="36"/>
+          <w:szCs w:val="36"/>
+        </w:rPr>
+        <w:t>✅</w:t>
+      </w:r>
+      <w:r>
+        <w:rPr>
+          <w:rFonts w:ascii="Arial" w:hAnsi="Arial" w:cs="Arial"/>
+          <w:sz w:val="36"/>
+          <w:szCs w:val="36"/>
+        </w:rPr>
+        <w:t xml:space="preserve"> </w:t>
+      </w:r>
+    </w:p>
+    <w:p>
+      <w:pPr>
+        <w:numPr>
+          <w:ilvl w:val="0"/>
+          <w:numId w:val="13"/>
+        </w:numPr>
+        <w:rPr>
+          <w:rFonts w:ascii="Arial" w:hAnsi="Arial" w:cs="Arial"/>
+          <w:sz w:val="36"/>
+          <w:szCs w:val="36"/>
+        </w:rPr>
+      </w:pPr>
+      <w:r>
+        <w:rPr>
+          <w:rFonts w:ascii="Arial" w:hAnsi="Arial" w:cs="Arial"/>
+          <w:sz w:val="36"/>
+          <w:szCs w:val="36"/>
+        </w:rPr>
+        <w:t xml:space="preserve">Pixelated </w:t>
+      </w:r>
+      <w:r>
+        <w:rPr>
+          <w:rFonts w:ascii="Segoe UI Emoji" w:hAnsi="Segoe UI Emoji" w:cs="Segoe UI Emoji"/>
+          <w:sz w:val="36"/>
+          <w:szCs w:val="36"/>
+        </w:rPr>
+        <w:t>✅</w:t>
+      </w:r>
+      <w:r>
+        <w:rPr>
+          <w:rFonts w:ascii="Arial" w:hAnsi="Arial" w:cs="Arial"/>
+          <w:sz w:val="36"/>
+          <w:szCs w:val="36"/>
+        </w:rPr>
+        <w:t xml:space="preserve"> </w:t>
+      </w:r>
+    </w:p>
+    <w:p>
+      <w:pPr>
+        <w:rPr>
+          <w:rFonts w:ascii="Arial" w:hAnsi="Arial" w:cs="Arial"/>
+          <w:sz w:val="36"/>
+          <w:szCs w:val="36"/>
+        </w:rPr>
+      </w:pPr>
+      <w:r>
+        <w:rPr>
+          <w:rFonts w:ascii="Arial" w:hAnsi="Arial" w:cs="Arial"/>
+          <w:sz w:val="36"/>
+          <w:szCs w:val="36"/>
+        </w:rPr>
+        <w:t>That's why OpenCV provides different interpolation methods.</w:t>
+      </w:r>
+    </w:p>
+    <w:p>
+      <w:pPr>
+        <w:rPr>
+          <w:rFonts w:ascii="Arial" w:hAnsi="Arial" w:cs="Arial"/>
+          <w:sz w:val="36"/>
+          <w:szCs w:val="36"/>
+        </w:rPr>
+      </w:pPr>
+      <w:r>
+        <w:rPr>
+          <w:rFonts w:ascii="Arial" w:hAnsi="Arial" w:cs="Arial"/>
+          <w:sz w:val="36"/>
+          <w:szCs w:val="36"/>
+        </w:rPr>
+        <w:t>The most common ones are:</w:t>
+      </w:r>
+    </w:p>
+    <w:p>
+      <w:pPr>
+        <w:numPr>
+          <w:ilvl w:val="0"/>
+          <w:numId w:val="14"/>
+        </w:numPr>
+        <w:rPr>
+          <w:rFonts w:ascii="Arial" w:hAnsi="Arial" w:cs="Arial"/>
+          <w:sz w:val="36"/>
+          <w:szCs w:val="36"/>
+        </w:rPr>
+      </w:pPr>
+      <w:r>
+        <w:rPr>
+          <w:rFonts w:ascii="Arial" w:hAnsi="Arial" w:cs="Arial"/>
+          <w:sz w:val="36"/>
+          <w:szCs w:val="36"/>
+        </w:rPr>
+        <w:t xml:space="preserve">INTER_NEAREST → Fastest, but blocky. </w:t>
+      </w:r>
+    </w:p>
+    <w:p>
+      <w:pPr>
+        <w:numPr>
+          <w:ilvl w:val="0"/>
+          <w:numId w:val="14"/>
+        </w:numPr>
+        <w:rPr>
+          <w:rFonts w:ascii="Arial" w:hAnsi="Arial" w:cs="Arial"/>
+          <w:sz w:val="36"/>
+          <w:szCs w:val="36"/>
+        </w:rPr>
+      </w:pPr>
+      <w:r>
+        <w:rPr>
+          <w:rFonts w:ascii="Arial" w:hAnsi="Arial" w:cs="Arial"/>
+          <w:sz w:val="36"/>
+          <w:szCs w:val="36"/>
+        </w:rPr>
+        <w:t xml:space="preserve">INTER_LINEAR → Default, good balance. </w:t>
+      </w:r>
+    </w:p>
+    <w:p>
+      <w:pPr>
+        <w:numPr>
+          <w:ilvl w:val="0"/>
+          <w:numId w:val="14"/>
+        </w:numPr>
+        <w:rPr>
+          <w:rFonts w:ascii="Arial" w:hAnsi="Arial" w:cs="Arial"/>
+          <w:sz w:val="36"/>
+          <w:szCs w:val="36"/>
+        </w:rPr>
+      </w:pPr>
+      <w:r>
+        <w:rPr>
+          <w:rFonts w:ascii="Arial" w:hAnsi="Arial" w:cs="Arial"/>
+          <w:sz w:val="36"/>
+          <w:szCs w:val="36"/>
+        </w:rPr>
+        <w:t xml:space="preserve">INTER_CUBIC → Better quality, slower. </w:t>
+      </w:r>
+    </w:p>
+    <w:p>
+      <w:pPr>
+        <w:numPr>
+          <w:ilvl w:val="0"/>
+          <w:numId w:val="14"/>
+        </w:numPr>
+        <w:rPr>
+          <w:rFonts w:ascii="Arial" w:hAnsi="Arial" w:cs="Arial"/>
+          <w:sz w:val="36"/>
+          <w:szCs w:val="36"/>
+        </w:rPr>
+      </w:pPr>
+      <w:r>
+        <w:rPr>
+          <w:rFonts w:ascii="Arial" w:hAnsi="Arial" w:cs="Arial"/>
+          <w:sz w:val="36"/>
+          <w:szCs w:val="36"/>
+        </w:rPr>
+        <w:t>INTER_AREA → Best when reducing image size.</w:t>
+      </w:r>
+    </w:p>
+    <w:p>
+      <w:pPr>
+        <w:rPr>
+          <w:rFonts w:ascii="Arial" w:hAnsi="Arial" w:cs="Arial"/>
+          <w:sz w:val="36"/>
+          <w:szCs w:val="36"/>
         </w:rPr>
       </w:pPr>
     </w:p>
@@ -5479,6 +9170,119 @@
     </w:lvl>
   </w:abstractNum>
   <w:abstractNum w:abstractNumId="1" w15:restartNumberingAfterBreak="0">
+    <w:nsid w:val="0BC6622D"/>
+    <w:multiLevelType w:val="hybridMultilevel"/>
+    <w:tmpl w:val="F12CB3EC"/>
+    <w:lvl w:ilvl="0" w:tplc="40090009">
+      <w:start w:val="1"/>
+      <w:numFmt w:val="bullet"/>
+      <w:lvlText w:val=""/>
+      <w:lvlJc w:val="left"/>
+      <w:pPr>
+        <w:ind w:left="720" w:hanging="360"/>
+      </w:pPr>
+      <w:rPr>
+        <w:rFonts w:ascii="Wingdings" w:hAnsi="Wingdings" w:hint="default"/>
+      </w:rPr>
+    </w:lvl>
+    <w:lvl w:ilvl="1" w:tplc="40090003" w:tentative="1">
+      <w:start w:val="1"/>
+      <w:numFmt w:val="bullet"/>
+      <w:lvlText w:val="o"/>
+      <w:lvlJc w:val="left"/>
+      <w:pPr>
+        <w:ind w:left="1440" w:hanging="360"/>
+      </w:pPr>
+      <w:rPr>
+        <w:rFonts w:ascii="Courier New" w:hAnsi="Courier New" w:cs="Courier New" w:hint="default"/>
+      </w:rPr>
+    </w:lvl>
+    <w:lvl w:ilvl="2" w:tplc="40090005" w:tentative="1">
+      <w:start w:val="1"/>
+      <w:numFmt w:val="bullet"/>
+      <w:lvlText w:val=""/>
+      <w:lvlJc w:val="left"/>
+      <w:pPr>
+        <w:ind w:left="2160" w:hanging="360"/>
+      </w:pPr>
+      <w:rPr>
+        <w:rFonts w:ascii="Wingdings" w:hAnsi="Wingdings" w:hint="default"/>
+      </w:rPr>
+    </w:lvl>
+    <w:lvl w:ilvl="3" w:tplc="40090001" w:tentative="1">
+      <w:start w:val="1"/>
+      <w:numFmt w:val="bullet"/>
+      <w:lvlText w:val=""/>
+      <w:lvlJc w:val="left"/>
+      <w:pPr>
+        <w:ind w:left="2880" w:hanging="360"/>
+      </w:pPr>
+      <w:rPr>
+        <w:rFonts w:ascii="Symbol" w:hAnsi="Symbol" w:hint="default"/>
+      </w:rPr>
+    </w:lvl>
+    <w:lvl w:ilvl="4" w:tplc="40090003" w:tentative="1">
+      <w:start w:val="1"/>
+      <w:numFmt w:val="bullet"/>
+      <w:lvlText w:val="o"/>
+      <w:lvlJc w:val="left"/>
+      <w:pPr>
+        <w:ind w:left="3600" w:hanging="360"/>
+      </w:pPr>
+      <w:rPr>
+        <w:rFonts w:ascii="Courier New" w:hAnsi="Courier New" w:cs="Courier New" w:hint="default"/>
+      </w:rPr>
+    </w:lvl>
+    <w:lvl w:ilvl="5" w:tplc="40090005" w:tentative="1">
+      <w:start w:val="1"/>
+      <w:numFmt w:val="bullet"/>
+      <w:lvlText w:val=""/>
+      <w:lvlJc w:val="left"/>
+      <w:pPr>
+        <w:ind w:left="4320" w:hanging="360"/>
+      </w:pPr>
+      <w:rPr>
+        <w:rFonts w:ascii="Wingdings" w:hAnsi="Wingdings" w:hint="default"/>
+      </w:rPr>
+    </w:lvl>
+    <w:lvl w:ilvl="6" w:tplc="40090001" w:tentative="1">
+      <w:start w:val="1"/>
+      <w:numFmt w:val="bullet"/>
+      <w:lvlText w:val=""/>
+      <w:lvlJc w:val="left"/>
+      <w:pPr>
+        <w:ind w:left="5040" w:hanging="360"/>
+      </w:pPr>
+      <w:rPr>
+        <w:rFonts w:ascii="Symbol" w:hAnsi="Symbol" w:hint="default"/>
+      </w:rPr>
+    </w:lvl>
+    <w:lvl w:ilvl="7" w:tplc="40090003" w:tentative="1">
+      <w:start w:val="1"/>
+      <w:numFmt w:val="bullet"/>
+      <w:lvlText w:val="o"/>
+      <w:lvlJc w:val="left"/>
+      <w:pPr>
+        <w:ind w:left="5760" w:hanging="360"/>
+      </w:pPr>
+      <w:rPr>
+        <w:rFonts w:ascii="Courier New" w:hAnsi="Courier New" w:cs="Courier New" w:hint="default"/>
+      </w:rPr>
+    </w:lvl>
+    <w:lvl w:ilvl="8" w:tplc="40090005" w:tentative="1">
+      <w:start w:val="1"/>
+      <w:numFmt w:val="bullet"/>
+      <w:lvlText w:val=""/>
+      <w:lvlJc w:val="left"/>
+      <w:pPr>
+        <w:ind w:left="6480" w:hanging="360"/>
+      </w:pPr>
+      <w:rPr>
+        <w:rFonts w:ascii="Wingdings" w:hAnsi="Wingdings" w:hint="default"/>
+      </w:rPr>
+    </w:lvl>
+  </w:abstractNum>
+  <w:abstractNum w:abstractNumId="2" w15:restartNumberingAfterBreak="0">
     <w:nsid w:val="2B6175FA"/>
     <w:multiLevelType w:val="multilevel"/>
     <w:tmpl w:val="78D63E14"/>
@@ -5627,7 +9431,120 @@
       </w:rPr>
     </w:lvl>
   </w:abstractNum>
-  <w:abstractNum w:abstractNumId="2" w15:restartNumberingAfterBreak="0">
+  <w:abstractNum w:abstractNumId="3" w15:restartNumberingAfterBreak="0">
+    <w:nsid w:val="321D39C3"/>
+    <w:multiLevelType w:val="hybridMultilevel"/>
+    <w:tmpl w:val="7550EF32"/>
+    <w:lvl w:ilvl="0" w:tplc="4009000D">
+      <w:start w:val="1"/>
+      <w:numFmt w:val="bullet"/>
+      <w:lvlText w:val=""/>
+      <w:lvlJc w:val="left"/>
+      <w:pPr>
+        <w:ind w:left="1440" w:hanging="360"/>
+      </w:pPr>
+      <w:rPr>
+        <w:rFonts w:ascii="Wingdings" w:hAnsi="Wingdings" w:hint="default"/>
+      </w:rPr>
+    </w:lvl>
+    <w:lvl w:ilvl="1" w:tplc="40090003" w:tentative="1">
+      <w:start w:val="1"/>
+      <w:numFmt w:val="bullet"/>
+      <w:lvlText w:val="o"/>
+      <w:lvlJc w:val="left"/>
+      <w:pPr>
+        <w:ind w:left="2160" w:hanging="360"/>
+      </w:pPr>
+      <w:rPr>
+        <w:rFonts w:ascii="Courier New" w:hAnsi="Courier New" w:cs="Courier New" w:hint="default"/>
+      </w:rPr>
+    </w:lvl>
+    <w:lvl w:ilvl="2" w:tplc="40090005" w:tentative="1">
+      <w:start w:val="1"/>
+      <w:numFmt w:val="bullet"/>
+      <w:lvlText w:val=""/>
+      <w:lvlJc w:val="left"/>
+      <w:pPr>
+        <w:ind w:left="2880" w:hanging="360"/>
+      </w:pPr>
+      <w:rPr>
+        <w:rFonts w:ascii="Wingdings" w:hAnsi="Wingdings" w:hint="default"/>
+      </w:rPr>
+    </w:lvl>
+    <w:lvl w:ilvl="3" w:tplc="40090001" w:tentative="1">
+      <w:start w:val="1"/>
+      <w:numFmt w:val="bullet"/>
+      <w:lvlText w:val=""/>
+      <w:lvlJc w:val="left"/>
+      <w:pPr>
+        <w:ind w:left="3600" w:hanging="360"/>
+      </w:pPr>
+      <w:rPr>
+        <w:rFonts w:ascii="Symbol" w:hAnsi="Symbol" w:hint="default"/>
+      </w:rPr>
+    </w:lvl>
+    <w:lvl w:ilvl="4" w:tplc="40090003" w:tentative="1">
+      <w:start w:val="1"/>
+      <w:numFmt w:val="bullet"/>
+      <w:lvlText w:val="o"/>
+      <w:lvlJc w:val="left"/>
+      <w:pPr>
+        <w:ind w:left="4320" w:hanging="360"/>
+      </w:pPr>
+      <w:rPr>
+        <w:rFonts w:ascii="Courier New" w:hAnsi="Courier New" w:cs="Courier New" w:hint="default"/>
+      </w:rPr>
+    </w:lvl>
+    <w:lvl w:ilvl="5" w:tplc="40090005" w:tentative="1">
+      <w:start w:val="1"/>
+      <w:numFmt w:val="bullet"/>
+      <w:lvlText w:val=""/>
+      <w:lvlJc w:val="left"/>
+      <w:pPr>
+        <w:ind w:left="5040" w:hanging="360"/>
+      </w:pPr>
+      <w:rPr>
+        <w:rFonts w:ascii="Wingdings" w:hAnsi="Wingdings" w:hint="default"/>
+      </w:rPr>
+    </w:lvl>
+    <w:lvl w:ilvl="6" w:tplc="40090001" w:tentative="1">
+      <w:start w:val="1"/>
+      <w:numFmt w:val="bullet"/>
+      <w:lvlText w:val=""/>
+      <w:lvlJc w:val="left"/>
+      <w:pPr>
+        <w:ind w:left="5760" w:hanging="360"/>
+      </w:pPr>
+      <w:rPr>
+        <w:rFonts w:ascii="Symbol" w:hAnsi="Symbol" w:hint="default"/>
+      </w:rPr>
+    </w:lvl>
+    <w:lvl w:ilvl="7" w:tplc="40090003" w:tentative="1">
+      <w:start w:val="1"/>
+      <w:numFmt w:val="bullet"/>
+      <w:lvlText w:val="o"/>
+      <w:lvlJc w:val="left"/>
+      <w:pPr>
+        <w:ind w:left="6480" w:hanging="360"/>
+      </w:pPr>
+      <w:rPr>
+        <w:rFonts w:ascii="Courier New" w:hAnsi="Courier New" w:cs="Courier New" w:hint="default"/>
+      </w:rPr>
+    </w:lvl>
+    <w:lvl w:ilvl="8" w:tplc="40090005" w:tentative="1">
+      <w:start w:val="1"/>
+      <w:numFmt w:val="bullet"/>
+      <w:lvlText w:val=""/>
+      <w:lvlJc w:val="left"/>
+      <w:pPr>
+        <w:ind w:left="7200" w:hanging="360"/>
+      </w:pPr>
+      <w:rPr>
+        <w:rFonts w:ascii="Wingdings" w:hAnsi="Wingdings" w:hint="default"/>
+      </w:rPr>
+    </w:lvl>
+  </w:abstractNum>
+  <w:abstractNum w:abstractNumId="4" w15:restartNumberingAfterBreak="0">
     <w:nsid w:val="353D30CB"/>
     <w:multiLevelType w:val="multilevel"/>
     <w:tmpl w:val="3EC0C1C8"/>
@@ -5776,7 +9693,7 @@
       </w:rPr>
     </w:lvl>
   </w:abstractNum>
-  <w:abstractNum w:abstractNumId="3" w15:restartNumberingAfterBreak="0">
+  <w:abstractNum w:abstractNumId="5" w15:restartNumberingAfterBreak="0">
     <w:nsid w:val="3884659F"/>
     <w:multiLevelType w:val="multilevel"/>
     <w:tmpl w:val="8E2C9308"/>
@@ -5925,7 +9842,305 @@
       </w:rPr>
     </w:lvl>
   </w:abstractNum>
-  <w:abstractNum w:abstractNumId="4" w15:restartNumberingAfterBreak="0">
+  <w:abstractNum w:abstractNumId="6" w15:restartNumberingAfterBreak="0">
+    <w:nsid w:val="46740736"/>
+    <w:multiLevelType w:val="multilevel"/>
+    <w:tmpl w:val="971ECD40"/>
+    <w:lvl w:ilvl="0">
+      <w:start w:val="1"/>
+      <w:numFmt w:val="bullet"/>
+      <w:lvlText w:val=""/>
+      <w:lvlJc w:val="left"/>
+      <w:pPr>
+        <w:tabs>
+          <w:tab w:val="num" w:pos="720"/>
+        </w:tabs>
+        <w:ind w:left="720" w:hanging="360"/>
+      </w:pPr>
+      <w:rPr>
+        <w:rFonts w:ascii="Symbol" w:hAnsi="Symbol" w:hint="default"/>
+        <w:sz w:val="20"/>
+      </w:rPr>
+    </w:lvl>
+    <w:lvl w:ilvl="1" w:tentative="1">
+      <w:start w:val="1"/>
+      <w:numFmt w:val="bullet"/>
+      <w:lvlText w:val="o"/>
+      <w:lvlJc w:val="left"/>
+      <w:pPr>
+        <w:tabs>
+          <w:tab w:val="num" w:pos="1440"/>
+        </w:tabs>
+        <w:ind w:left="1440" w:hanging="360"/>
+      </w:pPr>
+      <w:rPr>
+        <w:rFonts w:ascii="Courier New" w:hAnsi="Courier New" w:hint="default"/>
+        <w:sz w:val="20"/>
+      </w:rPr>
+    </w:lvl>
+    <w:lvl w:ilvl="2" w:tentative="1">
+      <w:start w:val="1"/>
+      <w:numFmt w:val="bullet"/>
+      <w:lvlText w:val=""/>
+      <w:lvlJc w:val="left"/>
+      <w:pPr>
+        <w:tabs>
+          <w:tab w:val="num" w:pos="2160"/>
+        </w:tabs>
+        <w:ind w:left="2160" w:hanging="360"/>
+      </w:pPr>
+      <w:rPr>
+        <w:rFonts w:ascii="Wingdings" w:hAnsi="Wingdings" w:hint="default"/>
+        <w:sz w:val="20"/>
+      </w:rPr>
+    </w:lvl>
+    <w:lvl w:ilvl="3" w:tentative="1">
+      <w:start w:val="1"/>
+      <w:numFmt w:val="bullet"/>
+      <w:lvlText w:val=""/>
+      <w:lvlJc w:val="left"/>
+      <w:pPr>
+        <w:tabs>
+          <w:tab w:val="num" w:pos="2880"/>
+        </w:tabs>
+        <w:ind w:left="2880" w:hanging="360"/>
+      </w:pPr>
+      <w:rPr>
+        <w:rFonts w:ascii="Wingdings" w:hAnsi="Wingdings" w:hint="default"/>
+        <w:sz w:val="20"/>
+      </w:rPr>
+    </w:lvl>
+    <w:lvl w:ilvl="4" w:tentative="1">
+      <w:start w:val="1"/>
+      <w:numFmt w:val="bullet"/>
+      <w:lvlText w:val=""/>
+      <w:lvlJc w:val="left"/>
+      <w:pPr>
+        <w:tabs>
+          <w:tab w:val="num" w:pos="3600"/>
+        </w:tabs>
+        <w:ind w:left="3600" w:hanging="360"/>
+      </w:pPr>
+      <w:rPr>
+        <w:rFonts w:ascii="Wingdings" w:hAnsi="Wingdings" w:hint="default"/>
+        <w:sz w:val="20"/>
+      </w:rPr>
+    </w:lvl>
+    <w:lvl w:ilvl="5" w:tentative="1">
+      <w:start w:val="1"/>
+      <w:numFmt w:val="bullet"/>
+      <w:lvlText w:val=""/>
+      <w:lvlJc w:val="left"/>
+      <w:pPr>
+        <w:tabs>
+          <w:tab w:val="num" w:pos="4320"/>
+        </w:tabs>
+        <w:ind w:left="4320" w:hanging="360"/>
+      </w:pPr>
+      <w:rPr>
+        <w:rFonts w:ascii="Wingdings" w:hAnsi="Wingdings" w:hint="default"/>
+        <w:sz w:val="20"/>
+      </w:rPr>
+    </w:lvl>
+    <w:lvl w:ilvl="6" w:tentative="1">
+      <w:start w:val="1"/>
+      <w:numFmt w:val="bullet"/>
+      <w:lvlText w:val=""/>
+      <w:lvlJc w:val="left"/>
+      <w:pPr>
+        <w:tabs>
+          <w:tab w:val="num" w:pos="5040"/>
+        </w:tabs>
+        <w:ind w:left="5040" w:hanging="360"/>
+      </w:pPr>
+      <w:rPr>
+        <w:rFonts w:ascii="Wingdings" w:hAnsi="Wingdings" w:hint="default"/>
+        <w:sz w:val="20"/>
+      </w:rPr>
+    </w:lvl>
+    <w:lvl w:ilvl="7" w:tentative="1">
+      <w:start w:val="1"/>
+      <w:numFmt w:val="bullet"/>
+      <w:lvlText w:val=""/>
+      <w:lvlJc w:val="left"/>
+      <w:pPr>
+        <w:tabs>
+          <w:tab w:val="num" w:pos="5760"/>
+        </w:tabs>
+        <w:ind w:left="5760" w:hanging="360"/>
+      </w:pPr>
+      <w:rPr>
+        <w:rFonts w:ascii="Wingdings" w:hAnsi="Wingdings" w:hint="default"/>
+        <w:sz w:val="20"/>
+      </w:rPr>
+    </w:lvl>
+    <w:lvl w:ilvl="8" w:tentative="1">
+      <w:start w:val="1"/>
+      <w:numFmt w:val="bullet"/>
+      <w:lvlText w:val=""/>
+      <w:lvlJc w:val="left"/>
+      <w:pPr>
+        <w:tabs>
+          <w:tab w:val="num" w:pos="6480"/>
+        </w:tabs>
+        <w:ind w:left="6480" w:hanging="360"/>
+      </w:pPr>
+      <w:rPr>
+        <w:rFonts w:ascii="Wingdings" w:hAnsi="Wingdings" w:hint="default"/>
+        <w:sz w:val="20"/>
+      </w:rPr>
+    </w:lvl>
+  </w:abstractNum>
+  <w:abstractNum w:abstractNumId="7" w15:restartNumberingAfterBreak="0">
+    <w:nsid w:val="47484916"/>
+    <w:multiLevelType w:val="multilevel"/>
+    <w:tmpl w:val="351A721E"/>
+    <w:lvl w:ilvl="0">
+      <w:start w:val="1"/>
+      <w:numFmt w:val="bullet"/>
+      <w:lvlText w:val=""/>
+      <w:lvlJc w:val="left"/>
+      <w:pPr>
+        <w:tabs>
+          <w:tab w:val="num" w:pos="720"/>
+        </w:tabs>
+        <w:ind w:left="720" w:hanging="360"/>
+      </w:pPr>
+      <w:rPr>
+        <w:rFonts w:ascii="Symbol" w:hAnsi="Symbol" w:hint="default"/>
+        <w:sz w:val="20"/>
+      </w:rPr>
+    </w:lvl>
+    <w:lvl w:ilvl="1" w:tentative="1">
+      <w:start w:val="1"/>
+      <w:numFmt w:val="bullet"/>
+      <w:lvlText w:val="o"/>
+      <w:lvlJc w:val="left"/>
+      <w:pPr>
+        <w:tabs>
+          <w:tab w:val="num" w:pos="1440"/>
+        </w:tabs>
+        <w:ind w:left="1440" w:hanging="360"/>
+      </w:pPr>
+      <w:rPr>
+        <w:rFonts w:ascii="Courier New" w:hAnsi="Courier New" w:hint="default"/>
+        <w:sz w:val="20"/>
+      </w:rPr>
+    </w:lvl>
+    <w:lvl w:ilvl="2" w:tentative="1">
+      <w:start w:val="1"/>
+      <w:numFmt w:val="bullet"/>
+      <w:lvlText w:val=""/>
+      <w:lvlJc w:val="left"/>
+      <w:pPr>
+        <w:tabs>
+          <w:tab w:val="num" w:pos="2160"/>
+        </w:tabs>
+        <w:ind w:left="2160" w:hanging="360"/>
+      </w:pPr>
+      <w:rPr>
+        <w:rFonts w:ascii="Wingdings" w:hAnsi="Wingdings" w:hint="default"/>
+        <w:sz w:val="20"/>
+      </w:rPr>
+    </w:lvl>
+    <w:lvl w:ilvl="3" w:tentative="1">
+      <w:start w:val="1"/>
+      <w:numFmt w:val="bullet"/>
+      <w:lvlText w:val=""/>
+      <w:lvlJc w:val="left"/>
+      <w:pPr>
+        <w:tabs>
+          <w:tab w:val="num" w:pos="2880"/>
+        </w:tabs>
+        <w:ind w:left="2880" w:hanging="360"/>
+      </w:pPr>
+      <w:rPr>
+        <w:rFonts w:ascii="Wingdings" w:hAnsi="Wingdings" w:hint="default"/>
+        <w:sz w:val="20"/>
+      </w:rPr>
+    </w:lvl>
+    <w:lvl w:ilvl="4" w:tentative="1">
+      <w:start w:val="1"/>
+      <w:numFmt w:val="bullet"/>
+      <w:lvlText w:val=""/>
+      <w:lvlJc w:val="left"/>
+      <w:pPr>
+        <w:tabs>
+          <w:tab w:val="num" w:pos="3600"/>
+        </w:tabs>
+        <w:ind w:left="3600" w:hanging="360"/>
+      </w:pPr>
+      <w:rPr>
+        <w:rFonts w:ascii="Wingdings" w:hAnsi="Wingdings" w:hint="default"/>
+        <w:sz w:val="20"/>
+      </w:rPr>
+    </w:lvl>
+    <w:lvl w:ilvl="5" w:tentative="1">
+      <w:start w:val="1"/>
+      <w:numFmt w:val="bullet"/>
+      <w:lvlText w:val=""/>
+      <w:lvlJc w:val="left"/>
+      <w:pPr>
+        <w:tabs>
+          <w:tab w:val="num" w:pos="4320"/>
+        </w:tabs>
+        <w:ind w:left="4320" w:hanging="360"/>
+      </w:pPr>
+      <w:rPr>
+        <w:rFonts w:ascii="Wingdings" w:hAnsi="Wingdings" w:hint="default"/>
+        <w:sz w:val="20"/>
+      </w:rPr>
+    </w:lvl>
+    <w:lvl w:ilvl="6" w:tentative="1">
+      <w:start w:val="1"/>
+      <w:numFmt w:val="bullet"/>
+      <w:lvlText w:val=""/>
+      <w:lvlJc w:val="left"/>
+      <w:pPr>
+        <w:tabs>
+          <w:tab w:val="num" w:pos="5040"/>
+        </w:tabs>
+        <w:ind w:left="5040" w:hanging="360"/>
+      </w:pPr>
+      <w:rPr>
+        <w:rFonts w:ascii="Wingdings" w:hAnsi="Wingdings" w:hint="default"/>
+        <w:sz w:val="20"/>
+      </w:rPr>
+    </w:lvl>
+    <w:lvl w:ilvl="7" w:tentative="1">
+      <w:start w:val="1"/>
+      <w:numFmt w:val="bullet"/>
+      <w:lvlText w:val=""/>
+      <w:lvlJc w:val="left"/>
+      <w:pPr>
+        <w:tabs>
+          <w:tab w:val="num" w:pos="5760"/>
+        </w:tabs>
+        <w:ind w:left="5760" w:hanging="360"/>
+      </w:pPr>
+      <w:rPr>
+        <w:rFonts w:ascii="Wingdings" w:hAnsi="Wingdings" w:hint="default"/>
+        <w:sz w:val="20"/>
+      </w:rPr>
+    </w:lvl>
+    <w:lvl w:ilvl="8" w:tentative="1">
+      <w:start w:val="1"/>
+      <w:numFmt w:val="bullet"/>
+      <w:lvlText w:val=""/>
+      <w:lvlJc w:val="left"/>
+      <w:pPr>
+        <w:tabs>
+          <w:tab w:val="num" w:pos="6480"/>
+        </w:tabs>
+        <w:ind w:left="6480" w:hanging="360"/>
+      </w:pPr>
+      <w:rPr>
+        <w:rFonts w:ascii="Wingdings" w:hAnsi="Wingdings" w:hint="default"/>
+        <w:sz w:val="20"/>
+      </w:rPr>
+    </w:lvl>
+  </w:abstractNum>
+  <w:abstractNum w:abstractNumId="8" w15:restartNumberingAfterBreak="0">
     <w:nsid w:val="539A0854"/>
     <w:multiLevelType w:val="multilevel"/>
     <w:tmpl w:val="5588D980"/>
@@ -6074,7 +10289,7 @@
       </w:rPr>
     </w:lvl>
   </w:abstractNum>
-  <w:abstractNum w:abstractNumId="5" w15:restartNumberingAfterBreak="0">
+  <w:abstractNum w:abstractNumId="9" w15:restartNumberingAfterBreak="0">
     <w:nsid w:val="5ABF11C5"/>
     <w:multiLevelType w:val="multilevel"/>
     <w:tmpl w:val="BE98880C"/>
@@ -6223,7 +10438,233 @@
       </w:rPr>
     </w:lvl>
   </w:abstractNum>
-  <w:abstractNum w:abstractNumId="6" w15:restartNumberingAfterBreak="0">
+  <w:abstractNum w:abstractNumId="10" w15:restartNumberingAfterBreak="0">
+    <w:nsid w:val="6CA6746B"/>
+    <w:multiLevelType w:val="hybridMultilevel"/>
+    <w:tmpl w:val="1B7A8422"/>
+    <w:lvl w:ilvl="0" w:tplc="40090009">
+      <w:start w:val="1"/>
+      <w:numFmt w:val="bullet"/>
+      <w:lvlText w:val=""/>
+      <w:lvlJc w:val="left"/>
+      <w:pPr>
+        <w:ind w:left="1440" w:hanging="360"/>
+      </w:pPr>
+      <w:rPr>
+        <w:rFonts w:ascii="Wingdings" w:hAnsi="Wingdings" w:hint="default"/>
+      </w:rPr>
+    </w:lvl>
+    <w:lvl w:ilvl="1" w:tplc="40090003" w:tentative="1">
+      <w:start w:val="1"/>
+      <w:numFmt w:val="bullet"/>
+      <w:lvlText w:val="o"/>
+      <w:lvlJc w:val="left"/>
+      <w:pPr>
+        <w:ind w:left="2160" w:hanging="360"/>
+      </w:pPr>
+      <w:rPr>
+        <w:rFonts w:ascii="Courier New" w:hAnsi="Courier New" w:cs="Courier New" w:hint="default"/>
+      </w:rPr>
+    </w:lvl>
+    <w:lvl w:ilvl="2" w:tplc="40090005" w:tentative="1">
+      <w:start w:val="1"/>
+      <w:numFmt w:val="bullet"/>
+      <w:lvlText w:val=""/>
+      <w:lvlJc w:val="left"/>
+      <w:pPr>
+        <w:ind w:left="2880" w:hanging="360"/>
+      </w:pPr>
+      <w:rPr>
+        <w:rFonts w:ascii="Wingdings" w:hAnsi="Wingdings" w:hint="default"/>
+      </w:rPr>
+    </w:lvl>
+    <w:lvl w:ilvl="3" w:tplc="40090001" w:tentative="1">
+      <w:start w:val="1"/>
+      <w:numFmt w:val="bullet"/>
+      <w:lvlText w:val=""/>
+      <w:lvlJc w:val="left"/>
+      <w:pPr>
+        <w:ind w:left="3600" w:hanging="360"/>
+      </w:pPr>
+      <w:rPr>
+        <w:rFonts w:ascii="Symbol" w:hAnsi="Symbol" w:hint="default"/>
+      </w:rPr>
+    </w:lvl>
+    <w:lvl w:ilvl="4" w:tplc="40090003" w:tentative="1">
+      <w:start w:val="1"/>
+      <w:numFmt w:val="bullet"/>
+      <w:lvlText w:val="o"/>
+      <w:lvlJc w:val="left"/>
+      <w:pPr>
+        <w:ind w:left="4320" w:hanging="360"/>
+      </w:pPr>
+      <w:rPr>
+        <w:rFonts w:ascii="Courier New" w:hAnsi="Courier New" w:cs="Courier New" w:hint="default"/>
+      </w:rPr>
+    </w:lvl>
+    <w:lvl w:ilvl="5" w:tplc="40090005" w:tentative="1">
+      <w:start w:val="1"/>
+      <w:numFmt w:val="bullet"/>
+      <w:lvlText w:val=""/>
+      <w:lvlJc w:val="left"/>
+      <w:pPr>
+        <w:ind w:left="5040" w:hanging="360"/>
+      </w:pPr>
+      <w:rPr>
+        <w:rFonts w:ascii="Wingdings" w:hAnsi="Wingdings" w:hint="default"/>
+      </w:rPr>
+    </w:lvl>
+    <w:lvl w:ilvl="6" w:tplc="40090001" w:tentative="1">
+      <w:start w:val="1"/>
+      <w:numFmt w:val="bullet"/>
+      <w:lvlText w:val=""/>
+      <w:lvlJc w:val="left"/>
+      <w:pPr>
+        <w:ind w:left="5760" w:hanging="360"/>
+      </w:pPr>
+      <w:rPr>
+        <w:rFonts w:ascii="Symbol" w:hAnsi="Symbol" w:hint="default"/>
+      </w:rPr>
+    </w:lvl>
+    <w:lvl w:ilvl="7" w:tplc="40090003" w:tentative="1">
+      <w:start w:val="1"/>
+      <w:numFmt w:val="bullet"/>
+      <w:lvlText w:val="o"/>
+      <w:lvlJc w:val="left"/>
+      <w:pPr>
+        <w:ind w:left="6480" w:hanging="360"/>
+      </w:pPr>
+      <w:rPr>
+        <w:rFonts w:ascii="Courier New" w:hAnsi="Courier New" w:cs="Courier New" w:hint="default"/>
+      </w:rPr>
+    </w:lvl>
+    <w:lvl w:ilvl="8" w:tplc="40090005" w:tentative="1">
+      <w:start w:val="1"/>
+      <w:numFmt w:val="bullet"/>
+      <w:lvlText w:val=""/>
+      <w:lvlJc w:val="left"/>
+      <w:pPr>
+        <w:ind w:left="7200" w:hanging="360"/>
+      </w:pPr>
+      <w:rPr>
+        <w:rFonts w:ascii="Wingdings" w:hAnsi="Wingdings" w:hint="default"/>
+      </w:rPr>
+    </w:lvl>
+  </w:abstractNum>
+  <w:abstractNum w:abstractNumId="11" w15:restartNumberingAfterBreak="0">
+    <w:nsid w:val="73E725D0"/>
+    <w:multiLevelType w:val="hybridMultilevel"/>
+    <w:tmpl w:val="E806EA88"/>
+    <w:lvl w:ilvl="0" w:tplc="40090001">
+      <w:start w:val="1"/>
+      <w:numFmt w:val="bullet"/>
+      <w:lvlText w:val=""/>
+      <w:lvlJc w:val="left"/>
+      <w:pPr>
+        <w:ind w:left="720" w:hanging="360"/>
+      </w:pPr>
+      <w:rPr>
+        <w:rFonts w:ascii="Symbol" w:hAnsi="Symbol" w:hint="default"/>
+      </w:rPr>
+    </w:lvl>
+    <w:lvl w:ilvl="1" w:tplc="40090003" w:tentative="1">
+      <w:start w:val="1"/>
+      <w:numFmt w:val="bullet"/>
+      <w:lvlText w:val="o"/>
+      <w:lvlJc w:val="left"/>
+      <w:pPr>
+        <w:ind w:left="1440" w:hanging="360"/>
+      </w:pPr>
+      <w:rPr>
+        <w:rFonts w:ascii="Courier New" w:hAnsi="Courier New" w:cs="Courier New" w:hint="default"/>
+      </w:rPr>
+    </w:lvl>
+    <w:lvl w:ilvl="2" w:tplc="40090005" w:tentative="1">
+      <w:start w:val="1"/>
+      <w:numFmt w:val="bullet"/>
+      <w:lvlText w:val=""/>
+      <w:lvlJc w:val="left"/>
+      <w:pPr>
+        <w:ind w:left="2160" w:hanging="360"/>
+      </w:pPr>
+      <w:rPr>
+        <w:rFonts w:ascii="Wingdings" w:hAnsi="Wingdings" w:hint="default"/>
+      </w:rPr>
+    </w:lvl>
+    <w:lvl w:ilvl="3" w:tplc="40090001" w:tentative="1">
+      <w:start w:val="1"/>
+      <w:numFmt w:val="bullet"/>
+      <w:lvlText w:val=""/>
+      <w:lvlJc w:val="left"/>
+      <w:pPr>
+        <w:ind w:left="2880" w:hanging="360"/>
+      </w:pPr>
+      <w:rPr>
+        <w:rFonts w:ascii="Symbol" w:hAnsi="Symbol" w:hint="default"/>
+      </w:rPr>
+    </w:lvl>
+    <w:lvl w:ilvl="4" w:tplc="40090003" w:tentative="1">
+      <w:start w:val="1"/>
+      <w:numFmt w:val="bullet"/>
+      <w:lvlText w:val="o"/>
+      <w:lvlJc w:val="left"/>
+      <w:pPr>
+        <w:ind w:left="3600" w:hanging="360"/>
+      </w:pPr>
+      <w:rPr>
+        <w:rFonts w:ascii="Courier New" w:hAnsi="Courier New" w:cs="Courier New" w:hint="default"/>
+      </w:rPr>
+    </w:lvl>
+    <w:lvl w:ilvl="5" w:tplc="40090005" w:tentative="1">
+      <w:start w:val="1"/>
+      <w:numFmt w:val="bullet"/>
+      <w:lvlText w:val=""/>
+      <w:lvlJc w:val="left"/>
+      <w:pPr>
+        <w:ind w:left="4320" w:hanging="360"/>
+      </w:pPr>
+      <w:rPr>
+        <w:rFonts w:ascii="Wingdings" w:hAnsi="Wingdings" w:hint="default"/>
+      </w:rPr>
+    </w:lvl>
+    <w:lvl w:ilvl="6" w:tplc="40090001" w:tentative="1">
+      <w:start w:val="1"/>
+      <w:numFmt w:val="bullet"/>
+      <w:lvlText w:val=""/>
+      <w:lvlJc w:val="left"/>
+      <w:pPr>
+        <w:ind w:left="5040" w:hanging="360"/>
+      </w:pPr>
+      <w:rPr>
+        <w:rFonts w:ascii="Symbol" w:hAnsi="Symbol" w:hint="default"/>
+      </w:rPr>
+    </w:lvl>
+    <w:lvl w:ilvl="7" w:tplc="40090003" w:tentative="1">
+      <w:start w:val="1"/>
+      <w:numFmt w:val="bullet"/>
+      <w:lvlText w:val="o"/>
+      <w:lvlJc w:val="left"/>
+      <w:pPr>
+        <w:ind w:left="5760" w:hanging="360"/>
+      </w:pPr>
+      <w:rPr>
+        <w:rFonts w:ascii="Courier New" w:hAnsi="Courier New" w:cs="Courier New" w:hint="default"/>
+      </w:rPr>
+    </w:lvl>
+    <w:lvl w:ilvl="8" w:tplc="40090005" w:tentative="1">
+      <w:start w:val="1"/>
+      <w:numFmt w:val="bullet"/>
+      <w:lvlText w:val=""/>
+      <w:lvlJc w:val="left"/>
+      <w:pPr>
+        <w:ind w:left="6480" w:hanging="360"/>
+      </w:pPr>
+      <w:rPr>
+        <w:rFonts w:ascii="Wingdings" w:hAnsi="Wingdings" w:hint="default"/>
+      </w:rPr>
+    </w:lvl>
+  </w:abstractNum>
+  <w:abstractNum w:abstractNumId="12" w15:restartNumberingAfterBreak="0">
     <w:nsid w:val="78C73386"/>
     <w:multiLevelType w:val="multilevel"/>
     <w:tmpl w:val="8D266888"/>
@@ -6372,7 +10813,7 @@
       </w:rPr>
     </w:lvl>
   </w:abstractNum>
-  <w:abstractNum w:abstractNumId="7" w15:restartNumberingAfterBreak="0">
+  <w:abstractNum w:abstractNumId="13" w15:restartNumberingAfterBreak="0">
     <w:nsid w:val="7C907E68"/>
     <w:multiLevelType w:val="multilevel"/>
     <w:tmpl w:val="729AECCA"/>
@@ -6522,28 +10963,46 @@
     </w:lvl>
   </w:abstractNum>
   <w:num w:numId="1" w16cid:durableId="176506218">
-    <w:abstractNumId w:val="3"/>
+    <w:abstractNumId w:val="5"/>
   </w:num>
   <w:num w:numId="2" w16cid:durableId="1302231459">
-    <w:abstractNumId w:val="7"/>
+    <w:abstractNumId w:val="13"/>
   </w:num>
   <w:num w:numId="3" w16cid:durableId="1849980898">
-    <w:abstractNumId w:val="1"/>
+    <w:abstractNumId w:val="2"/>
   </w:num>
   <w:num w:numId="4" w16cid:durableId="1309558280">
-    <w:abstractNumId w:val="5"/>
+    <w:abstractNumId w:val="9"/>
   </w:num>
   <w:num w:numId="5" w16cid:durableId="1543057062">
-    <w:abstractNumId w:val="2"/>
+    <w:abstractNumId w:val="4"/>
   </w:num>
   <w:num w:numId="6" w16cid:durableId="1045367518">
-    <w:abstractNumId w:val="4"/>
+    <w:abstractNumId w:val="8"/>
   </w:num>
   <w:num w:numId="7" w16cid:durableId="1985309264">
     <w:abstractNumId w:val="0"/>
   </w:num>
   <w:num w:numId="8" w16cid:durableId="1196625876">
+    <w:abstractNumId w:val="12"/>
+  </w:num>
+  <w:num w:numId="9" w16cid:durableId="1454976088">
+    <w:abstractNumId w:val="11"/>
+  </w:num>
+  <w:num w:numId="10" w16cid:durableId="165094492">
+    <w:abstractNumId w:val="1"/>
+  </w:num>
+  <w:num w:numId="11" w16cid:durableId="1715502554">
+    <w:abstractNumId w:val="10"/>
+  </w:num>
+  <w:num w:numId="12" w16cid:durableId="729379705">
+    <w:abstractNumId w:val="3"/>
+  </w:num>
+  <w:num w:numId="13" w16cid:durableId="1295212702">
     <w:abstractNumId w:val="6"/>
+  </w:num>
+  <w:num w:numId="14" w16cid:durableId="1017728248">
+    <w:abstractNumId w:val="7"/>
   </w:num>
 </w:numbering>
 </file>
@@ -6948,6 +11407,7 @@
   <w:style w:type="paragraph" w:default="1" w:styleId="Normal">
     <w:name w:val="Normal"/>
     <w:qFormat/>
+    <w:rsid w:val="00754A04"/>
   </w:style>
   <w:style w:type="paragraph" w:styleId="Heading1">
     <w:name w:val="heading 1"/>

</xml_diff>

<commit_message>
Complete Lesson 3: OpenCV Color Spaces and Channel Operations
</commit_message>
<xml_diff>
--- a/Working.docx
+++ b/Working.docx
@@ -7903,7 +7903,7 @@
           <w:szCs w:val="32"/>
         </w:rPr>
         <w:pict w14:anchorId="68E9C0E4">
-          <v:rect id="_x0000_i1055" style="width:0;height:1.5pt" o:hralign="center" o:hrstd="t" o:hr="t" fillcolor="#a0a0a0" stroked="f"/>
+          <v:rect id="_x0000_i1049" style="width:0;height:1.5pt" o:hralign="center" o:hrstd="t" o:hr="t" fillcolor="#a0a0a0" stroked="f"/>
         </w:pict>
       </w:r>
     </w:p>
@@ -9001,6 +9001,2290 @@
     </w:p>
     <w:p>
       <w:pPr>
+        <w:rPr>
+          <w:rFonts w:ascii="Arial" w:hAnsi="Arial" w:cs="Arial"/>
+          <w:sz w:val="36"/>
+          <w:szCs w:val="36"/>
+        </w:rPr>
+      </w:pPr>
+      <w:r>
+        <w:rPr>
+          <w:rFonts w:ascii="Arial" w:hAnsi="Arial" w:cs="Arial"/>
+          <w:sz w:val="36"/>
+          <w:szCs w:val="36"/>
+        </w:rPr>
+        <w:br w:type="page"/>
+      </w:r>
+    </w:p>
+    <w:p>
+      <w:pPr>
+        <w:rPr>
+          <w:rFonts w:ascii="Arial" w:hAnsi="Arial" w:cs="Arial"/>
+          <w:sz w:val="36"/>
+          <w:szCs w:val="36"/>
+        </w:rPr>
+      </w:pPr>
+      <w:r>
+        <w:rPr>
+          <w:rFonts w:ascii="Arial" w:hAnsi="Arial" w:cs="Arial"/>
+          <w:sz w:val="36"/>
+          <w:szCs w:val="36"/>
+        </w:rPr>
+        <w:lastRenderedPageBreak/>
+        <w:t>Day 4</w:t>
+      </w:r>
+    </w:p>
+    <w:p>
+      <w:pPr>
+        <w:rPr>
+          <w:rFonts w:ascii="Arial" w:hAnsi="Arial" w:cs="Arial"/>
+          <w:sz w:val="36"/>
+          <w:szCs w:val="36"/>
+        </w:rPr>
+      </w:pPr>
+      <w:r>
+        <w:rPr>
+          <w:rFonts w:ascii="Arial" w:hAnsi="Arial" w:cs="Arial"/>
+          <w:sz w:val="36"/>
+          <w:szCs w:val="36"/>
+        </w:rPr>
+        <w:t>─────────────────────────────</w:t>
+      </w:r>
+    </w:p>
+    <w:p>
+      <w:pPr>
+        <w:rPr>
+          <w:rFonts w:ascii="Arial" w:hAnsi="Arial" w:cs="Arial"/>
+          <w:sz w:val="36"/>
+          <w:szCs w:val="36"/>
+        </w:rPr>
+      </w:pPr>
+      <w:r>
+        <w:rPr>
+          <w:rFonts w:ascii="Segoe UI Emoji" w:hAnsi="Segoe UI Emoji" w:cs="Segoe UI Emoji"/>
+          <w:sz w:val="36"/>
+          <w:szCs w:val="36"/>
+        </w:rPr>
+        <w:t>✅</w:t>
+      </w:r>
+      <w:r>
+        <w:rPr>
+          <w:rFonts w:ascii="Arial" w:hAnsi="Arial" w:cs="Arial"/>
+          <w:sz w:val="36"/>
+          <w:szCs w:val="36"/>
+        </w:rPr>
+        <w:t xml:space="preserve"> </w:t>
+      </w:r>
+      <w:proofErr w:type="spellStart"/>
+      <w:r>
+        <w:rPr>
+          <w:rFonts w:ascii="Arial" w:hAnsi="Arial" w:cs="Arial"/>
+          <w:sz w:val="36"/>
+          <w:szCs w:val="36"/>
+        </w:rPr>
+        <w:t>Color</w:t>
+      </w:r>
+      <w:proofErr w:type="spellEnd"/>
+      <w:r>
+        <w:rPr>
+          <w:rFonts w:ascii="Arial" w:hAnsi="Arial" w:cs="Arial"/>
+          <w:sz w:val="36"/>
+          <w:szCs w:val="36"/>
+        </w:rPr>
+        <w:t xml:space="preserve"> Spaces</w:t>
+      </w:r>
+    </w:p>
+    <w:p>
+      <w:pPr>
+        <w:rPr>
+          <w:rFonts w:ascii="Arial" w:hAnsi="Arial" w:cs="Arial"/>
+          <w:sz w:val="36"/>
+          <w:szCs w:val="36"/>
+        </w:rPr>
+      </w:pPr>
+      <w:r>
+        <w:rPr>
+          <w:rFonts w:ascii="Arial" w:hAnsi="Arial" w:cs="Arial"/>
+          <w:sz w:val="36"/>
+          <w:szCs w:val="36"/>
+        </w:rPr>
+        <w:t xml:space="preserve">   • BGR</w:t>
+      </w:r>
+    </w:p>
+    <w:p>
+      <w:pPr>
+        <w:rPr>
+          <w:rFonts w:ascii="Arial" w:hAnsi="Arial" w:cs="Arial"/>
+          <w:sz w:val="36"/>
+          <w:szCs w:val="36"/>
+        </w:rPr>
+      </w:pPr>
+      <w:r>
+        <w:rPr>
+          <w:rFonts w:ascii="Arial" w:hAnsi="Arial" w:cs="Arial"/>
+          <w:sz w:val="36"/>
+          <w:szCs w:val="36"/>
+        </w:rPr>
+        <w:t xml:space="preserve">   • RGB</w:t>
+      </w:r>
+    </w:p>
+    <w:p>
+      <w:pPr>
+        <w:rPr>
+          <w:rFonts w:ascii="Arial" w:hAnsi="Arial" w:cs="Arial"/>
+          <w:sz w:val="36"/>
+          <w:szCs w:val="36"/>
+        </w:rPr>
+      </w:pPr>
+      <w:r>
+        <w:rPr>
+          <w:rFonts w:ascii="Arial" w:hAnsi="Arial" w:cs="Arial"/>
+          <w:sz w:val="36"/>
+          <w:szCs w:val="36"/>
+        </w:rPr>
+        <w:t xml:space="preserve">   • Grayscale</w:t>
+      </w:r>
+    </w:p>
+    <w:p>
+      <w:pPr>
+        <w:rPr>
+          <w:rFonts w:ascii="Arial" w:hAnsi="Arial" w:cs="Arial"/>
+          <w:sz w:val="36"/>
+          <w:szCs w:val="36"/>
+        </w:rPr>
+      </w:pPr>
+      <w:r>
+        <w:rPr>
+          <w:rFonts w:ascii="Arial" w:hAnsi="Arial" w:cs="Arial"/>
+          <w:sz w:val="36"/>
+          <w:szCs w:val="36"/>
+        </w:rPr>
+        <w:t xml:space="preserve">   • HSV</w:t>
+      </w:r>
+    </w:p>
+    <w:p>
+      <w:pPr>
+        <w:rPr>
+          <w:rFonts w:ascii="Arial" w:hAnsi="Arial" w:cs="Arial"/>
+          <w:sz w:val="36"/>
+          <w:szCs w:val="36"/>
+        </w:rPr>
+      </w:pPr>
+    </w:p>
+    <w:p>
+      <w:pPr>
+        <w:rPr>
+          <w:rFonts w:ascii="Arial" w:hAnsi="Arial" w:cs="Arial"/>
+          <w:sz w:val="36"/>
+          <w:szCs w:val="36"/>
+        </w:rPr>
+      </w:pPr>
+      <w:r>
+        <w:rPr>
+          <w:rFonts w:ascii="Segoe UI Emoji" w:hAnsi="Segoe UI Emoji" w:cs="Segoe UI Emoji"/>
+          <w:sz w:val="36"/>
+          <w:szCs w:val="36"/>
+        </w:rPr>
+        <w:t>⬜</w:t>
+      </w:r>
+      <w:r>
+        <w:rPr>
+          <w:rFonts w:ascii="Arial" w:hAnsi="Arial" w:cs="Arial"/>
+          <w:sz w:val="36"/>
+          <w:szCs w:val="36"/>
+        </w:rPr>
+        <w:t xml:space="preserve"> Convert between </w:t>
+      </w:r>
+      <w:proofErr w:type="spellStart"/>
+      <w:r>
+        <w:rPr>
+          <w:rFonts w:ascii="Arial" w:hAnsi="Arial" w:cs="Arial"/>
+          <w:sz w:val="36"/>
+          <w:szCs w:val="36"/>
+        </w:rPr>
+        <w:t>color</w:t>
+      </w:r>
+      <w:proofErr w:type="spellEnd"/>
+      <w:r>
+        <w:rPr>
+          <w:rFonts w:ascii="Arial" w:hAnsi="Arial" w:cs="Arial"/>
+          <w:sz w:val="36"/>
+          <w:szCs w:val="36"/>
+        </w:rPr>
+        <w:t xml:space="preserve"> spaces</w:t>
+      </w:r>
+    </w:p>
+    <w:p>
+      <w:pPr>
+        <w:rPr>
+          <w:rFonts w:ascii="Arial" w:hAnsi="Arial" w:cs="Arial"/>
+          <w:sz w:val="36"/>
+          <w:szCs w:val="36"/>
+        </w:rPr>
+      </w:pPr>
+    </w:p>
+    <w:p>
+      <w:pPr>
+        <w:rPr>
+          <w:rFonts w:ascii="Arial" w:hAnsi="Arial" w:cs="Arial"/>
+          <w:sz w:val="36"/>
+          <w:szCs w:val="36"/>
+        </w:rPr>
+      </w:pPr>
+      <w:r>
+        <w:rPr>
+          <w:rFonts w:ascii="Segoe UI Emoji" w:hAnsi="Segoe UI Emoji" w:cs="Segoe UI Emoji"/>
+          <w:sz w:val="36"/>
+          <w:szCs w:val="36"/>
+        </w:rPr>
+        <w:t>⬜</w:t>
+      </w:r>
+      <w:r>
+        <w:rPr>
+          <w:rFonts w:ascii="Arial" w:hAnsi="Arial" w:cs="Arial"/>
+          <w:sz w:val="36"/>
+          <w:szCs w:val="36"/>
+        </w:rPr>
+        <w:t xml:space="preserve"> Split </w:t>
+      </w:r>
+      <w:proofErr w:type="spellStart"/>
+      <w:r>
+        <w:rPr>
+          <w:rFonts w:ascii="Arial" w:hAnsi="Arial" w:cs="Arial"/>
+          <w:sz w:val="36"/>
+          <w:szCs w:val="36"/>
+        </w:rPr>
+        <w:t>color</w:t>
+      </w:r>
+      <w:proofErr w:type="spellEnd"/>
+      <w:r>
+        <w:rPr>
+          <w:rFonts w:ascii="Arial" w:hAnsi="Arial" w:cs="Arial"/>
+          <w:sz w:val="36"/>
+          <w:szCs w:val="36"/>
+        </w:rPr>
+        <w:t xml:space="preserve"> channels</w:t>
+      </w:r>
+    </w:p>
+    <w:p>
+      <w:pPr>
+        <w:rPr>
+          <w:rFonts w:ascii="Arial" w:hAnsi="Arial" w:cs="Arial"/>
+          <w:sz w:val="36"/>
+          <w:szCs w:val="36"/>
+        </w:rPr>
+      </w:pPr>
+    </w:p>
+    <w:p>
+      <w:pPr>
+        <w:rPr>
+          <w:rFonts w:ascii="Arial" w:hAnsi="Arial" w:cs="Arial"/>
+          <w:sz w:val="36"/>
+          <w:szCs w:val="36"/>
+        </w:rPr>
+      </w:pPr>
+      <w:r>
+        <w:rPr>
+          <w:rFonts w:ascii="Segoe UI Emoji" w:hAnsi="Segoe UI Emoji" w:cs="Segoe UI Emoji"/>
+          <w:sz w:val="36"/>
+          <w:szCs w:val="36"/>
+        </w:rPr>
+        <w:t>⬜</w:t>
+      </w:r>
+      <w:r>
+        <w:rPr>
+          <w:rFonts w:ascii="Arial" w:hAnsi="Arial" w:cs="Arial"/>
+          <w:sz w:val="36"/>
+          <w:szCs w:val="36"/>
+        </w:rPr>
+        <w:t xml:space="preserve"> Merge </w:t>
+      </w:r>
+      <w:proofErr w:type="spellStart"/>
+      <w:r>
+        <w:rPr>
+          <w:rFonts w:ascii="Arial" w:hAnsi="Arial" w:cs="Arial"/>
+          <w:sz w:val="36"/>
+          <w:szCs w:val="36"/>
+        </w:rPr>
+        <w:t>color</w:t>
+      </w:r>
+      <w:proofErr w:type="spellEnd"/>
+      <w:r>
+        <w:rPr>
+          <w:rFonts w:ascii="Arial" w:hAnsi="Arial" w:cs="Arial"/>
+          <w:sz w:val="36"/>
+          <w:szCs w:val="36"/>
+        </w:rPr>
+        <w:t xml:space="preserve"> channels</w:t>
+      </w:r>
+    </w:p>
+    <w:p>
+      <w:pPr>
+        <w:rPr>
+          <w:rFonts w:ascii="Arial" w:hAnsi="Arial" w:cs="Arial"/>
+          <w:sz w:val="36"/>
+          <w:szCs w:val="36"/>
+        </w:rPr>
+      </w:pPr>
+    </w:p>
+    <w:p>
+      <w:pPr>
+        <w:rPr>
+          <w:rFonts w:ascii="Arial" w:hAnsi="Arial" w:cs="Arial"/>
+          <w:sz w:val="36"/>
+          <w:szCs w:val="36"/>
+        </w:rPr>
+      </w:pPr>
+      <w:r>
+        <w:rPr>
+          <w:rFonts w:ascii="Segoe UI Emoji" w:hAnsi="Segoe UI Emoji" w:cs="Segoe UI Emoji"/>
+          <w:sz w:val="36"/>
+          <w:szCs w:val="36"/>
+        </w:rPr>
+        <w:t>⬜</w:t>
+      </w:r>
+      <w:r>
+        <w:rPr>
+          <w:rFonts w:ascii="Arial" w:hAnsi="Arial" w:cs="Arial"/>
+          <w:sz w:val="36"/>
+          <w:szCs w:val="36"/>
+        </w:rPr>
+        <w:t xml:space="preserve"> Mini Project</w:t>
+      </w:r>
+    </w:p>
+    <w:p>
+      <w:pPr>
+        <w:rPr>
+          <w:rFonts w:ascii="Arial" w:hAnsi="Arial" w:cs="Arial"/>
+          <w:sz w:val="36"/>
+          <w:szCs w:val="36"/>
+        </w:rPr>
+      </w:pPr>
+    </w:p>
+    <w:p>
+      <w:pPr>
+        <w:rPr>
+          <w:rFonts w:ascii="Arial" w:hAnsi="Arial" w:cs="Arial"/>
+          <w:sz w:val="36"/>
+          <w:szCs w:val="36"/>
+        </w:rPr>
+      </w:pPr>
+    </w:p>
+    <w:p>
+      <w:pPr>
+        <w:pStyle w:val="ListParagraph"/>
+        <w:numPr>
+          <w:ilvl w:val="0"/>
+          <w:numId w:val="10"/>
+        </w:numPr>
+        <w:rPr>
+          <w:rFonts w:ascii="Arial" w:hAnsi="Arial" w:cs="Arial"/>
+          <w:sz w:val="36"/>
+          <w:szCs w:val="36"/>
+        </w:rPr>
+      </w:pPr>
+      <w:r>
+        <w:rPr>
+          <w:rFonts w:ascii="Arial" w:hAnsi="Arial" w:cs="Arial"/>
+          <w:sz w:val="36"/>
+          <w:szCs w:val="36"/>
+        </w:rPr>
+        <w:t>A grayscale image contains only brightness (intensity) information.</w:t>
+      </w:r>
+    </w:p>
+    <w:p>
+      <w:pPr>
+        <w:rPr>
+          <w:rFonts w:ascii="Arial" w:hAnsi="Arial" w:cs="Arial"/>
+          <w:sz w:val="36"/>
+          <w:szCs w:val="36"/>
+        </w:rPr>
+      </w:pPr>
+    </w:p>
+    <w:p>
+      <w:pPr>
+        <w:rPr>
+          <w:rFonts w:ascii="Arial" w:hAnsi="Arial" w:cs="Arial"/>
+          <w:sz w:val="36"/>
+          <w:szCs w:val="36"/>
+        </w:rPr>
+      </w:pPr>
+      <w:r>
+        <w:rPr>
+          <w:rFonts w:ascii="Arial" w:hAnsi="Arial" w:cs="Arial"/>
+          <w:sz w:val="36"/>
+          <w:szCs w:val="36"/>
+        </w:rPr>
+        <w:t xml:space="preserve">All </w:t>
+      </w:r>
+      <w:proofErr w:type="spellStart"/>
+      <w:r>
+        <w:rPr>
+          <w:rFonts w:ascii="Arial" w:hAnsi="Arial" w:cs="Arial"/>
+          <w:sz w:val="36"/>
+          <w:szCs w:val="36"/>
+        </w:rPr>
+        <w:t>color</w:t>
+      </w:r>
+      <w:proofErr w:type="spellEnd"/>
+      <w:r>
+        <w:rPr>
+          <w:rFonts w:ascii="Arial" w:hAnsi="Arial" w:cs="Arial"/>
+          <w:sz w:val="36"/>
+          <w:szCs w:val="36"/>
+        </w:rPr>
+        <w:t xml:space="preserve"> information (Red, Green, and Blue) is removed.</w:t>
+      </w:r>
+    </w:p>
+    <w:p>
+      <w:pPr>
+        <w:pStyle w:val="ListParagraph"/>
+        <w:numPr>
+          <w:ilvl w:val="0"/>
+          <w:numId w:val="10"/>
+        </w:numPr>
+        <w:rPr>
+          <w:rFonts w:ascii="Arial" w:hAnsi="Arial" w:cs="Arial"/>
+          <w:sz w:val="36"/>
+          <w:szCs w:val="36"/>
+        </w:rPr>
+      </w:pPr>
+      <w:r>
+        <w:rPr>
+          <w:rFonts w:ascii="Arial" w:hAnsi="Arial" w:cs="Arial"/>
+          <w:sz w:val="36"/>
+          <w:szCs w:val="36"/>
+        </w:rPr>
+        <w:lastRenderedPageBreak/>
+        <w:t xml:space="preserve"> Why OpenCV uses RGB format instead of RGB?</w:t>
+      </w:r>
+    </w:p>
+    <w:p>
+      <w:pPr>
+        <w:pStyle w:val="ListParagraph"/>
+        <w:rPr>
+          <w:rFonts w:ascii="Arial" w:hAnsi="Arial" w:cs="Arial"/>
+          <w:sz w:val="36"/>
+          <w:szCs w:val="36"/>
+        </w:rPr>
+      </w:pPr>
+    </w:p>
+    <w:p>
+      <w:pPr>
+        <w:pStyle w:val="ListParagraph"/>
+        <w:rPr>
+          <w:rFonts w:ascii="Arial" w:hAnsi="Arial" w:cs="Arial"/>
+          <w:sz w:val="36"/>
+          <w:szCs w:val="36"/>
+        </w:rPr>
+      </w:pPr>
+      <w:r>
+        <w:rPr>
+          <w:rFonts w:ascii="Arial" w:hAnsi="Arial" w:cs="Arial"/>
+          <w:sz w:val="36"/>
+          <w:szCs w:val="36"/>
+        </w:rPr>
+        <w:t xml:space="preserve">OpenCV was originally developed using older image processing libraries and formats that stored </w:t>
+      </w:r>
+      <w:proofErr w:type="spellStart"/>
+      <w:r>
+        <w:rPr>
+          <w:rFonts w:ascii="Arial" w:hAnsi="Arial" w:cs="Arial"/>
+          <w:sz w:val="36"/>
+          <w:szCs w:val="36"/>
+        </w:rPr>
+        <w:t>color</w:t>
+      </w:r>
+      <w:proofErr w:type="spellEnd"/>
+      <w:r>
+        <w:rPr>
+          <w:rFonts w:ascii="Arial" w:hAnsi="Arial" w:cs="Arial"/>
+          <w:sz w:val="36"/>
+          <w:szCs w:val="36"/>
+        </w:rPr>
+        <w:t xml:space="preserve"> data in BGR order. To maintain compatibility with those systems, OpenCV kept BGR as its default </w:t>
+      </w:r>
+      <w:proofErr w:type="spellStart"/>
+      <w:r>
+        <w:rPr>
+          <w:rFonts w:ascii="Arial" w:hAnsi="Arial" w:cs="Arial"/>
+          <w:sz w:val="36"/>
+          <w:szCs w:val="36"/>
+        </w:rPr>
+        <w:t>color</w:t>
+      </w:r>
+      <w:proofErr w:type="spellEnd"/>
+      <w:r>
+        <w:rPr>
+          <w:rFonts w:ascii="Arial" w:hAnsi="Arial" w:cs="Arial"/>
+          <w:sz w:val="36"/>
+          <w:szCs w:val="36"/>
+        </w:rPr>
+        <w:t xml:space="preserve"> format. Modern libraries like Matplotlib and Pillow use RGB, so we often convert BGR to RGB when using them together.</w:t>
+      </w:r>
+    </w:p>
+    <w:p>
+      <w:pPr>
+        <w:pStyle w:val="ListParagraph"/>
+        <w:rPr>
+          <w:rFonts w:ascii="Arial" w:hAnsi="Arial" w:cs="Arial"/>
+          <w:sz w:val="36"/>
+          <w:szCs w:val="36"/>
+        </w:rPr>
+      </w:pPr>
+    </w:p>
+    <w:p>
+      <w:pPr>
+        <w:pStyle w:val="ListParagraph"/>
+        <w:numPr>
+          <w:ilvl w:val="0"/>
+          <w:numId w:val="10"/>
+        </w:numPr>
+        <w:rPr>
+          <w:rFonts w:ascii="Arial" w:hAnsi="Arial" w:cs="Arial"/>
+          <w:sz w:val="36"/>
+          <w:szCs w:val="36"/>
+        </w:rPr>
+      </w:pPr>
+      <w:r>
+        <w:rPr>
+          <w:rFonts w:ascii="Arial" w:hAnsi="Arial" w:cs="Arial"/>
+          <w:sz w:val="36"/>
+          <w:szCs w:val="36"/>
+        </w:rPr>
+        <w:t>cv2.cvtColor()</w:t>
+      </w:r>
+    </w:p>
+    <w:p>
+      <w:pPr>
+        <w:pStyle w:val="ListParagraph"/>
+        <w:rPr>
+          <w:rFonts w:ascii="Arial" w:hAnsi="Arial" w:cs="Arial"/>
+          <w:sz w:val="36"/>
+          <w:szCs w:val="36"/>
+        </w:rPr>
+      </w:pPr>
+    </w:p>
+    <w:p>
+      <w:pPr>
+        <w:pStyle w:val="ListParagraph"/>
+        <w:rPr>
+          <w:rFonts w:ascii="Arial" w:hAnsi="Arial" w:cs="Arial"/>
+          <w:sz w:val="36"/>
+          <w:szCs w:val="36"/>
+        </w:rPr>
+      </w:pPr>
+      <w:r>
+        <w:rPr>
+          <w:rFonts w:ascii="Arial" w:hAnsi="Arial" w:cs="Arial"/>
+          <w:sz w:val="36"/>
+          <w:szCs w:val="36"/>
+        </w:rPr>
+        <w:t xml:space="preserve">• </w:t>
+      </w:r>
+      <w:proofErr w:type="spellStart"/>
+      <w:r>
+        <w:rPr>
+          <w:rFonts w:ascii="Arial" w:hAnsi="Arial" w:cs="Arial"/>
+          <w:sz w:val="36"/>
+          <w:szCs w:val="36"/>
+        </w:rPr>
+        <w:t>cvt</w:t>
+      </w:r>
+      <w:proofErr w:type="spellEnd"/>
+      <w:r>
+        <w:rPr>
+          <w:rFonts w:ascii="Arial" w:hAnsi="Arial" w:cs="Arial"/>
+          <w:sz w:val="36"/>
+          <w:szCs w:val="36"/>
+        </w:rPr>
+        <w:t xml:space="preserve"> = Convert</w:t>
+      </w:r>
+    </w:p>
+    <w:p>
+      <w:pPr>
+        <w:pStyle w:val="ListParagraph"/>
+        <w:rPr>
+          <w:rFonts w:ascii="Arial" w:hAnsi="Arial" w:cs="Arial"/>
+          <w:sz w:val="36"/>
+          <w:szCs w:val="36"/>
+        </w:rPr>
+      </w:pPr>
+      <w:r>
+        <w:rPr>
+          <w:rFonts w:ascii="Arial" w:hAnsi="Arial" w:cs="Arial"/>
+          <w:sz w:val="36"/>
+          <w:szCs w:val="36"/>
+        </w:rPr>
+        <w:t xml:space="preserve">• </w:t>
+      </w:r>
+      <w:proofErr w:type="spellStart"/>
+      <w:r>
+        <w:rPr>
+          <w:rFonts w:ascii="Arial" w:hAnsi="Arial" w:cs="Arial"/>
+          <w:sz w:val="36"/>
+          <w:szCs w:val="36"/>
+        </w:rPr>
+        <w:t>Color</w:t>
+      </w:r>
+      <w:proofErr w:type="spellEnd"/>
+      <w:r>
+        <w:rPr>
+          <w:rFonts w:ascii="Arial" w:hAnsi="Arial" w:cs="Arial"/>
+          <w:sz w:val="36"/>
+          <w:szCs w:val="36"/>
+        </w:rPr>
+        <w:t xml:space="preserve"> = </w:t>
+      </w:r>
+      <w:proofErr w:type="spellStart"/>
+      <w:r>
+        <w:rPr>
+          <w:rFonts w:ascii="Arial" w:hAnsi="Arial" w:cs="Arial"/>
+          <w:sz w:val="36"/>
+          <w:szCs w:val="36"/>
+        </w:rPr>
+        <w:t>Color</w:t>
+      </w:r>
+      <w:proofErr w:type="spellEnd"/>
+      <w:r>
+        <w:rPr>
+          <w:rFonts w:ascii="Arial" w:hAnsi="Arial" w:cs="Arial"/>
+          <w:sz w:val="36"/>
+          <w:szCs w:val="36"/>
+        </w:rPr>
+        <w:t xml:space="preserve"> Space</w:t>
+      </w:r>
+    </w:p>
+    <w:p>
+      <w:pPr>
+        <w:pStyle w:val="ListParagraph"/>
+        <w:rPr>
+          <w:rFonts w:ascii="Arial" w:hAnsi="Arial" w:cs="Arial"/>
+          <w:sz w:val="36"/>
+          <w:szCs w:val="36"/>
+        </w:rPr>
+      </w:pPr>
+      <w:r>
+        <w:rPr>
+          <w:rFonts w:ascii="Arial" w:hAnsi="Arial" w:cs="Arial"/>
+          <w:sz w:val="36"/>
+          <w:szCs w:val="36"/>
+        </w:rPr>
+        <w:t xml:space="preserve">• Used to convert an image from one </w:t>
+      </w:r>
+      <w:proofErr w:type="spellStart"/>
+      <w:r>
+        <w:rPr>
+          <w:rFonts w:ascii="Arial" w:hAnsi="Arial" w:cs="Arial"/>
+          <w:sz w:val="36"/>
+          <w:szCs w:val="36"/>
+        </w:rPr>
+        <w:t>color</w:t>
+      </w:r>
+      <w:proofErr w:type="spellEnd"/>
+      <w:r>
+        <w:rPr>
+          <w:rFonts w:ascii="Arial" w:hAnsi="Arial" w:cs="Arial"/>
+          <w:sz w:val="36"/>
+          <w:szCs w:val="36"/>
+        </w:rPr>
+        <w:t xml:space="preserve"> space to another.</w:t>
+      </w:r>
+    </w:p>
+    <w:p>
+      <w:pPr>
+        <w:pStyle w:val="ListParagraph"/>
+        <w:rPr>
+          <w:rFonts w:ascii="Arial" w:hAnsi="Arial" w:cs="Arial"/>
+          <w:sz w:val="36"/>
+          <w:szCs w:val="36"/>
+        </w:rPr>
+      </w:pPr>
+      <w:r>
+        <w:rPr>
+          <w:rFonts w:ascii="Arial" w:hAnsi="Arial" w:cs="Arial"/>
+          <w:sz w:val="36"/>
+          <w:szCs w:val="36"/>
+        </w:rPr>
+        <w:t>• It returns a new NumPy array.</w:t>
+      </w:r>
+    </w:p>
+    <w:p>
+      <w:pPr>
+        <w:pStyle w:val="ListParagraph"/>
+        <w:rPr>
+          <w:rFonts w:ascii="Arial" w:hAnsi="Arial" w:cs="Arial"/>
+          <w:sz w:val="36"/>
+          <w:szCs w:val="36"/>
+        </w:rPr>
+      </w:pPr>
+      <w:r>
+        <w:rPr>
+          <w:rFonts w:ascii="Arial" w:hAnsi="Arial" w:cs="Arial"/>
+          <w:sz w:val="36"/>
+          <w:szCs w:val="36"/>
+        </w:rPr>
+        <w:t>• The original image remains unchanged unless we overwrite it.</w:t>
+      </w:r>
+    </w:p>
+    <w:p>
+      <w:pPr>
+        <w:pStyle w:val="ListParagraph"/>
+        <w:rPr>
+          <w:rFonts w:ascii="Arial" w:hAnsi="Arial" w:cs="Arial"/>
+          <w:sz w:val="36"/>
+          <w:szCs w:val="36"/>
+        </w:rPr>
+      </w:pPr>
+    </w:p>
+    <w:p>
+      <w:pPr>
+        <w:pStyle w:val="ListParagraph"/>
+        <w:numPr>
+          <w:ilvl w:val="0"/>
+          <w:numId w:val="10"/>
+        </w:numPr>
+        <w:rPr>
+          <w:rFonts w:ascii="Arial" w:hAnsi="Arial" w:cs="Arial"/>
+          <w:sz w:val="36"/>
+          <w:szCs w:val="36"/>
+        </w:rPr>
+      </w:pPr>
+      <w:proofErr w:type="spellStart"/>
+      <w:proofErr w:type="gramStart"/>
+      <w:r>
+        <w:rPr>
+          <w:rFonts w:ascii="Arial" w:hAnsi="Arial" w:cs="Arial"/>
+          <w:sz w:val="36"/>
+          <w:szCs w:val="36"/>
+        </w:rPr>
+        <w:t>image.shape</w:t>
+      </w:r>
+      <w:proofErr w:type="spellEnd"/>
+      <w:proofErr w:type="gramEnd"/>
+      <w:r>
+        <w:rPr>
+          <w:rFonts w:ascii="Arial" w:hAnsi="Arial" w:cs="Arial"/>
+          <w:sz w:val="36"/>
+          <w:szCs w:val="36"/>
+        </w:rPr>
+        <w:t xml:space="preserve"> only tells us the dimensions of the image:</w:t>
+      </w:r>
+    </w:p>
+    <w:p>
+      <w:pPr>
+        <w:pStyle w:val="ListParagraph"/>
+        <w:rPr>
+          <w:rFonts w:ascii="Arial" w:hAnsi="Arial" w:cs="Arial"/>
+          <w:sz w:val="36"/>
+          <w:szCs w:val="36"/>
+        </w:rPr>
+      </w:pPr>
+      <w:r>
+        <w:rPr>
+          <w:rFonts w:ascii="Arial" w:hAnsi="Arial" w:cs="Arial"/>
+          <w:sz w:val="36"/>
+          <w:szCs w:val="36"/>
+        </w:rPr>
+        <w:t>(Height, Width, Channels)</w:t>
+      </w:r>
+    </w:p>
+    <w:p>
+      <w:pPr>
+        <w:pStyle w:val="ListParagraph"/>
+        <w:rPr>
+          <w:rFonts w:ascii="Arial" w:hAnsi="Arial" w:cs="Arial"/>
+          <w:sz w:val="36"/>
+          <w:szCs w:val="36"/>
+        </w:rPr>
+      </w:pPr>
+    </w:p>
+    <w:p>
+      <w:pPr>
+        <w:pStyle w:val="ListParagraph"/>
+        <w:rPr>
+          <w:rFonts w:ascii="Arial" w:hAnsi="Arial" w:cs="Arial"/>
+          <w:sz w:val="36"/>
+          <w:szCs w:val="36"/>
+        </w:rPr>
+      </w:pPr>
+      <w:r>
+        <w:rPr>
+          <w:rFonts w:ascii="Arial" w:hAnsi="Arial" w:cs="Arial"/>
+          <w:sz w:val="36"/>
+          <w:szCs w:val="36"/>
+        </w:rPr>
+        <w:t>It does not tell us the pixel values.</w:t>
+      </w:r>
+    </w:p>
+    <w:p>
+      <w:pPr>
+        <w:pStyle w:val="ListParagraph"/>
+        <w:rPr>
+          <w:rFonts w:ascii="Arial" w:hAnsi="Arial" w:cs="Arial"/>
+          <w:sz w:val="36"/>
+          <w:szCs w:val="36"/>
+        </w:rPr>
+      </w:pPr>
+    </w:p>
+    <w:p>
+      <w:pPr>
+        <w:pStyle w:val="ListParagraph"/>
+        <w:rPr>
+          <w:rFonts w:ascii="Arial" w:hAnsi="Arial" w:cs="Arial"/>
+          <w:sz w:val="36"/>
+          <w:szCs w:val="36"/>
+        </w:rPr>
+      </w:pPr>
+      <w:r>
+        <w:rPr>
+          <w:rFonts w:ascii="Arial" w:hAnsi="Arial" w:cs="Arial"/>
+          <w:sz w:val="36"/>
+          <w:szCs w:val="36"/>
+        </w:rPr>
+        <w:t>To see the pixel values, we use indexing:</w:t>
+      </w:r>
+    </w:p>
+    <w:p>
+      <w:pPr>
+        <w:pStyle w:val="ListParagraph"/>
+        <w:rPr>
+          <w:rFonts w:ascii="Arial" w:hAnsi="Arial" w:cs="Arial"/>
+          <w:sz w:val="36"/>
+          <w:szCs w:val="36"/>
+        </w:rPr>
+      </w:pPr>
+      <w:proofErr w:type="gramStart"/>
+      <w:r>
+        <w:rPr>
+          <w:rFonts w:ascii="Arial" w:hAnsi="Arial" w:cs="Arial"/>
+          <w:sz w:val="36"/>
+          <w:szCs w:val="36"/>
+        </w:rPr>
+        <w:t>image[</w:t>
+      </w:r>
+      <w:proofErr w:type="gramEnd"/>
+      <w:r>
+        <w:rPr>
+          <w:rFonts w:ascii="Arial" w:hAnsi="Arial" w:cs="Arial"/>
+          <w:sz w:val="36"/>
+          <w:szCs w:val="36"/>
+        </w:rPr>
+        <w:t>row, column]</w:t>
+      </w:r>
+    </w:p>
+    <w:p>
+      <w:pPr>
+        <w:pStyle w:val="ListParagraph"/>
+        <w:rPr>
+          <w:rFonts w:ascii="Arial" w:hAnsi="Arial" w:cs="Arial"/>
+          <w:sz w:val="36"/>
+          <w:szCs w:val="36"/>
+        </w:rPr>
+      </w:pPr>
+    </w:p>
+    <w:p>
+      <w:pPr>
+        <w:pStyle w:val="ListParagraph"/>
+        <w:rPr>
+          <w:rFonts w:ascii="Arial" w:hAnsi="Arial" w:cs="Arial"/>
+          <w:sz w:val="36"/>
+          <w:szCs w:val="36"/>
+        </w:rPr>
+      </w:pPr>
+      <w:r>
+        <w:rPr>
+          <w:rFonts w:ascii="Arial" w:hAnsi="Arial" w:cs="Arial"/>
+          <w:sz w:val="36"/>
+          <w:szCs w:val="36"/>
+        </w:rPr>
+        <w:lastRenderedPageBreak/>
+        <w:t>HSV asks different questions.</w:t>
+      </w:r>
+    </w:p>
+    <w:p>
+      <w:pPr>
+        <w:pStyle w:val="ListParagraph"/>
+        <w:rPr>
+          <w:rFonts w:ascii="Arial" w:hAnsi="Arial" w:cs="Arial"/>
+          <w:sz w:val="36"/>
+          <w:szCs w:val="36"/>
+        </w:rPr>
+      </w:pPr>
+      <w:r>
+        <w:rPr>
+          <w:rFonts w:ascii="Arial" w:hAnsi="Arial" w:cs="Arial"/>
+          <w:sz w:val="36"/>
+          <w:szCs w:val="36"/>
+        </w:rPr>
+        <w:t xml:space="preserve">It separates </w:t>
+      </w:r>
+      <w:proofErr w:type="spellStart"/>
+      <w:r>
+        <w:rPr>
+          <w:rFonts w:ascii="Arial" w:hAnsi="Arial" w:cs="Arial"/>
+          <w:sz w:val="36"/>
+          <w:szCs w:val="36"/>
+        </w:rPr>
+        <w:t>color</w:t>
+      </w:r>
+      <w:proofErr w:type="spellEnd"/>
+      <w:r>
+        <w:rPr>
+          <w:rFonts w:ascii="Arial" w:hAnsi="Arial" w:cs="Arial"/>
+          <w:sz w:val="36"/>
+          <w:szCs w:val="36"/>
+        </w:rPr>
+        <w:t xml:space="preserve"> into </w:t>
+      </w:r>
+      <w:r>
+        <w:rPr>
+          <w:rFonts w:ascii="Arial" w:hAnsi="Arial" w:cs="Arial"/>
+          <w:b/>
+          <w:bCs/>
+          <w:sz w:val="36"/>
+          <w:szCs w:val="36"/>
+        </w:rPr>
+        <w:t>three properties</w:t>
+      </w:r>
+      <w:r>
+        <w:rPr>
+          <w:rFonts w:ascii="Arial" w:hAnsi="Arial" w:cs="Arial"/>
+          <w:sz w:val="36"/>
+          <w:szCs w:val="36"/>
+        </w:rPr>
+        <w:t>:</w:t>
+      </w:r>
+    </w:p>
+    <w:p>
+      <w:pPr>
+        <w:pStyle w:val="ListParagraph"/>
+        <w:numPr>
+          <w:ilvl w:val="0"/>
+          <w:numId w:val="15"/>
+        </w:numPr>
+        <w:rPr>
+          <w:rFonts w:ascii="Arial" w:hAnsi="Arial" w:cs="Arial"/>
+          <w:sz w:val="36"/>
+          <w:szCs w:val="36"/>
+        </w:rPr>
+      </w:pPr>
+      <w:r>
+        <w:rPr>
+          <w:rFonts w:ascii="Arial" w:hAnsi="Arial" w:cs="Arial"/>
+          <w:b/>
+          <w:bCs/>
+          <w:sz w:val="36"/>
+          <w:szCs w:val="36"/>
+        </w:rPr>
+        <w:t>H = Hue</w:t>
+      </w:r>
+      <w:r>
+        <w:rPr>
+          <w:rFonts w:ascii="Arial" w:hAnsi="Arial" w:cs="Arial"/>
+          <w:sz w:val="36"/>
+          <w:szCs w:val="36"/>
+        </w:rPr>
+        <w:t xml:space="preserve"> → What </w:t>
+      </w:r>
+      <w:proofErr w:type="spellStart"/>
+      <w:r>
+        <w:rPr>
+          <w:rFonts w:ascii="Arial" w:hAnsi="Arial" w:cs="Arial"/>
+          <w:sz w:val="36"/>
+          <w:szCs w:val="36"/>
+        </w:rPr>
+        <w:t>color</w:t>
+      </w:r>
+      <w:proofErr w:type="spellEnd"/>
+      <w:r>
+        <w:rPr>
+          <w:rFonts w:ascii="Arial" w:hAnsi="Arial" w:cs="Arial"/>
+          <w:sz w:val="36"/>
+          <w:szCs w:val="36"/>
+        </w:rPr>
+        <w:t xml:space="preserve"> is it? </w:t>
+      </w:r>
+    </w:p>
+    <w:p>
+      <w:pPr>
+        <w:pStyle w:val="ListParagraph"/>
+        <w:numPr>
+          <w:ilvl w:val="0"/>
+          <w:numId w:val="15"/>
+        </w:numPr>
+        <w:rPr>
+          <w:rFonts w:ascii="Arial" w:hAnsi="Arial" w:cs="Arial"/>
+          <w:sz w:val="36"/>
+          <w:szCs w:val="36"/>
+        </w:rPr>
+      </w:pPr>
+      <w:r>
+        <w:rPr>
+          <w:rFonts w:ascii="Arial" w:hAnsi="Arial" w:cs="Arial"/>
+          <w:b/>
+          <w:bCs/>
+          <w:sz w:val="36"/>
+          <w:szCs w:val="36"/>
+        </w:rPr>
+        <w:t>S = Saturation</w:t>
+      </w:r>
+      <w:r>
+        <w:rPr>
+          <w:rFonts w:ascii="Arial" w:hAnsi="Arial" w:cs="Arial"/>
+          <w:sz w:val="36"/>
+          <w:szCs w:val="36"/>
+        </w:rPr>
+        <w:t xml:space="preserve"> → How pure or dull is the </w:t>
+      </w:r>
+      <w:proofErr w:type="spellStart"/>
+      <w:r>
+        <w:rPr>
+          <w:rFonts w:ascii="Arial" w:hAnsi="Arial" w:cs="Arial"/>
+          <w:sz w:val="36"/>
+          <w:szCs w:val="36"/>
+        </w:rPr>
+        <w:t>color</w:t>
+      </w:r>
+      <w:proofErr w:type="spellEnd"/>
+      <w:r>
+        <w:rPr>
+          <w:rFonts w:ascii="Arial" w:hAnsi="Arial" w:cs="Arial"/>
+          <w:sz w:val="36"/>
+          <w:szCs w:val="36"/>
+        </w:rPr>
+        <w:t xml:space="preserve">? </w:t>
+      </w:r>
+    </w:p>
+    <w:p>
+      <w:pPr>
+        <w:pStyle w:val="ListParagraph"/>
+        <w:numPr>
+          <w:ilvl w:val="0"/>
+          <w:numId w:val="15"/>
+        </w:numPr>
+        <w:rPr>
+          <w:rFonts w:ascii="Arial" w:hAnsi="Arial" w:cs="Arial"/>
+          <w:sz w:val="36"/>
+          <w:szCs w:val="36"/>
+        </w:rPr>
+      </w:pPr>
+      <w:r>
+        <w:rPr>
+          <w:rFonts w:ascii="Arial" w:hAnsi="Arial" w:cs="Arial"/>
+          <w:b/>
+          <w:bCs/>
+          <w:sz w:val="36"/>
+          <w:szCs w:val="36"/>
+        </w:rPr>
+        <w:t>V = Value</w:t>
+      </w:r>
+      <w:r>
+        <w:rPr>
+          <w:rFonts w:ascii="Arial" w:hAnsi="Arial" w:cs="Arial"/>
+          <w:sz w:val="36"/>
+          <w:szCs w:val="36"/>
+        </w:rPr>
+        <w:t xml:space="preserve"> → How bright or dark is it? </w:t>
+      </w:r>
+    </w:p>
+    <w:p>
+      <w:pPr>
+        <w:pStyle w:val="ListParagraph"/>
+        <w:rPr>
+          <w:rFonts w:ascii="Arial" w:hAnsi="Arial" w:cs="Arial"/>
+          <w:sz w:val="36"/>
+          <w:szCs w:val="36"/>
+        </w:rPr>
+      </w:pPr>
+      <w:r>
+        <w:rPr>
+          <w:rFonts w:ascii="Arial" w:hAnsi="Arial" w:cs="Arial"/>
+          <w:sz w:val="36"/>
+          <w:szCs w:val="36"/>
+        </w:rPr>
+        <w:t xml:space="preserve">This separation makes </w:t>
+      </w:r>
+      <w:proofErr w:type="spellStart"/>
+      <w:r>
+        <w:rPr>
+          <w:rFonts w:ascii="Arial" w:hAnsi="Arial" w:cs="Arial"/>
+          <w:sz w:val="36"/>
+          <w:szCs w:val="36"/>
+        </w:rPr>
+        <w:t>color</w:t>
+      </w:r>
+      <w:proofErr w:type="spellEnd"/>
+      <w:r>
+        <w:rPr>
+          <w:rFonts w:ascii="Arial" w:hAnsi="Arial" w:cs="Arial"/>
+          <w:sz w:val="36"/>
+          <w:szCs w:val="36"/>
+        </w:rPr>
+        <w:t xml:space="preserve"> detection much easier.</w:t>
+      </w:r>
+    </w:p>
+    <w:p>
+      <w:pPr>
+        <w:pStyle w:val="ListParagraph"/>
+        <w:rPr>
+          <w:rFonts w:ascii="Arial" w:hAnsi="Arial" w:cs="Arial"/>
+          <w:sz w:val="36"/>
+          <w:szCs w:val="36"/>
+        </w:rPr>
+      </w:pPr>
+    </w:p>
+    <w:p>
+      <w:pPr>
+        <w:pStyle w:val="ListParagraph"/>
+        <w:rPr>
+          <w:rFonts w:ascii="Arial" w:hAnsi="Arial" w:cs="Arial"/>
+          <w:b/>
+          <w:bCs/>
+          <w:sz w:val="36"/>
+          <w:szCs w:val="36"/>
+        </w:rPr>
+      </w:pPr>
+      <w:r>
+        <w:rPr>
+          <w:rFonts w:ascii="Arial" w:hAnsi="Arial" w:cs="Arial"/>
+          <w:b/>
+          <w:bCs/>
+          <w:sz w:val="36"/>
+          <w:szCs w:val="36"/>
+        </w:rPr>
+        <w:t>1️</w:t>
+      </w:r>
+      <w:r>
+        <w:rPr>
+          <w:rFonts w:ascii="Segoe UI Symbol" w:hAnsi="Segoe UI Symbol" w:cs="Segoe UI Symbol"/>
+          <w:b/>
+          <w:bCs/>
+          <w:sz w:val="36"/>
+          <w:szCs w:val="36"/>
+        </w:rPr>
+        <w:t>⃣</w:t>
+      </w:r>
+      <w:r>
+        <w:rPr>
+          <w:rFonts w:ascii="Arial" w:hAnsi="Arial" w:cs="Arial"/>
+          <w:b/>
+          <w:bCs/>
+          <w:sz w:val="36"/>
+          <w:szCs w:val="36"/>
+        </w:rPr>
+        <w:t xml:space="preserve"> Hue (H)</w:t>
+      </w:r>
+    </w:p>
+    <w:p>
+      <w:pPr>
+        <w:pStyle w:val="ListParagraph"/>
+        <w:rPr>
+          <w:rFonts w:ascii="Arial" w:hAnsi="Arial" w:cs="Arial"/>
+          <w:sz w:val="36"/>
+          <w:szCs w:val="36"/>
+        </w:rPr>
+      </w:pPr>
+      <w:r>
+        <w:rPr>
+          <w:rFonts w:ascii="Arial" w:hAnsi="Arial" w:cs="Arial"/>
+          <w:sz w:val="36"/>
+          <w:szCs w:val="36"/>
+        </w:rPr>
+        <w:t>Hue answers one question:</w:t>
+      </w:r>
+    </w:p>
+    <w:p>
+      <w:pPr>
+        <w:pStyle w:val="ListParagraph"/>
+        <w:rPr>
+          <w:rFonts w:ascii="Arial" w:hAnsi="Arial" w:cs="Arial"/>
+          <w:sz w:val="36"/>
+          <w:szCs w:val="36"/>
+        </w:rPr>
+      </w:pPr>
+      <w:r>
+        <w:rPr>
+          <w:rFonts w:ascii="Arial" w:hAnsi="Arial" w:cs="Arial"/>
+          <w:b/>
+          <w:bCs/>
+          <w:sz w:val="36"/>
+          <w:szCs w:val="36"/>
+        </w:rPr>
+        <w:t xml:space="preserve">What is the actual </w:t>
+      </w:r>
+      <w:proofErr w:type="spellStart"/>
+      <w:r>
+        <w:rPr>
+          <w:rFonts w:ascii="Arial" w:hAnsi="Arial" w:cs="Arial"/>
+          <w:b/>
+          <w:bCs/>
+          <w:sz w:val="36"/>
+          <w:szCs w:val="36"/>
+        </w:rPr>
+        <w:t>color</w:t>
+      </w:r>
+      <w:proofErr w:type="spellEnd"/>
+      <w:r>
+        <w:rPr>
+          <w:rFonts w:ascii="Arial" w:hAnsi="Arial" w:cs="Arial"/>
+          <w:b/>
+          <w:bCs/>
+          <w:sz w:val="36"/>
+          <w:szCs w:val="36"/>
+        </w:rPr>
+        <w:t>?</w:t>
+      </w:r>
+    </w:p>
+    <w:p>
+      <w:pPr>
+        <w:pStyle w:val="ListParagraph"/>
+        <w:rPr>
+          <w:rFonts w:ascii="Arial" w:hAnsi="Arial" w:cs="Arial"/>
+          <w:sz w:val="36"/>
+          <w:szCs w:val="36"/>
+        </w:rPr>
+      </w:pPr>
+    </w:p>
+    <w:p>
+      <w:pPr>
+        <w:pStyle w:val="ListParagraph"/>
+        <w:rPr>
+          <w:rFonts w:ascii="Arial" w:hAnsi="Arial" w:cs="Arial"/>
+          <w:b/>
+          <w:bCs/>
+          <w:sz w:val="36"/>
+          <w:szCs w:val="36"/>
+        </w:rPr>
+      </w:pPr>
+      <w:r>
+        <w:rPr>
+          <w:rFonts w:ascii="Arial" w:hAnsi="Arial" w:cs="Arial"/>
+          <w:b/>
+          <w:bCs/>
+          <w:sz w:val="36"/>
+          <w:szCs w:val="36"/>
+        </w:rPr>
+        <w:t>2️</w:t>
+      </w:r>
+      <w:r>
+        <w:rPr>
+          <w:rFonts w:ascii="Segoe UI Symbol" w:hAnsi="Segoe UI Symbol" w:cs="Segoe UI Symbol"/>
+          <w:b/>
+          <w:bCs/>
+          <w:sz w:val="36"/>
+          <w:szCs w:val="36"/>
+        </w:rPr>
+        <w:t>⃣</w:t>
+      </w:r>
+      <w:r>
+        <w:rPr>
+          <w:rFonts w:ascii="Arial" w:hAnsi="Arial" w:cs="Arial"/>
+          <w:b/>
+          <w:bCs/>
+          <w:sz w:val="36"/>
+          <w:szCs w:val="36"/>
+        </w:rPr>
+        <w:t xml:space="preserve"> Saturation (S)</w:t>
+      </w:r>
+    </w:p>
+    <w:p>
+      <w:pPr>
+        <w:pStyle w:val="ListParagraph"/>
+        <w:rPr>
+          <w:rFonts w:ascii="Arial" w:hAnsi="Arial" w:cs="Arial"/>
+          <w:sz w:val="36"/>
+          <w:szCs w:val="36"/>
+        </w:rPr>
+      </w:pPr>
+      <w:r>
+        <w:rPr>
+          <w:rFonts w:ascii="Arial" w:hAnsi="Arial" w:cs="Arial"/>
+          <w:sz w:val="36"/>
+          <w:szCs w:val="36"/>
+        </w:rPr>
+        <w:t>Saturation answers:</w:t>
+      </w:r>
+    </w:p>
+    <w:p>
+      <w:pPr>
+        <w:pStyle w:val="ListParagraph"/>
+        <w:rPr>
+          <w:rFonts w:ascii="Arial" w:hAnsi="Arial" w:cs="Arial"/>
+          <w:b/>
+          <w:bCs/>
+          <w:sz w:val="36"/>
+          <w:szCs w:val="36"/>
+        </w:rPr>
+      </w:pPr>
+      <w:r>
+        <w:rPr>
+          <w:rFonts w:ascii="Arial" w:hAnsi="Arial" w:cs="Arial"/>
+          <w:b/>
+          <w:bCs/>
+          <w:sz w:val="36"/>
+          <w:szCs w:val="36"/>
+        </w:rPr>
+        <w:t xml:space="preserve">How rich or pure is the </w:t>
+      </w:r>
+      <w:proofErr w:type="spellStart"/>
+      <w:r>
+        <w:rPr>
+          <w:rFonts w:ascii="Arial" w:hAnsi="Arial" w:cs="Arial"/>
+          <w:b/>
+          <w:bCs/>
+          <w:sz w:val="36"/>
+          <w:szCs w:val="36"/>
+        </w:rPr>
+        <w:t>color</w:t>
+      </w:r>
+      <w:proofErr w:type="spellEnd"/>
+      <w:r>
+        <w:rPr>
+          <w:rFonts w:ascii="Arial" w:hAnsi="Arial" w:cs="Arial"/>
+          <w:b/>
+          <w:bCs/>
+          <w:sz w:val="36"/>
+          <w:szCs w:val="36"/>
+        </w:rPr>
+        <w:t>?</w:t>
+      </w:r>
+    </w:p>
+    <w:p>
+      <w:pPr>
+        <w:pStyle w:val="ListParagraph"/>
+        <w:rPr>
+          <w:rFonts w:ascii="Arial" w:hAnsi="Arial" w:cs="Arial"/>
+          <w:sz w:val="36"/>
+          <w:szCs w:val="36"/>
+        </w:rPr>
+      </w:pPr>
+      <w:r>
+        <w:rPr>
+          <w:rFonts w:ascii="Arial" w:hAnsi="Arial" w:cs="Arial"/>
+          <w:b/>
+          <w:bCs/>
+          <w:sz w:val="36"/>
+          <w:szCs w:val="36"/>
+        </w:rPr>
+        <w:t xml:space="preserve"> </w:t>
+      </w:r>
+    </w:p>
+    <w:p>
+      <w:pPr>
+        <w:pStyle w:val="ListParagraph"/>
+        <w:rPr>
+          <w:rFonts w:ascii="Arial" w:hAnsi="Arial" w:cs="Arial"/>
+          <w:b/>
+          <w:bCs/>
+          <w:sz w:val="36"/>
+          <w:szCs w:val="36"/>
+        </w:rPr>
+      </w:pPr>
+      <w:r>
+        <w:rPr>
+          <w:rFonts w:ascii="Arial" w:hAnsi="Arial" w:cs="Arial"/>
+          <w:b/>
+          <w:bCs/>
+          <w:sz w:val="36"/>
+          <w:szCs w:val="36"/>
+        </w:rPr>
+        <w:t>3️</w:t>
+      </w:r>
+      <w:r>
+        <w:rPr>
+          <w:rFonts w:ascii="Segoe UI Symbol" w:hAnsi="Segoe UI Symbol" w:cs="Segoe UI Symbol"/>
+          <w:b/>
+          <w:bCs/>
+          <w:sz w:val="36"/>
+          <w:szCs w:val="36"/>
+        </w:rPr>
+        <w:t>⃣</w:t>
+      </w:r>
+      <w:r>
+        <w:rPr>
+          <w:rFonts w:ascii="Arial" w:hAnsi="Arial" w:cs="Arial"/>
+          <w:b/>
+          <w:bCs/>
+          <w:sz w:val="36"/>
+          <w:szCs w:val="36"/>
+        </w:rPr>
+        <w:t xml:space="preserve"> Value (V)</w:t>
+      </w:r>
+    </w:p>
+    <w:p>
+      <w:pPr>
+        <w:pStyle w:val="ListParagraph"/>
+        <w:rPr>
+          <w:rFonts w:ascii="Arial" w:hAnsi="Arial" w:cs="Arial"/>
+          <w:sz w:val="36"/>
+          <w:szCs w:val="36"/>
+        </w:rPr>
+      </w:pPr>
+      <w:r>
+        <w:rPr>
+          <w:rFonts w:ascii="Arial" w:hAnsi="Arial" w:cs="Arial"/>
+          <w:sz w:val="36"/>
+          <w:szCs w:val="36"/>
+        </w:rPr>
+        <w:t>Value answers:</w:t>
+      </w:r>
+    </w:p>
+    <w:p>
+      <w:pPr>
+        <w:pStyle w:val="ListParagraph"/>
+        <w:rPr>
+          <w:rFonts w:ascii="Arial" w:hAnsi="Arial" w:cs="Arial"/>
+          <w:sz w:val="36"/>
+          <w:szCs w:val="36"/>
+        </w:rPr>
+      </w:pPr>
+      <w:r>
+        <w:rPr>
+          <w:rFonts w:ascii="Arial" w:hAnsi="Arial" w:cs="Arial"/>
+          <w:b/>
+          <w:bCs/>
+          <w:sz w:val="36"/>
+          <w:szCs w:val="36"/>
+        </w:rPr>
+        <w:t xml:space="preserve">How bright is the </w:t>
+      </w:r>
+      <w:proofErr w:type="spellStart"/>
+      <w:r>
+        <w:rPr>
+          <w:rFonts w:ascii="Arial" w:hAnsi="Arial" w:cs="Arial"/>
+          <w:b/>
+          <w:bCs/>
+          <w:sz w:val="36"/>
+          <w:szCs w:val="36"/>
+        </w:rPr>
+        <w:t>color</w:t>
+      </w:r>
+      <w:proofErr w:type="spellEnd"/>
+      <w:r>
+        <w:rPr>
+          <w:rFonts w:ascii="Arial" w:hAnsi="Arial" w:cs="Arial"/>
+          <w:b/>
+          <w:bCs/>
+          <w:sz w:val="36"/>
+          <w:szCs w:val="36"/>
+        </w:rPr>
+        <w:t>?</w:t>
+      </w:r>
+    </w:p>
+    <w:p>
+      <w:pPr>
+        <w:pStyle w:val="ListParagraph"/>
+        <w:rPr>
+          <w:rFonts w:ascii="Arial" w:hAnsi="Arial" w:cs="Arial"/>
+          <w:sz w:val="36"/>
+          <w:szCs w:val="36"/>
+        </w:rPr>
+      </w:pPr>
+    </w:p>
+    <w:p>
+      <w:pPr>
+        <w:pStyle w:val="ListParagraph"/>
+        <w:rPr>
+          <w:rFonts w:ascii="Arial" w:hAnsi="Arial" w:cs="Arial"/>
+          <w:sz w:val="36"/>
+          <w:szCs w:val="36"/>
+        </w:rPr>
+      </w:pPr>
+      <w:r>
+        <w:rPr>
+          <w:rFonts w:ascii="Arial" w:hAnsi="Arial" w:cs="Arial"/>
+          <w:sz w:val="36"/>
+          <w:szCs w:val="36"/>
+        </w:rPr>
+        <w:t xml:space="preserve">HSV </w:t>
+      </w:r>
+      <w:proofErr w:type="spellStart"/>
+      <w:r>
+        <w:rPr>
+          <w:rFonts w:ascii="Arial" w:hAnsi="Arial" w:cs="Arial"/>
+          <w:sz w:val="36"/>
+          <w:szCs w:val="36"/>
+        </w:rPr>
+        <w:t>Color</w:t>
+      </w:r>
+      <w:proofErr w:type="spellEnd"/>
+      <w:r>
+        <w:rPr>
+          <w:rFonts w:ascii="Arial" w:hAnsi="Arial" w:cs="Arial"/>
+          <w:sz w:val="36"/>
+          <w:szCs w:val="36"/>
+        </w:rPr>
+        <w:t xml:space="preserve"> Space</w:t>
+      </w:r>
+    </w:p>
+    <w:p>
+      <w:pPr>
+        <w:pStyle w:val="ListParagraph"/>
+        <w:rPr>
+          <w:rFonts w:ascii="Arial" w:hAnsi="Arial" w:cs="Arial"/>
+          <w:sz w:val="36"/>
+          <w:szCs w:val="36"/>
+        </w:rPr>
+      </w:pPr>
+    </w:p>
+    <w:p>
+      <w:pPr>
+        <w:pStyle w:val="ListParagraph"/>
+        <w:rPr>
+          <w:rFonts w:ascii="Arial" w:hAnsi="Arial" w:cs="Arial"/>
+          <w:sz w:val="36"/>
+          <w:szCs w:val="36"/>
+        </w:rPr>
+      </w:pPr>
+      <w:r>
+        <w:rPr>
+          <w:rFonts w:ascii="Arial" w:hAnsi="Arial" w:cs="Arial"/>
+          <w:sz w:val="36"/>
+          <w:szCs w:val="36"/>
+        </w:rPr>
+        <w:t>H = Hue</w:t>
+      </w:r>
+    </w:p>
+    <w:p>
+      <w:pPr>
+        <w:pStyle w:val="ListParagraph"/>
+        <w:rPr>
+          <w:rFonts w:ascii="Arial" w:hAnsi="Arial" w:cs="Arial"/>
+          <w:sz w:val="36"/>
+          <w:szCs w:val="36"/>
+        </w:rPr>
+      </w:pPr>
+      <w:r>
+        <w:rPr>
+          <w:rFonts w:ascii="Arial" w:hAnsi="Arial" w:cs="Arial"/>
+          <w:sz w:val="36"/>
+          <w:szCs w:val="36"/>
+        </w:rPr>
+        <w:t xml:space="preserve">• Represents the actual </w:t>
+      </w:r>
+      <w:proofErr w:type="spellStart"/>
+      <w:r>
+        <w:rPr>
+          <w:rFonts w:ascii="Arial" w:hAnsi="Arial" w:cs="Arial"/>
+          <w:sz w:val="36"/>
+          <w:szCs w:val="36"/>
+        </w:rPr>
+        <w:t>color</w:t>
+      </w:r>
+      <w:proofErr w:type="spellEnd"/>
+      <w:r>
+        <w:rPr>
+          <w:rFonts w:ascii="Arial" w:hAnsi="Arial" w:cs="Arial"/>
+          <w:sz w:val="36"/>
+          <w:szCs w:val="36"/>
+        </w:rPr>
+        <w:t>.</w:t>
+      </w:r>
+    </w:p>
+    <w:p>
+      <w:pPr>
+        <w:pStyle w:val="ListParagraph"/>
+        <w:rPr>
+          <w:rFonts w:ascii="Arial" w:hAnsi="Arial" w:cs="Arial"/>
+          <w:sz w:val="36"/>
+          <w:szCs w:val="36"/>
+        </w:rPr>
+      </w:pPr>
+    </w:p>
+    <w:p>
+      <w:pPr>
+        <w:pStyle w:val="ListParagraph"/>
+        <w:rPr>
+          <w:rFonts w:ascii="Arial" w:hAnsi="Arial" w:cs="Arial"/>
+          <w:sz w:val="36"/>
+          <w:szCs w:val="36"/>
+        </w:rPr>
+      </w:pPr>
+      <w:r>
+        <w:rPr>
+          <w:rFonts w:ascii="Arial" w:hAnsi="Arial" w:cs="Arial"/>
+          <w:sz w:val="36"/>
+          <w:szCs w:val="36"/>
+        </w:rPr>
+        <w:t>S = Saturation</w:t>
+      </w:r>
+    </w:p>
+    <w:p>
+      <w:pPr>
+        <w:pStyle w:val="ListParagraph"/>
+        <w:rPr>
+          <w:rFonts w:ascii="Arial" w:hAnsi="Arial" w:cs="Arial"/>
+          <w:sz w:val="36"/>
+          <w:szCs w:val="36"/>
+        </w:rPr>
+      </w:pPr>
+      <w:r>
+        <w:rPr>
+          <w:rFonts w:ascii="Arial" w:hAnsi="Arial" w:cs="Arial"/>
+          <w:sz w:val="36"/>
+          <w:szCs w:val="36"/>
+        </w:rPr>
+        <w:t xml:space="preserve">• Represents the purity or richness of the </w:t>
+      </w:r>
+      <w:proofErr w:type="spellStart"/>
+      <w:r>
+        <w:rPr>
+          <w:rFonts w:ascii="Arial" w:hAnsi="Arial" w:cs="Arial"/>
+          <w:sz w:val="36"/>
+          <w:szCs w:val="36"/>
+        </w:rPr>
+        <w:t>color</w:t>
+      </w:r>
+      <w:proofErr w:type="spellEnd"/>
+      <w:r>
+        <w:rPr>
+          <w:rFonts w:ascii="Arial" w:hAnsi="Arial" w:cs="Arial"/>
+          <w:sz w:val="36"/>
+          <w:szCs w:val="36"/>
+        </w:rPr>
+        <w:t>.</w:t>
+      </w:r>
+    </w:p>
+    <w:p>
+      <w:pPr>
+        <w:pStyle w:val="ListParagraph"/>
+        <w:rPr>
+          <w:rFonts w:ascii="Arial" w:hAnsi="Arial" w:cs="Arial"/>
+          <w:sz w:val="36"/>
+          <w:szCs w:val="36"/>
+        </w:rPr>
+      </w:pPr>
+    </w:p>
+    <w:p>
+      <w:pPr>
+        <w:pStyle w:val="ListParagraph"/>
+        <w:rPr>
+          <w:rFonts w:ascii="Arial" w:hAnsi="Arial" w:cs="Arial"/>
+          <w:sz w:val="36"/>
+          <w:szCs w:val="36"/>
+        </w:rPr>
+      </w:pPr>
+      <w:r>
+        <w:rPr>
+          <w:rFonts w:ascii="Arial" w:hAnsi="Arial" w:cs="Arial"/>
+          <w:sz w:val="36"/>
+          <w:szCs w:val="36"/>
+        </w:rPr>
+        <w:t>V = Value</w:t>
+      </w:r>
+    </w:p>
+    <w:p>
+      <w:pPr>
+        <w:pStyle w:val="ListParagraph"/>
+        <w:rPr>
+          <w:rFonts w:ascii="Arial" w:hAnsi="Arial" w:cs="Arial"/>
+          <w:sz w:val="36"/>
+          <w:szCs w:val="36"/>
+        </w:rPr>
+      </w:pPr>
+      <w:r>
+        <w:rPr>
+          <w:rFonts w:ascii="Arial" w:hAnsi="Arial" w:cs="Arial"/>
+          <w:sz w:val="36"/>
+          <w:szCs w:val="36"/>
+        </w:rPr>
+        <w:lastRenderedPageBreak/>
+        <w:t xml:space="preserve">• Represents the brightness of the </w:t>
+      </w:r>
+      <w:proofErr w:type="spellStart"/>
+      <w:r>
+        <w:rPr>
+          <w:rFonts w:ascii="Arial" w:hAnsi="Arial" w:cs="Arial"/>
+          <w:sz w:val="36"/>
+          <w:szCs w:val="36"/>
+        </w:rPr>
+        <w:t>color</w:t>
+      </w:r>
+      <w:proofErr w:type="spellEnd"/>
+      <w:r>
+        <w:rPr>
+          <w:rFonts w:ascii="Arial" w:hAnsi="Arial" w:cs="Arial"/>
+          <w:sz w:val="36"/>
+          <w:szCs w:val="36"/>
+        </w:rPr>
+        <w:t>.</w:t>
+      </w:r>
+    </w:p>
+    <w:p>
+      <w:pPr>
+        <w:pStyle w:val="ListParagraph"/>
+        <w:rPr>
+          <w:rFonts w:ascii="Arial" w:hAnsi="Arial" w:cs="Arial"/>
+          <w:sz w:val="36"/>
+          <w:szCs w:val="36"/>
+        </w:rPr>
+      </w:pPr>
+    </w:p>
+    <w:p>
+      <w:pPr>
+        <w:pStyle w:val="ListParagraph"/>
+        <w:rPr>
+          <w:rFonts w:ascii="Arial" w:hAnsi="Arial" w:cs="Arial"/>
+          <w:sz w:val="36"/>
+          <w:szCs w:val="36"/>
+        </w:rPr>
+      </w:pPr>
+      <w:r>
+        <w:rPr>
+          <w:rFonts w:ascii="Arial" w:hAnsi="Arial" w:cs="Arial"/>
+          <w:sz w:val="36"/>
+          <w:szCs w:val="36"/>
+        </w:rPr>
+        <w:t xml:space="preserve">HSV is widely used in Computer Vision because it separates </w:t>
+      </w:r>
+      <w:proofErr w:type="spellStart"/>
+      <w:r>
+        <w:rPr>
+          <w:rFonts w:ascii="Arial" w:hAnsi="Arial" w:cs="Arial"/>
+          <w:sz w:val="36"/>
+          <w:szCs w:val="36"/>
+        </w:rPr>
+        <w:t>color</w:t>
+      </w:r>
+      <w:proofErr w:type="spellEnd"/>
+      <w:r>
+        <w:rPr>
+          <w:rFonts w:ascii="Arial" w:hAnsi="Arial" w:cs="Arial"/>
+          <w:sz w:val="36"/>
+          <w:szCs w:val="36"/>
+        </w:rPr>
+        <w:t xml:space="preserve"> information from brightness, making </w:t>
+      </w:r>
+      <w:proofErr w:type="spellStart"/>
+      <w:r>
+        <w:rPr>
+          <w:rFonts w:ascii="Arial" w:hAnsi="Arial" w:cs="Arial"/>
+          <w:sz w:val="36"/>
+          <w:szCs w:val="36"/>
+        </w:rPr>
+        <w:t>color</w:t>
+      </w:r>
+      <w:proofErr w:type="spellEnd"/>
+      <w:r>
+        <w:rPr>
+          <w:rFonts w:ascii="Arial" w:hAnsi="Arial" w:cs="Arial"/>
+          <w:sz w:val="36"/>
+          <w:szCs w:val="36"/>
+        </w:rPr>
+        <w:t xml:space="preserve"> detection easier.</w:t>
+      </w:r>
+    </w:p>
+    <w:p>
+      <w:pPr>
+        <w:pStyle w:val="ListParagraph"/>
+        <w:rPr>
+          <w:rFonts w:ascii="Arial" w:hAnsi="Arial" w:cs="Arial"/>
+          <w:sz w:val="36"/>
+          <w:szCs w:val="36"/>
+        </w:rPr>
+      </w:pPr>
+    </w:p>
+    <w:p>
+      <w:pPr>
+        <w:pStyle w:val="ListParagraph"/>
+        <w:numPr>
+          <w:ilvl w:val="0"/>
+          <w:numId w:val="10"/>
+        </w:numPr>
+        <w:rPr>
+          <w:rFonts w:ascii="Arial" w:hAnsi="Arial" w:cs="Arial"/>
+          <w:sz w:val="36"/>
+          <w:szCs w:val="36"/>
+        </w:rPr>
+      </w:pPr>
+      <w:r>
+        <w:rPr>
+          <w:rFonts w:ascii="Arial" w:hAnsi="Arial" w:cs="Arial"/>
+          <w:sz w:val="36"/>
+          <w:szCs w:val="36"/>
+        </w:rPr>
+        <w:t>cv2.COLOR_BGR2HSV</w:t>
+      </w:r>
+    </w:p>
+    <w:p>
+      <w:pPr>
+        <w:pStyle w:val="ListParagraph"/>
+        <w:rPr>
+          <w:rFonts w:ascii="Arial" w:hAnsi="Arial" w:cs="Arial"/>
+          <w:sz w:val="36"/>
+          <w:szCs w:val="36"/>
+        </w:rPr>
+      </w:pPr>
+    </w:p>
+    <w:p>
+      <w:pPr>
+        <w:pStyle w:val="ListParagraph"/>
+        <w:rPr>
+          <w:rFonts w:ascii="Arial" w:hAnsi="Arial" w:cs="Arial"/>
+          <w:sz w:val="36"/>
+          <w:szCs w:val="36"/>
+        </w:rPr>
+      </w:pPr>
+      <w:r>
+        <w:rPr>
+          <w:rFonts w:ascii="Arial" w:hAnsi="Arial" w:cs="Arial"/>
+          <w:sz w:val="36"/>
+          <w:szCs w:val="36"/>
+        </w:rPr>
+        <w:t xml:space="preserve">• Converts a BGR image into the HSV </w:t>
+      </w:r>
+      <w:proofErr w:type="spellStart"/>
+      <w:r>
+        <w:rPr>
+          <w:rFonts w:ascii="Arial" w:hAnsi="Arial" w:cs="Arial"/>
+          <w:sz w:val="36"/>
+          <w:szCs w:val="36"/>
+        </w:rPr>
+        <w:t>color</w:t>
+      </w:r>
+      <w:proofErr w:type="spellEnd"/>
+      <w:r>
+        <w:rPr>
+          <w:rFonts w:ascii="Arial" w:hAnsi="Arial" w:cs="Arial"/>
+          <w:sz w:val="36"/>
+          <w:szCs w:val="36"/>
+        </w:rPr>
+        <w:t xml:space="preserve"> space.</w:t>
+      </w:r>
+    </w:p>
+    <w:p>
+      <w:pPr>
+        <w:pStyle w:val="ListParagraph"/>
+        <w:rPr>
+          <w:rFonts w:ascii="Arial" w:hAnsi="Arial" w:cs="Arial"/>
+          <w:sz w:val="36"/>
+          <w:szCs w:val="36"/>
+        </w:rPr>
+      </w:pPr>
+      <w:r>
+        <w:rPr>
+          <w:rFonts w:ascii="Arial" w:hAnsi="Arial" w:cs="Arial"/>
+          <w:sz w:val="36"/>
+          <w:szCs w:val="36"/>
+        </w:rPr>
+        <w:t>• Returns a new NumPy array.</w:t>
+      </w:r>
+    </w:p>
+    <w:p>
+      <w:pPr>
+        <w:pStyle w:val="ListParagraph"/>
+        <w:rPr>
+          <w:rFonts w:ascii="Arial" w:hAnsi="Arial" w:cs="Arial"/>
+          <w:sz w:val="36"/>
+          <w:szCs w:val="36"/>
+        </w:rPr>
+      </w:pPr>
+      <w:r>
+        <w:rPr>
+          <w:rFonts w:ascii="Arial" w:hAnsi="Arial" w:cs="Arial"/>
+          <w:sz w:val="36"/>
+          <w:szCs w:val="36"/>
+        </w:rPr>
+        <w:t>• The HSV image may look unusual when displayed with cv2.imshow().</w:t>
+      </w:r>
+    </w:p>
+    <w:p>
+      <w:pPr>
+        <w:pStyle w:val="ListParagraph"/>
+        <w:rPr>
+          <w:rFonts w:ascii="Arial" w:hAnsi="Arial" w:cs="Arial"/>
+          <w:sz w:val="36"/>
+          <w:szCs w:val="36"/>
+        </w:rPr>
+      </w:pPr>
+      <w:r>
+        <w:rPr>
+          <w:rFonts w:ascii="Arial" w:hAnsi="Arial" w:cs="Arial"/>
+          <w:sz w:val="36"/>
+          <w:szCs w:val="36"/>
+        </w:rPr>
+        <w:t xml:space="preserve">• HSV is mainly used for image processing tasks such as </w:t>
+      </w:r>
+      <w:proofErr w:type="spellStart"/>
+      <w:r>
+        <w:rPr>
+          <w:rFonts w:ascii="Arial" w:hAnsi="Arial" w:cs="Arial"/>
+          <w:sz w:val="36"/>
+          <w:szCs w:val="36"/>
+        </w:rPr>
+        <w:t>color</w:t>
+      </w:r>
+      <w:proofErr w:type="spellEnd"/>
+      <w:r>
+        <w:rPr>
+          <w:rFonts w:ascii="Arial" w:hAnsi="Arial" w:cs="Arial"/>
+          <w:sz w:val="36"/>
+          <w:szCs w:val="36"/>
+        </w:rPr>
+        <w:t xml:space="preserve"> detection, segmentation, and object tracking.</w:t>
+      </w:r>
+    </w:p>
+    <w:p>
+      <w:pPr>
+        <w:pStyle w:val="ListParagraph"/>
+        <w:rPr>
+          <w:rFonts w:ascii="Arial" w:hAnsi="Arial" w:cs="Arial"/>
+          <w:sz w:val="36"/>
+          <w:szCs w:val="36"/>
+        </w:rPr>
+      </w:pPr>
+    </w:p>
+    <w:p>
+      <w:pPr>
+        <w:pStyle w:val="ListParagraph"/>
+        <w:numPr>
+          <w:ilvl w:val="0"/>
+          <w:numId w:val="10"/>
+        </w:numPr>
+        <w:rPr>
+          <w:rFonts w:ascii="Arial" w:hAnsi="Arial" w:cs="Arial"/>
+          <w:sz w:val="36"/>
+          <w:szCs w:val="36"/>
+        </w:rPr>
+      </w:pPr>
+      <w:r>
+        <w:rPr>
+          <w:rFonts w:ascii="Arial" w:hAnsi="Arial" w:cs="Arial"/>
+          <w:sz w:val="36"/>
+          <w:szCs w:val="36"/>
+        </w:rPr>
+        <w:t xml:space="preserve">Splitting of channels </w:t>
+      </w:r>
+    </w:p>
+    <w:p>
+      <w:pPr>
+        <w:pStyle w:val="ListParagraph"/>
+        <w:rPr>
+          <w:rFonts w:ascii="Arial" w:hAnsi="Arial" w:cs="Arial"/>
+          <w:sz w:val="36"/>
+          <w:szCs w:val="36"/>
+        </w:rPr>
+      </w:pPr>
+      <w:r>
+        <w:rPr>
+          <w:rFonts w:ascii="Arial" w:hAnsi="Arial" w:cs="Arial"/>
+          <w:sz w:val="36"/>
+          <w:szCs w:val="36"/>
+        </w:rPr>
+        <w:t>Blue Channel</w:t>
+      </w:r>
+    </w:p>
+    <w:p>
+      <w:pPr>
+        <w:pStyle w:val="ListParagraph"/>
+        <w:rPr>
+          <w:rFonts w:ascii="Arial" w:hAnsi="Arial" w:cs="Arial"/>
+          <w:sz w:val="36"/>
+          <w:szCs w:val="36"/>
+        </w:rPr>
+      </w:pPr>
+      <w:r>
+        <w:rPr>
+          <w:rFonts w:ascii="Segoe UI Emoji" w:hAnsi="Segoe UI Emoji" w:cs="Segoe UI Emoji"/>
+          <w:sz w:val="36"/>
+          <w:szCs w:val="36"/>
+        </w:rPr>
+        <w:t>❌</w:t>
+      </w:r>
+      <w:r>
+        <w:rPr>
+          <w:rFonts w:ascii="Arial" w:hAnsi="Arial" w:cs="Arial"/>
+          <w:sz w:val="36"/>
+          <w:szCs w:val="36"/>
+        </w:rPr>
+        <w:t xml:space="preserve"> Not a blue-</w:t>
+      </w:r>
+      <w:proofErr w:type="spellStart"/>
+      <w:r>
+        <w:rPr>
+          <w:rFonts w:ascii="Arial" w:hAnsi="Arial" w:cs="Arial"/>
+          <w:sz w:val="36"/>
+          <w:szCs w:val="36"/>
+        </w:rPr>
+        <w:t>colored</w:t>
+      </w:r>
+      <w:proofErr w:type="spellEnd"/>
+      <w:r>
+        <w:rPr>
+          <w:rFonts w:ascii="Arial" w:hAnsi="Arial" w:cs="Arial"/>
+          <w:sz w:val="36"/>
+          <w:szCs w:val="36"/>
+        </w:rPr>
+        <w:t xml:space="preserve"> image</w:t>
+      </w:r>
+    </w:p>
+    <w:p>
+      <w:pPr>
+        <w:pStyle w:val="ListParagraph"/>
+        <w:rPr>
+          <w:rFonts w:ascii="Arial" w:hAnsi="Arial" w:cs="Arial"/>
+          <w:sz w:val="36"/>
+          <w:szCs w:val="36"/>
+        </w:rPr>
+      </w:pPr>
+    </w:p>
+    <w:p>
+      <w:pPr>
+        <w:pStyle w:val="ListParagraph"/>
+        <w:rPr>
+          <w:rFonts w:ascii="Arial" w:hAnsi="Arial" w:cs="Arial"/>
+          <w:sz w:val="36"/>
+          <w:szCs w:val="36"/>
+        </w:rPr>
+      </w:pPr>
+      <w:r>
+        <w:rPr>
+          <w:rFonts w:ascii="Segoe UI Emoji" w:hAnsi="Segoe UI Emoji" w:cs="Segoe UI Emoji"/>
+          <w:sz w:val="36"/>
+          <w:szCs w:val="36"/>
+        </w:rPr>
+        <w:t>✅</w:t>
+      </w:r>
+      <w:r>
+        <w:rPr>
+          <w:rFonts w:ascii="Arial" w:hAnsi="Arial" w:cs="Arial"/>
+          <w:sz w:val="36"/>
+          <w:szCs w:val="36"/>
+        </w:rPr>
+        <w:t xml:space="preserve"> A grayscale image showing the amount of blue.</w:t>
+      </w:r>
+    </w:p>
+    <w:p>
+      <w:pPr>
+        <w:pStyle w:val="ListParagraph"/>
+        <w:rPr>
+          <w:rFonts w:ascii="Arial" w:hAnsi="Arial" w:cs="Arial"/>
+          <w:sz w:val="36"/>
+          <w:szCs w:val="36"/>
+        </w:rPr>
+      </w:pPr>
+    </w:p>
+    <w:p>
+      <w:pPr>
+        <w:pStyle w:val="ListParagraph"/>
+        <w:rPr>
+          <w:rFonts w:ascii="Arial" w:hAnsi="Arial" w:cs="Arial"/>
+          <w:sz w:val="36"/>
+          <w:szCs w:val="36"/>
+        </w:rPr>
+      </w:pPr>
+      <w:r>
+        <w:rPr>
+          <w:rFonts w:ascii="Arial" w:hAnsi="Arial" w:cs="Arial"/>
+          <w:sz w:val="36"/>
+          <w:szCs w:val="36"/>
+        </w:rPr>
+        <w:t>Green Channel</w:t>
+      </w:r>
+    </w:p>
+    <w:p>
+      <w:pPr>
+        <w:pStyle w:val="ListParagraph"/>
+        <w:rPr>
+          <w:rFonts w:ascii="Arial" w:hAnsi="Arial" w:cs="Arial"/>
+          <w:sz w:val="36"/>
+          <w:szCs w:val="36"/>
+        </w:rPr>
+      </w:pPr>
+      <w:r>
+        <w:rPr>
+          <w:rFonts w:ascii="Segoe UI Emoji" w:hAnsi="Segoe UI Emoji" w:cs="Segoe UI Emoji"/>
+          <w:sz w:val="36"/>
+          <w:szCs w:val="36"/>
+        </w:rPr>
+        <w:t>❌</w:t>
+      </w:r>
+      <w:r>
+        <w:rPr>
+          <w:rFonts w:ascii="Arial" w:hAnsi="Arial" w:cs="Arial"/>
+          <w:sz w:val="36"/>
+          <w:szCs w:val="36"/>
+        </w:rPr>
+        <w:t xml:space="preserve"> Not a green-</w:t>
+      </w:r>
+      <w:proofErr w:type="spellStart"/>
+      <w:r>
+        <w:rPr>
+          <w:rFonts w:ascii="Arial" w:hAnsi="Arial" w:cs="Arial"/>
+          <w:sz w:val="36"/>
+          <w:szCs w:val="36"/>
+        </w:rPr>
+        <w:t>colored</w:t>
+      </w:r>
+      <w:proofErr w:type="spellEnd"/>
+      <w:r>
+        <w:rPr>
+          <w:rFonts w:ascii="Arial" w:hAnsi="Arial" w:cs="Arial"/>
+          <w:sz w:val="36"/>
+          <w:szCs w:val="36"/>
+        </w:rPr>
+        <w:t xml:space="preserve"> image</w:t>
+      </w:r>
+    </w:p>
+    <w:p>
+      <w:pPr>
+        <w:pStyle w:val="ListParagraph"/>
+        <w:rPr>
+          <w:rFonts w:ascii="Arial" w:hAnsi="Arial" w:cs="Arial"/>
+          <w:sz w:val="36"/>
+          <w:szCs w:val="36"/>
+        </w:rPr>
+      </w:pPr>
+    </w:p>
+    <w:p>
+      <w:pPr>
+        <w:pStyle w:val="ListParagraph"/>
+        <w:rPr>
+          <w:rFonts w:ascii="Arial" w:hAnsi="Arial" w:cs="Arial"/>
+          <w:sz w:val="36"/>
+          <w:szCs w:val="36"/>
+        </w:rPr>
+      </w:pPr>
+      <w:r>
+        <w:rPr>
+          <w:rFonts w:ascii="Segoe UI Emoji" w:hAnsi="Segoe UI Emoji" w:cs="Segoe UI Emoji"/>
+          <w:sz w:val="36"/>
+          <w:szCs w:val="36"/>
+        </w:rPr>
+        <w:t>✅</w:t>
+      </w:r>
+      <w:r>
+        <w:rPr>
+          <w:rFonts w:ascii="Arial" w:hAnsi="Arial" w:cs="Arial"/>
+          <w:sz w:val="36"/>
+          <w:szCs w:val="36"/>
+        </w:rPr>
+        <w:t xml:space="preserve"> A grayscale image showing the amount of green.</w:t>
+      </w:r>
+    </w:p>
+    <w:p>
+      <w:pPr>
+        <w:pStyle w:val="ListParagraph"/>
+        <w:rPr>
+          <w:rFonts w:ascii="Arial" w:hAnsi="Arial" w:cs="Arial"/>
+          <w:sz w:val="36"/>
+          <w:szCs w:val="36"/>
+        </w:rPr>
+      </w:pPr>
+    </w:p>
+    <w:p>
+      <w:pPr>
+        <w:pStyle w:val="ListParagraph"/>
+        <w:rPr>
+          <w:rFonts w:ascii="Arial" w:hAnsi="Arial" w:cs="Arial"/>
+          <w:sz w:val="36"/>
+          <w:szCs w:val="36"/>
+        </w:rPr>
+      </w:pPr>
+      <w:r>
+        <w:rPr>
+          <w:rFonts w:ascii="Arial" w:hAnsi="Arial" w:cs="Arial"/>
+          <w:sz w:val="36"/>
+          <w:szCs w:val="36"/>
+        </w:rPr>
+        <w:lastRenderedPageBreak/>
+        <w:t>Red Channel</w:t>
+      </w:r>
+    </w:p>
+    <w:p>
+      <w:pPr>
+        <w:pStyle w:val="ListParagraph"/>
+        <w:rPr>
+          <w:rFonts w:ascii="Arial" w:hAnsi="Arial" w:cs="Arial"/>
+          <w:sz w:val="36"/>
+          <w:szCs w:val="36"/>
+        </w:rPr>
+      </w:pPr>
+      <w:r>
+        <w:rPr>
+          <w:rFonts w:ascii="Segoe UI Emoji" w:hAnsi="Segoe UI Emoji" w:cs="Segoe UI Emoji"/>
+          <w:sz w:val="36"/>
+          <w:szCs w:val="36"/>
+        </w:rPr>
+        <w:t>❌</w:t>
+      </w:r>
+      <w:r>
+        <w:rPr>
+          <w:rFonts w:ascii="Arial" w:hAnsi="Arial" w:cs="Arial"/>
+          <w:sz w:val="36"/>
+          <w:szCs w:val="36"/>
+        </w:rPr>
+        <w:t xml:space="preserve"> Not a red-</w:t>
+      </w:r>
+      <w:proofErr w:type="spellStart"/>
+      <w:r>
+        <w:rPr>
+          <w:rFonts w:ascii="Arial" w:hAnsi="Arial" w:cs="Arial"/>
+          <w:sz w:val="36"/>
+          <w:szCs w:val="36"/>
+        </w:rPr>
+        <w:t>colored</w:t>
+      </w:r>
+      <w:proofErr w:type="spellEnd"/>
+      <w:r>
+        <w:rPr>
+          <w:rFonts w:ascii="Arial" w:hAnsi="Arial" w:cs="Arial"/>
+          <w:sz w:val="36"/>
+          <w:szCs w:val="36"/>
+        </w:rPr>
+        <w:t xml:space="preserve"> image</w:t>
+      </w:r>
+    </w:p>
+    <w:p>
+      <w:pPr>
+        <w:pStyle w:val="ListParagraph"/>
+        <w:rPr>
+          <w:rFonts w:ascii="Arial" w:hAnsi="Arial" w:cs="Arial"/>
+          <w:sz w:val="36"/>
+          <w:szCs w:val="36"/>
+        </w:rPr>
+      </w:pPr>
+    </w:p>
+    <w:p>
+      <w:pPr>
+        <w:pStyle w:val="ListParagraph"/>
+        <w:rPr>
+          <w:rFonts w:ascii="Arial" w:hAnsi="Arial" w:cs="Arial"/>
+          <w:sz w:val="36"/>
+          <w:szCs w:val="36"/>
+        </w:rPr>
+      </w:pPr>
+      <w:r>
+        <w:rPr>
+          <w:rFonts w:ascii="Segoe UI Emoji" w:hAnsi="Segoe UI Emoji" w:cs="Segoe UI Emoji"/>
+          <w:sz w:val="36"/>
+          <w:szCs w:val="36"/>
+        </w:rPr>
+        <w:t>✅</w:t>
+      </w:r>
+      <w:r>
+        <w:rPr>
+          <w:rFonts w:ascii="Arial" w:hAnsi="Arial" w:cs="Arial"/>
+          <w:sz w:val="36"/>
+          <w:szCs w:val="36"/>
+        </w:rPr>
+        <w:t xml:space="preserve"> A grayscale image showing the amount of red.</w:t>
+      </w:r>
+    </w:p>
+    <w:p>
+      <w:pPr>
+        <w:pStyle w:val="ListParagraph"/>
+        <w:rPr>
+          <w:rFonts w:ascii="Arial" w:hAnsi="Arial" w:cs="Arial"/>
+          <w:sz w:val="36"/>
+          <w:szCs w:val="36"/>
+        </w:rPr>
+      </w:pPr>
+    </w:p>
+    <w:p>
+      <w:pPr>
+        <w:pStyle w:val="ListParagraph"/>
         <w:rPr>
           <w:rFonts w:ascii="Arial" w:hAnsi="Arial" w:cs="Arial"/>
           <w:sz w:val="36"/>
@@ -9021,9 +11305,9 @@
 <file path=word/numbering.xml><?xml version="1.0" encoding="utf-8"?>
 <w:numbering xmlns:wpc="http://schemas.microsoft.com/office/word/2010/wordprocessingCanvas" xmlns:cx="http://schemas.microsoft.com/office/drawing/2014/chartex" xmlns:cx1="http://schemas.microsoft.com/office/drawing/2015/9/8/chartex" xmlns:cx2="http://schemas.microsoft.com/office/drawing/2015/10/21/chartex" xmlns:cx3="http://schemas.microsoft.com/office/drawing/2016/5/9/chartex" xmlns:cx4="http://schemas.microsoft.com/office/drawing/2016/5/10/chartex" xmlns:cx5="http://schemas.microsoft.com/office/drawing/2016/5/11/chartex" xmlns:cx6="http://schemas.microsoft.com/office/drawing/2016/5/12/chartex" xmlns:cx7="http://schemas.microsoft.com/office/drawing/2016/5/13/chartex" xmlns:cx8="http://schemas.microsoft.com/office/drawing/2016/5/14/chartex" xmlns:mc="http://schemas.openxmlformats.org/markup-compatibility/2006" xmlns:aink="http://schemas.microsoft.com/office/drawing/2016/ink" xmlns:am3d="http://schemas.microsoft.com/office/drawing/2017/model3d" xmlns:o="urn:schemas-microsoft-com:office:office" xmlns:oel="http://schemas.microsoft.com/office/2019/extlst" xmlns:r="http://schemas.openxmlformats.org/officeDocument/2006/relationships" xmlns:m="http://schemas.openxmlformats.org/officeDocument/2006/math" xmlns:v="urn:schemas-microsoft-com:vml" xmlns:wp14="http://schemas.microsoft.com/office/word/2010/wordprocessingDrawing" xmlns:wp="http://schemas.openxmlformats.org/drawingml/2006/wordprocessingDrawing" xmlns:w10="urn:schemas-microsoft-com:office:word" xmlns:w="http://schemas.openxmlformats.org/wordprocessingml/2006/main" xmlns:w14="http://schemas.microsoft.com/office/word/2010/wordml" xmlns:w15="http://schemas.microsoft.com/office/word/2012/wordml" xmlns:w16cex="http://schemas.microsoft.com/office/word/2018/wordml/cex" xmlns:w16cid="http://schemas.microsoft.com/office/word/2016/wordml/cid" xmlns:w16="http://schemas.microsoft.com/office/word/2018/wordml" xmlns:w16du="http://schemas.microsoft.com/office/word/2023/wordml/word16du" xmlns:w16sdtdh="http://schemas.microsoft.com/office/word/2020/wordml/sdtdatahash" xmlns:w16sdtfl="http://schemas.microsoft.com/office/word/2024/wordml/sdtformatlock" xmlns:w16se="http://schemas.microsoft.com/office/word/2015/wordml/symex" xmlns:wpg="http://schemas.microsoft.com/office/word/2010/wordprocessingGroup" xmlns:wpi="http://schemas.microsoft.com/office/word/2010/wordprocessingInk" xmlns:wne="http://schemas.microsoft.com/office/word/2006/wordml" xmlns:wps="http://schemas.microsoft.com/office/word/2010/wordprocessingShape" mc:Ignorable="w14 w15 w16se w16cid w16 w16cex w16sdtdh w16sdtfl w16du wp14">
   <w:abstractNum w:abstractNumId="0" w15:restartNumberingAfterBreak="0">
-    <w:nsid w:val="07962403"/>
+    <w:nsid w:val="020B0719"/>
     <w:multiLevelType w:val="multilevel"/>
-    <w:tmpl w:val="8F287D86"/>
+    <w:tmpl w:val="F712062C"/>
     <w:lvl w:ilvl="0">
       <w:start w:val="1"/>
       <w:numFmt w:val="bullet"/>
@@ -9170,122 +11454,9 @@
     </w:lvl>
   </w:abstractNum>
   <w:abstractNum w:abstractNumId="1" w15:restartNumberingAfterBreak="0">
-    <w:nsid w:val="0BC6622D"/>
-    <w:multiLevelType w:val="hybridMultilevel"/>
-    <w:tmpl w:val="F12CB3EC"/>
-    <w:lvl w:ilvl="0" w:tplc="40090009">
-      <w:start w:val="1"/>
-      <w:numFmt w:val="bullet"/>
-      <w:lvlText w:val=""/>
-      <w:lvlJc w:val="left"/>
-      <w:pPr>
-        <w:ind w:left="720" w:hanging="360"/>
-      </w:pPr>
-      <w:rPr>
-        <w:rFonts w:ascii="Wingdings" w:hAnsi="Wingdings" w:hint="default"/>
-      </w:rPr>
-    </w:lvl>
-    <w:lvl w:ilvl="1" w:tplc="40090003" w:tentative="1">
-      <w:start w:val="1"/>
-      <w:numFmt w:val="bullet"/>
-      <w:lvlText w:val="o"/>
-      <w:lvlJc w:val="left"/>
-      <w:pPr>
-        <w:ind w:left="1440" w:hanging="360"/>
-      </w:pPr>
-      <w:rPr>
-        <w:rFonts w:ascii="Courier New" w:hAnsi="Courier New" w:cs="Courier New" w:hint="default"/>
-      </w:rPr>
-    </w:lvl>
-    <w:lvl w:ilvl="2" w:tplc="40090005" w:tentative="1">
-      <w:start w:val="1"/>
-      <w:numFmt w:val="bullet"/>
-      <w:lvlText w:val=""/>
-      <w:lvlJc w:val="left"/>
-      <w:pPr>
-        <w:ind w:left="2160" w:hanging="360"/>
-      </w:pPr>
-      <w:rPr>
-        <w:rFonts w:ascii="Wingdings" w:hAnsi="Wingdings" w:hint="default"/>
-      </w:rPr>
-    </w:lvl>
-    <w:lvl w:ilvl="3" w:tplc="40090001" w:tentative="1">
-      <w:start w:val="1"/>
-      <w:numFmt w:val="bullet"/>
-      <w:lvlText w:val=""/>
-      <w:lvlJc w:val="left"/>
-      <w:pPr>
-        <w:ind w:left="2880" w:hanging="360"/>
-      </w:pPr>
-      <w:rPr>
-        <w:rFonts w:ascii="Symbol" w:hAnsi="Symbol" w:hint="default"/>
-      </w:rPr>
-    </w:lvl>
-    <w:lvl w:ilvl="4" w:tplc="40090003" w:tentative="1">
-      <w:start w:val="1"/>
-      <w:numFmt w:val="bullet"/>
-      <w:lvlText w:val="o"/>
-      <w:lvlJc w:val="left"/>
-      <w:pPr>
-        <w:ind w:left="3600" w:hanging="360"/>
-      </w:pPr>
-      <w:rPr>
-        <w:rFonts w:ascii="Courier New" w:hAnsi="Courier New" w:cs="Courier New" w:hint="default"/>
-      </w:rPr>
-    </w:lvl>
-    <w:lvl w:ilvl="5" w:tplc="40090005" w:tentative="1">
-      <w:start w:val="1"/>
-      <w:numFmt w:val="bullet"/>
-      <w:lvlText w:val=""/>
-      <w:lvlJc w:val="left"/>
-      <w:pPr>
-        <w:ind w:left="4320" w:hanging="360"/>
-      </w:pPr>
-      <w:rPr>
-        <w:rFonts w:ascii="Wingdings" w:hAnsi="Wingdings" w:hint="default"/>
-      </w:rPr>
-    </w:lvl>
-    <w:lvl w:ilvl="6" w:tplc="40090001" w:tentative="1">
-      <w:start w:val="1"/>
-      <w:numFmt w:val="bullet"/>
-      <w:lvlText w:val=""/>
-      <w:lvlJc w:val="left"/>
-      <w:pPr>
-        <w:ind w:left="5040" w:hanging="360"/>
-      </w:pPr>
-      <w:rPr>
-        <w:rFonts w:ascii="Symbol" w:hAnsi="Symbol" w:hint="default"/>
-      </w:rPr>
-    </w:lvl>
-    <w:lvl w:ilvl="7" w:tplc="40090003" w:tentative="1">
-      <w:start w:val="1"/>
-      <w:numFmt w:val="bullet"/>
-      <w:lvlText w:val="o"/>
-      <w:lvlJc w:val="left"/>
-      <w:pPr>
-        <w:ind w:left="5760" w:hanging="360"/>
-      </w:pPr>
-      <w:rPr>
-        <w:rFonts w:ascii="Courier New" w:hAnsi="Courier New" w:cs="Courier New" w:hint="default"/>
-      </w:rPr>
-    </w:lvl>
-    <w:lvl w:ilvl="8" w:tplc="40090005" w:tentative="1">
-      <w:start w:val="1"/>
-      <w:numFmt w:val="bullet"/>
-      <w:lvlText w:val=""/>
-      <w:lvlJc w:val="left"/>
-      <w:pPr>
-        <w:ind w:left="6480" w:hanging="360"/>
-      </w:pPr>
-      <w:rPr>
-        <w:rFonts w:ascii="Wingdings" w:hAnsi="Wingdings" w:hint="default"/>
-      </w:rPr>
-    </w:lvl>
-  </w:abstractNum>
-  <w:abstractNum w:abstractNumId="2" w15:restartNumberingAfterBreak="0">
-    <w:nsid w:val="2B6175FA"/>
+    <w:nsid w:val="07962403"/>
     <w:multiLevelType w:val="multilevel"/>
-    <w:tmpl w:val="78D63E14"/>
+    <w:tmpl w:val="8F287D86"/>
     <w:lvl w:ilvl="0">
       <w:start w:val="1"/>
       <w:numFmt w:val="bullet"/>
@@ -9431,17 +11602,17 @@
       </w:rPr>
     </w:lvl>
   </w:abstractNum>
-  <w:abstractNum w:abstractNumId="3" w15:restartNumberingAfterBreak="0">
-    <w:nsid w:val="321D39C3"/>
+  <w:abstractNum w:abstractNumId="2" w15:restartNumberingAfterBreak="0">
+    <w:nsid w:val="0BC6622D"/>
     <w:multiLevelType w:val="hybridMultilevel"/>
-    <w:tmpl w:val="7550EF32"/>
-    <w:lvl w:ilvl="0" w:tplc="4009000D">
+    <w:tmpl w:val="C792D9F2"/>
+    <w:lvl w:ilvl="0" w:tplc="40090009">
       <w:start w:val="1"/>
       <w:numFmt w:val="bullet"/>
-      <w:lvlText w:val=""/>
+      <w:lvlText w:val=""/>
       <w:lvlJc w:val="left"/>
       <w:pPr>
-        <w:ind w:left="1440" w:hanging="360"/>
+        <w:ind w:left="720" w:hanging="360"/>
       </w:pPr>
       <w:rPr>
         <w:rFonts w:ascii="Wingdings" w:hAnsi="Wingdings" w:hint="default"/>
@@ -9453,7 +11624,7 @@
       <w:lvlText w:val="o"/>
       <w:lvlJc w:val="left"/>
       <w:pPr>
-        <w:ind w:left="2160" w:hanging="360"/>
+        <w:ind w:left="1440" w:hanging="360"/>
       </w:pPr>
       <w:rPr>
         <w:rFonts w:ascii="Courier New" w:hAnsi="Courier New" w:cs="Courier New" w:hint="default"/>
@@ -9465,7 +11636,7 @@
       <w:lvlText w:val=""/>
       <w:lvlJc w:val="left"/>
       <w:pPr>
-        <w:ind w:left="2880" w:hanging="360"/>
+        <w:ind w:left="2160" w:hanging="360"/>
       </w:pPr>
       <w:rPr>
         <w:rFonts w:ascii="Wingdings" w:hAnsi="Wingdings" w:hint="default"/>
@@ -9477,7 +11648,7 @@
       <w:lvlText w:val=""/>
       <w:lvlJc w:val="left"/>
       <w:pPr>
-        <w:ind w:left="3600" w:hanging="360"/>
+        <w:ind w:left="2880" w:hanging="360"/>
       </w:pPr>
       <w:rPr>
         <w:rFonts w:ascii="Symbol" w:hAnsi="Symbol" w:hint="default"/>
@@ -9489,7 +11660,7 @@
       <w:lvlText w:val="o"/>
       <w:lvlJc w:val="left"/>
       <w:pPr>
-        <w:ind w:left="4320" w:hanging="360"/>
+        <w:ind w:left="3600" w:hanging="360"/>
       </w:pPr>
       <w:rPr>
         <w:rFonts w:ascii="Courier New" w:hAnsi="Courier New" w:cs="Courier New" w:hint="default"/>
@@ -9501,7 +11672,7 @@
       <w:lvlText w:val=""/>
       <w:lvlJc w:val="left"/>
       <w:pPr>
-        <w:ind w:left="5040" w:hanging="360"/>
+        <w:ind w:left="4320" w:hanging="360"/>
       </w:pPr>
       <w:rPr>
         <w:rFonts w:ascii="Wingdings" w:hAnsi="Wingdings" w:hint="default"/>
@@ -9513,7 +11684,7 @@
       <w:lvlText w:val=""/>
       <w:lvlJc w:val="left"/>
       <w:pPr>
-        <w:ind w:left="5760" w:hanging="360"/>
+        <w:ind w:left="5040" w:hanging="360"/>
       </w:pPr>
       <w:rPr>
         <w:rFonts w:ascii="Symbol" w:hAnsi="Symbol" w:hint="default"/>
@@ -9525,7 +11696,7 @@
       <w:lvlText w:val="o"/>
       <w:lvlJc w:val="left"/>
       <w:pPr>
-        <w:ind w:left="6480" w:hanging="360"/>
+        <w:ind w:left="5760" w:hanging="360"/>
       </w:pPr>
       <w:rPr>
         <w:rFonts w:ascii="Courier New" w:hAnsi="Courier New" w:cs="Courier New" w:hint="default"/>
@@ -9537,17 +11708,17 @@
       <w:lvlText w:val=""/>
       <w:lvlJc w:val="left"/>
       <w:pPr>
-        <w:ind w:left="7200" w:hanging="360"/>
+        <w:ind w:left="6480" w:hanging="360"/>
       </w:pPr>
       <w:rPr>
         <w:rFonts w:ascii="Wingdings" w:hAnsi="Wingdings" w:hint="default"/>
       </w:rPr>
     </w:lvl>
   </w:abstractNum>
-  <w:abstractNum w:abstractNumId="4" w15:restartNumberingAfterBreak="0">
-    <w:nsid w:val="353D30CB"/>
+  <w:abstractNum w:abstractNumId="3" w15:restartNumberingAfterBreak="0">
+    <w:nsid w:val="2B6175FA"/>
     <w:multiLevelType w:val="multilevel"/>
-    <w:tmpl w:val="3EC0C1C8"/>
+    <w:tmpl w:val="78D63E14"/>
     <w:lvl w:ilvl="0">
       <w:start w:val="1"/>
       <w:numFmt w:val="bullet"/>
@@ -9693,10 +11864,123 @@
       </w:rPr>
     </w:lvl>
   </w:abstractNum>
+  <w:abstractNum w:abstractNumId="4" w15:restartNumberingAfterBreak="0">
+    <w:nsid w:val="321D39C3"/>
+    <w:multiLevelType w:val="hybridMultilevel"/>
+    <w:tmpl w:val="7550EF32"/>
+    <w:lvl w:ilvl="0" w:tplc="4009000D">
+      <w:start w:val="1"/>
+      <w:numFmt w:val="bullet"/>
+      <w:lvlText w:val=""/>
+      <w:lvlJc w:val="left"/>
+      <w:pPr>
+        <w:ind w:left="1440" w:hanging="360"/>
+      </w:pPr>
+      <w:rPr>
+        <w:rFonts w:ascii="Wingdings" w:hAnsi="Wingdings" w:hint="default"/>
+      </w:rPr>
+    </w:lvl>
+    <w:lvl w:ilvl="1" w:tplc="40090003" w:tentative="1">
+      <w:start w:val="1"/>
+      <w:numFmt w:val="bullet"/>
+      <w:lvlText w:val="o"/>
+      <w:lvlJc w:val="left"/>
+      <w:pPr>
+        <w:ind w:left="2160" w:hanging="360"/>
+      </w:pPr>
+      <w:rPr>
+        <w:rFonts w:ascii="Courier New" w:hAnsi="Courier New" w:cs="Courier New" w:hint="default"/>
+      </w:rPr>
+    </w:lvl>
+    <w:lvl w:ilvl="2" w:tplc="40090005" w:tentative="1">
+      <w:start w:val="1"/>
+      <w:numFmt w:val="bullet"/>
+      <w:lvlText w:val=""/>
+      <w:lvlJc w:val="left"/>
+      <w:pPr>
+        <w:ind w:left="2880" w:hanging="360"/>
+      </w:pPr>
+      <w:rPr>
+        <w:rFonts w:ascii="Wingdings" w:hAnsi="Wingdings" w:hint="default"/>
+      </w:rPr>
+    </w:lvl>
+    <w:lvl w:ilvl="3" w:tplc="40090001" w:tentative="1">
+      <w:start w:val="1"/>
+      <w:numFmt w:val="bullet"/>
+      <w:lvlText w:val=""/>
+      <w:lvlJc w:val="left"/>
+      <w:pPr>
+        <w:ind w:left="3600" w:hanging="360"/>
+      </w:pPr>
+      <w:rPr>
+        <w:rFonts w:ascii="Symbol" w:hAnsi="Symbol" w:hint="default"/>
+      </w:rPr>
+    </w:lvl>
+    <w:lvl w:ilvl="4" w:tplc="40090003" w:tentative="1">
+      <w:start w:val="1"/>
+      <w:numFmt w:val="bullet"/>
+      <w:lvlText w:val="o"/>
+      <w:lvlJc w:val="left"/>
+      <w:pPr>
+        <w:ind w:left="4320" w:hanging="360"/>
+      </w:pPr>
+      <w:rPr>
+        <w:rFonts w:ascii="Courier New" w:hAnsi="Courier New" w:cs="Courier New" w:hint="default"/>
+      </w:rPr>
+    </w:lvl>
+    <w:lvl w:ilvl="5" w:tplc="40090005" w:tentative="1">
+      <w:start w:val="1"/>
+      <w:numFmt w:val="bullet"/>
+      <w:lvlText w:val=""/>
+      <w:lvlJc w:val="left"/>
+      <w:pPr>
+        <w:ind w:left="5040" w:hanging="360"/>
+      </w:pPr>
+      <w:rPr>
+        <w:rFonts w:ascii="Wingdings" w:hAnsi="Wingdings" w:hint="default"/>
+      </w:rPr>
+    </w:lvl>
+    <w:lvl w:ilvl="6" w:tplc="40090001" w:tentative="1">
+      <w:start w:val="1"/>
+      <w:numFmt w:val="bullet"/>
+      <w:lvlText w:val=""/>
+      <w:lvlJc w:val="left"/>
+      <w:pPr>
+        <w:ind w:left="5760" w:hanging="360"/>
+      </w:pPr>
+      <w:rPr>
+        <w:rFonts w:ascii="Symbol" w:hAnsi="Symbol" w:hint="default"/>
+      </w:rPr>
+    </w:lvl>
+    <w:lvl w:ilvl="7" w:tplc="40090003" w:tentative="1">
+      <w:start w:val="1"/>
+      <w:numFmt w:val="bullet"/>
+      <w:lvlText w:val="o"/>
+      <w:lvlJc w:val="left"/>
+      <w:pPr>
+        <w:ind w:left="6480" w:hanging="360"/>
+      </w:pPr>
+      <w:rPr>
+        <w:rFonts w:ascii="Courier New" w:hAnsi="Courier New" w:cs="Courier New" w:hint="default"/>
+      </w:rPr>
+    </w:lvl>
+    <w:lvl w:ilvl="8" w:tplc="40090005" w:tentative="1">
+      <w:start w:val="1"/>
+      <w:numFmt w:val="bullet"/>
+      <w:lvlText w:val=""/>
+      <w:lvlJc w:val="left"/>
+      <w:pPr>
+        <w:ind w:left="7200" w:hanging="360"/>
+      </w:pPr>
+      <w:rPr>
+        <w:rFonts w:ascii="Wingdings" w:hAnsi="Wingdings" w:hint="default"/>
+      </w:rPr>
+    </w:lvl>
+  </w:abstractNum>
   <w:abstractNum w:abstractNumId="5" w15:restartNumberingAfterBreak="0">
-    <w:nsid w:val="3884659F"/>
+    <w:nsid w:val="353D30CB"/>
     <w:multiLevelType w:val="multilevel"/>
-    <w:tmpl w:val="8E2C9308"/>
+    <w:tmpl w:val="3EC0C1C8"/>
     <w:lvl w:ilvl="0">
       <w:start w:val="1"/>
       <w:numFmt w:val="bullet"/>
@@ -9843,9 +12127,9 @@
     </w:lvl>
   </w:abstractNum>
   <w:abstractNum w:abstractNumId="6" w15:restartNumberingAfterBreak="0">
-    <w:nsid w:val="46740736"/>
+    <w:nsid w:val="3884659F"/>
     <w:multiLevelType w:val="multilevel"/>
-    <w:tmpl w:val="971ECD40"/>
+    <w:tmpl w:val="8E2C9308"/>
     <w:lvl w:ilvl="0">
       <w:start w:val="1"/>
       <w:numFmt w:val="bullet"/>
@@ -9992,9 +12276,9 @@
     </w:lvl>
   </w:abstractNum>
   <w:abstractNum w:abstractNumId="7" w15:restartNumberingAfterBreak="0">
-    <w:nsid w:val="47484916"/>
+    <w:nsid w:val="46740736"/>
     <w:multiLevelType w:val="multilevel"/>
-    <w:tmpl w:val="351A721E"/>
+    <w:tmpl w:val="971ECD40"/>
     <w:lvl w:ilvl="0">
       <w:start w:val="1"/>
       <w:numFmt w:val="bullet"/>
@@ -10141,9 +12425,9 @@
     </w:lvl>
   </w:abstractNum>
   <w:abstractNum w:abstractNumId="8" w15:restartNumberingAfterBreak="0">
-    <w:nsid w:val="539A0854"/>
+    <w:nsid w:val="47484916"/>
     <w:multiLevelType w:val="multilevel"/>
-    <w:tmpl w:val="5588D980"/>
+    <w:tmpl w:val="351A721E"/>
     <w:lvl w:ilvl="0">
       <w:start w:val="1"/>
       <w:numFmt w:val="bullet"/>
@@ -10290,9 +12574,9 @@
     </w:lvl>
   </w:abstractNum>
   <w:abstractNum w:abstractNumId="9" w15:restartNumberingAfterBreak="0">
-    <w:nsid w:val="5ABF11C5"/>
+    <w:nsid w:val="539A0854"/>
     <w:multiLevelType w:val="multilevel"/>
-    <w:tmpl w:val="BE98880C"/>
+    <w:tmpl w:val="5588D980"/>
     <w:lvl w:ilvl="0">
       <w:start w:val="1"/>
       <w:numFmt w:val="bullet"/>
@@ -10439,235 +12723,9 @@
     </w:lvl>
   </w:abstractNum>
   <w:abstractNum w:abstractNumId="10" w15:restartNumberingAfterBreak="0">
-    <w:nsid w:val="6CA6746B"/>
-    <w:multiLevelType w:val="hybridMultilevel"/>
-    <w:tmpl w:val="1B7A8422"/>
-    <w:lvl w:ilvl="0" w:tplc="40090009">
-      <w:start w:val="1"/>
-      <w:numFmt w:val="bullet"/>
-      <w:lvlText w:val=""/>
-      <w:lvlJc w:val="left"/>
-      <w:pPr>
-        <w:ind w:left="1440" w:hanging="360"/>
-      </w:pPr>
-      <w:rPr>
-        <w:rFonts w:ascii="Wingdings" w:hAnsi="Wingdings" w:hint="default"/>
-      </w:rPr>
-    </w:lvl>
-    <w:lvl w:ilvl="1" w:tplc="40090003" w:tentative="1">
-      <w:start w:val="1"/>
-      <w:numFmt w:val="bullet"/>
-      <w:lvlText w:val="o"/>
-      <w:lvlJc w:val="left"/>
-      <w:pPr>
-        <w:ind w:left="2160" w:hanging="360"/>
-      </w:pPr>
-      <w:rPr>
-        <w:rFonts w:ascii="Courier New" w:hAnsi="Courier New" w:cs="Courier New" w:hint="default"/>
-      </w:rPr>
-    </w:lvl>
-    <w:lvl w:ilvl="2" w:tplc="40090005" w:tentative="1">
-      <w:start w:val="1"/>
-      <w:numFmt w:val="bullet"/>
-      <w:lvlText w:val=""/>
-      <w:lvlJc w:val="left"/>
-      <w:pPr>
-        <w:ind w:left="2880" w:hanging="360"/>
-      </w:pPr>
-      <w:rPr>
-        <w:rFonts w:ascii="Wingdings" w:hAnsi="Wingdings" w:hint="default"/>
-      </w:rPr>
-    </w:lvl>
-    <w:lvl w:ilvl="3" w:tplc="40090001" w:tentative="1">
-      <w:start w:val="1"/>
-      <w:numFmt w:val="bullet"/>
-      <w:lvlText w:val=""/>
-      <w:lvlJc w:val="left"/>
-      <w:pPr>
-        <w:ind w:left="3600" w:hanging="360"/>
-      </w:pPr>
-      <w:rPr>
-        <w:rFonts w:ascii="Symbol" w:hAnsi="Symbol" w:hint="default"/>
-      </w:rPr>
-    </w:lvl>
-    <w:lvl w:ilvl="4" w:tplc="40090003" w:tentative="1">
-      <w:start w:val="1"/>
-      <w:numFmt w:val="bullet"/>
-      <w:lvlText w:val="o"/>
-      <w:lvlJc w:val="left"/>
-      <w:pPr>
-        <w:ind w:left="4320" w:hanging="360"/>
-      </w:pPr>
-      <w:rPr>
-        <w:rFonts w:ascii="Courier New" w:hAnsi="Courier New" w:cs="Courier New" w:hint="default"/>
-      </w:rPr>
-    </w:lvl>
-    <w:lvl w:ilvl="5" w:tplc="40090005" w:tentative="1">
-      <w:start w:val="1"/>
-      <w:numFmt w:val="bullet"/>
-      <w:lvlText w:val=""/>
-      <w:lvlJc w:val="left"/>
-      <w:pPr>
-        <w:ind w:left="5040" w:hanging="360"/>
-      </w:pPr>
-      <w:rPr>
-        <w:rFonts w:ascii="Wingdings" w:hAnsi="Wingdings" w:hint="default"/>
-      </w:rPr>
-    </w:lvl>
-    <w:lvl w:ilvl="6" w:tplc="40090001" w:tentative="1">
-      <w:start w:val="1"/>
-      <w:numFmt w:val="bullet"/>
-      <w:lvlText w:val=""/>
-      <w:lvlJc w:val="left"/>
-      <w:pPr>
-        <w:ind w:left="5760" w:hanging="360"/>
-      </w:pPr>
-      <w:rPr>
-        <w:rFonts w:ascii="Symbol" w:hAnsi="Symbol" w:hint="default"/>
-      </w:rPr>
-    </w:lvl>
-    <w:lvl w:ilvl="7" w:tplc="40090003" w:tentative="1">
-      <w:start w:val="1"/>
-      <w:numFmt w:val="bullet"/>
-      <w:lvlText w:val="o"/>
-      <w:lvlJc w:val="left"/>
-      <w:pPr>
-        <w:ind w:left="6480" w:hanging="360"/>
-      </w:pPr>
-      <w:rPr>
-        <w:rFonts w:ascii="Courier New" w:hAnsi="Courier New" w:cs="Courier New" w:hint="default"/>
-      </w:rPr>
-    </w:lvl>
-    <w:lvl w:ilvl="8" w:tplc="40090005" w:tentative="1">
-      <w:start w:val="1"/>
-      <w:numFmt w:val="bullet"/>
-      <w:lvlText w:val=""/>
-      <w:lvlJc w:val="left"/>
-      <w:pPr>
-        <w:ind w:left="7200" w:hanging="360"/>
-      </w:pPr>
-      <w:rPr>
-        <w:rFonts w:ascii="Wingdings" w:hAnsi="Wingdings" w:hint="default"/>
-      </w:rPr>
-    </w:lvl>
-  </w:abstractNum>
-  <w:abstractNum w:abstractNumId="11" w15:restartNumberingAfterBreak="0">
-    <w:nsid w:val="73E725D0"/>
-    <w:multiLevelType w:val="hybridMultilevel"/>
-    <w:tmpl w:val="E806EA88"/>
-    <w:lvl w:ilvl="0" w:tplc="40090001">
-      <w:start w:val="1"/>
-      <w:numFmt w:val="bullet"/>
-      <w:lvlText w:val=""/>
-      <w:lvlJc w:val="left"/>
-      <w:pPr>
-        <w:ind w:left="720" w:hanging="360"/>
-      </w:pPr>
-      <w:rPr>
-        <w:rFonts w:ascii="Symbol" w:hAnsi="Symbol" w:hint="default"/>
-      </w:rPr>
-    </w:lvl>
-    <w:lvl w:ilvl="1" w:tplc="40090003" w:tentative="1">
-      <w:start w:val="1"/>
-      <w:numFmt w:val="bullet"/>
-      <w:lvlText w:val="o"/>
-      <w:lvlJc w:val="left"/>
-      <w:pPr>
-        <w:ind w:left="1440" w:hanging="360"/>
-      </w:pPr>
-      <w:rPr>
-        <w:rFonts w:ascii="Courier New" w:hAnsi="Courier New" w:cs="Courier New" w:hint="default"/>
-      </w:rPr>
-    </w:lvl>
-    <w:lvl w:ilvl="2" w:tplc="40090005" w:tentative="1">
-      <w:start w:val="1"/>
-      <w:numFmt w:val="bullet"/>
-      <w:lvlText w:val=""/>
-      <w:lvlJc w:val="left"/>
-      <w:pPr>
-        <w:ind w:left="2160" w:hanging="360"/>
-      </w:pPr>
-      <w:rPr>
-        <w:rFonts w:ascii="Wingdings" w:hAnsi="Wingdings" w:hint="default"/>
-      </w:rPr>
-    </w:lvl>
-    <w:lvl w:ilvl="3" w:tplc="40090001" w:tentative="1">
-      <w:start w:val="1"/>
-      <w:numFmt w:val="bullet"/>
-      <w:lvlText w:val=""/>
-      <w:lvlJc w:val="left"/>
-      <w:pPr>
-        <w:ind w:left="2880" w:hanging="360"/>
-      </w:pPr>
-      <w:rPr>
-        <w:rFonts w:ascii="Symbol" w:hAnsi="Symbol" w:hint="default"/>
-      </w:rPr>
-    </w:lvl>
-    <w:lvl w:ilvl="4" w:tplc="40090003" w:tentative="1">
-      <w:start w:val="1"/>
-      <w:numFmt w:val="bullet"/>
-      <w:lvlText w:val="o"/>
-      <w:lvlJc w:val="left"/>
-      <w:pPr>
-        <w:ind w:left="3600" w:hanging="360"/>
-      </w:pPr>
-      <w:rPr>
-        <w:rFonts w:ascii="Courier New" w:hAnsi="Courier New" w:cs="Courier New" w:hint="default"/>
-      </w:rPr>
-    </w:lvl>
-    <w:lvl w:ilvl="5" w:tplc="40090005" w:tentative="1">
-      <w:start w:val="1"/>
-      <w:numFmt w:val="bullet"/>
-      <w:lvlText w:val=""/>
-      <w:lvlJc w:val="left"/>
-      <w:pPr>
-        <w:ind w:left="4320" w:hanging="360"/>
-      </w:pPr>
-      <w:rPr>
-        <w:rFonts w:ascii="Wingdings" w:hAnsi="Wingdings" w:hint="default"/>
-      </w:rPr>
-    </w:lvl>
-    <w:lvl w:ilvl="6" w:tplc="40090001" w:tentative="1">
-      <w:start w:val="1"/>
-      <w:numFmt w:val="bullet"/>
-      <w:lvlText w:val=""/>
-      <w:lvlJc w:val="left"/>
-      <w:pPr>
-        <w:ind w:left="5040" w:hanging="360"/>
-      </w:pPr>
-      <w:rPr>
-        <w:rFonts w:ascii="Symbol" w:hAnsi="Symbol" w:hint="default"/>
-      </w:rPr>
-    </w:lvl>
-    <w:lvl w:ilvl="7" w:tplc="40090003" w:tentative="1">
-      <w:start w:val="1"/>
-      <w:numFmt w:val="bullet"/>
-      <w:lvlText w:val="o"/>
-      <w:lvlJc w:val="left"/>
-      <w:pPr>
-        <w:ind w:left="5760" w:hanging="360"/>
-      </w:pPr>
-      <w:rPr>
-        <w:rFonts w:ascii="Courier New" w:hAnsi="Courier New" w:cs="Courier New" w:hint="default"/>
-      </w:rPr>
-    </w:lvl>
-    <w:lvl w:ilvl="8" w:tplc="40090005" w:tentative="1">
-      <w:start w:val="1"/>
-      <w:numFmt w:val="bullet"/>
-      <w:lvlText w:val=""/>
-      <w:lvlJc w:val="left"/>
-      <w:pPr>
-        <w:ind w:left="6480" w:hanging="360"/>
-      </w:pPr>
-      <w:rPr>
-        <w:rFonts w:ascii="Wingdings" w:hAnsi="Wingdings" w:hint="default"/>
-      </w:rPr>
-    </w:lvl>
-  </w:abstractNum>
-  <w:abstractNum w:abstractNumId="12" w15:restartNumberingAfterBreak="0">
-    <w:nsid w:val="78C73386"/>
+    <w:nsid w:val="5ABF11C5"/>
     <w:multiLevelType w:val="multilevel"/>
-    <w:tmpl w:val="8D266888"/>
+    <w:tmpl w:val="BE98880C"/>
     <w:lvl w:ilvl="0">
       <w:start w:val="1"/>
       <w:numFmt w:val="bullet"/>
@@ -10813,10 +12871,236 @@
       </w:rPr>
     </w:lvl>
   </w:abstractNum>
+  <w:abstractNum w:abstractNumId="11" w15:restartNumberingAfterBreak="0">
+    <w:nsid w:val="6CA6746B"/>
+    <w:multiLevelType w:val="hybridMultilevel"/>
+    <w:tmpl w:val="1B7A8422"/>
+    <w:lvl w:ilvl="0" w:tplc="40090009">
+      <w:start w:val="1"/>
+      <w:numFmt w:val="bullet"/>
+      <w:lvlText w:val=""/>
+      <w:lvlJc w:val="left"/>
+      <w:pPr>
+        <w:ind w:left="1440" w:hanging="360"/>
+      </w:pPr>
+      <w:rPr>
+        <w:rFonts w:ascii="Wingdings" w:hAnsi="Wingdings" w:hint="default"/>
+      </w:rPr>
+    </w:lvl>
+    <w:lvl w:ilvl="1" w:tplc="40090003" w:tentative="1">
+      <w:start w:val="1"/>
+      <w:numFmt w:val="bullet"/>
+      <w:lvlText w:val="o"/>
+      <w:lvlJc w:val="left"/>
+      <w:pPr>
+        <w:ind w:left="2160" w:hanging="360"/>
+      </w:pPr>
+      <w:rPr>
+        <w:rFonts w:ascii="Courier New" w:hAnsi="Courier New" w:cs="Courier New" w:hint="default"/>
+      </w:rPr>
+    </w:lvl>
+    <w:lvl w:ilvl="2" w:tplc="40090005" w:tentative="1">
+      <w:start w:val="1"/>
+      <w:numFmt w:val="bullet"/>
+      <w:lvlText w:val=""/>
+      <w:lvlJc w:val="left"/>
+      <w:pPr>
+        <w:ind w:left="2880" w:hanging="360"/>
+      </w:pPr>
+      <w:rPr>
+        <w:rFonts w:ascii="Wingdings" w:hAnsi="Wingdings" w:hint="default"/>
+      </w:rPr>
+    </w:lvl>
+    <w:lvl w:ilvl="3" w:tplc="40090001" w:tentative="1">
+      <w:start w:val="1"/>
+      <w:numFmt w:val="bullet"/>
+      <w:lvlText w:val=""/>
+      <w:lvlJc w:val="left"/>
+      <w:pPr>
+        <w:ind w:left="3600" w:hanging="360"/>
+      </w:pPr>
+      <w:rPr>
+        <w:rFonts w:ascii="Symbol" w:hAnsi="Symbol" w:hint="default"/>
+      </w:rPr>
+    </w:lvl>
+    <w:lvl w:ilvl="4" w:tplc="40090003" w:tentative="1">
+      <w:start w:val="1"/>
+      <w:numFmt w:val="bullet"/>
+      <w:lvlText w:val="o"/>
+      <w:lvlJc w:val="left"/>
+      <w:pPr>
+        <w:ind w:left="4320" w:hanging="360"/>
+      </w:pPr>
+      <w:rPr>
+        <w:rFonts w:ascii="Courier New" w:hAnsi="Courier New" w:cs="Courier New" w:hint="default"/>
+      </w:rPr>
+    </w:lvl>
+    <w:lvl w:ilvl="5" w:tplc="40090005" w:tentative="1">
+      <w:start w:val="1"/>
+      <w:numFmt w:val="bullet"/>
+      <w:lvlText w:val=""/>
+      <w:lvlJc w:val="left"/>
+      <w:pPr>
+        <w:ind w:left="5040" w:hanging="360"/>
+      </w:pPr>
+      <w:rPr>
+        <w:rFonts w:ascii="Wingdings" w:hAnsi="Wingdings" w:hint="default"/>
+      </w:rPr>
+    </w:lvl>
+    <w:lvl w:ilvl="6" w:tplc="40090001" w:tentative="1">
+      <w:start w:val="1"/>
+      <w:numFmt w:val="bullet"/>
+      <w:lvlText w:val=""/>
+      <w:lvlJc w:val="left"/>
+      <w:pPr>
+        <w:ind w:left="5760" w:hanging="360"/>
+      </w:pPr>
+      <w:rPr>
+        <w:rFonts w:ascii="Symbol" w:hAnsi="Symbol" w:hint="default"/>
+      </w:rPr>
+    </w:lvl>
+    <w:lvl w:ilvl="7" w:tplc="40090003" w:tentative="1">
+      <w:start w:val="1"/>
+      <w:numFmt w:val="bullet"/>
+      <w:lvlText w:val="o"/>
+      <w:lvlJc w:val="left"/>
+      <w:pPr>
+        <w:ind w:left="6480" w:hanging="360"/>
+      </w:pPr>
+      <w:rPr>
+        <w:rFonts w:ascii="Courier New" w:hAnsi="Courier New" w:cs="Courier New" w:hint="default"/>
+      </w:rPr>
+    </w:lvl>
+    <w:lvl w:ilvl="8" w:tplc="40090005" w:tentative="1">
+      <w:start w:val="1"/>
+      <w:numFmt w:val="bullet"/>
+      <w:lvlText w:val=""/>
+      <w:lvlJc w:val="left"/>
+      <w:pPr>
+        <w:ind w:left="7200" w:hanging="360"/>
+      </w:pPr>
+      <w:rPr>
+        <w:rFonts w:ascii="Wingdings" w:hAnsi="Wingdings" w:hint="default"/>
+      </w:rPr>
+    </w:lvl>
+  </w:abstractNum>
+  <w:abstractNum w:abstractNumId="12" w15:restartNumberingAfterBreak="0">
+    <w:nsid w:val="73E725D0"/>
+    <w:multiLevelType w:val="hybridMultilevel"/>
+    <w:tmpl w:val="E806EA88"/>
+    <w:lvl w:ilvl="0" w:tplc="40090001">
+      <w:start w:val="1"/>
+      <w:numFmt w:val="bullet"/>
+      <w:lvlText w:val=""/>
+      <w:lvlJc w:val="left"/>
+      <w:pPr>
+        <w:ind w:left="720" w:hanging="360"/>
+      </w:pPr>
+      <w:rPr>
+        <w:rFonts w:ascii="Symbol" w:hAnsi="Symbol" w:hint="default"/>
+      </w:rPr>
+    </w:lvl>
+    <w:lvl w:ilvl="1" w:tplc="40090003" w:tentative="1">
+      <w:start w:val="1"/>
+      <w:numFmt w:val="bullet"/>
+      <w:lvlText w:val="o"/>
+      <w:lvlJc w:val="left"/>
+      <w:pPr>
+        <w:ind w:left="1440" w:hanging="360"/>
+      </w:pPr>
+      <w:rPr>
+        <w:rFonts w:ascii="Courier New" w:hAnsi="Courier New" w:cs="Courier New" w:hint="default"/>
+      </w:rPr>
+    </w:lvl>
+    <w:lvl w:ilvl="2" w:tplc="40090005" w:tentative="1">
+      <w:start w:val="1"/>
+      <w:numFmt w:val="bullet"/>
+      <w:lvlText w:val=""/>
+      <w:lvlJc w:val="left"/>
+      <w:pPr>
+        <w:ind w:left="2160" w:hanging="360"/>
+      </w:pPr>
+      <w:rPr>
+        <w:rFonts w:ascii="Wingdings" w:hAnsi="Wingdings" w:hint="default"/>
+      </w:rPr>
+    </w:lvl>
+    <w:lvl w:ilvl="3" w:tplc="40090001" w:tentative="1">
+      <w:start w:val="1"/>
+      <w:numFmt w:val="bullet"/>
+      <w:lvlText w:val=""/>
+      <w:lvlJc w:val="left"/>
+      <w:pPr>
+        <w:ind w:left="2880" w:hanging="360"/>
+      </w:pPr>
+      <w:rPr>
+        <w:rFonts w:ascii="Symbol" w:hAnsi="Symbol" w:hint="default"/>
+      </w:rPr>
+    </w:lvl>
+    <w:lvl w:ilvl="4" w:tplc="40090003" w:tentative="1">
+      <w:start w:val="1"/>
+      <w:numFmt w:val="bullet"/>
+      <w:lvlText w:val="o"/>
+      <w:lvlJc w:val="left"/>
+      <w:pPr>
+        <w:ind w:left="3600" w:hanging="360"/>
+      </w:pPr>
+      <w:rPr>
+        <w:rFonts w:ascii="Courier New" w:hAnsi="Courier New" w:cs="Courier New" w:hint="default"/>
+      </w:rPr>
+    </w:lvl>
+    <w:lvl w:ilvl="5" w:tplc="40090005" w:tentative="1">
+      <w:start w:val="1"/>
+      <w:numFmt w:val="bullet"/>
+      <w:lvlText w:val=""/>
+      <w:lvlJc w:val="left"/>
+      <w:pPr>
+        <w:ind w:left="4320" w:hanging="360"/>
+      </w:pPr>
+      <w:rPr>
+        <w:rFonts w:ascii="Wingdings" w:hAnsi="Wingdings" w:hint="default"/>
+      </w:rPr>
+    </w:lvl>
+    <w:lvl w:ilvl="6" w:tplc="40090001" w:tentative="1">
+      <w:start w:val="1"/>
+      <w:numFmt w:val="bullet"/>
+      <w:lvlText w:val=""/>
+      <w:lvlJc w:val="left"/>
+      <w:pPr>
+        <w:ind w:left="5040" w:hanging="360"/>
+      </w:pPr>
+      <w:rPr>
+        <w:rFonts w:ascii="Symbol" w:hAnsi="Symbol" w:hint="default"/>
+      </w:rPr>
+    </w:lvl>
+    <w:lvl w:ilvl="7" w:tplc="40090003" w:tentative="1">
+      <w:start w:val="1"/>
+      <w:numFmt w:val="bullet"/>
+      <w:lvlText w:val="o"/>
+      <w:lvlJc w:val="left"/>
+      <w:pPr>
+        <w:ind w:left="5760" w:hanging="360"/>
+      </w:pPr>
+      <w:rPr>
+        <w:rFonts w:ascii="Courier New" w:hAnsi="Courier New" w:cs="Courier New" w:hint="default"/>
+      </w:rPr>
+    </w:lvl>
+    <w:lvl w:ilvl="8" w:tplc="40090005" w:tentative="1">
+      <w:start w:val="1"/>
+      <w:numFmt w:val="bullet"/>
+      <w:lvlText w:val=""/>
+      <w:lvlJc w:val="left"/>
+      <w:pPr>
+        <w:ind w:left="6480" w:hanging="360"/>
+      </w:pPr>
+      <w:rPr>
+        <w:rFonts w:ascii="Wingdings" w:hAnsi="Wingdings" w:hint="default"/>
+      </w:rPr>
+    </w:lvl>
+  </w:abstractNum>
   <w:abstractNum w:abstractNumId="13" w15:restartNumberingAfterBreak="0">
-    <w:nsid w:val="7C907E68"/>
+    <w:nsid w:val="78C73386"/>
     <w:multiLevelType w:val="multilevel"/>
-    <w:tmpl w:val="729AECCA"/>
+    <w:tmpl w:val="8D266888"/>
     <w:lvl w:ilvl="0">
       <w:start w:val="1"/>
       <w:numFmt w:val="bullet"/>
@@ -10962,47 +13246,199 @@
       </w:rPr>
     </w:lvl>
   </w:abstractNum>
+  <w:abstractNum w:abstractNumId="14" w15:restartNumberingAfterBreak="0">
+    <w:nsid w:val="7C907E68"/>
+    <w:multiLevelType w:val="multilevel"/>
+    <w:tmpl w:val="729AECCA"/>
+    <w:lvl w:ilvl="0">
+      <w:start w:val="1"/>
+      <w:numFmt w:val="bullet"/>
+      <w:lvlText w:val=""/>
+      <w:lvlJc w:val="left"/>
+      <w:pPr>
+        <w:tabs>
+          <w:tab w:val="num" w:pos="720"/>
+        </w:tabs>
+        <w:ind w:left="720" w:hanging="360"/>
+      </w:pPr>
+      <w:rPr>
+        <w:rFonts w:ascii="Symbol" w:hAnsi="Symbol" w:hint="default"/>
+        <w:sz w:val="20"/>
+      </w:rPr>
+    </w:lvl>
+    <w:lvl w:ilvl="1" w:tentative="1">
+      <w:start w:val="1"/>
+      <w:numFmt w:val="bullet"/>
+      <w:lvlText w:val="o"/>
+      <w:lvlJc w:val="left"/>
+      <w:pPr>
+        <w:tabs>
+          <w:tab w:val="num" w:pos="1440"/>
+        </w:tabs>
+        <w:ind w:left="1440" w:hanging="360"/>
+      </w:pPr>
+      <w:rPr>
+        <w:rFonts w:ascii="Courier New" w:hAnsi="Courier New" w:hint="default"/>
+        <w:sz w:val="20"/>
+      </w:rPr>
+    </w:lvl>
+    <w:lvl w:ilvl="2" w:tentative="1">
+      <w:start w:val="1"/>
+      <w:numFmt w:val="bullet"/>
+      <w:lvlText w:val=""/>
+      <w:lvlJc w:val="left"/>
+      <w:pPr>
+        <w:tabs>
+          <w:tab w:val="num" w:pos="2160"/>
+        </w:tabs>
+        <w:ind w:left="2160" w:hanging="360"/>
+      </w:pPr>
+      <w:rPr>
+        <w:rFonts w:ascii="Wingdings" w:hAnsi="Wingdings" w:hint="default"/>
+        <w:sz w:val="20"/>
+      </w:rPr>
+    </w:lvl>
+    <w:lvl w:ilvl="3" w:tentative="1">
+      <w:start w:val="1"/>
+      <w:numFmt w:val="bullet"/>
+      <w:lvlText w:val=""/>
+      <w:lvlJc w:val="left"/>
+      <w:pPr>
+        <w:tabs>
+          <w:tab w:val="num" w:pos="2880"/>
+        </w:tabs>
+        <w:ind w:left="2880" w:hanging="360"/>
+      </w:pPr>
+      <w:rPr>
+        <w:rFonts w:ascii="Wingdings" w:hAnsi="Wingdings" w:hint="default"/>
+        <w:sz w:val="20"/>
+      </w:rPr>
+    </w:lvl>
+    <w:lvl w:ilvl="4" w:tentative="1">
+      <w:start w:val="1"/>
+      <w:numFmt w:val="bullet"/>
+      <w:lvlText w:val=""/>
+      <w:lvlJc w:val="left"/>
+      <w:pPr>
+        <w:tabs>
+          <w:tab w:val="num" w:pos="3600"/>
+        </w:tabs>
+        <w:ind w:left="3600" w:hanging="360"/>
+      </w:pPr>
+      <w:rPr>
+        <w:rFonts w:ascii="Wingdings" w:hAnsi="Wingdings" w:hint="default"/>
+        <w:sz w:val="20"/>
+      </w:rPr>
+    </w:lvl>
+    <w:lvl w:ilvl="5" w:tentative="1">
+      <w:start w:val="1"/>
+      <w:numFmt w:val="bullet"/>
+      <w:lvlText w:val=""/>
+      <w:lvlJc w:val="left"/>
+      <w:pPr>
+        <w:tabs>
+          <w:tab w:val="num" w:pos="4320"/>
+        </w:tabs>
+        <w:ind w:left="4320" w:hanging="360"/>
+      </w:pPr>
+      <w:rPr>
+        <w:rFonts w:ascii="Wingdings" w:hAnsi="Wingdings" w:hint="default"/>
+        <w:sz w:val="20"/>
+      </w:rPr>
+    </w:lvl>
+    <w:lvl w:ilvl="6" w:tentative="1">
+      <w:start w:val="1"/>
+      <w:numFmt w:val="bullet"/>
+      <w:lvlText w:val=""/>
+      <w:lvlJc w:val="left"/>
+      <w:pPr>
+        <w:tabs>
+          <w:tab w:val="num" w:pos="5040"/>
+        </w:tabs>
+        <w:ind w:left="5040" w:hanging="360"/>
+      </w:pPr>
+      <w:rPr>
+        <w:rFonts w:ascii="Wingdings" w:hAnsi="Wingdings" w:hint="default"/>
+        <w:sz w:val="20"/>
+      </w:rPr>
+    </w:lvl>
+    <w:lvl w:ilvl="7" w:tentative="1">
+      <w:start w:val="1"/>
+      <w:numFmt w:val="bullet"/>
+      <w:lvlText w:val=""/>
+      <w:lvlJc w:val="left"/>
+      <w:pPr>
+        <w:tabs>
+          <w:tab w:val="num" w:pos="5760"/>
+        </w:tabs>
+        <w:ind w:left="5760" w:hanging="360"/>
+      </w:pPr>
+      <w:rPr>
+        <w:rFonts w:ascii="Wingdings" w:hAnsi="Wingdings" w:hint="default"/>
+        <w:sz w:val="20"/>
+      </w:rPr>
+    </w:lvl>
+    <w:lvl w:ilvl="8" w:tentative="1">
+      <w:start w:val="1"/>
+      <w:numFmt w:val="bullet"/>
+      <w:lvlText w:val=""/>
+      <w:lvlJc w:val="left"/>
+      <w:pPr>
+        <w:tabs>
+          <w:tab w:val="num" w:pos="6480"/>
+        </w:tabs>
+        <w:ind w:left="6480" w:hanging="360"/>
+      </w:pPr>
+      <w:rPr>
+        <w:rFonts w:ascii="Wingdings" w:hAnsi="Wingdings" w:hint="default"/>
+        <w:sz w:val="20"/>
+      </w:rPr>
+    </w:lvl>
+  </w:abstractNum>
   <w:num w:numId="1" w16cid:durableId="176506218">
+    <w:abstractNumId w:val="6"/>
+  </w:num>
+  <w:num w:numId="2" w16cid:durableId="1302231459">
+    <w:abstractNumId w:val="14"/>
+  </w:num>
+  <w:num w:numId="3" w16cid:durableId="1849980898">
+    <w:abstractNumId w:val="3"/>
+  </w:num>
+  <w:num w:numId="4" w16cid:durableId="1309558280">
+    <w:abstractNumId w:val="10"/>
+  </w:num>
+  <w:num w:numId="5" w16cid:durableId="1543057062">
     <w:abstractNumId w:val="5"/>
   </w:num>
-  <w:num w:numId="2" w16cid:durableId="1302231459">
+  <w:num w:numId="6" w16cid:durableId="1045367518">
+    <w:abstractNumId w:val="9"/>
+  </w:num>
+  <w:num w:numId="7" w16cid:durableId="1985309264">
+    <w:abstractNumId w:val="1"/>
+  </w:num>
+  <w:num w:numId="8" w16cid:durableId="1196625876">
     <w:abstractNumId w:val="13"/>
   </w:num>
-  <w:num w:numId="3" w16cid:durableId="1849980898">
+  <w:num w:numId="9" w16cid:durableId="1454976088">
+    <w:abstractNumId w:val="12"/>
+  </w:num>
+  <w:num w:numId="10" w16cid:durableId="165094492">
     <w:abstractNumId w:val="2"/>
   </w:num>
-  <w:num w:numId="4" w16cid:durableId="1309558280">
-    <w:abstractNumId w:val="9"/>
+  <w:num w:numId="11" w16cid:durableId="1715502554">
+    <w:abstractNumId w:val="11"/>
   </w:num>
-  <w:num w:numId="5" w16cid:durableId="1543057062">
+  <w:num w:numId="12" w16cid:durableId="729379705">
     <w:abstractNumId w:val="4"/>
   </w:num>
-  <w:num w:numId="6" w16cid:durableId="1045367518">
+  <w:num w:numId="13" w16cid:durableId="1295212702">
+    <w:abstractNumId w:val="7"/>
+  </w:num>
+  <w:num w:numId="14" w16cid:durableId="1017728248">
     <w:abstractNumId w:val="8"/>
   </w:num>
-  <w:num w:numId="7" w16cid:durableId="1985309264">
+  <w:num w:numId="15" w16cid:durableId="226503431">
     <w:abstractNumId w:val="0"/>
-  </w:num>
-  <w:num w:numId="8" w16cid:durableId="1196625876">
-    <w:abstractNumId w:val="12"/>
-  </w:num>
-  <w:num w:numId="9" w16cid:durableId="1454976088">
-    <w:abstractNumId w:val="11"/>
-  </w:num>
-  <w:num w:numId="10" w16cid:durableId="165094492">
-    <w:abstractNumId w:val="1"/>
-  </w:num>
-  <w:num w:numId="11" w16cid:durableId="1715502554">
-    <w:abstractNumId w:val="10"/>
-  </w:num>
-  <w:num w:numId="12" w16cid:durableId="729379705">
-    <w:abstractNumId w:val="3"/>
-  </w:num>
-  <w:num w:numId="13" w16cid:durableId="1295212702">
-    <w:abstractNumId w:val="6"/>
-  </w:num>
-  <w:num w:numId="14" w16cid:durableId="1017728248">
-    <w:abstractNumId w:val="7"/>
   </w:num>
 </w:numbering>
 </file>
@@ -11611,6 +14047,7 @@
   <w:style w:type="character" w:default="1" w:styleId="DefaultParagraphFont">
     <w:name w:val="Default Paragraph Font"/>
     <w:uiPriority w:val="1"/>
+    <w:semiHidden/>
     <w:unhideWhenUsed/>
   </w:style>
   <w:style w:type="table" w:default="1" w:styleId="TableNormal">

</xml_diff>

<commit_message>
Complete Lesson 6: Histograms, Histogram Equalization and CLAHE
</commit_message>
<xml_diff>
--- a/Working.docx
+++ b/Working.docx
@@ -22566,6 +22566,727 @@
         </w:rPr>
       </w:pPr>
     </w:p>
+    <w:p>
+      <w:pPr>
+        <w:rPr>
+          <w:rFonts w:ascii="Arial" w:hAnsi="Arial" w:cs="Arial"/>
+          <w:sz w:val="36"/>
+          <w:szCs w:val="36"/>
+        </w:rPr>
+      </w:pPr>
+      <w:r>
+        <w:rPr>
+          <w:rFonts w:ascii="Arial" w:hAnsi="Arial" w:cs="Arial"/>
+          <w:sz w:val="36"/>
+          <w:szCs w:val="36"/>
+        </w:rPr>
+        <w:br w:type="page"/>
+      </w:r>
+    </w:p>
+    <w:p>
+      <w:pPr>
+        <w:pStyle w:val="ListParagraph"/>
+        <w:jc w:val="both"/>
+        <w:rPr>
+          <w:rFonts w:ascii="Arial" w:hAnsi="Arial" w:cs="Arial"/>
+          <w:sz w:val="36"/>
+          <w:szCs w:val="36"/>
+        </w:rPr>
+      </w:pPr>
+      <w:r>
+        <w:rPr>
+          <w:rFonts w:ascii="Arial" w:hAnsi="Arial" w:cs="Arial"/>
+          <w:sz w:val="36"/>
+          <w:szCs w:val="36"/>
+        </w:rPr>
+        <w:lastRenderedPageBreak/>
+        <w:t xml:space="preserve">Lesson </w:t>
+      </w:r>
+      <w:proofErr w:type="gramStart"/>
+      <w:r>
+        <w:rPr>
+          <w:rFonts w:ascii="Arial" w:hAnsi="Arial" w:cs="Arial"/>
+          <w:sz w:val="36"/>
+          <w:szCs w:val="36"/>
+        </w:rPr>
+        <w:t>6:-</w:t>
+      </w:r>
+      <w:proofErr w:type="gramEnd"/>
+    </w:p>
+    <w:p>
+      <w:pPr>
+        <w:pStyle w:val="ListParagraph"/>
+        <w:jc w:val="both"/>
+        <w:rPr>
+          <w:rFonts w:ascii="Arial" w:hAnsi="Arial" w:cs="Arial"/>
+          <w:sz w:val="36"/>
+          <w:szCs w:val="36"/>
+        </w:rPr>
+      </w:pPr>
+    </w:p>
+    <w:tbl>
+      <w:tblPr>
+        <w:tblW w:w="0" w:type="auto"/>
+        <w:tblCellSpacing w:w="15" w:type="dxa"/>
+        <w:tblCellMar>
+          <w:top w:w="15" w:type="dxa"/>
+          <w:left w:w="15" w:type="dxa"/>
+          <w:bottom w:w="15" w:type="dxa"/>
+          <w:right w:w="15" w:type="dxa"/>
+        </w:tblCellMar>
+        <w:tblLook w:val="04A0" w:firstRow="1" w:lastRow="0" w:firstColumn="1" w:lastColumn="0" w:noHBand="0" w:noVBand="1"/>
+      </w:tblPr>
+      <w:tblGrid>
+        <w:gridCol w:w="4387"/>
+        <w:gridCol w:w="4639"/>
+      </w:tblGrid>
+      <w:tr>
+        <w:trPr>
+          <w:tblHeader/>
+          <w:tblCellSpacing w:w="15" w:type="dxa"/>
+        </w:trPr>
+        <w:tc>
+          <w:tcPr>
+            <w:tcW w:w="0" w:type="auto"/>
+            <w:vAlign w:val="center"/>
+            <w:hideMark/>
+          </w:tcPr>
+          <w:p>
+            <w:pPr>
+              <w:pStyle w:val="ListParagraph"/>
+              <w:jc w:val="both"/>
+              <w:rPr>
+                <w:rFonts w:ascii="Arial" w:hAnsi="Arial" w:cs="Arial"/>
+                <w:b/>
+                <w:bCs/>
+                <w:sz w:val="36"/>
+                <w:szCs w:val="36"/>
+              </w:rPr>
+            </w:pPr>
+            <w:r>
+              <w:rPr>
+                <w:rFonts w:ascii="Arial" w:hAnsi="Arial" w:cs="Arial"/>
+                <w:b/>
+                <w:bCs/>
+                <w:sz w:val="36"/>
+                <w:szCs w:val="36"/>
+              </w:rPr>
+              <w:t>Function</w:t>
+            </w:r>
+          </w:p>
+        </w:tc>
+        <w:tc>
+          <w:tcPr>
+            <w:tcW w:w="0" w:type="auto"/>
+            <w:vAlign w:val="center"/>
+            <w:hideMark/>
+          </w:tcPr>
+          <w:p>
+            <w:pPr>
+              <w:pStyle w:val="ListParagraph"/>
+              <w:jc w:val="both"/>
+              <w:rPr>
+                <w:rFonts w:ascii="Arial" w:hAnsi="Arial" w:cs="Arial"/>
+                <w:b/>
+                <w:bCs/>
+                <w:sz w:val="36"/>
+                <w:szCs w:val="36"/>
+              </w:rPr>
+            </w:pPr>
+            <w:r>
+              <w:rPr>
+                <w:rFonts w:ascii="Arial" w:hAnsi="Arial" w:cs="Arial"/>
+                <w:b/>
+                <w:bCs/>
+                <w:sz w:val="36"/>
+                <w:szCs w:val="36"/>
+              </w:rPr>
+              <w:t>Purpose</w:t>
+            </w:r>
+          </w:p>
+        </w:tc>
+      </w:tr>
+      <w:tr>
+        <w:trPr>
+          <w:tblCellSpacing w:w="15" w:type="dxa"/>
+        </w:trPr>
+        <w:tc>
+          <w:tcPr>
+            <w:tcW w:w="0" w:type="auto"/>
+            <w:vAlign w:val="center"/>
+            <w:hideMark/>
+          </w:tcPr>
+          <w:p>
+            <w:pPr>
+              <w:pStyle w:val="ListParagraph"/>
+              <w:jc w:val="both"/>
+              <w:rPr>
+                <w:rFonts w:ascii="Arial" w:hAnsi="Arial" w:cs="Arial"/>
+                <w:sz w:val="36"/>
+                <w:szCs w:val="36"/>
+              </w:rPr>
+            </w:pPr>
+            <w:proofErr w:type="spellStart"/>
+            <w:proofErr w:type="gramStart"/>
+            <w:r>
+              <w:rPr>
+                <w:rFonts w:ascii="Arial" w:hAnsi="Arial" w:cs="Arial"/>
+                <w:sz w:val="36"/>
+                <w:szCs w:val="36"/>
+              </w:rPr>
+              <w:t>plt.figure</w:t>
+            </w:r>
+            <w:proofErr w:type="spellEnd"/>
+            <w:proofErr w:type="gramEnd"/>
+            <w:r>
+              <w:rPr>
+                <w:rFonts w:ascii="Arial" w:hAnsi="Arial" w:cs="Arial"/>
+                <w:sz w:val="36"/>
+                <w:szCs w:val="36"/>
+              </w:rPr>
+              <w:t>(</w:t>
+            </w:r>
+            <w:proofErr w:type="spellStart"/>
+            <w:r>
+              <w:rPr>
+                <w:rFonts w:ascii="Arial" w:hAnsi="Arial" w:cs="Arial"/>
+                <w:sz w:val="36"/>
+                <w:szCs w:val="36"/>
+              </w:rPr>
+              <w:t>figsize</w:t>
+            </w:r>
+            <w:proofErr w:type="spellEnd"/>
+            <w:proofErr w:type="gramStart"/>
+            <w:r>
+              <w:rPr>
+                <w:rFonts w:ascii="Arial" w:hAnsi="Arial" w:cs="Arial"/>
+                <w:sz w:val="36"/>
+                <w:szCs w:val="36"/>
+              </w:rPr>
+              <w:t>=(</w:t>
+            </w:r>
+            <w:proofErr w:type="gramEnd"/>
+            <w:r>
+              <w:rPr>
+                <w:rFonts w:ascii="Arial" w:hAnsi="Arial" w:cs="Arial"/>
+                <w:sz w:val="36"/>
+                <w:szCs w:val="36"/>
+              </w:rPr>
+              <w:t>8,5))</w:t>
+            </w:r>
+          </w:p>
+        </w:tc>
+        <w:tc>
+          <w:tcPr>
+            <w:tcW w:w="0" w:type="auto"/>
+            <w:vAlign w:val="center"/>
+            <w:hideMark/>
+          </w:tcPr>
+          <w:p>
+            <w:pPr>
+              <w:pStyle w:val="ListParagraph"/>
+              <w:jc w:val="both"/>
+              <w:rPr>
+                <w:rFonts w:ascii="Arial" w:hAnsi="Arial" w:cs="Arial"/>
+                <w:sz w:val="36"/>
+                <w:szCs w:val="36"/>
+              </w:rPr>
+            </w:pPr>
+            <w:r>
+              <w:rPr>
+                <w:rFonts w:ascii="Arial" w:hAnsi="Arial" w:cs="Arial"/>
+                <w:sz w:val="36"/>
+                <w:szCs w:val="36"/>
+              </w:rPr>
+              <w:t>Creates a graph window of a specific size</w:t>
+            </w:r>
+          </w:p>
+        </w:tc>
+      </w:tr>
+      <w:tr>
+        <w:trPr>
+          <w:tblCellSpacing w:w="15" w:type="dxa"/>
+        </w:trPr>
+        <w:tc>
+          <w:tcPr>
+            <w:tcW w:w="0" w:type="auto"/>
+            <w:vAlign w:val="center"/>
+            <w:hideMark/>
+          </w:tcPr>
+          <w:p>
+            <w:pPr>
+              <w:pStyle w:val="ListParagraph"/>
+              <w:jc w:val="both"/>
+              <w:rPr>
+                <w:rFonts w:ascii="Arial" w:hAnsi="Arial" w:cs="Arial"/>
+                <w:sz w:val="36"/>
+                <w:szCs w:val="36"/>
+              </w:rPr>
+            </w:pPr>
+            <w:proofErr w:type="spellStart"/>
+            <w:proofErr w:type="gramStart"/>
+            <w:r>
+              <w:rPr>
+                <w:rFonts w:ascii="Arial" w:hAnsi="Arial" w:cs="Arial"/>
+                <w:sz w:val="36"/>
+                <w:szCs w:val="36"/>
+              </w:rPr>
+              <w:t>plt.plot</w:t>
+            </w:r>
+            <w:proofErr w:type="spellEnd"/>
+            <w:proofErr w:type="gramEnd"/>
+            <w:r>
+              <w:rPr>
+                <w:rFonts w:ascii="Arial" w:hAnsi="Arial" w:cs="Arial"/>
+                <w:sz w:val="36"/>
+                <w:szCs w:val="36"/>
+              </w:rPr>
+              <w:t>(hist)</w:t>
+            </w:r>
+          </w:p>
+        </w:tc>
+        <w:tc>
+          <w:tcPr>
+            <w:tcW w:w="0" w:type="auto"/>
+            <w:vAlign w:val="center"/>
+            <w:hideMark/>
+          </w:tcPr>
+          <w:p>
+            <w:pPr>
+              <w:pStyle w:val="ListParagraph"/>
+              <w:jc w:val="both"/>
+              <w:rPr>
+                <w:rFonts w:ascii="Arial" w:hAnsi="Arial" w:cs="Arial"/>
+                <w:sz w:val="36"/>
+                <w:szCs w:val="36"/>
+              </w:rPr>
+            </w:pPr>
+            <w:r>
+              <w:rPr>
+                <w:rFonts w:ascii="Arial" w:hAnsi="Arial" w:cs="Arial"/>
+                <w:sz w:val="36"/>
+                <w:szCs w:val="36"/>
+              </w:rPr>
+              <w:t>Draws the histogram</w:t>
+            </w:r>
+          </w:p>
+        </w:tc>
+      </w:tr>
+      <w:tr>
+        <w:trPr>
+          <w:tblCellSpacing w:w="15" w:type="dxa"/>
+        </w:trPr>
+        <w:tc>
+          <w:tcPr>
+            <w:tcW w:w="0" w:type="auto"/>
+            <w:vAlign w:val="center"/>
+            <w:hideMark/>
+          </w:tcPr>
+          <w:p>
+            <w:pPr>
+              <w:pStyle w:val="ListParagraph"/>
+              <w:jc w:val="both"/>
+              <w:rPr>
+                <w:rFonts w:ascii="Arial" w:hAnsi="Arial" w:cs="Arial"/>
+                <w:sz w:val="36"/>
+                <w:szCs w:val="36"/>
+              </w:rPr>
+            </w:pPr>
+            <w:proofErr w:type="spellStart"/>
+            <w:proofErr w:type="gramStart"/>
+            <w:r>
+              <w:rPr>
+                <w:rFonts w:ascii="Arial" w:hAnsi="Arial" w:cs="Arial"/>
+                <w:sz w:val="36"/>
+                <w:szCs w:val="36"/>
+              </w:rPr>
+              <w:t>plt.title</w:t>
+            </w:r>
+            <w:proofErr w:type="spellEnd"/>
+            <w:proofErr w:type="gramEnd"/>
+            <w:r>
+              <w:rPr>
+                <w:rFonts w:ascii="Arial" w:hAnsi="Arial" w:cs="Arial"/>
+                <w:sz w:val="36"/>
+                <w:szCs w:val="36"/>
+              </w:rPr>
+              <w:t>()</w:t>
+            </w:r>
+          </w:p>
+        </w:tc>
+        <w:tc>
+          <w:tcPr>
+            <w:tcW w:w="0" w:type="auto"/>
+            <w:vAlign w:val="center"/>
+            <w:hideMark/>
+          </w:tcPr>
+          <w:p>
+            <w:pPr>
+              <w:pStyle w:val="ListParagraph"/>
+              <w:jc w:val="both"/>
+              <w:rPr>
+                <w:rFonts w:ascii="Arial" w:hAnsi="Arial" w:cs="Arial"/>
+                <w:sz w:val="36"/>
+                <w:szCs w:val="36"/>
+              </w:rPr>
+            </w:pPr>
+            <w:r>
+              <w:rPr>
+                <w:rFonts w:ascii="Arial" w:hAnsi="Arial" w:cs="Arial"/>
+                <w:sz w:val="36"/>
+                <w:szCs w:val="36"/>
+              </w:rPr>
+              <w:t>Adds a graph title</w:t>
+            </w:r>
+          </w:p>
+        </w:tc>
+      </w:tr>
+      <w:tr>
+        <w:trPr>
+          <w:tblCellSpacing w:w="15" w:type="dxa"/>
+        </w:trPr>
+        <w:tc>
+          <w:tcPr>
+            <w:tcW w:w="0" w:type="auto"/>
+            <w:vAlign w:val="center"/>
+            <w:hideMark/>
+          </w:tcPr>
+          <w:p>
+            <w:pPr>
+              <w:pStyle w:val="ListParagraph"/>
+              <w:jc w:val="both"/>
+              <w:rPr>
+                <w:rFonts w:ascii="Arial" w:hAnsi="Arial" w:cs="Arial"/>
+                <w:sz w:val="36"/>
+                <w:szCs w:val="36"/>
+              </w:rPr>
+            </w:pPr>
+            <w:proofErr w:type="spellStart"/>
+            <w:proofErr w:type="gramStart"/>
+            <w:r>
+              <w:rPr>
+                <w:rFonts w:ascii="Arial" w:hAnsi="Arial" w:cs="Arial"/>
+                <w:sz w:val="36"/>
+                <w:szCs w:val="36"/>
+              </w:rPr>
+              <w:t>plt.xlabel</w:t>
+            </w:r>
+            <w:proofErr w:type="spellEnd"/>
+            <w:proofErr w:type="gramEnd"/>
+            <w:r>
+              <w:rPr>
+                <w:rFonts w:ascii="Arial" w:hAnsi="Arial" w:cs="Arial"/>
+                <w:sz w:val="36"/>
+                <w:szCs w:val="36"/>
+              </w:rPr>
+              <w:t>()</w:t>
+            </w:r>
+          </w:p>
+        </w:tc>
+        <w:tc>
+          <w:tcPr>
+            <w:tcW w:w="0" w:type="auto"/>
+            <w:vAlign w:val="center"/>
+            <w:hideMark/>
+          </w:tcPr>
+          <w:p>
+            <w:pPr>
+              <w:pStyle w:val="ListParagraph"/>
+              <w:jc w:val="both"/>
+              <w:rPr>
+                <w:rFonts w:ascii="Arial" w:hAnsi="Arial" w:cs="Arial"/>
+                <w:sz w:val="36"/>
+                <w:szCs w:val="36"/>
+              </w:rPr>
+            </w:pPr>
+            <w:r>
+              <w:rPr>
+                <w:rFonts w:ascii="Arial" w:hAnsi="Arial" w:cs="Arial"/>
+                <w:sz w:val="36"/>
+                <w:szCs w:val="36"/>
+              </w:rPr>
+              <w:t>Labels the X-axis</w:t>
+            </w:r>
+          </w:p>
+        </w:tc>
+      </w:tr>
+      <w:tr>
+        <w:trPr>
+          <w:tblCellSpacing w:w="15" w:type="dxa"/>
+        </w:trPr>
+        <w:tc>
+          <w:tcPr>
+            <w:tcW w:w="0" w:type="auto"/>
+            <w:vAlign w:val="center"/>
+            <w:hideMark/>
+          </w:tcPr>
+          <w:p>
+            <w:pPr>
+              <w:pStyle w:val="ListParagraph"/>
+              <w:jc w:val="both"/>
+              <w:rPr>
+                <w:rFonts w:ascii="Arial" w:hAnsi="Arial" w:cs="Arial"/>
+                <w:sz w:val="36"/>
+                <w:szCs w:val="36"/>
+              </w:rPr>
+            </w:pPr>
+            <w:proofErr w:type="spellStart"/>
+            <w:proofErr w:type="gramStart"/>
+            <w:r>
+              <w:rPr>
+                <w:rFonts w:ascii="Arial" w:hAnsi="Arial" w:cs="Arial"/>
+                <w:sz w:val="36"/>
+                <w:szCs w:val="36"/>
+              </w:rPr>
+              <w:t>plt.ylabel</w:t>
+            </w:r>
+            <w:proofErr w:type="spellEnd"/>
+            <w:proofErr w:type="gramEnd"/>
+            <w:r>
+              <w:rPr>
+                <w:rFonts w:ascii="Arial" w:hAnsi="Arial" w:cs="Arial"/>
+                <w:sz w:val="36"/>
+                <w:szCs w:val="36"/>
+              </w:rPr>
+              <w:t>()</w:t>
+            </w:r>
+          </w:p>
+        </w:tc>
+        <w:tc>
+          <w:tcPr>
+            <w:tcW w:w="0" w:type="auto"/>
+            <w:vAlign w:val="center"/>
+            <w:hideMark/>
+          </w:tcPr>
+          <w:p>
+            <w:pPr>
+              <w:pStyle w:val="ListParagraph"/>
+              <w:jc w:val="both"/>
+              <w:rPr>
+                <w:rFonts w:ascii="Arial" w:hAnsi="Arial" w:cs="Arial"/>
+                <w:sz w:val="36"/>
+                <w:szCs w:val="36"/>
+              </w:rPr>
+            </w:pPr>
+            <w:r>
+              <w:rPr>
+                <w:rFonts w:ascii="Arial" w:hAnsi="Arial" w:cs="Arial"/>
+                <w:sz w:val="36"/>
+                <w:szCs w:val="36"/>
+              </w:rPr>
+              <w:t>Labels the Y-axis</w:t>
+            </w:r>
+          </w:p>
+        </w:tc>
+      </w:tr>
+      <w:tr>
+        <w:trPr>
+          <w:tblCellSpacing w:w="15" w:type="dxa"/>
+        </w:trPr>
+        <w:tc>
+          <w:tcPr>
+            <w:tcW w:w="0" w:type="auto"/>
+            <w:vAlign w:val="center"/>
+            <w:hideMark/>
+          </w:tcPr>
+          <w:p>
+            <w:pPr>
+              <w:pStyle w:val="ListParagraph"/>
+              <w:jc w:val="both"/>
+              <w:rPr>
+                <w:rFonts w:ascii="Arial" w:hAnsi="Arial" w:cs="Arial"/>
+                <w:sz w:val="36"/>
+                <w:szCs w:val="36"/>
+              </w:rPr>
+            </w:pPr>
+            <w:proofErr w:type="spellStart"/>
+            <w:proofErr w:type="gramStart"/>
+            <w:r>
+              <w:rPr>
+                <w:rFonts w:ascii="Arial" w:hAnsi="Arial" w:cs="Arial"/>
+                <w:sz w:val="36"/>
+                <w:szCs w:val="36"/>
+              </w:rPr>
+              <w:t>plt.xlim</w:t>
+            </w:r>
+            <w:proofErr w:type="spellEnd"/>
+            <w:proofErr w:type="gramEnd"/>
+            <w:r>
+              <w:rPr>
+                <w:rFonts w:ascii="Arial" w:hAnsi="Arial" w:cs="Arial"/>
+                <w:sz w:val="36"/>
+                <w:szCs w:val="36"/>
+              </w:rPr>
+              <w:t>([0,256])</w:t>
+            </w:r>
+          </w:p>
+        </w:tc>
+        <w:tc>
+          <w:tcPr>
+            <w:tcW w:w="0" w:type="auto"/>
+            <w:vAlign w:val="center"/>
+            <w:hideMark/>
+          </w:tcPr>
+          <w:p>
+            <w:pPr>
+              <w:pStyle w:val="ListParagraph"/>
+              <w:jc w:val="both"/>
+              <w:rPr>
+                <w:rFonts w:ascii="Arial" w:hAnsi="Arial" w:cs="Arial"/>
+                <w:sz w:val="36"/>
+                <w:szCs w:val="36"/>
+              </w:rPr>
+            </w:pPr>
+            <w:r>
+              <w:rPr>
+                <w:rFonts w:ascii="Arial" w:hAnsi="Arial" w:cs="Arial"/>
+                <w:sz w:val="36"/>
+                <w:szCs w:val="36"/>
+              </w:rPr>
+              <w:t>Sets the X-axis range</w:t>
+            </w:r>
+          </w:p>
+        </w:tc>
+      </w:tr>
+      <w:tr>
+        <w:trPr>
+          <w:tblCellSpacing w:w="15" w:type="dxa"/>
+        </w:trPr>
+        <w:tc>
+          <w:tcPr>
+            <w:tcW w:w="0" w:type="auto"/>
+            <w:vAlign w:val="center"/>
+            <w:hideMark/>
+          </w:tcPr>
+          <w:p>
+            <w:pPr>
+              <w:pStyle w:val="ListParagraph"/>
+              <w:jc w:val="both"/>
+              <w:rPr>
+                <w:rFonts w:ascii="Arial" w:hAnsi="Arial" w:cs="Arial"/>
+                <w:sz w:val="36"/>
+                <w:szCs w:val="36"/>
+              </w:rPr>
+            </w:pPr>
+            <w:proofErr w:type="spellStart"/>
+            <w:proofErr w:type="gramStart"/>
+            <w:r>
+              <w:rPr>
+                <w:rFonts w:ascii="Arial" w:hAnsi="Arial" w:cs="Arial"/>
+                <w:sz w:val="36"/>
+                <w:szCs w:val="36"/>
+              </w:rPr>
+              <w:t>plt.grid</w:t>
+            </w:r>
+            <w:proofErr w:type="spellEnd"/>
+            <w:proofErr w:type="gramEnd"/>
+            <w:r>
+              <w:rPr>
+                <w:rFonts w:ascii="Arial" w:hAnsi="Arial" w:cs="Arial"/>
+                <w:sz w:val="36"/>
+                <w:szCs w:val="36"/>
+              </w:rPr>
+              <w:t>(True)</w:t>
+            </w:r>
+          </w:p>
+        </w:tc>
+        <w:tc>
+          <w:tcPr>
+            <w:tcW w:w="0" w:type="auto"/>
+            <w:vAlign w:val="center"/>
+            <w:hideMark/>
+          </w:tcPr>
+          <w:p>
+            <w:pPr>
+              <w:pStyle w:val="ListParagraph"/>
+              <w:jc w:val="both"/>
+              <w:rPr>
+                <w:rFonts w:ascii="Arial" w:hAnsi="Arial" w:cs="Arial"/>
+                <w:sz w:val="36"/>
+                <w:szCs w:val="36"/>
+              </w:rPr>
+            </w:pPr>
+            <w:r>
+              <w:rPr>
+                <w:rFonts w:ascii="Arial" w:hAnsi="Arial" w:cs="Arial"/>
+                <w:sz w:val="36"/>
+                <w:szCs w:val="36"/>
+              </w:rPr>
+              <w:t>Shows grid lines</w:t>
+            </w:r>
+          </w:p>
+        </w:tc>
+      </w:tr>
+      <w:tr>
+        <w:trPr>
+          <w:tblCellSpacing w:w="15" w:type="dxa"/>
+        </w:trPr>
+        <w:tc>
+          <w:tcPr>
+            <w:tcW w:w="0" w:type="auto"/>
+            <w:vAlign w:val="center"/>
+            <w:hideMark/>
+          </w:tcPr>
+          <w:p>
+            <w:pPr>
+              <w:pStyle w:val="ListParagraph"/>
+              <w:jc w:val="both"/>
+              <w:rPr>
+                <w:rFonts w:ascii="Arial" w:hAnsi="Arial" w:cs="Arial"/>
+                <w:sz w:val="36"/>
+                <w:szCs w:val="36"/>
+              </w:rPr>
+            </w:pPr>
+            <w:proofErr w:type="spellStart"/>
+            <w:proofErr w:type="gramStart"/>
+            <w:r>
+              <w:rPr>
+                <w:rFonts w:ascii="Arial" w:hAnsi="Arial" w:cs="Arial"/>
+                <w:sz w:val="36"/>
+                <w:szCs w:val="36"/>
+              </w:rPr>
+              <w:t>plt.show</w:t>
+            </w:r>
+            <w:proofErr w:type="spellEnd"/>
+            <w:proofErr w:type="gramEnd"/>
+            <w:r>
+              <w:rPr>
+                <w:rFonts w:ascii="Arial" w:hAnsi="Arial" w:cs="Arial"/>
+                <w:sz w:val="36"/>
+                <w:szCs w:val="36"/>
+              </w:rPr>
+              <w:t>()</w:t>
+            </w:r>
+          </w:p>
+        </w:tc>
+        <w:tc>
+          <w:tcPr>
+            <w:tcW w:w="0" w:type="auto"/>
+            <w:vAlign w:val="center"/>
+            <w:hideMark/>
+          </w:tcPr>
+          <w:p>
+            <w:pPr>
+              <w:pStyle w:val="ListParagraph"/>
+              <w:jc w:val="both"/>
+              <w:rPr>
+                <w:rFonts w:ascii="Arial" w:hAnsi="Arial" w:cs="Arial"/>
+                <w:sz w:val="36"/>
+                <w:szCs w:val="36"/>
+              </w:rPr>
+            </w:pPr>
+            <w:r>
+              <w:rPr>
+                <w:rFonts w:ascii="Arial" w:hAnsi="Arial" w:cs="Arial"/>
+                <w:sz w:val="36"/>
+                <w:szCs w:val="36"/>
+              </w:rPr>
+              <w:t>Displays the graph</w:t>
+            </w:r>
+          </w:p>
+        </w:tc>
+      </w:tr>
+    </w:tbl>
     <w:p>
       <w:pPr>
         <w:pStyle w:val="ListParagraph"/>

</xml_diff>